<commit_message>
create main doc v1
</commit_message>
<xml_diff>
--- a/Hauptdokument.docx
+++ b/Hauptdokument.docx
@@ -33,6 +33,7 @@
         <w:spacing w:after="240"/>
         <w:jc w:val="center"/>
       </w:pPr>
+      <w:proofErr w:type="spellStart"/>
       <w:r>
         <w:rPr>
           <w:b/>
@@ -40,7 +41,17 @@
           <w:sz w:val="32"/>
           <w:szCs w:val="32"/>
         </w:rPr>
-        <w:t>BSc-Thesis</w:t>
+        <w:t>BSc</w:t>
+      </w:r>
+      <w:proofErr w:type="spellEnd"/>
+      <w:r>
+        <w:rPr>
+          <w:b/>
+          <w:bCs/>
+          <w:sz w:val="32"/>
+          <w:szCs w:val="32"/>
+        </w:rPr>
+        <w:t>-Thesis</w:t>
       </w:r>
     </w:p>
     <w:p>
@@ -130,18 +141,36 @@
       <w:pPr>
         <w:pStyle w:val="berschrift1"/>
       </w:pPr>
+      <w:proofErr w:type="gramStart"/>
       <w:r>
         <w:lastRenderedPageBreak/>
         <w:t>1  Motivation</w:t>
       </w:r>
-    </w:p>
-    <w:p>
-      <w:pPr>
-        <w:spacing w:after="160" w:line="320" w:lineRule="auto"/>
-        <w:jc w:val="both"/>
-      </w:pPr>
-      <w:r>
-        <w:t>Medienkonsum ist das Ergebnis eines Zusammenspiels zweier Seiten: Auf der einen Seite stehen die Nutzenden mit ihren Bedürfnissen und Motivationen wie Information, Unterhaltung, Orientierung, soziale Zugehörigkeit und Identitätsbildung. Auf der anderen Seite stehen die Anbieter mit ihren Geschäftsmodellen, Zielen und Anreizen wie Reichweite, Nutzerbindung, Werbeeinnahmen und Marktanteilen. Idealerweise stehen diese beiden Seiten in einem ausgewogenen Verhältnis: Die Anbieter liefern Inhalte, die Bedürfnisse der Nutzenden erfüllen, und erhalten dafür Aufmerksamkeit oder Entgelt. In den letzten zwei Jahrzehnten hat sich dieses Gleichgewicht jedoch zunehmend zugunsten der Anbieterseite verschoben, insbesondere im Bereich der sozialen Medien (Zuboff, 2019; Montag &amp; Elhai, 2023).</w:t>
+      <w:proofErr w:type="gramEnd"/>
+    </w:p>
+    <w:p>
+      <w:pPr>
+        <w:spacing w:after="160" w:line="320" w:lineRule="auto"/>
+        <w:jc w:val="both"/>
+      </w:pPr>
+      <w:r>
+        <w:t>Medienkonsum ist das Ergebnis eines Zusammenspiels zweier Seiten: Auf der einen Seite stehen die Nutzenden mit ihren Bedürfnissen und Motivationen wie Information, Unterhaltung, Orientierung, soziale Zugehörigkeit und Identitätsbildung. Auf der anderen Seite stehen die Anbieter mit ihren Geschäftsmodellen, Zielen und Anreizen wie Reichweite, Nutzerbindung, Werbeeinnahmen und Marktanteilen. Idealerweise stehen diese beiden Seiten in einem ausgewogenen Verhältnis: Die Anbieter liefern Inhalte, die Bedürfnisse der Nutzenden erfüllen, und erhalten dafür Aufmerksamkeit oder Entgelt. In den letzten zwei Jahrzehnten hat sich dieses Gleichgewicht jedoch zunehmend zugunsten der Anbieterseite verschoben, insbesondere im Bereich der sozialen Medien (</w:t>
+      </w:r>
+      <w:proofErr w:type="spellStart"/>
+      <w:r>
+        <w:t>Zuboff</w:t>
+      </w:r>
+      <w:proofErr w:type="spellEnd"/>
+      <w:r>
+        <w:t xml:space="preserve">, 2019; Montag &amp; </w:t>
+      </w:r>
+      <w:proofErr w:type="spellStart"/>
+      <w:r>
+        <w:t>Elhai</w:t>
+      </w:r>
+      <w:proofErr w:type="spellEnd"/>
+      <w:r>
+        <w:t>, 2023).</w:t>
       </w:r>
     </w:p>
     <w:p>
@@ -157,26 +186,63 @@
       <w:pPr>
         <w:pStyle w:val="berschrift2"/>
       </w:pPr>
-      <w:r>
-        <w:t>1.1  Das Spannungsfeld zwischen Nutzer und Anbieter</w:t>
-      </w:r>
-    </w:p>
-    <w:p>
-      <w:pPr>
-        <w:spacing w:after="160" w:line="320" w:lineRule="auto"/>
-        <w:jc w:val="both"/>
-      </w:pPr>
-      <w:r>
-        <w:t>Die Motivationen der Nutzenden digitaler Medien sind vielfältig und lassen sich grob vier Ebenen zuordnen (in Anlehnung an den Uses-and-Gratifications-Ansatz nach Katz, Blumler und Gurevitch, 1973, sowie die Self-Determination Theory nach Ryan und Deci, 2000): (1) kognitive Bedürfnisse wie Information und Orientierung, (2) affektive Bedürfnisse wie Unterhaltung und Entspannung, (3) soziale Bedürfnisse wie Zugehörigkeit und Austausch sowie (4) Bedürfnisse nach persönlicher Entwicklung und Selbstbestimmung. Wird ein Medium diesen Motivationen gerecht, entstehen Zufriedenheit, Kompetenzerleben und Autonomie.</w:t>
-      </w:r>
-    </w:p>
-    <w:p>
-      <w:pPr>
-        <w:spacing w:after="160" w:line="320" w:lineRule="auto"/>
-        <w:jc w:val="both"/>
-      </w:pPr>
-      <w:r>
-        <w:t>Die Motivationen der Anbieter hingegen sind primär ökonomischer Natur. Kommerzielle Plattformen wie TikTok, Instagram, Facebook oder YouTube finanzieren sich überwiegend durch Werbung. Ihr zentrales Zielgrössensystem sind Engagement-Metriken: Verweildauer, Klicks, Impressions, Interaktionsrate. Diese Grössen entscheiden über den Werbepreis und damit über den Ertrag. Alle zentralen Designentscheidungen, von der Rangfolge der Inhalte bis zur Gestaltung der Benutzeroberfläche, orientieren sich an diesen Metriken.</w:t>
+      <w:proofErr w:type="gramStart"/>
+      <w:r>
+        <w:t>1.1  Das</w:t>
+      </w:r>
+      <w:proofErr w:type="gramEnd"/>
+      <w:r>
+        <w:t xml:space="preserve"> Spannungsfeld zwischen Nutzer und Anbieter</w:t>
+      </w:r>
+    </w:p>
+    <w:p>
+      <w:pPr>
+        <w:spacing w:after="160" w:line="320" w:lineRule="auto"/>
+        <w:jc w:val="both"/>
+      </w:pPr>
+      <w:r>
+        <w:t xml:space="preserve">Die Motivationen der Nutzenden digitaler Medien sind vielfältig und lassen sich grob vier Ebenen zuordnen (in Anlehnung an den </w:t>
+      </w:r>
+      <w:proofErr w:type="spellStart"/>
+      <w:r>
+        <w:t>Uses</w:t>
+      </w:r>
+      <w:proofErr w:type="spellEnd"/>
+      <w:r>
+        <w:t>-and-</w:t>
+      </w:r>
+      <w:proofErr w:type="spellStart"/>
+      <w:r>
+        <w:t>Gratifications</w:t>
+      </w:r>
+      <w:proofErr w:type="spellEnd"/>
+      <w:r>
+        <w:t xml:space="preserve">-Ansatz nach Katz, </w:t>
+      </w:r>
+      <w:proofErr w:type="spellStart"/>
+      <w:r>
+        <w:t>Blumler</w:t>
+      </w:r>
+      <w:proofErr w:type="spellEnd"/>
+      <w:r>
+        <w:t xml:space="preserve"> und Gurevitch, 1973, sowie die Self-Determination Theory nach Ryan und Deci, 2000): (1) kognitive Bedürfnisse wie Information und Orientierung, (2) affektive Bedürfnisse wie Unterhaltung und Entspannung, (3) soziale Bedürfnisse wie Zugehörigkeit und Austausch sowie (4) Bedürfnisse nach persönlicher Entwicklung und Selbstbestimmung. Wird ein Medium diesen Motivationen gerecht, entstehen Zufriedenheit, Kompetenzerleben und Autonomie.</w:t>
+      </w:r>
+    </w:p>
+    <w:p>
+      <w:pPr>
+        <w:spacing w:after="160" w:line="320" w:lineRule="auto"/>
+        <w:jc w:val="both"/>
+      </w:pPr>
+      <w:r>
+        <w:t xml:space="preserve">Die Motivationen der Anbieter hingegen sind primär ökonomischer Natur. Kommerzielle Plattformen wie TikTok, Instagram, Facebook oder YouTube finanzieren sich überwiegend durch Werbung. Ihr zentrales Zielgrössensystem sind Engagement-Metriken: Verweildauer, Klicks, </w:t>
+      </w:r>
+      <w:proofErr w:type="spellStart"/>
+      <w:r>
+        <w:t>Impressions</w:t>
+      </w:r>
+      <w:proofErr w:type="spellEnd"/>
+      <w:r>
+        <w:t>, Interaktionsrate. Diese Grössen entscheiden über den Werbepreis und damit über den Ertrag. Alle zentralen Designentscheidungen, von der Rangfolge der Inhalte bis zur Gestaltung der Benutzeroberfläche, orientieren sich an diesen Metriken.</w:t>
       </w:r>
     </w:p>
     <w:p>
@@ -192,9 +258,14 @@
       <w:pPr>
         <w:pStyle w:val="berschrift2"/>
       </w:pPr>
+      <w:proofErr w:type="gramStart"/>
       <w:r>
         <w:lastRenderedPageBreak/>
-        <w:t>1.2  Das Geschäftsmodell der Aufmerksamkeitsökonomie</w:t>
+        <w:t>1.2  Das</w:t>
+      </w:r>
+      <w:proofErr w:type="gramEnd"/>
+      <w:r>
+        <w:t xml:space="preserve"> Geschäftsmodell der Aufmerksamkeitsökonomie</w:t>
       </w:r>
     </w:p>
     <w:p>
@@ -212,24 +283,53 @@
         <w:jc w:val="both"/>
       </w:pPr>
       <w:r>
-        <w:t>Die Asymmetrie dieses Modells ist strukturell: Während die Plattformen immer mehr über ihre Nutzenden wissen, bleibt den Nutzenden verborgen, welche Daten erhoben, wie sie interpretiert und mit welchem Ziel sie eingesetzt werden. Reviglio und Agosti (2020) sprechen in diesem Zusammenhang vom Fehlen einer «algorithmischen Souveränität»: Nutzende sind den Entscheidungen der Systeme weitgehend ausgeliefert, ohne sie substanziell beeinflussen oder auch nur verstehen zu können.</w:t>
+        <w:t xml:space="preserve">Die Asymmetrie dieses Modells ist strukturell: Während die Plattformen immer mehr über ihre Nutzenden wissen, bleibt den Nutzenden verborgen, welche Daten erhoben, wie sie interpretiert und mit welchem Ziel sie eingesetzt werden. </w:t>
+      </w:r>
+      <w:proofErr w:type="spellStart"/>
+      <w:r>
+        <w:t>Reviglio</w:t>
+      </w:r>
+      <w:proofErr w:type="spellEnd"/>
+      <w:r>
+        <w:t xml:space="preserve"> und Agosti (2020) sprechen in diesem Zusammenhang vom Fehlen einer «algorithmischen Souveränität»: Nutzende sind den Entscheidungen der Systeme weitgehend ausgeliefert, ohne sie substanziell beeinflussen oder auch nur verstehen zu können.</w:t>
       </w:r>
     </w:p>
     <w:p>
       <w:pPr>
         <w:pStyle w:val="berschrift2"/>
       </w:pPr>
-      <w:r>
-        <w:t>1.3  Manipulative Designmuster</w:t>
-      </w:r>
-    </w:p>
-    <w:p>
-      <w:pPr>
-        <w:spacing w:after="160" w:line="320" w:lineRule="auto"/>
-        <w:jc w:val="both"/>
-      </w:pPr>
-      <w:r>
-        <w:t>Die ökonomische Logik manifestiert sich in konkreten Designmustern, die gezielt auf Schwachstellen der menschlichen Psyche zielen. Fogg (2003) hat mit dem Modell der Persuasive Technology gezeigt, wie Computer als Werkzeuge, Medien und soziale Akteure Verhalten beeinflussen können; Social-Media-Plattformen nutzen diese Prinzipien heute in grossem Massstab zur Engagement-Maximierung (Montag et al., 2019; Montag &amp; Elhai, 2023). Zu den am besten dokumentierten Mustern gehören:</w:t>
+      <w:proofErr w:type="gramStart"/>
+      <w:r>
+        <w:t>1.3  Manipulative</w:t>
+      </w:r>
+      <w:proofErr w:type="gramEnd"/>
+      <w:r>
+        <w:t xml:space="preserve"> Designmuster</w:t>
+      </w:r>
+    </w:p>
+    <w:p>
+      <w:pPr>
+        <w:spacing w:after="160" w:line="320" w:lineRule="auto"/>
+        <w:jc w:val="both"/>
+      </w:pPr>
+      <w:r>
+        <w:t xml:space="preserve">Die ökonomische Logik manifestiert sich in konkreten Designmustern, die gezielt auf Schwachstellen der menschlichen Psyche zielen. Fogg (2003) hat mit dem Modell der Persuasive Technology gezeigt, wie Computer als Werkzeuge, Medien und soziale Akteure Verhalten beeinflussen können; </w:t>
+      </w:r>
+      <w:proofErr w:type="spellStart"/>
+      <w:r>
+        <w:t>Social</w:t>
+      </w:r>
+      <w:proofErr w:type="spellEnd"/>
+      <w:r>
+        <w:t xml:space="preserve">-Media-Plattformen nutzen diese Prinzipien heute in grossem Massstab zur Engagement-Maximierung (Montag et al., 2019; Montag &amp; </w:t>
+      </w:r>
+      <w:proofErr w:type="spellStart"/>
+      <w:r>
+        <w:t>Elhai</w:t>
+      </w:r>
+      <w:proofErr w:type="spellEnd"/>
+      <w:r>
+        <w:t>, 2023). Zu den am besten dokumentierten Mustern gehören:</w:t>
       </w:r>
     </w:p>
     <w:p>
@@ -321,12 +421,21 @@
         </w:numPr>
         <w:spacing w:after="80" w:line="300" w:lineRule="auto"/>
       </w:pPr>
+      <w:proofErr w:type="spellStart"/>
       <w:r>
         <w:rPr>
           <w:b/>
           <w:bCs/>
         </w:rPr>
-        <w:t xml:space="preserve">Social-Proof- und Reziprozitätsmechanismen, </w:t>
+        <w:t>Social</w:t>
+      </w:r>
+      <w:proofErr w:type="spellEnd"/>
+      <w:r>
+        <w:rPr>
+          <w:b/>
+          <w:bCs/>
+        </w:rPr>
+        <w:t xml:space="preserve">-Proof- und Reziprozitätsmechanismen, </w:t>
       </w:r>
       <w:r>
         <w:t>die soziale Grundbedürfnisse (Bestätigung, Gegenseitigkeit) für die Plattformbindung nutzen.</w:t>
@@ -345,9 +454,14 @@
       <w:pPr>
         <w:pStyle w:val="berschrift2"/>
       </w:pPr>
+      <w:proofErr w:type="gramStart"/>
       <w:r>
         <w:lastRenderedPageBreak/>
-        <w:t>1.4  Filterblasen, Echokammern und Polarisierung</w:t>
+        <w:t>1.4  Filterblasen</w:t>
+      </w:r>
+      <w:proofErr w:type="gramEnd"/>
+      <w:r>
+        <w:t>, Echokammern und Polarisierung</w:t>
       </w:r>
     </w:p>
     <w:p>
@@ -365,24 +479,45 @@
         <w:jc w:val="both"/>
       </w:pPr>
       <w:r>
-        <w:t>Sunstein (2017) beschreibt, wie diese Informationsarchitekturen die gesellschaftliche Polarisierung befeuern: Wenn Nutzende bevorzugt mit Inhalten konfrontiert werden, die ihre bestehende Meinung bestätigen, verschärfen sich die Gräben zwischen unterschiedlichen Weltsichten. Dabei ist wichtig, dass dies nicht allein ein Problem der Algorithmen ist (menschliche kognitive Verzerrungen wie der Confirmation Bias wirken in die gleiche Richtung), sondern dass die Algorithmen bestehende Tendenzen systematisch verstärken, weil polarisierende und emotionalisierende Inhalte stärkere Reaktionen und damit höheres Engagement auslösen. Vosoughi, Roy und Aral (2018) belegen dies empirisch anhand einer grossangelegten Twitter-Analyse: Falsch- und Sensationsinformationen verbreiten sich im Durchschnitt schneller, tiefer und breiter als vergleichbare wahre Inhalte, was primär auf die stärkere emotionale Reaktion der Nutzenden zurückzuführen ist.</w:t>
+        <w:t xml:space="preserve">Sunstein (2017) beschreibt, wie diese Informationsarchitekturen die gesellschaftliche Polarisierung befeuern: Wenn Nutzende bevorzugt mit Inhalten konfrontiert werden, die ihre bestehende Meinung bestätigen, verschärfen sich die Gräben zwischen unterschiedlichen Weltsichten. Dabei ist wichtig, dass dies nicht allein ein Problem der Algorithmen ist (menschliche kognitive Verzerrungen wie der </w:t>
+      </w:r>
+      <w:proofErr w:type="spellStart"/>
+      <w:r>
+        <w:t>Confirmation</w:t>
+      </w:r>
+      <w:proofErr w:type="spellEnd"/>
+      <w:r>
+        <w:t xml:space="preserve"> Bias wirken in die gleiche Richtung), sondern dass die Algorithmen bestehende Tendenzen systematisch verstärken, weil polarisierende und emotionalisierende Inhalte stärkere Reaktionen und damit höheres Engagement auslösen. Vosoughi, Roy und Aral (2018) belegen dies empirisch anhand einer grossangelegten Twitter-Analyse: Falsch- und Sensationsinformationen verbreiten sich im Durchschnitt schneller, tiefer und breiter als vergleichbare wahre Inhalte, was primär auf die stärkere emotionale Reaktion der Nutzenden zurückzuführen ist.</w:t>
       </w:r>
     </w:p>
     <w:p>
       <w:pPr>
         <w:pStyle w:val="berschrift2"/>
       </w:pPr>
-      <w:r>
-        <w:t>1.5  Psychisches Wohlbefinden und Suchtverhalten</w:t>
-      </w:r>
-    </w:p>
-    <w:p>
-      <w:pPr>
-        <w:spacing w:after="160" w:line="320" w:lineRule="auto"/>
-        <w:jc w:val="both"/>
-      </w:pPr>
-      <w:r>
-        <w:t>Die Folgen für das individuelle Wohlbefinden sind inzwischen empirisch vielfach untersucht. Verduyn et al. (2015) zeigen in einer experimentellen und längsschnittlichen Studie, dass passive Facebook-Nutzung (Konsumieren ohne aktive Teilnahme) das affektive Wohlbefinden nachweislich untergräbt, während aktive, kommunikative Nutzung neutral oder sogar positiv wirkt.</w:t>
+      <w:proofErr w:type="gramStart"/>
+      <w:r>
+        <w:t>1.5  Psychisches</w:t>
+      </w:r>
+      <w:proofErr w:type="gramEnd"/>
+      <w:r>
+        <w:t xml:space="preserve"> Wohlbefinden und Suchtverhalten</w:t>
+      </w:r>
+    </w:p>
+    <w:p>
+      <w:pPr>
+        <w:spacing w:after="160" w:line="320" w:lineRule="auto"/>
+        <w:jc w:val="both"/>
+      </w:pPr>
+      <w:r>
+        <w:t xml:space="preserve">Die Folgen für das individuelle Wohlbefinden sind inzwischen empirisch vielfach untersucht. </w:t>
+      </w:r>
+      <w:proofErr w:type="spellStart"/>
+      <w:r>
+        <w:t>Verduyn</w:t>
+      </w:r>
+      <w:proofErr w:type="spellEnd"/>
+      <w:r>
+        <w:t xml:space="preserve"> et al. (2015) zeigen in einer experimentellen und längsschnittlichen Studie, dass passive Facebook-Nutzung (Konsumieren ohne aktive Teilnahme) das affektive Wohlbefinden nachweislich untergräbt, während aktive, kommunikative Nutzung neutral oder sogar positiv wirkt.</w:t>
       </w:r>
     </w:p>
     <w:p>
@@ -411,8 +546,13 @@
       <w:pPr>
         <w:pStyle w:val="berschrift2"/>
       </w:pPr>
-      <w:r>
-        <w:t>1.6  Verlust der Nutzerautonomie</w:t>
+      <w:proofErr w:type="gramStart"/>
+      <w:r>
+        <w:t>1.6  Verlust</w:t>
+      </w:r>
+      <w:proofErr w:type="gramEnd"/>
+      <w:r>
+        <w:t xml:space="preserve"> der Nutzerautonomie</w:t>
       </w:r>
     </w:p>
     <w:p>
@@ -430,15 +570,36 @@
         <w:jc w:val="both"/>
       </w:pPr>
       <w:r>
-        <w:t>In der Praxis manifestiert sich dieser Autonomieverlust auf mehreren Ebenen: Nutzende sehen nicht, warum ein bestimmter Inhalt ausgespielt wird (Black Box). Sie können die zugrundeliegende Logik nicht substanziell ändern (fehlende Souveränität, Reviglio &amp; Agosti, 2020). Ihre Steuerungsmöglichkeiten beschränken sich auf oberflächliche Stellschrauben («diesen Kanal nicht mehr anzeigen», «Interesse bekunden»), während die tieferen Entscheidungsstrukturen intransparent bleiben. Milano, Taddeo und Floridi (2020) argumentieren deshalb, dass Empfehlungssysteme neben Relevanz auch Diversität, Fairness und Nutzerwohl als explizite Optimierungsziele benötigen.</w:t>
+        <w:t xml:space="preserve">In der Praxis manifestiert sich dieser Autonomieverlust auf mehreren Ebenen: Nutzende sehen nicht, warum ein bestimmter Inhalt ausgespielt wird (Black Box). Sie können die zugrundeliegende Logik nicht substanziell ändern (fehlende Souveränität, </w:t>
+      </w:r>
+      <w:proofErr w:type="spellStart"/>
+      <w:r>
+        <w:t>Reviglio</w:t>
+      </w:r>
+      <w:proofErr w:type="spellEnd"/>
+      <w:r>
+        <w:t xml:space="preserve"> &amp; Agosti, 2020). Ihre Steuerungsmöglichkeiten beschränken sich auf oberflächliche Stellschrauben («diesen Kanal nicht mehr anzeigen», «Interesse bekunden»), während die tieferen Entscheidungsstrukturen intransparent bleiben. Milano, Taddeo und </w:t>
+      </w:r>
+      <w:proofErr w:type="spellStart"/>
+      <w:r>
+        <w:t>Floridi</w:t>
+      </w:r>
+      <w:proofErr w:type="spellEnd"/>
+      <w:r>
+        <w:t xml:space="preserve"> (2020) argumentieren deshalb, dass Empfehlungssysteme neben Relevanz auch Diversität, Fairness und Nutzerwohl als explizite Optimierungsziele benötigen.</w:t>
       </w:r>
     </w:p>
     <w:p>
       <w:pPr>
         <w:pStyle w:val="berschrift2"/>
       </w:pPr>
-      <w:r>
-        <w:t>1.7  Zwischenfazit: Der Kern des Problems</w:t>
+      <w:proofErr w:type="gramStart"/>
+      <w:r>
+        <w:t>1.7  Zwischenfazit</w:t>
+      </w:r>
+      <w:proofErr w:type="gramEnd"/>
+      <w:r>
+        <w:t>: Der Kern des Problems</w:t>
       </w:r>
     </w:p>
     <w:p>
@@ -456,7 +617,39 @@
         <w:jc w:val="both"/>
       </w:pPr>
       <w:r>
-        <w:t>Die Forschungslage zeigt drei miteinander verwobene Aspekte dieses Ungleichgewichts. Erstens ist es kein Zufall, sondern strukturell im werbefinanzierten Geschäftsmodell angelegt (Zuboff, 2019; Montag &amp; Elhai, 2023). Zweitens hat es messbare negative Folgen auf Informationsvielfalt, soziale Kohäsion und individuelles Wohlbefinden (Nguyen et al., 2014; Geschke et al., 2019; Verduyn et al., 2015; Orben, 2020). Drittens verfügen Nutzende in den aktuellen Systemen kaum über die Möglichkeit, dieses Ungleichgewicht selbst zu korrigieren (Reviglio &amp; Agosti, 2020; Milano et al., 2020).</w:t>
+        <w:t>Die Forschungslage zeigt drei miteinander verwobene Aspekte dieses Ungleichgewichts. Erstens ist es kein Zufall, sondern strukturell im werbefinanzierten Geschäftsmodell angelegt (</w:t>
+      </w:r>
+      <w:proofErr w:type="spellStart"/>
+      <w:r>
+        <w:t>Zuboff</w:t>
+      </w:r>
+      <w:proofErr w:type="spellEnd"/>
+      <w:r>
+        <w:t xml:space="preserve">, 2019; Montag &amp; </w:t>
+      </w:r>
+      <w:proofErr w:type="spellStart"/>
+      <w:r>
+        <w:t>Elhai</w:t>
+      </w:r>
+      <w:proofErr w:type="spellEnd"/>
+      <w:r>
+        <w:t xml:space="preserve">, 2023). Zweitens hat es messbare negative Folgen auf Informationsvielfalt, soziale Kohäsion und individuelles Wohlbefinden (Nguyen et al., 2014; Geschke et al., 2019; </w:t>
+      </w:r>
+      <w:proofErr w:type="spellStart"/>
+      <w:r>
+        <w:t>Verduyn</w:t>
+      </w:r>
+      <w:proofErr w:type="spellEnd"/>
+      <w:r>
+        <w:t xml:space="preserve"> et al., 2015; Orben, 2020). Drittens verfügen Nutzende in den aktuellen Systemen kaum über die Möglichkeit, dieses Ungleichgewicht selbst zu korrigieren (</w:t>
+      </w:r>
+      <w:proofErr w:type="spellStart"/>
+      <w:r>
+        <w:t>Reviglio</w:t>
+      </w:r>
+      <w:proofErr w:type="spellEnd"/>
+      <w:r>
+        <w:t xml:space="preserve"> &amp; Agosti, 2020; Milano et al., 2020).</w:t>
       </w:r>
     </w:p>
     <w:p>
@@ -472,10 +665,12 @@
       <w:pPr>
         <w:pStyle w:val="berschrift1"/>
       </w:pPr>
+      <w:proofErr w:type="gramStart"/>
       <w:r>
         <w:lastRenderedPageBreak/>
         <w:t>2  Background</w:t>
       </w:r>
+      <w:proofErr w:type="gramEnd"/>
     </w:p>
     <w:p>
       <w:pPr>
@@ -490,8 +685,13 @@
       <w:pPr>
         <w:pStyle w:val="berschrift2"/>
       </w:pPr>
-      <w:r>
-        <w:t>2.1  Vorgehen der Literaturrecherche</w:t>
+      <w:proofErr w:type="gramStart"/>
+      <w:r>
+        <w:t>2.1  Vorgehen</w:t>
+      </w:r>
+      <w:proofErr w:type="gramEnd"/>
+      <w:r>
+        <w:t xml:space="preserve"> der Literaturrecherche</w:t>
       </w:r>
     </w:p>
     <w:p>
@@ -509,34 +709,146 @@
         <w:jc w:val="both"/>
       </w:pPr>
       <w:r>
-        <w:t>Als erstes Werkzeug wurden die klassischen wissenschaftlichen Suchmaschinen Swisscovery und Google Scholar eingesetzt. Gesucht wurde nach englisch- und deutschsprachigen Quellen zu den Kernbegriffen «Digital Wellbeing», «Social Media», «Recommender Systems», «Personalization», «Value-Sensitive Design» und «Self-Determination Theory». Die Ergebnislisten wurden nach Titel, Abstract und Zitationshäufigkeit vorgefiltert. Als besonders ertragreich erwiesen sich die Reviews von Burr et al. (2020) und Orben (2020), die als Einstiegspunkte für Rückwärtssuchen dienten.</w:t>
-      </w:r>
-    </w:p>
-    <w:p>
-      <w:pPr>
-        <w:spacing w:after="160" w:line="320" w:lineRule="auto"/>
-        <w:jc w:val="both"/>
-      </w:pPr>
-      <w:r>
-        <w:t>Als zweites Werkzeug wurde Claude (Anthropic) als KI-basiertes Recherchewerkzeug eingesetzt, primär zur Query Expansion und zur Identifikation angrenzender Theoriefelder. Prompts wie «Welche Theorien und zentralen Autorinnen und Autoren prägen die Debatte um Digital Wellbeing in Social Media?» oder «Welche Konzepte adressieren Nutzerkontrolle und algorithmische Transparenz in Empfehlungssystemen?» lieferten thematische Übersichten und konkrete Quellenvorschläge. Auf diesem Weg wurden unter anderem die Begriffe «Algorithmic Sovereignty» (Reviglio &amp; Agosti, 2020), «Persuasive Technology» (Fogg, 2003), «Digital Nudging» (Weinmann et al., 2016) und das METUX-Modell (Peters et al., 2018) als relevant identifiziert. Claude wurde dabei ausschliesslich für die Ideenfindung und Begriffserweiterung genutzt; jede vorgeschlagene Quelle wurde anschliessend in Swisscovery, im Verlagskatalog oder über den Digital Object Identifier verifiziert und als Originaldokument bezogen. Kein Inhalt wurde ohne Gegenprüfung übernommen.</w:t>
-      </w:r>
-    </w:p>
-    <w:p>
-      <w:pPr>
-        <w:spacing w:after="160" w:line="320" w:lineRule="auto"/>
-        <w:jc w:val="both"/>
-      </w:pPr>
-      <w:r>
-        <w:t>Als drittes Werkzeug wurde NotebookLM (Google) eingesetzt, um den aufgebauten Quellenpool thematisch zu strukturieren und die Kernaussagen mehrerer Arbeiten gegenüberzustellen. Dies erleichterte die Einordnung der Quellen in die Abschnitte zu Bedürfnissen, Mechanismen und Beurteilungsgrundlagen und half, inhaltliche Dopplungen und Lücken zu erkennen.</w:t>
-      </w:r>
-    </w:p>
-    <w:p>
-      <w:pPr>
-        <w:spacing w:after="160" w:line="320" w:lineRule="auto"/>
-        <w:jc w:val="both"/>
-      </w:pPr>
-      <w:r>
-        <w:t xml:space="preserve">Die finale Verwaltung der Quellen erfolgt in Zotero. Das gesamte Quellenset ist dort gepflegt und exportierbar; die in Kapitel 1 und 2 zitierten Arbeiten sind im Literaturverzeichnis aufgeführt. Der </w:t>
+        <w:t xml:space="preserve">Als erstes Werkzeug wurden die klassischen wissenschaftlichen Suchmaschinen </w:t>
+      </w:r>
+      <w:proofErr w:type="spellStart"/>
+      <w:r>
+        <w:t>Swisscovery</w:t>
+      </w:r>
+      <w:proofErr w:type="spellEnd"/>
+      <w:r>
+        <w:t xml:space="preserve"> und Google Scholar eingesetzt. Gesucht wurde nach englisch- und deutschsprachigen Quellen zu den Kernbegriffen «Digital Wellbeing», «</w:t>
+      </w:r>
+      <w:proofErr w:type="spellStart"/>
+      <w:r>
+        <w:t>Social</w:t>
+      </w:r>
+      <w:proofErr w:type="spellEnd"/>
+      <w:r>
+        <w:t xml:space="preserve"> Media», «</w:t>
+      </w:r>
+      <w:proofErr w:type="spellStart"/>
+      <w:r>
+        <w:t>Recommender</w:t>
+      </w:r>
+      <w:proofErr w:type="spellEnd"/>
+      <w:r>
+        <w:t xml:space="preserve"> Systems», «</w:t>
+      </w:r>
+      <w:proofErr w:type="spellStart"/>
+      <w:r>
+        <w:t>Personalization</w:t>
+      </w:r>
+      <w:proofErr w:type="spellEnd"/>
+      <w:r>
+        <w:t>», «Value-Sensitive Design» und «Self-Determination Theory». Die Ergebnislisten wurden nach Titel, Abstract und Zitationshäufigkeit vorgefiltert. Als besonders ertragreich erwiesen sich die Reviews von Burr et al. (2020) und Orben (2020), die als Einstiegspunkte für Rückwärtssuchen dienten.</w:t>
+      </w:r>
+    </w:p>
+    <w:p>
+      <w:pPr>
+        <w:spacing w:after="160" w:line="320" w:lineRule="auto"/>
+        <w:jc w:val="both"/>
+      </w:pPr>
+      <w:r>
+        <w:t xml:space="preserve">Als zweites Werkzeug wurde Claude (Anthropic) als KI-basiertes Recherchewerkzeug eingesetzt, primär zur Query Expansion und zur Identifikation angrenzender Theoriefelder. Prompts wie «Welche Theorien und zentralen Autorinnen und Autoren prägen die Debatte um Digital Wellbeing in </w:t>
+      </w:r>
+      <w:proofErr w:type="spellStart"/>
+      <w:r>
+        <w:t>Social</w:t>
+      </w:r>
+      <w:proofErr w:type="spellEnd"/>
+      <w:r>
+        <w:t xml:space="preserve"> Media?» oder «Welche Konzepte adressieren Nutzerkontrolle und algorithmische Transparenz in Empfehlungssystemen?» lieferten thematische Übersichten und konkrete Quellenvorschläge. Auf diesem Weg wurden unter anderem die Begriffe «</w:t>
+      </w:r>
+      <w:proofErr w:type="spellStart"/>
+      <w:r>
+        <w:t>Algorithmic</w:t>
+      </w:r>
+      <w:proofErr w:type="spellEnd"/>
+      <w:r>
+        <w:t xml:space="preserve"> </w:t>
+      </w:r>
+      <w:proofErr w:type="spellStart"/>
+      <w:r>
+        <w:t>Sovereignty</w:t>
+      </w:r>
+      <w:proofErr w:type="spellEnd"/>
+      <w:r>
+        <w:t>» (</w:t>
+      </w:r>
+      <w:proofErr w:type="spellStart"/>
+      <w:r>
+        <w:t>Reviglio</w:t>
+      </w:r>
+      <w:proofErr w:type="spellEnd"/>
+      <w:r>
+        <w:t xml:space="preserve"> &amp; Agosti, 2020), «Persuasive Technology» (Fogg, 2003), «Digital Nudging» (Weinmann et al., 2016) und das METUX-Modell (Peters et al., 2018) als relevant identifiziert. Claude wurde dabei ausschliesslich für die Ideenfindung und Begriffserweiterung genutzt; jede vorgeschlagene Quelle wurde anschliessend in </w:t>
+      </w:r>
+      <w:proofErr w:type="spellStart"/>
+      <w:r>
+        <w:t>Swisscovery</w:t>
+      </w:r>
+      <w:proofErr w:type="spellEnd"/>
+      <w:r>
+        <w:t xml:space="preserve">, im Verlagskatalog oder über den Digital </w:t>
+      </w:r>
+      <w:proofErr w:type="spellStart"/>
+      <w:r>
+        <w:t>Object</w:t>
+      </w:r>
+      <w:proofErr w:type="spellEnd"/>
+      <w:r>
+        <w:t xml:space="preserve"> Identifier verifiziert und als Originaldokument bezogen. Kein Inhalt wurde ohne Gegenprüfung übernommen.</w:t>
+      </w:r>
+    </w:p>
+    <w:p>
+      <w:pPr>
+        <w:spacing w:after="160" w:line="320" w:lineRule="auto"/>
+        <w:jc w:val="both"/>
+        <w:rPr>
+          <w:i/>
+          <w:iCs/>
+        </w:rPr>
+      </w:pPr>
+      <w:r>
+        <w:rPr>
+          <w:i/>
+          <w:iCs/>
+        </w:rPr>
+        <w:t xml:space="preserve">Als drittes Werkzeug wurde </w:t>
+      </w:r>
+      <w:proofErr w:type="spellStart"/>
+      <w:r>
+        <w:rPr>
+          <w:i/>
+          <w:iCs/>
+        </w:rPr>
+        <w:t>NotebookLM</w:t>
+      </w:r>
+      <w:proofErr w:type="spellEnd"/>
+      <w:r>
+        <w:rPr>
+          <w:i/>
+          <w:iCs/>
+        </w:rPr>
+        <w:t xml:space="preserve"> (Google) eingesetzt, um den aufgebauten Quellenpool thematisch zu strukturieren und die Kernaussagen mehrerer Arbeiten gegenüberzustellen. Dies erleichterte die Einordnung der Quellen in die Abschnitte zu Bedürfnissen, Mechanismen und Beurteilungsgrundlagen und half, inhaltliche Dopplungen und Lücken zu erkennen.</w:t>
+      </w:r>
+    </w:p>
+    <w:p>
+      <w:pPr>
+        <w:spacing w:after="160" w:line="320" w:lineRule="auto"/>
+        <w:jc w:val="both"/>
+      </w:pPr>
+      <w:r>
+        <w:t xml:space="preserve">Die finale Verwaltung der Quellen erfolgt in </w:t>
+      </w:r>
+      <w:proofErr w:type="spellStart"/>
+      <w:r>
+        <w:t>Zotero</w:t>
+      </w:r>
+      <w:proofErr w:type="spellEnd"/>
+      <w:r>
+        <w:t xml:space="preserve">. Das gesamte Quellenset ist dort gepflegt und exportierbar; die in Kapitel 1 und 2 zitierten Arbeiten sind im Literaturverzeichnis aufgeführt. Der </w:t>
       </w:r>
       <w:r>
         <w:lastRenderedPageBreak/>
@@ -547,17 +859,24 @@
       <w:pPr>
         <w:pStyle w:val="berschrift2"/>
       </w:pPr>
-      <w:r>
-        <w:t>2.2  Bedürfnisse und Motivationen der Akteure</w:t>
+      <w:proofErr w:type="gramStart"/>
+      <w:r>
+        <w:t>2.2  Bedürfnisse</w:t>
+      </w:r>
+      <w:proofErr w:type="gramEnd"/>
+      <w:r>
+        <w:t xml:space="preserve"> und Motivationen der Akteure</w:t>
       </w:r>
     </w:p>
     <w:p>
       <w:pPr>
         <w:pStyle w:val="berschrift3"/>
       </w:pPr>
+      <w:proofErr w:type="gramStart"/>
       <w:r>
         <w:t>2.2.1  Anbieterseite</w:t>
       </w:r>
+      <w:proofErr w:type="gramEnd"/>
     </w:p>
     <w:p>
       <w:pPr>
@@ -585,7 +904,23 @@
         <w:t xml:space="preserve">Kommerzielle Plattformen </w:t>
       </w:r>
       <w:r>
-        <w:t>(TikTok, Meta, YouTube, X) finanzieren sich primär werbebasiert. Ihr zentrales Geschäftsziel ist die Maximierung von Aufmerksamkeit und Datenspuren, die an Werbetreibende weiterverkauft werden (Zuboff, 2019).</w:t>
+        <w:t xml:space="preserve">(TikTok, </w:t>
+      </w:r>
+      <w:proofErr w:type="spellStart"/>
+      <w:r>
+        <w:t>Meta</w:t>
+      </w:r>
+      <w:proofErr w:type="spellEnd"/>
+      <w:r>
+        <w:t>, YouTube, X) finanzieren sich primär werbebasiert. Ihr zentrales Geschäftsziel ist die Maximierung von Aufmerksamkeit und Datenspuren, die an Werbetreibende weiterverkauft werden (</w:t>
+      </w:r>
+      <w:proofErr w:type="spellStart"/>
+      <w:r>
+        <w:t>Zuboff</w:t>
+      </w:r>
+      <w:proofErr w:type="spellEnd"/>
+      <w:r>
+        <w:t>, 2019).</w:t>
       </w:r>
     </w:p>
     <w:p>
@@ -641,17 +976,43 @@
       <w:pPr>
         <w:pStyle w:val="berschrift3"/>
       </w:pPr>
+      <w:proofErr w:type="gramStart"/>
       <w:r>
         <w:t>2.2.2  Nutzerseite</w:t>
       </w:r>
-    </w:p>
-    <w:p>
-      <w:pPr>
-        <w:spacing w:after="160" w:line="320" w:lineRule="auto"/>
-        <w:jc w:val="both"/>
-      </w:pPr>
-      <w:r>
-        <w:t xml:space="preserve">Auf der Nutzerseite lassen sich die Bedürfnisse entlang verschiedener theoretischer Rahmen gruppieren. Aus dem Uses-and-Gratifications-Ansatz (Katz, Blumler &amp; Gurevitch, 1973) ergeben sich typische Nutzungsmotive wie Information, Unterhaltung, soziale Interaktion und Identitätsbildung. Ergänzend identifizieren Ryan und Deci (2000) in der Self-Determination Theory drei psychologische Grundbedürfnisse, die für intrinsische Motivation und Wohlbefinden zentral sind: </w:t>
+      <w:proofErr w:type="gramEnd"/>
+    </w:p>
+    <w:p>
+      <w:pPr>
+        <w:spacing w:after="160" w:line="320" w:lineRule="auto"/>
+        <w:jc w:val="both"/>
+      </w:pPr>
+      <w:r>
+        <w:t xml:space="preserve">Auf der Nutzerseite lassen sich die Bedürfnisse entlang verschiedener theoretischer Rahmen gruppieren. Aus dem </w:t>
+      </w:r>
+      <w:proofErr w:type="spellStart"/>
+      <w:r>
+        <w:t>Uses</w:t>
+      </w:r>
+      <w:proofErr w:type="spellEnd"/>
+      <w:r>
+        <w:t>-and-</w:t>
+      </w:r>
+      <w:proofErr w:type="spellStart"/>
+      <w:r>
+        <w:t>Gratifications</w:t>
+      </w:r>
+      <w:proofErr w:type="spellEnd"/>
+      <w:r>
+        <w:t xml:space="preserve">-Ansatz (Katz, </w:t>
+      </w:r>
+      <w:proofErr w:type="spellStart"/>
+      <w:r>
+        <w:t>Blumler</w:t>
+      </w:r>
+      <w:proofErr w:type="spellEnd"/>
+      <w:r>
+        <w:t xml:space="preserve"> &amp; Gurevitch, 1973) ergeben sich typische Nutzungsmotive wie Information, Unterhaltung, soziale Interaktion und Identitätsbildung. Ergänzend identifizieren Ryan und Deci (2000) in der Self-Determination Theory drei psychologische Grundbedürfnisse, die für intrinsische Motivation und Wohlbefinden zentral sind: </w:t>
       </w:r>
     </w:p>
     <w:p>
@@ -720,7 +1081,15 @@
         <w:jc w:val="both"/>
       </w:pPr>
       <w:r>
-        <w:t>Peters, Calvo und Ryan (2018) übertragen diese Perspektive im METUX-Modell (Motivation, Engagement and Thriving in User Experience) direkt auf die Gestaltung digitaler Produkte: Ein System fördert Wohlbefinden, wenn es diese Grundbedürfnisse auf mehreren Ebenen (Adoption, Benutzeroberfläche, Aufgabe, Verhalten, Leben) unterstützt, und untergräbt es, wenn es sie blockiert.</w:t>
+        <w:t xml:space="preserve">Peters, Calvo und Ryan (2018) übertragen diese Perspektive im METUX-Modell (Motivation, Engagement and </w:t>
+      </w:r>
+      <w:proofErr w:type="spellStart"/>
+      <w:r>
+        <w:t>Thriving</w:t>
+      </w:r>
+      <w:proofErr w:type="spellEnd"/>
+      <w:r>
+        <w:t xml:space="preserve"> in User Experience) direkt auf die Gestaltung digitaler Produkte: Ein System fördert Wohlbefinden, wenn es diese Grundbedürfnisse auf mehreren Ebenen (Adoption, Benutzeroberfläche, Aufgabe, Verhalten, Leben) unterstützt, und untergräbt es, wenn es sie blockiert.</w:t>
       </w:r>
     </w:p>
     <w:p>
@@ -737,8 +1106,13 @@
       <w:pPr>
         <w:pStyle w:val="berschrift2"/>
       </w:pPr>
-      <w:r>
-        <w:t>2.3  Mechanismen digitaler Medienangebote</w:t>
+      <w:proofErr w:type="gramStart"/>
+      <w:r>
+        <w:t>2.3  Mechanismen</w:t>
+      </w:r>
+      <w:proofErr w:type="gramEnd"/>
+      <w:r>
+        <w:t xml:space="preserve"> digitaler Medienangebote</w:t>
       </w:r>
     </w:p>
     <w:p>
@@ -754,51 +1128,100 @@
       <w:pPr>
         <w:pStyle w:val="berschrift3"/>
       </w:pPr>
-      <w:r>
-        <w:t>2.3.1  Klassifikation und Ontologien</w:t>
-      </w:r>
-    </w:p>
-    <w:p>
-      <w:pPr>
-        <w:spacing w:after="160" w:line="320" w:lineRule="auto"/>
-        <w:jc w:val="both"/>
-      </w:pPr>
-      <w:r>
-        <w:t>Inhalte müssen strukturiert werden, damit sie auffindbar und empfehlbar sind. Klassifikationssysteme ordnen Inhalte entlang festgelegter Kategorien (Genre, Thema, Stimmung, Zielgruppe). Ontologien gehen darüber hinaus und modellieren semantische Beziehungen zwischen Konzepten, etwa die Zugehörigkeit von Subgenres zu Obergenres oder Ähnlichkeiten zwischen Themen. Auf der Nutzerseite werden analoge Strukturen verwendet, um Interessensprofile explizit oder implizit zu repräsentieren. Die Qualität dieser Strukturen prägt massgeblich die Qualität späterer Empfehlungen.</w:t>
+      <w:proofErr w:type="gramStart"/>
+      <w:r>
+        <w:t>2.3.1  Klassifikation</w:t>
+      </w:r>
+      <w:proofErr w:type="gramEnd"/>
+      <w:r>
+        <w:t xml:space="preserve"> und Ontologien</w:t>
+      </w:r>
+    </w:p>
+    <w:p>
+      <w:pPr>
+        <w:spacing w:after="160" w:line="320" w:lineRule="auto"/>
+        <w:jc w:val="both"/>
+      </w:pPr>
+      <w:r>
+        <w:t xml:space="preserve">Inhalte müssen strukturiert werden, damit sie auffindbar und </w:t>
+      </w:r>
+      <w:proofErr w:type="spellStart"/>
+      <w:r>
+        <w:t>empfehlbar</w:t>
+      </w:r>
+      <w:proofErr w:type="spellEnd"/>
+      <w:r>
+        <w:t xml:space="preserve"> sind. Klassifikationssysteme ordnen Inhalte entlang festgelegter Kategorien (Genre, Thema, Stimmung, Zielgruppe). Ontologien gehen darüber hinaus und modellieren semantische Beziehungen zwischen Konzepten, etwa die Zugehörigkeit von Subgenres zu Obergenres oder Ähnlichkeiten zwischen Themen. Auf der Nutzerseite werden analoge Strukturen verwendet, um Interessensprofile explizit oder implizit zu repräsentieren. Die Qualität dieser Strukturen prägt massgeblich die Qualität späterer Empfehlungen.</w:t>
       </w:r>
     </w:p>
     <w:p>
       <w:pPr>
         <w:pStyle w:val="berschrift3"/>
       </w:pPr>
+      <w:proofErr w:type="gramStart"/>
       <w:r>
         <w:t>2.3.2  Suche</w:t>
       </w:r>
-    </w:p>
-    <w:p>
-      <w:pPr>
-        <w:spacing w:after="160" w:line="320" w:lineRule="auto"/>
-        <w:jc w:val="both"/>
-      </w:pPr>
-      <w:r>
-        <w:t>Suchmechanismen sind der klassische aktive Zugang zu Inhalten: Die Nutzenden formulieren eine Anfrage, das System liefert eine Ergebnisliste. Die Relevanzbewertung basiert historisch auf Textmatching und Linkstrukturen, zunehmend auch auf semantischen Embeddings und personalisierten Signalen. Suche ist vergleichsweise transparent, da die Intention von den Nutzenden formuliert wird. Zugleich wächst die Intransparenz dort, wo Personalisierung die Trefferlisten unsichtbar verändert.</w:t>
+      <w:proofErr w:type="gramEnd"/>
+    </w:p>
+    <w:p>
+      <w:pPr>
+        <w:spacing w:after="160" w:line="320" w:lineRule="auto"/>
+        <w:jc w:val="both"/>
+      </w:pPr>
+      <w:r>
+        <w:t xml:space="preserve">Suchmechanismen sind der klassische aktive Zugang zu Inhalten: Die Nutzenden formulieren eine Anfrage, das System liefert eine Ergebnisliste. Die Relevanzbewertung basiert historisch auf </w:t>
+      </w:r>
+      <w:proofErr w:type="spellStart"/>
+      <w:r>
+        <w:t>Textmatching</w:t>
+      </w:r>
+      <w:proofErr w:type="spellEnd"/>
+      <w:r>
+        <w:t xml:space="preserve"> und Linkstrukturen, zunehmend auch auf semantischen </w:t>
+      </w:r>
+      <w:proofErr w:type="spellStart"/>
+      <w:r>
+        <w:t>Embeddings</w:t>
+      </w:r>
+      <w:proofErr w:type="spellEnd"/>
+      <w:r>
+        <w:t xml:space="preserve"> und personalisierten Signalen. Suche </w:t>
+      </w:r>
+      <w:proofErr w:type="gramStart"/>
+      <w:r>
+        <w:t>ist vergleichsweise</w:t>
+      </w:r>
+      <w:proofErr w:type="gramEnd"/>
+      <w:r>
+        <w:t xml:space="preserve"> transparent, da die Intention von den Nutzenden formuliert wird. Zugleich wächst die Intransparenz dort, wo Personalisierung die Trefferlisten unsichtbar verändert.</w:t>
       </w:r>
     </w:p>
     <w:p>
       <w:pPr>
         <w:pStyle w:val="berschrift3"/>
       </w:pPr>
+      <w:proofErr w:type="gramStart"/>
       <w:r>
         <w:t>2.3.3  Empfehlungssysteme</w:t>
       </w:r>
-    </w:p>
-    <w:p>
-      <w:pPr>
-        <w:spacing w:after="160" w:line="320" w:lineRule="auto"/>
-        <w:jc w:val="both"/>
-      </w:pPr>
-      <w:r>
-        <w:t>Empfehlungssysteme (Recommender Systems) schlagen Inhalte vor, ohne dass die Nutzenden aktiv danach suchen. In der Standardliteratur werden drei klassische Hauptparadigmen unterschieden (Ricci, Rokach &amp; Shapira, 2015):</w:t>
+      <w:proofErr w:type="gramEnd"/>
+    </w:p>
+    <w:p>
+      <w:pPr>
+        <w:spacing w:after="160" w:line="320" w:lineRule="auto"/>
+        <w:jc w:val="both"/>
+      </w:pPr>
+      <w:r>
+        <w:t>Empfehlungssysteme (</w:t>
+      </w:r>
+      <w:proofErr w:type="spellStart"/>
+      <w:r>
+        <w:t>Recommender</w:t>
+      </w:r>
+      <w:proofErr w:type="spellEnd"/>
+      <w:r>
+        <w:t xml:space="preserve"> Systems) schlagen Inhalte vor, ohne dass die Nutzenden aktiv danach suchen. In der Standardliteratur werden drei klassische Hauptparadigmen unterschieden (Ricci, Rokach &amp; Shapira, 2015):</w:t>
       </w:r>
     </w:p>
     <w:p>
@@ -858,7 +1281,15 @@
         <w:t xml:space="preserve">Hybride und Deep-Learning-basierte Ansätze: </w:t>
       </w:r>
       <w:r>
-        <w:t>Kombination der obigen Verfahren mit impliziten Signalen (Verweildauer, Scrolltiefe, Wiederholungen) und tiefen neuronalen Modellen, wie sie in Feeds von TikTok oder Instagram dominieren.</w:t>
+        <w:t xml:space="preserve">Kombination der obigen Verfahren mit impliziten Signalen (Verweildauer, </w:t>
+      </w:r>
+      <w:proofErr w:type="spellStart"/>
+      <w:r>
+        <w:t>Scrolltiefe</w:t>
+      </w:r>
+      <w:proofErr w:type="spellEnd"/>
+      <w:r>
+        <w:t>, Wiederholungen) und tiefen neuronalen Modellen, wie sie in Feeds von TikTok oder Instagram dominieren.</w:t>
       </w:r>
     </w:p>
     <w:p>
@@ -868,32 +1299,58 @@
       </w:pPr>
       <w:r>
         <w:lastRenderedPageBreak/>
-        <w:t>Die Optimierung erfolgt in der kommerziellen Praxis überwiegend auf Engagement-Metriken. Nguyen et al. (2014) zeigen, dass dies zur Einengung der inhaltlichen Vielfalt führt. Milano, Taddeo und Floridi (2020) systematisieren die daraus folgenden ethischen Herausforderungen entlang sechs Dimensionen: Inhaltsqualität, Privatsphäre, Autonomie, Meinungsvielfalt, soziale Auswirkungen und Verantwortlichkeit.</w:t>
+        <w:t xml:space="preserve">Die Optimierung erfolgt in der kommerziellen Praxis überwiegend auf Engagement-Metriken. Nguyen et al. (2014) zeigen, dass dies zur Einengung der inhaltlichen Vielfalt führt. Milano, Taddeo und </w:t>
+      </w:r>
+      <w:proofErr w:type="spellStart"/>
+      <w:r>
+        <w:t>Floridi</w:t>
+      </w:r>
+      <w:proofErr w:type="spellEnd"/>
+      <w:r>
+        <w:t xml:space="preserve"> (2020) systematisieren die daraus folgenden ethischen Herausforderungen entlang sechs Dimensionen: Inhaltsqualität, Privatsphäre, Autonomie, Meinungsvielfalt, soziale Auswirkungen und Verantwortlichkeit.</w:t>
       </w:r>
     </w:p>
     <w:p>
       <w:pPr>
         <w:pStyle w:val="berschrift3"/>
       </w:pPr>
-      <w:r>
-        <w:t>2.3.4  Personalisierung und Feed-Kuration</w:t>
-      </w:r>
-    </w:p>
-    <w:p>
-      <w:pPr>
-        <w:spacing w:after="160" w:line="320" w:lineRule="auto"/>
-        <w:jc w:val="both"/>
-      </w:pPr>
-      <w:r>
-        <w:t>Über die reine Empfehlung hinaus kuratieren Plattformen ganze Feeds, also ständig aktualisierte Inhaltsströme, die auf die einzelne Person zugeschnitten sind. Die Entscheidungslogik ist typischerweise nicht einsehbar: Das, was die Nutzenden sehen, ist das Ergebnis tausender implizit gelernter Signale, deren genaues Zusammenspiel selbst die Entwicklerinnen und Entwickler oft nur noch approximativ beschreiben können. Reviglio und Agosti (2020) fordern in diesem Zusammenhang eine algorithmische Souveränität: die Möglichkeit, die Logiken zu verstehen, zu modifizieren und bewusst zu steuern.</w:t>
+      <w:proofErr w:type="gramStart"/>
+      <w:r>
+        <w:t>2.3.4  Personalisierung</w:t>
+      </w:r>
+      <w:proofErr w:type="gramEnd"/>
+      <w:r>
+        <w:t xml:space="preserve"> und Feed-Kuration</w:t>
+      </w:r>
+    </w:p>
+    <w:p>
+      <w:pPr>
+        <w:spacing w:after="160" w:line="320" w:lineRule="auto"/>
+        <w:jc w:val="both"/>
+      </w:pPr>
+      <w:r>
+        <w:t xml:space="preserve">Über die reine Empfehlung hinaus kuratieren Plattformen ganze Feeds, also ständig aktualisierte Inhaltsströme, die auf die einzelne Person zugeschnitten sind. Die Entscheidungslogik ist typischerweise nicht einsehbar: Das, was die Nutzenden sehen, ist das Ergebnis tausender implizit gelernter Signale, deren genaues Zusammenspiel selbst die Entwicklerinnen und Entwickler oft nur noch approximativ beschreiben können. </w:t>
+      </w:r>
+      <w:proofErr w:type="spellStart"/>
+      <w:r>
+        <w:t>Reviglio</w:t>
+      </w:r>
+      <w:proofErr w:type="spellEnd"/>
+      <w:r>
+        <w:t xml:space="preserve"> und Agosti (2020) fordern in diesem Zusammenhang eine algorithmische Souveränität: die Möglichkeit, die Logiken zu verstehen, zu modifizieren und bewusst zu steuern.</w:t>
       </w:r>
     </w:p>
     <w:p>
       <w:pPr>
         <w:pStyle w:val="berschrift3"/>
       </w:pPr>
-      <w:r>
-        <w:t>2.3.5  Sharing und soziale Mechanismen</w:t>
+      <w:proofErr w:type="gramStart"/>
+      <w:r>
+        <w:t>2.3.5  Sharing</w:t>
+      </w:r>
+      <w:proofErr w:type="gramEnd"/>
+      <w:r>
+        <w:t xml:space="preserve"> und soziale Mechanismen</w:t>
       </w:r>
     </w:p>
     <w:p>
@@ -909,8 +1366,13 @@
       <w:pPr>
         <w:pStyle w:val="berschrift3"/>
       </w:pPr>
-      <w:r>
-        <w:t>2.3.6  Persuasive Design und Nudging</w:t>
+      <w:proofErr w:type="gramStart"/>
+      <w:r>
+        <w:t>2.3.6  Persuasive</w:t>
+      </w:r>
+      <w:proofErr w:type="gramEnd"/>
+      <w:r>
+        <w:t xml:space="preserve"> Design und Nudging</w:t>
       </w:r>
     </w:p>
     <w:p>
@@ -926,27 +1388,52 @@
       <w:pPr>
         <w:pStyle w:val="berschrift3"/>
       </w:pPr>
-      <w:r>
-        <w:t>2.3.7  Monetarisierungsmechanismen</w:t>
-      </w:r>
-    </w:p>
-    <w:p>
-      <w:pPr>
-        <w:spacing w:after="160" w:line="320" w:lineRule="auto"/>
-        <w:jc w:val="both"/>
-      </w:pPr>
-      <w:r>
-        <w:t>Die beschriebenen Mechanismen stehen in unmittelbarer Wechselwirkung mit der Monetarisierung. Werbebasierte Plattformen koppeln Empfehlungen, Feeds und persuasive Muster systematisch an Engagement-Metriken, während abonnementbasierte Anbieter tendenziell auf Retention-Metriken optimieren und öffentlich-rechtliche Anbieter auf Erfüllungskennzahlen wie Reichweite und Vielfalt. Die Wahl der Monetarisierung prägt damit das Verhalten der Mechanismen ebenso stark wie ihre technische Architektur (Zuboff, 2019; Montag &amp; Elhai, 2023).</w:t>
+      <w:proofErr w:type="gramStart"/>
+      <w:r>
+        <w:t xml:space="preserve">2.3.7  </w:t>
+      </w:r>
+      <w:proofErr w:type="spellStart"/>
+      <w:r>
+        <w:t>Monetarisierungsmechanismen</w:t>
+      </w:r>
+      <w:proofErr w:type="spellEnd"/>
+      <w:proofErr w:type="gramEnd"/>
+    </w:p>
+    <w:p>
+      <w:pPr>
+        <w:spacing w:after="160" w:line="320" w:lineRule="auto"/>
+        <w:jc w:val="both"/>
+      </w:pPr>
+      <w:r>
+        <w:t>Die beschriebenen Mechanismen stehen in unmittelbarer Wechselwirkung mit der Monetarisierung. Werbebasierte Plattformen koppeln Empfehlungen, Feeds und persuasive Muster systematisch an Engagement-Metriken, während abonnementbasierte Anbieter tendenziell auf Retention-Metriken optimieren und öffentlich-rechtliche Anbieter auf Erfüllungskennzahlen wie Reichweite und Vielfalt. Die Wahl der Monetarisierung prägt damit das Verhalten der Mechanismen ebenso stark wie ihre technische Architektur (</w:t>
+      </w:r>
+      <w:proofErr w:type="spellStart"/>
+      <w:r>
+        <w:t>Zuboff</w:t>
+      </w:r>
+      <w:proofErr w:type="spellEnd"/>
+      <w:r>
+        <w:t xml:space="preserve">, 2019; Montag &amp; </w:t>
+      </w:r>
+      <w:proofErr w:type="spellStart"/>
+      <w:r>
+        <w:t>Elhai</w:t>
+      </w:r>
+      <w:proofErr w:type="spellEnd"/>
+      <w:r>
+        <w:t>, 2023).</w:t>
       </w:r>
     </w:p>
     <w:p>
       <w:pPr>
         <w:pStyle w:val="berschrift2"/>
       </w:pPr>
+      <w:proofErr w:type="gramStart"/>
       <w:r>
         <w:lastRenderedPageBreak/>
         <w:t>2.4  Beurteilungsgrundlagen</w:t>
       </w:r>
+      <w:proofErr w:type="gramEnd"/>
     </w:p>
     <w:p>
       <w:pPr>
@@ -961,8 +1448,13 @@
       <w:pPr>
         <w:pStyle w:val="berschrift3"/>
       </w:pPr>
-      <w:r>
-        <w:t>2.4.1  Self-Determination Theory (SDT)</w:t>
+      <w:proofErr w:type="gramStart"/>
+      <w:r>
+        <w:t>2.4.1  Self</w:t>
+      </w:r>
+      <w:proofErr w:type="gramEnd"/>
+      <w:r>
+        <w:t>-Determination Theory (SDT)</w:t>
       </w:r>
     </w:p>
     <w:p>
@@ -978,8 +1470,13 @@
       <w:pPr>
         <w:pStyle w:val="berschrift3"/>
       </w:pPr>
-      <w:r>
-        <w:t>2.4.2  Value-Sensitive Design (VSD)</w:t>
+      <w:proofErr w:type="gramStart"/>
+      <w:r>
+        <w:t>2.4.2  Value</w:t>
+      </w:r>
+      <w:proofErr w:type="gramEnd"/>
+      <w:r>
+        <w:t>-Sensitive Design (VSD)</w:t>
       </w:r>
     </w:p>
     <w:p>
@@ -995,42 +1492,81 @@
       <w:pPr>
         <w:pStyle w:val="berschrift3"/>
       </w:pPr>
-      <w:r>
-        <w:t>2.4.3  Digital Wellbeing</w:t>
-      </w:r>
-    </w:p>
-    <w:p>
-      <w:pPr>
-        <w:spacing w:after="160" w:line="320" w:lineRule="auto"/>
-        <w:jc w:val="both"/>
-      </w:pPr>
-      <w:r>
-        <w:t>Digital Wellbeing beschreibt die Qualität des Medienkonsums aus Perspektive des Nutzers. Calvo und Peters (2014) haben mit dem Ansatz des «Positive Computing» die grundlegende Forderung formuliert, dass digitale Systeme aktiv das menschliche Wohlbefinden und Aufblühen fördern sollen, statt es nur zu vermeiden, Schaden zu verursachen. Vanden Abeele (2021) betont ergänzend den dynamischen Charakter von Digital Wellbeing: Wellbeing ist keine absolute Grösse, sondern eine kontextabhängige Balance. Burr, Taddeo und Floridi (2020) fordern, dass Technologiedesign aktiv zum Wohlbefinden beitragen soll statt es zu untergraben, und entwickeln dafür einen thematischen Ordnungsrahmen. Peters, Ahmadpour und Calvo (2020) konkretisieren diesen Anspruch in einem Framework für Wellbeing-Supportive Design, das Features, Charakteristika und Prototypen systematisch katalogisiert.</w:t>
+      <w:proofErr w:type="gramStart"/>
+      <w:r>
+        <w:t>2.4.3  Digital</w:t>
+      </w:r>
+      <w:proofErr w:type="gramEnd"/>
+      <w:r>
+        <w:t xml:space="preserve"> Wellbeing</w:t>
+      </w:r>
+    </w:p>
+    <w:p>
+      <w:pPr>
+        <w:spacing w:after="160" w:line="320" w:lineRule="auto"/>
+        <w:jc w:val="both"/>
+      </w:pPr>
+      <w:r>
+        <w:t xml:space="preserve">Digital Wellbeing beschreibt die Qualität des Medienkonsums aus Perspektive des Nutzers. Calvo und Peters (2014) haben mit dem Ansatz des «Positive Computing» die grundlegende Forderung formuliert, dass digitale Systeme aktiv das menschliche Wohlbefinden und Aufblühen fördern sollen, statt es nur zu vermeiden, Schaden zu verursachen. Vanden Abeele (2021) betont ergänzend den dynamischen Charakter von Digital Wellbeing: Wellbeing ist keine absolute Grösse, sondern eine kontextabhängige Balance. Burr, Taddeo und </w:t>
+      </w:r>
+      <w:proofErr w:type="spellStart"/>
+      <w:r>
+        <w:t>Floridi</w:t>
+      </w:r>
+      <w:proofErr w:type="spellEnd"/>
+      <w:r>
+        <w:t xml:space="preserve"> (2020) fordern, dass Technologiedesign aktiv zum Wohlbefinden beitragen </w:t>
+      </w:r>
+      <w:proofErr w:type="gramStart"/>
+      <w:r>
+        <w:t>soll</w:t>
+      </w:r>
+      <w:proofErr w:type="gramEnd"/>
+      <w:r>
+        <w:t xml:space="preserve"> statt es zu untergraben, und entwickeln dafür einen thematischen Ordnungsrahmen. Peters, Ahmadpour und Calvo (2020) konkretisieren diesen Anspruch in einem Framework für Wellbeing-Supportive Design, das Features, Charakteristika und Prototypen systematisch katalogisiert.</w:t>
       </w:r>
     </w:p>
     <w:p>
       <w:pPr>
         <w:pStyle w:val="berschrift3"/>
       </w:pPr>
-      <w:r>
-        <w:t>2.4.4  Ethik von Empfehlungssystemen und algorithmische Souveränität</w:t>
-      </w:r>
-    </w:p>
-    <w:p>
-      <w:pPr>
-        <w:spacing w:after="160" w:line="320" w:lineRule="auto"/>
-        <w:jc w:val="both"/>
-      </w:pPr>
-      <w:r>
-        <w:t>Milano et al. (2020) systematisieren die ethischen Herausforderungen von Empfehlungssystemen und argumentieren, dass neben Relevanz auch Diversität, Fairness und Nutzerwohl als Optimierungsziele verankert werden müssen. Reviglio und Agosti (2020) ergänzen die politische Dimension und fordern algorithmische Souveränität, also eine echte, bedeutungsvolle Kontrolle über die Algorithmen, die Inhalte kuratieren.</w:t>
+      <w:proofErr w:type="gramStart"/>
+      <w:r>
+        <w:t>2.4.4  Ethik</w:t>
+      </w:r>
+      <w:proofErr w:type="gramEnd"/>
+      <w:r>
+        <w:t xml:space="preserve"> von Empfehlungssystemen und algorithmische Souveränität</w:t>
+      </w:r>
+    </w:p>
+    <w:p>
+      <w:pPr>
+        <w:spacing w:after="160" w:line="320" w:lineRule="auto"/>
+        <w:jc w:val="both"/>
+      </w:pPr>
+      <w:r>
+        <w:t xml:space="preserve">Milano et al. (2020) systematisieren die ethischen Herausforderungen von Empfehlungssystemen und argumentieren, dass neben Relevanz auch Diversität, Fairness und Nutzerwohl als Optimierungsziele verankert werden müssen. </w:t>
+      </w:r>
+      <w:proofErr w:type="spellStart"/>
+      <w:r>
+        <w:t>Reviglio</w:t>
+      </w:r>
+      <w:proofErr w:type="spellEnd"/>
+      <w:r>
+        <w:t xml:space="preserve"> und Agosti (2020) ergänzen die politische Dimension und fordern algorithmische Souveränität, also eine echte, bedeutungsvolle Kontrolle über die Algorithmen, die Inhalte kuratieren.</w:t>
       </w:r>
     </w:p>
     <w:p>
       <w:pPr>
         <w:pStyle w:val="berschrift3"/>
       </w:pPr>
-      <w:r>
-        <w:t>2.4.5  Gebrauchstauglichkeit und Akzeptanz</w:t>
+      <w:proofErr w:type="gramStart"/>
+      <w:r>
+        <w:t>2.4.5  Gebrauchstauglichkeit</w:t>
+      </w:r>
+      <w:proofErr w:type="gramEnd"/>
+      <w:r>
+        <w:t xml:space="preserve"> und Akzeptanz</w:t>
       </w:r>
     </w:p>
     <w:p>
@@ -1040,24 +1576,53 @@
       </w:pPr>
       <w:r>
         <w:lastRenderedPageBreak/>
-        <w:t>Neben den normativen Kriterien spielt die klassische Gebrauchstauglichkeit eine Rolle. Der System Usability Scale (Brooke, 1996; Bangor, Kortum &amp; Miller, 2008) ist ein etabliertes, kurzes Messinstrument, das die subjektive Usability eines Systems mit zehn Items erhebt und in der vorliegenden Arbeit ergänzend zu den wellbeing-bezogenen Massen eingesetzt werden kann.</w:t>
+        <w:t xml:space="preserve">Neben den normativen Kriterien spielt die klassische Gebrauchstauglichkeit eine Rolle. Der System Usability Scale (Brooke, 1996; Bangor, Kortum &amp; Miller, 2008) ist ein etabliertes, kurzes Messinstrument, das die subjektive Usability eines Systems mit zehn Items erhebt und in der vorliegenden Arbeit ergänzend zu den </w:t>
+      </w:r>
+      <w:proofErr w:type="spellStart"/>
+      <w:r>
+        <w:t>wellbeing</w:t>
+      </w:r>
+      <w:proofErr w:type="spellEnd"/>
+      <w:r>
+        <w:t>-bezogenen Massen eingesetzt werden kann.</w:t>
       </w:r>
     </w:p>
     <w:p>
       <w:pPr>
         <w:pStyle w:val="berschrift2"/>
       </w:pPr>
-      <w:r>
-        <w:t>2.5  Gegenüberstellung der Medienmodelle</w:t>
-      </w:r>
-    </w:p>
-    <w:p>
-      <w:pPr>
-        <w:spacing w:after="160" w:line="320" w:lineRule="auto"/>
-        <w:jc w:val="both"/>
-      </w:pPr>
-      <w:r>
-        <w:t>Die beschriebenen Mechanismen und Kriterien lassen sich entlang von drei idealtypischen Medienmodellen zusammenfassen: einem traditionell-redaktionellen Modell (z. B. öffentlich-rechtliches Radio), einem engagement-optimierten Modell (z. B. TikTok, Instagram) und einem wellbeing-orientierten Modell, das diese Arbeit konzipiert und prototypisch umsetzt.</w:t>
+      <w:proofErr w:type="gramStart"/>
+      <w:r>
+        <w:t>2.5  Gegenüberstellung</w:t>
+      </w:r>
+      <w:proofErr w:type="gramEnd"/>
+      <w:r>
+        <w:t xml:space="preserve"> der Medienmodelle</w:t>
+      </w:r>
+    </w:p>
+    <w:p>
+      <w:pPr>
+        <w:spacing w:after="160" w:line="320" w:lineRule="auto"/>
+        <w:jc w:val="both"/>
+      </w:pPr>
+      <w:r>
+        <w:t xml:space="preserve">Die beschriebenen Mechanismen und Kriterien lassen sich entlang von drei idealtypischen Medienmodellen zusammenfassen: einem traditionell-redaktionellen Modell (z. B. öffentlich-rechtliches Radio), einem </w:t>
+      </w:r>
+      <w:proofErr w:type="spellStart"/>
+      <w:r>
+        <w:t>engagement</w:t>
+      </w:r>
+      <w:proofErr w:type="spellEnd"/>
+      <w:r>
+        <w:t xml:space="preserve">-optimierten Modell (z. B. TikTok, Instagram) und einem </w:t>
+      </w:r>
+      <w:proofErr w:type="spellStart"/>
+      <w:r>
+        <w:t>wellbeing</w:t>
+      </w:r>
+      <w:proofErr w:type="spellEnd"/>
+      <w:r>
+        <w:t>-orientierten Modell, das diese Arbeit konzipiert und prototypisch umsetzt.</w:t>
       </w:r>
     </w:p>
     <w:tbl>
@@ -1084,12 +1649,6 @@
         <w:gridCol w:w="2340"/>
       </w:tblGrid>
       <w:tr>
-        <w:tblPrEx>
-          <w:tblCellMar>
-            <w:top w:w="0" w:type="dxa"/>
-            <w:bottom w:w="0" w:type="dxa"/>
-          </w:tblCellMar>
-        </w:tblPrEx>
         <w:trPr>
           <w:tblHeader/>
         </w:trPr>
@@ -1211,12 +1770,6 @@
         </w:tc>
       </w:tr>
       <w:tr>
-        <w:tblPrEx>
-          <w:tblCellMar>
-            <w:top w:w="0" w:type="dxa"/>
-            <w:bottom w:w="0" w:type="dxa"/>
-          </w:tblCellMar>
-        </w:tblPrEx>
         <w:tc>
           <w:tcPr>
             <w:tcW w:w="2340" w:type="dxa"/>
@@ -1323,12 +1876,6 @@
         </w:tc>
       </w:tr>
       <w:tr>
-        <w:tblPrEx>
-          <w:tblCellMar>
-            <w:top w:w="0" w:type="dxa"/>
-            <w:bottom w:w="0" w:type="dxa"/>
-          </w:tblCellMar>
-        </w:tblPrEx>
         <w:tc>
           <w:tcPr>
             <w:tcW w:w="2340" w:type="dxa"/>
@@ -1435,12 +1982,6 @@
         </w:tc>
       </w:tr>
       <w:tr>
-        <w:tblPrEx>
-          <w:tblCellMar>
-            <w:top w:w="0" w:type="dxa"/>
-            <w:bottom w:w="0" w:type="dxa"/>
-          </w:tblCellMar>
-        </w:tblPrEx>
         <w:tc>
           <w:tcPr>
             <w:tcW w:w="2340" w:type="dxa"/>
@@ -1510,12 +2051,36 @@
             </w:tcMar>
           </w:tcPr>
           <w:p>
+            <w:pPr>
+              <w:rPr>
+                <w:lang w:val="en-US"/>
+              </w:rPr>
+            </w:pPr>
             <w:r>
               <w:rPr>
                 <w:sz w:val="20"/>
                 <w:szCs w:val="20"/>
+                <w:lang w:val="en-US"/>
               </w:rPr>
-              <w:t>Minimal (Like/Skip, Interessen-Tagging)</w:t>
+              <w:t xml:space="preserve">Minimal (Like/Skip, </w:t>
+            </w:r>
+            <w:proofErr w:type="spellStart"/>
+            <w:r>
+              <w:rPr>
+                <w:sz w:val="20"/>
+                <w:szCs w:val="20"/>
+                <w:lang w:val="en-US"/>
+              </w:rPr>
+              <w:t>Interessen</w:t>
+            </w:r>
+            <w:proofErr w:type="spellEnd"/>
+            <w:r>
+              <w:rPr>
+                <w:sz w:val="20"/>
+                <w:szCs w:val="20"/>
+                <w:lang w:val="en-US"/>
+              </w:rPr>
+              <w:t>-Tagging)</w:t>
             </w:r>
           </w:p>
         </w:tc>
@@ -1547,12 +2112,6 @@
         </w:tc>
       </w:tr>
       <w:tr>
-        <w:tblPrEx>
-          <w:tblCellMar>
-            <w:top w:w="0" w:type="dxa"/>
-            <w:bottom w:w="0" w:type="dxa"/>
-          </w:tblCellMar>
-        </w:tblPrEx>
         <w:tc>
           <w:tcPr>
             <w:tcW w:w="2340" w:type="dxa"/>
@@ -1596,6 +2155,7 @@
             </w:tcMar>
           </w:tcPr>
           <w:p>
+            <w:proofErr w:type="spellStart"/>
             <w:r>
               <w:rPr>
                 <w:sz w:val="20"/>
@@ -1603,6 +2163,7 @@
               </w:rPr>
               <w:t>Pluralismusauftrag</w:t>
             </w:r>
+            <w:proofErr w:type="spellEnd"/>
           </w:p>
         </w:tc>
         <w:tc>
@@ -1659,12 +2220,6 @@
         </w:tc>
       </w:tr>
       <w:tr>
-        <w:tblPrEx>
-          <w:tblCellMar>
-            <w:top w:w="0" w:type="dxa"/>
-            <w:bottom w:w="0" w:type="dxa"/>
-          </w:tblCellMar>
-        </w:tblPrEx>
         <w:tc>
           <w:tcPr>
             <w:tcW w:w="2340" w:type="dxa"/>
@@ -1771,12 +2326,6 @@
         </w:tc>
       </w:tr>
       <w:tr>
-        <w:tblPrEx>
-          <w:tblCellMar>
-            <w:top w:w="0" w:type="dxa"/>
-            <w:bottom w:w="0" w:type="dxa"/>
-          </w:tblCellMar>
-        </w:tblPrEx>
         <w:tc>
           <w:tcPr>
             <w:tcW w:w="2340" w:type="dxa"/>
@@ -1883,12 +2432,6 @@
         </w:tc>
       </w:tr>
       <w:tr>
-        <w:tblPrEx>
-          <w:tblCellMar>
-            <w:top w:w="0" w:type="dxa"/>
-            <w:bottom w:w="0" w:type="dxa"/>
-          </w:tblCellMar>
-        </w:tblPrEx>
         <w:tc>
           <w:tcPr>
             <w:tcW w:w="2340" w:type="dxa"/>
@@ -2001,24 +2544,58 @@
         <w:jc w:val="both"/>
       </w:pPr>
       <w:r>
-        <w:t>Die Gegenüberstellung zeigt: Jedes Modell hat spezifische Stärken und Schwächen. Das redaktionelle Modell steht für Qualität und Pluralismus, bietet aber wenig Personalisierung und schlechtere Verfügbarkeit. Das engagement-optimierte Modell bietet hohe Relevanz und Verfügbarkeit, jedoch um den Preis von Vielfalt, Transparenz und Autonomie. Das wellbeing-orientierte Modell versucht, Personalisierung mit Transparenz, Nutzerkontrolle und Qualität zu verbinden, ist aber in der Praxis bisher kaum in durchgängigen Artefakten umgesetzt.</w:t>
+        <w:t xml:space="preserve">Die Gegenüberstellung zeigt: Jedes Modell hat spezifische Stärken und Schwächen. Das redaktionelle Modell steht für Qualität und Pluralismus, bietet aber wenig Personalisierung und schlechtere Verfügbarkeit. Das </w:t>
+      </w:r>
+      <w:proofErr w:type="spellStart"/>
+      <w:r>
+        <w:t>engagement</w:t>
+      </w:r>
+      <w:proofErr w:type="spellEnd"/>
+      <w:r>
+        <w:t xml:space="preserve">-optimierte Modell bietet hohe Relevanz und Verfügbarkeit, jedoch um den Preis von Vielfalt, Transparenz und Autonomie. Das </w:t>
+      </w:r>
+      <w:proofErr w:type="spellStart"/>
+      <w:r>
+        <w:t>wellbeing</w:t>
+      </w:r>
+      <w:proofErr w:type="spellEnd"/>
+      <w:r>
+        <w:t>-orientierte Modell versucht, Personalisierung mit Transparenz, Nutzerkontrolle und Qualität zu verbinden, ist aber in der Praxis bisher kaum in durchgängigen Artefakten umgesetzt.</w:t>
       </w:r>
     </w:p>
     <w:p>
       <w:pPr>
         <w:pStyle w:val="berschrift2"/>
       </w:pPr>
+      <w:proofErr w:type="gramStart"/>
       <w:r>
         <w:t>2.6  Forschungslücke</w:t>
       </w:r>
-    </w:p>
-    <w:p>
-      <w:pPr>
-        <w:spacing w:after="160" w:line="320" w:lineRule="auto"/>
-        <w:jc w:val="both"/>
-      </w:pPr>
-      <w:r>
-        <w:t>Aus der Literatur wird deutlich, dass die theoretischen Grundlagen für eine nutzerzentrierte, wellbeing-orientierte Gestaltung digitaler Medien vorhanden sind: Self-Determination Theory, Value-Sensitive Design, Digital Wellbeing, Persuasive Technology und algorithmische Souveränität liefern einen dichten konzeptionellen Rahmen. Auch die Probleme der engagement-getriebenen Modelle sind sowohl theoretisch als auch empirisch gut dokumentiert.</w:t>
+      <w:proofErr w:type="gramEnd"/>
+    </w:p>
+    <w:p>
+      <w:pPr>
+        <w:spacing w:after="160" w:line="320" w:lineRule="auto"/>
+        <w:jc w:val="both"/>
+      </w:pPr>
+      <w:r>
+        <w:t xml:space="preserve">Aus der Literatur wird deutlich, dass die theoretischen Grundlagen für eine nutzerzentrierte, </w:t>
+      </w:r>
+      <w:proofErr w:type="spellStart"/>
+      <w:r>
+        <w:t>wellbeing</w:t>
+      </w:r>
+      <w:proofErr w:type="spellEnd"/>
+      <w:r>
+        <w:t xml:space="preserve">-orientierte Gestaltung digitaler Medien vorhanden sind: Self-Determination Theory, Value-Sensitive Design, Digital Wellbeing, Persuasive Technology und algorithmische Souveränität liefern einen dichten konzeptionellen Rahmen. Auch die Probleme der </w:t>
+      </w:r>
+      <w:proofErr w:type="spellStart"/>
+      <w:r>
+        <w:t>engagement</w:t>
+      </w:r>
+      <w:proofErr w:type="spellEnd"/>
+      <w:r>
+        <w:t>-getriebenen Modelle sind sowohl theoretisch als auch empirisch gut dokumentiert.</w:t>
       </w:r>
     </w:p>
     <w:p>
@@ -2051,42 +2628,119 @@
         <w:jc w:val="both"/>
       </w:pPr>
       <w:r>
-        <w:t>Die folgende Liste enthält die in den Kapiteln 1 und 2 zitierten Quellen. Sie wird im weiteren Verlauf der Arbeit ergänzt und vollständig in Zotero verwaltet.</w:t>
+        <w:t xml:space="preserve">Die folgende Liste enthält die in den Kapiteln 1 und 2 zitierten Quellen. Sie wird im weiteren Verlauf der Arbeit ergänzt und vollständig in </w:t>
+      </w:r>
+      <w:proofErr w:type="spellStart"/>
+      <w:r>
+        <w:t>Zotero</w:t>
+      </w:r>
+      <w:proofErr w:type="spellEnd"/>
+      <w:r>
+        <w:t xml:space="preserve"> verwaltet.</w:t>
       </w:r>
     </w:p>
     <w:p>
       <w:pPr>
         <w:spacing w:after="120" w:line="280" w:lineRule="auto"/>
         <w:ind w:left="720" w:hanging="720"/>
-      </w:pPr>
-      <w:r>
-        <w:t>Bangor, A., Kortum, P. T., &amp; Miller, J. T. (2008). An empirical evaluation of the System Usability Scale. International Journal of Human-Computer Interaction, 24(6), 574–594. https://doi.org/10.1080/10447310802205776</w:t>
+        <w:rPr>
+          <w:lang w:val="en-US"/>
+        </w:rPr>
+      </w:pPr>
+      <w:r>
+        <w:t xml:space="preserve">Bangor, A., Kortum, P. T., &amp; Miller, J. T. (2008). </w:t>
+      </w:r>
+      <w:r>
+        <w:rPr>
+          <w:lang w:val="en-US"/>
+        </w:rPr>
+        <w:t>An empirical evaluation of the System Usability Scale. International Journal of Human-Computer Interaction, 24(6), 574–594. https://doi.org/10.1080/10447310802205776</w:t>
       </w:r>
     </w:p>
     <w:p>
       <w:pPr>
         <w:spacing w:after="120" w:line="280" w:lineRule="auto"/>
         <w:ind w:left="720" w:hanging="720"/>
-      </w:pPr>
-      <w:r>
-        <w:t>Brooke, J. (1996). SUS: A «quick and dirty» usability scale. In P. W. Jordan, B. Thomas, I. L. McClelland &amp; B. Weerdmeester (Hrsg.), Usability evaluation in industry (S. 189–194). Taylor &amp; Francis.</w:t>
+        <w:rPr>
+          <w:lang w:val="en-US"/>
+        </w:rPr>
+      </w:pPr>
+      <w:r>
+        <w:rPr>
+          <w:lang w:val="en-US"/>
+        </w:rPr>
+        <w:t xml:space="preserve">Brooke, J. (1996). SUS: A «quick and dirty» usability scale. In P. W. Jordan, B. Thomas, I. L. McClelland &amp; B. </w:t>
+      </w:r>
+      <w:proofErr w:type="spellStart"/>
+      <w:r>
+        <w:rPr>
+          <w:lang w:val="en-US"/>
+        </w:rPr>
+        <w:t>Weerdmeester</w:t>
+      </w:r>
+      <w:proofErr w:type="spellEnd"/>
+      <w:r>
+        <w:rPr>
+          <w:lang w:val="en-US"/>
+        </w:rPr>
+        <w:t xml:space="preserve"> (</w:t>
+      </w:r>
+      <w:proofErr w:type="spellStart"/>
+      <w:r>
+        <w:rPr>
+          <w:lang w:val="en-US"/>
+        </w:rPr>
+        <w:t>Hrsg</w:t>
+      </w:r>
+      <w:proofErr w:type="spellEnd"/>
+      <w:r>
+        <w:rPr>
+          <w:lang w:val="en-US"/>
+        </w:rPr>
+        <w:t>.), Usability evaluation in industry (S. 189–194). Taylor &amp; Francis.</w:t>
       </w:r>
     </w:p>
     <w:p>
       <w:pPr>
         <w:spacing w:after="120" w:line="280" w:lineRule="auto"/>
         <w:ind w:left="720" w:hanging="720"/>
-      </w:pPr>
-      <w:r>
-        <w:t>Burr, C., Taddeo, M., &amp; Floridi, L. (2020). The ethics of digital well-being: A thematic review. Science and Engineering Ethics, 26, 2441–2460. https://doi.org/10.1007/s11948-020-00175-8</w:t>
+        <w:rPr>
+          <w:lang w:val="en-US"/>
+        </w:rPr>
+      </w:pPr>
+      <w:r>
+        <w:rPr>
+          <w:lang w:val="en-US"/>
+        </w:rPr>
+        <w:t xml:space="preserve">Burr, C., Taddeo, M., &amp; </w:t>
+      </w:r>
+      <w:proofErr w:type="spellStart"/>
+      <w:r>
+        <w:rPr>
+          <w:lang w:val="en-US"/>
+        </w:rPr>
+        <w:t>Floridi</w:t>
+      </w:r>
+      <w:proofErr w:type="spellEnd"/>
+      <w:r>
+        <w:rPr>
+          <w:lang w:val="en-US"/>
+        </w:rPr>
+        <w:t>, L. (2020). The ethics of digital well-being: A thematic review. Science and Engineering Ethics, 26, 2441–2460. https://doi.org/10.1007/s11948-020-00175-8</w:t>
       </w:r>
     </w:p>
     <w:p>
       <w:pPr>
         <w:spacing w:after="120" w:line="280" w:lineRule="auto"/>
         <w:ind w:left="720" w:hanging="720"/>
-      </w:pPr>
-      <w:r>
+        <w:rPr>
+          <w:lang w:val="en-US"/>
+        </w:rPr>
+      </w:pPr>
+      <w:r>
+        <w:rPr>
+          <w:lang w:val="en-US"/>
+        </w:rPr>
         <w:t>Calvo, R. A., &amp; Peters, D. (2014). Positive computing: Technology for wellbeing and human potential. MIT Press.</w:t>
       </w:r>
     </w:p>
@@ -2096,24 +2750,45 @@
         <w:ind w:left="720" w:hanging="720"/>
       </w:pPr>
       <w:r>
-        <w:t>Fogg, B. J. (2003). The functional triad: Computers in persuasive roles. In Persuasive technology: Using computers to change what we think and do (Kap. 2, S. 23–29). Morgan Kaufmann. https://doi.org/10.1016/B978-1-55860-643-2.X5000-8</w:t>
+        <w:rPr>
+          <w:lang w:val="en-US"/>
+        </w:rPr>
+        <w:t xml:space="preserve">Fogg, B. J. (2003). The functional triad: Computers in persuasive roles. In Persuasive technology: Using computers to change what we think and do (Kap. 2, S. 23–29). </w:t>
+      </w:r>
+      <w:r>
+        <w:t>Morgan Kaufmann. https://doi.org/10.1016/B978-1-55860-643-2.X5000-8</w:t>
       </w:r>
     </w:p>
     <w:p>
       <w:pPr>
         <w:spacing w:after="120" w:line="280" w:lineRule="auto"/>
         <w:ind w:left="720" w:hanging="720"/>
-      </w:pPr>
-      <w:r>
-        <w:t>Geschke, D., Lorenz, J., &amp; Holtz, P. (2019). The triple-filter bubble: Using agent-based modelling to test a meta-theoretical framework for the emergence of filter bubbles and echo chambers. British Journal of Social Psychology, 58(1), 129–149. https://doi.org/10.1111/bjso.12286</w:t>
+        <w:rPr>
+          <w:lang w:val="en-US"/>
+        </w:rPr>
+      </w:pPr>
+      <w:r>
+        <w:t xml:space="preserve">Geschke, D., Lorenz, J., &amp; Holtz, P. (2019). </w:t>
+      </w:r>
+      <w:r>
+        <w:rPr>
+          <w:lang w:val="en-US"/>
+        </w:rPr>
+        <w:t>The triple-filter bubble: Using agent-based modelling to test a meta-theoretical framework for the emergence of filter bubbles and echo chambers. British Journal of Social Psychology, 58(1), 129–149. https://doi.org/10.1111/bjso.12286</w:t>
       </w:r>
     </w:p>
     <w:p>
       <w:pPr>
         <w:spacing w:after="120" w:line="280" w:lineRule="auto"/>
         <w:ind w:left="720" w:hanging="720"/>
-      </w:pPr>
-      <w:r>
+        <w:rPr>
+          <w:lang w:val="en-US"/>
+        </w:rPr>
+      </w:pPr>
+      <w:r>
+        <w:rPr>
+          <w:lang w:val="en-US"/>
+        </w:rPr>
         <w:t>Hendry, D. G., Friedman, B., &amp; Ballard, S. (2021). Value sensitive design as a formative framework. Ethics and Information Technology, 23(1), 39–44. https://doi.org/10.1007/s10676-021-09579-x</w:t>
       </w:r>
     </w:p>
@@ -2121,26 +2796,72 @@
       <w:pPr>
         <w:spacing w:after="120" w:line="280" w:lineRule="auto"/>
         <w:ind w:left="720" w:hanging="720"/>
-      </w:pPr>
-      <w:r>
-        <w:t>Katz, E., Blumler, J. G., &amp; Gurevitch, M. (1973). Uses and gratifications research. Public Opinion Quarterly, 37(4), 509–523. https://doi.org/10.1086/268109</w:t>
+        <w:rPr>
+          <w:lang w:val="en-US"/>
+        </w:rPr>
+      </w:pPr>
+      <w:r>
+        <w:rPr>
+          <w:lang w:val="en-US"/>
+        </w:rPr>
+        <w:t xml:space="preserve">Katz, E., </w:t>
+      </w:r>
+      <w:proofErr w:type="spellStart"/>
+      <w:r>
+        <w:rPr>
+          <w:lang w:val="en-US"/>
+        </w:rPr>
+        <w:t>Blumler</w:t>
+      </w:r>
+      <w:proofErr w:type="spellEnd"/>
+      <w:r>
+        <w:rPr>
+          <w:lang w:val="en-US"/>
+        </w:rPr>
+        <w:t>, J. G., &amp; Gurevitch, M. (1973). Uses and gratifications research. Public Opinion Quarterly, 37(4), 509–523. https://doi.org/10.1086/268109</w:t>
       </w:r>
     </w:p>
     <w:p>
       <w:pPr>
         <w:spacing w:after="120" w:line="280" w:lineRule="auto"/>
         <w:ind w:left="720" w:hanging="720"/>
-      </w:pPr>
-      <w:r>
-        <w:t>Milano, S., Taddeo, M., &amp; Floridi, L. (2020). Recommender systems and their ethical challenges. AI &amp; Society, 35, 957–967. https://doi.org/10.1007/s00146-020-00950-y</w:t>
+        <w:rPr>
+          <w:lang w:val="en-US"/>
+        </w:rPr>
+      </w:pPr>
+      <w:r>
+        <w:rPr>
+          <w:lang w:val="en-US"/>
+        </w:rPr>
+        <w:t xml:space="preserve">Milano, S., Taddeo, M., &amp; </w:t>
+      </w:r>
+      <w:proofErr w:type="spellStart"/>
+      <w:r>
+        <w:rPr>
+          <w:lang w:val="en-US"/>
+        </w:rPr>
+        <w:t>Floridi</w:t>
+      </w:r>
+      <w:proofErr w:type="spellEnd"/>
+      <w:r>
+        <w:rPr>
+          <w:lang w:val="en-US"/>
+        </w:rPr>
+        <w:t>, L. (2020). Recommender systems and their ethical challenges. AI &amp; Society, 35, 957–967. https://doi.org/10.1007/s00146-020-00950-y</w:t>
       </w:r>
     </w:p>
     <w:p>
       <w:pPr>
         <w:spacing w:after="120" w:line="280" w:lineRule="auto"/>
         <w:ind w:left="720" w:hanging="720"/>
-      </w:pPr>
-      <w:r>
+        <w:rPr>
+          <w:lang w:val="en-US"/>
+        </w:rPr>
+      </w:pPr>
+      <w:r>
+        <w:rPr>
+          <w:lang w:val="en-US"/>
+        </w:rPr>
         <w:t>Montag, C., &amp; Elhai, J. D. (2023). On social media design, (online-)time well-spent and addictive behaviors in the age of surveillance capitalism. Current Addiction Reports, 10(4), 384–395. https://doi.org/10.1007/s40429-023-00494-3</w:t>
       </w:r>
     </w:p>
@@ -2148,8 +2869,14 @@
       <w:pPr>
         <w:spacing w:after="120" w:line="280" w:lineRule="auto"/>
         <w:ind w:left="720" w:hanging="720"/>
-      </w:pPr>
-      <w:r>
+        <w:rPr>
+          <w:lang w:val="en-US"/>
+        </w:rPr>
+      </w:pPr>
+      <w:r>
+        <w:rPr>
+          <w:lang w:val="en-US"/>
+        </w:rPr>
         <w:t>Montag, C., Lachmann, B., Herrlich, M., &amp; Zweig, K. (2019). Addictive features of social media/messenger platforms and freemium games against the background of psychological and economic theories. International Journal of Environmental Research and Public Health, 16(14), 2612. https://doi.org/10.3390/ijerph16142612</w:t>
       </w:r>
     </w:p>
@@ -2157,17 +2884,40 @@
       <w:pPr>
         <w:spacing w:after="120" w:line="280" w:lineRule="auto"/>
         <w:ind w:left="720" w:hanging="720"/>
-      </w:pPr>
-      <w:r>
-        <w:t>Nguyen, T. T., Hui, P.-M., Harper, F. M., Terveen, L., &amp; Konstan, J. A. (2014). Exploring the filter bubble: The effect of using recommender systems on content diversity. In Proceedings of the 23rd International Conference on World Wide Web (S. 677–686). ACM. https://doi.org/10.1145/2566486.2568012</w:t>
+        <w:rPr>
+          <w:lang w:val="en-US"/>
+        </w:rPr>
+      </w:pPr>
+      <w:r>
+        <w:t xml:space="preserve">Nguyen, T. T., Hui, P.-M., Harper, F. M., Terveen, L., &amp; </w:t>
+      </w:r>
+      <w:proofErr w:type="spellStart"/>
+      <w:r>
+        <w:t>Konstan</w:t>
+      </w:r>
+      <w:proofErr w:type="spellEnd"/>
+      <w:r>
+        <w:t xml:space="preserve">, J. A. (2014). </w:t>
+      </w:r>
+      <w:r>
+        <w:rPr>
+          <w:lang w:val="en-US"/>
+        </w:rPr>
+        <w:t>Exploring the filter bubble: The effect of using recommender systems on content diversity. In Proceedings of the 23rd International Conference on World Wide Web (S. 677–686). ACM. https://doi.org/10.1145/2566486.2568012</w:t>
       </w:r>
     </w:p>
     <w:p>
       <w:pPr>
         <w:spacing w:after="120" w:line="280" w:lineRule="auto"/>
         <w:ind w:left="720" w:hanging="720"/>
-      </w:pPr>
-      <w:r>
+        <w:rPr>
+          <w:lang w:val="en-US"/>
+        </w:rPr>
+      </w:pPr>
+      <w:r>
+        <w:rPr>
+          <w:lang w:val="en-US"/>
+        </w:rPr>
         <w:lastRenderedPageBreak/>
         <w:t>Orben, A. (2020). Teenagers, screens and social media: A narrative review of reviews and key studies. Social Psychiatry and Psychiatric Epidemiology, 55(4), 407–414. https://doi.org/10.1007/s00127-019-01825-4</w:t>
       </w:r>
@@ -2176,8 +2926,14 @@
       <w:pPr>
         <w:spacing w:after="120" w:line="280" w:lineRule="auto"/>
         <w:ind w:left="720" w:hanging="720"/>
-      </w:pPr>
-      <w:r>
+        <w:rPr>
+          <w:lang w:val="en-US"/>
+        </w:rPr>
+      </w:pPr>
+      <w:r>
+        <w:rPr>
+          <w:lang w:val="en-US"/>
+        </w:rPr>
         <w:t>Pariser, E. (2011). The filter bubble: What the internet is hiding from you. Penguin Press.</w:t>
       </w:r>
     </w:p>
@@ -2185,27 +2941,109 @@
       <w:pPr>
         <w:spacing w:after="120" w:line="280" w:lineRule="auto"/>
         <w:ind w:left="720" w:hanging="720"/>
-      </w:pPr>
-      <w:r>
-        <w:t>Peters, D., Ahmadpour, N., &amp; Calvo, R. A. (2020). Tools for wellbeing-supportive design: Features, characteristics, and prototypes. Multimodal Technologies and Interaction, 4(3), 40. https://doi.org/10.3390/mti4030040</w:t>
+        <w:rPr>
+          <w:lang w:val="en-US"/>
+        </w:rPr>
+      </w:pPr>
+      <w:r>
+        <w:rPr>
+          <w:lang w:val="en-US"/>
+        </w:rPr>
+        <w:t xml:space="preserve">Peters, D., Ahmadpour, N., &amp; Calvo, R. A. (2020). Tools for </w:t>
+      </w:r>
+      <w:proofErr w:type="gramStart"/>
+      <w:r>
+        <w:rPr>
+          <w:lang w:val="en-US"/>
+        </w:rPr>
+        <w:t>wellbeing</w:t>
+      </w:r>
+      <w:proofErr w:type="gramEnd"/>
+      <w:r>
+        <w:rPr>
+          <w:lang w:val="en-US"/>
+        </w:rPr>
+        <w:t>-supportive design: Features, characteristics, and prototypes. Multimodal Technologies and Interaction, 4(3), 40. https://doi.org/10.3390/mti4030040</w:t>
       </w:r>
     </w:p>
     <w:p>
       <w:pPr>
         <w:spacing w:after="120" w:line="280" w:lineRule="auto"/>
         <w:ind w:left="720" w:hanging="720"/>
-      </w:pPr>
-      <w:r>
-        <w:t>Peters, D., Calvo, R. A., &amp; Ryan, R. M. (2018). Designing for motivation, engagement and wellbeing in digital experience. Frontiers in Psychology, 9, 797. https://doi.org/10.3389/fpsyg.2018.00797</w:t>
+        <w:rPr>
+          <w:lang w:val="en-US"/>
+        </w:rPr>
+      </w:pPr>
+      <w:r>
+        <w:rPr>
+          <w:lang w:val="en-US"/>
+        </w:rPr>
+        <w:t xml:space="preserve">Peters, D., Calvo, R. A., &amp; Ryan, R. M. (2018). </w:t>
+      </w:r>
+      <w:proofErr w:type="gramStart"/>
+      <w:r>
+        <w:rPr>
+          <w:lang w:val="en-US"/>
+        </w:rPr>
+        <w:t>Designing for</w:t>
+      </w:r>
+      <w:proofErr w:type="gramEnd"/>
+      <w:r>
+        <w:rPr>
+          <w:lang w:val="en-US"/>
+        </w:rPr>
+        <w:t xml:space="preserve"> motivation, engagement and wellbeing in digital experience. Frontiers in Psychology, 9, 797. https://doi.org/10.3389/fpsyg.2018.00797</w:t>
       </w:r>
     </w:p>
     <w:p>
       <w:pPr>
         <w:spacing w:after="120" w:line="280" w:lineRule="auto"/>
         <w:ind w:left="720" w:hanging="720"/>
-      </w:pPr>
-      <w:r>
-        <w:t>Reviglio, U., &amp; Agosti, C. (2020). Thinking outside the black-box: The case for «algorithmic sovereignty» in social media. Social Media + Society, 6(2), 1–12. https://doi.org/10.1177/2056305120915613</w:t>
+        <w:rPr>
+          <w:lang w:val="en-US"/>
+        </w:rPr>
+      </w:pPr>
+      <w:proofErr w:type="spellStart"/>
+      <w:r>
+        <w:rPr>
+          <w:lang w:val="en-US"/>
+        </w:rPr>
+        <w:t>Reviglio</w:t>
+      </w:r>
+      <w:proofErr w:type="spellEnd"/>
+      <w:r>
+        <w:rPr>
+          <w:lang w:val="en-US"/>
+        </w:rPr>
+        <w:t xml:space="preserve">, U., &amp; Agosti, C. (2020). Thinking outside the </w:t>
+      </w:r>
+      <w:proofErr w:type="gramStart"/>
+      <w:r>
+        <w:rPr>
+          <w:lang w:val="en-US"/>
+        </w:rPr>
+        <w:t>black-box</w:t>
+      </w:r>
+      <w:proofErr w:type="gramEnd"/>
+      <w:r>
+        <w:rPr>
+          <w:lang w:val="en-US"/>
+        </w:rPr>
+        <w:t xml:space="preserve">: The case for «algorithmic sovereignty» in social media. </w:t>
+      </w:r>
+      <w:proofErr w:type="gramStart"/>
+      <w:r>
+        <w:rPr>
+          <w:lang w:val="en-US"/>
+        </w:rPr>
+        <w:t>Social Media</w:t>
+      </w:r>
+      <w:proofErr w:type="gramEnd"/>
+      <w:r>
+        <w:rPr>
+          <w:lang w:val="en-US"/>
+        </w:rPr>
+        <w:t xml:space="preserve"> + Society, 6(2), 1–12. https://doi.org/10.1177/2056305120915613</w:t>
       </w:r>
     </w:p>
     <w:p>
@@ -2214,24 +3052,83 @@
         <w:ind w:left="720" w:hanging="720"/>
       </w:pPr>
       <w:r>
-        <w:t>Ricci, F., Rokach, L., &amp; Shapira, B. (Hrsg.). (2015). Recommender systems handbook (2. Aufl.). Springer. https://doi.org/10.1007/978-1-4899-7637-6</w:t>
+        <w:rPr>
+          <w:lang w:val="en-US"/>
+        </w:rPr>
+        <w:t>Ricci, F., Rokach, L., &amp; Shapira, B. (</w:t>
+      </w:r>
+      <w:proofErr w:type="spellStart"/>
+      <w:r>
+        <w:rPr>
+          <w:lang w:val="en-US"/>
+        </w:rPr>
+        <w:t>Hrsg</w:t>
+      </w:r>
+      <w:proofErr w:type="spellEnd"/>
+      <w:r>
+        <w:rPr>
+          <w:lang w:val="en-US"/>
+        </w:rPr>
+        <w:t xml:space="preserve">.). </w:t>
+      </w:r>
+      <w:r>
+        <w:t xml:space="preserve">(2015). </w:t>
+      </w:r>
+      <w:proofErr w:type="spellStart"/>
+      <w:r>
+        <w:t>Recommender</w:t>
+      </w:r>
+      <w:proofErr w:type="spellEnd"/>
+      <w:r>
+        <w:t xml:space="preserve"> </w:t>
+      </w:r>
+      <w:proofErr w:type="spellStart"/>
+      <w:r>
+        <w:t>systems</w:t>
+      </w:r>
+      <w:proofErr w:type="spellEnd"/>
+      <w:r>
+        <w:t xml:space="preserve"> </w:t>
+      </w:r>
+      <w:proofErr w:type="spellStart"/>
+      <w:r>
+        <w:t>handbook</w:t>
+      </w:r>
+      <w:proofErr w:type="spellEnd"/>
+      <w:r>
+        <w:t xml:space="preserve"> (2. Aufl.). Springer. https://doi.org/10.1007/978-1-4899-7637-6</w:t>
       </w:r>
     </w:p>
     <w:p>
       <w:pPr>
         <w:spacing w:after="120" w:line="280" w:lineRule="auto"/>
         <w:ind w:left="720" w:hanging="720"/>
-      </w:pPr>
-      <w:r>
-        <w:t>Ryan, R. M., &amp; Deci, E. L. (2000). Self-determination theory and the facilitation of intrinsic motivation, social development, and well-being. American Psychologist, 55(1), 68–78. https://doi.org/10.1037/0003-066X.55.1.68</w:t>
+        <w:rPr>
+          <w:lang w:val="en-US"/>
+        </w:rPr>
+      </w:pPr>
+      <w:r>
+        <w:t xml:space="preserve">Ryan, R. M., &amp; Deci, E. L. (2000). </w:t>
+      </w:r>
+      <w:r>
+        <w:rPr>
+          <w:lang w:val="en-US"/>
+        </w:rPr>
+        <w:t>Self-determination theory and the facilitation of intrinsic motivation, social development, and well-being. American Psychologist, 55(1), 68–78. https://doi.org/10.1037/0003-066X.55.1.68</w:t>
       </w:r>
     </w:p>
     <w:p>
       <w:pPr>
         <w:spacing w:after="120" w:line="280" w:lineRule="auto"/>
         <w:ind w:left="720" w:hanging="720"/>
-      </w:pPr>
-      <w:r>
+        <w:rPr>
+          <w:lang w:val="en-US"/>
+        </w:rPr>
+      </w:pPr>
+      <w:r>
+        <w:rPr>
+          <w:lang w:val="en-US"/>
+        </w:rPr>
         <w:t>Sunstein, C. R. (2017). Polarization. In #Republic: Divided democracy in the age of social media (Kap. 3, S. 59–97). Princeton University Press.</w:t>
       </w:r>
     </w:p>
@@ -2239,18 +3136,58 @@
       <w:pPr>
         <w:spacing w:after="120" w:line="280" w:lineRule="auto"/>
         <w:ind w:left="720" w:hanging="720"/>
-      </w:pPr>
-      <w:r>
-        <w:t>Vanden Abeele, M. M. P. (2021). Digital wellbeing as a dynamic construct. Communication Theory, 31(4), 932–955. https://doi.org/10.1093/ct/qtaa024</w:t>
+        <w:rPr>
+          <w:lang w:val="en-US"/>
+        </w:rPr>
+      </w:pPr>
+      <w:r>
+        <w:rPr>
+          <w:lang w:val="en-US"/>
+        </w:rPr>
+        <w:t xml:space="preserve">Vanden Abeele, M. M. P. (2021). Digital wellbeing </w:t>
+      </w:r>
+      <w:proofErr w:type="gramStart"/>
+      <w:r>
+        <w:rPr>
+          <w:lang w:val="en-US"/>
+        </w:rPr>
+        <w:t>as</w:t>
+      </w:r>
+      <w:proofErr w:type="gramEnd"/>
+      <w:r>
+        <w:rPr>
+          <w:lang w:val="en-US"/>
+        </w:rPr>
+        <w:t xml:space="preserve"> a dynamic construct. Communication Theory, 31(4), 932–955. https://doi.org/10.1093/ct/qtaa024</w:t>
       </w:r>
     </w:p>
     <w:p>
       <w:pPr>
         <w:spacing w:after="120" w:line="280" w:lineRule="auto"/>
         <w:ind w:left="720" w:hanging="720"/>
-      </w:pPr>
-      <w:r>
-        <w:t>Verduyn, P., Lee, D. S., Park, J., Shablack, H., Orvell, A., Bayer, J., Ybarra, O., Jonides, J., &amp; Kross, E. (2015). Passive Facebook usage undermines affective well-being: Experimental and longitudinal evidence. Journal of Experimental Psychology: General, 144(2), 480–488. https://doi.org/10.1037/xge0000057</w:t>
+        <w:rPr>
+          <w:lang w:val="en-US"/>
+        </w:rPr>
+      </w:pPr>
+      <w:r>
+        <w:rPr>
+          <w:lang w:val="en-US"/>
+        </w:rPr>
+        <w:t xml:space="preserve">Verduyn, P., Lee, D. S., Park, J., </w:t>
+      </w:r>
+      <w:proofErr w:type="spellStart"/>
+      <w:r>
+        <w:rPr>
+          <w:lang w:val="en-US"/>
+        </w:rPr>
+        <w:t>Shablack</w:t>
+      </w:r>
+      <w:proofErr w:type="spellEnd"/>
+      <w:r>
+        <w:rPr>
+          <w:lang w:val="en-US"/>
+        </w:rPr>
+        <w:t>, H., Orvell, A., Bayer, J., Ybarra, O., Jonides, J., &amp; Kross, E. (2015). Passive Facebook usage undermines affective well-being: Experimental and longitudinal evidence. Journal of Experimental Psychology: General, 144(2), 480–488. https://doi.org/10.1037/xge0000057</w:t>
       </w:r>
     </w:p>
     <w:p>
@@ -2259,16 +3196,31 @@
         <w:ind w:left="720" w:hanging="720"/>
       </w:pPr>
       <w:r>
-        <w:t>Vosoughi, S., Roy, D., &amp; Aral, S. (2018). The spread of true and false news online. Science, 359(6380), 1146–1151. https://doi.org/10.1126/science.aap9559</w:t>
+        <w:rPr>
+          <w:lang w:val="en-US"/>
+        </w:rPr>
+        <w:t xml:space="preserve">Vosoughi, S., Roy, D., &amp; Aral, S. (2018). The spread of true and false news online. </w:t>
+      </w:r>
+      <w:r>
+        <w:t>Science, 359(6380), 1146–1151. https://doi.org/10.1126/science.aap9559</w:t>
       </w:r>
     </w:p>
     <w:p>
       <w:pPr>
         <w:spacing w:after="120" w:line="280" w:lineRule="auto"/>
         <w:ind w:left="720" w:hanging="720"/>
-      </w:pPr>
-      <w:r>
-        <w:t>Weinmann, M., Schneider, C., &amp; vom Brocke, J. (2016). Digital nudging. Business &amp; Information Systems Engineering, 58(6), 433–436. https://doi.org/10.1007/s12599-016-0453-3</w:t>
+        <w:rPr>
+          <w:lang w:val="en-US"/>
+        </w:rPr>
+      </w:pPr>
+      <w:r>
+        <w:t xml:space="preserve">Weinmann, M., Schneider, C., &amp; vom Brocke, J. (2016). </w:t>
+      </w:r>
+      <w:r>
+        <w:rPr>
+          <w:lang w:val="en-US"/>
+        </w:rPr>
+        <w:t>Digital nudging. Business &amp; Information Systems Engineering, 58(6), 433–436. https://doi.org/10.1007/s12599-016-0453-3</w:t>
       </w:r>
     </w:p>
     <w:p>
@@ -2277,7 +3229,18 @@
         <w:ind w:left="720" w:hanging="720"/>
       </w:pPr>
       <w:r>
-        <w:t>Zuboff, S. (2019). The discovery of behavioral surplus. In The age of surveillance capitalism: The fight for a human future at the new frontier of power (Kap. 3, S. 63–97). PublicAffairs.</w:t>
+        <w:rPr>
+          <w:lang w:val="en-US"/>
+        </w:rPr>
+        <w:t xml:space="preserve">Zuboff, S. (2019). The discovery of behavioral surplus. In The age of surveillance capitalism: The fight for a human future at the new frontier of power (Kap. 3, S. 63–97). </w:t>
+      </w:r>
+      <w:proofErr w:type="spellStart"/>
+      <w:r>
+        <w:t>PublicAffairs</w:t>
+      </w:r>
+      <w:proofErr w:type="spellEnd"/>
+      <w:r>
+        <w:t>.</w:t>
       </w:r>
     </w:p>
     <w:sectPr>
@@ -2450,7 +3413,25 @@
         <w:sz w:val="18"/>
         <w:szCs w:val="18"/>
       </w:rPr>
-      <w:t>Radio 25: Hauptdokument (Entwurf Kapitel 1 &amp; 2)</w:t>
+      <w:t>Radio 25: Hauptdokument (</w:t>
+    </w:r>
+    <w:proofErr w:type="gramStart"/>
+    <w:r>
+      <w:rPr>
+        <w:color w:val="808080"/>
+        <w:sz w:val="18"/>
+        <w:szCs w:val="18"/>
+      </w:rPr>
+      <w:t>Entwurf</w:t>
+    </w:r>
+    <w:proofErr w:type="gramEnd"/>
+    <w:r>
+      <w:rPr>
+        <w:color w:val="808080"/>
+        <w:sz w:val="18"/>
+        <w:szCs w:val="18"/>
+      </w:rPr>
+      <w:t xml:space="preserve"> Kapitel 1 &amp; 2)</w:t>
     </w:r>
   </w:p>
 </w:hdr>

</xml_diff>

<commit_message>
name change to attuen
</commit_message>
<xml_diff>
--- a/Hauptdokument.docx
+++ b/Hauptdokument.docx
@@ -29,7 +29,6 @@
         <w:spacing w:after="600"/>
         <w:jc w:val="center"/>
       </w:pPr>
-      <w:proofErr w:type="spellStart"/>
       <w:r>
         <w:rPr>
           <w:b/>
@@ -37,17 +36,7 @@
           <w:sz w:val="28"/>
           <w:szCs w:val="28"/>
         </w:rPr>
-        <w:t>BSc</w:t>
-      </w:r>
-      <w:proofErr w:type="spellEnd"/>
-      <w:r>
-        <w:rPr>
-          <w:b/>
-          <w:bCs/>
-          <w:sz w:val="28"/>
-          <w:szCs w:val="28"/>
-        </w:rPr>
-        <w:t>-Thesis</w:t>
+        <w:t>BSc-Thesis</w:t>
       </w:r>
     </w:p>
     <w:p>
@@ -62,7 +51,7 @@
           <w:sz w:val="44"/>
           <w:szCs w:val="44"/>
         </w:rPr>
-        <w:t>Radio 25: Nutzerzentrierte Personalisierung</w:t>
+        <w:t>Attune: Nutzerzentrierte Personalisierung</w:t>
       </w:r>
     </w:p>
     <w:p>
@@ -127,35 +116,17 @@
         <w:pStyle w:val="berschrift1"/>
         <w:pageBreakBefore/>
       </w:pPr>
-      <w:proofErr w:type="gramStart"/>
       <w:r>
         <w:lastRenderedPageBreak/>
         <w:t>1  Motivation</w:t>
       </w:r>
-      <w:proofErr w:type="gramEnd"/>
-    </w:p>
-    <w:p>
-      <w:pPr>
-        <w:spacing w:after="160" w:line="360" w:lineRule="auto"/>
-      </w:pPr>
-      <w:r>
-        <w:t>Medienkonsum ist das Ergebnis eines Zusammenspiels zweier Seiten: Auf der einen Seite stehen die Nutzenden mit ihren Bedürfnissen und Motivationen wie Information, Unterhaltung, Orientierung, soziale Zugehörigkeit und Identitätsbildung. Auf der anderen Seite stehen die Anbieter mit ihren Geschäftsmodellen, Zielen und Anreizen wie Reichweite, Nutzerbindung, Werbeeinnahmen und Marktanteilen. Idealerweise stehen diese beiden Seiten in einem ausgewogenen Verhältnis: Die Anbieter liefern Inhalte, die Bedürfnisse der Nutzenden erfüllen, und erhalten dafür Aufmerksamkeit oder Entgelt. In den letzten zwei Jahrzehnten hat sich dieses Gleichgewicht jedoch zunehmend zugunsten der Anbieterseite verschoben, insbesondere im Bereich der sozialen Medien (</w:t>
-      </w:r>
-      <w:proofErr w:type="spellStart"/>
-      <w:r>
-        <w:t>Zuboff</w:t>
-      </w:r>
-      <w:proofErr w:type="spellEnd"/>
-      <w:r>
-        <w:t xml:space="preserve">, 2019; Montag &amp; </w:t>
-      </w:r>
-      <w:proofErr w:type="spellStart"/>
-      <w:r>
-        <w:t>Elhai</w:t>
-      </w:r>
-      <w:proofErr w:type="spellEnd"/>
-      <w:r>
-        <w:t>, 2023).</w:t>
+    </w:p>
+    <w:p>
+      <w:pPr>
+        <w:spacing w:after="160" w:line="360" w:lineRule="auto"/>
+      </w:pPr>
+      <w:r>
+        <w:t>Medienkonsum ist das Ergebnis eines Zusammenspiels zweier Seiten: Auf der einen Seite stehen die Nutzenden mit ihren Bedürfnissen und Motivationen wie Information, Unterhaltung, Orientierung, soziale Zugehörigkeit und Identitätsbildung. Auf der anderen Seite stehen die Anbieter mit ihren Geschäftsmodellen, Zielen und Anreizen wie Reichweite, Nutzerbindung, Werbeeinnahmen und Marktanteilen. Idealerweise stehen diese beiden Seiten in einem ausgewogenen Verhältnis: Die Anbieter liefern Inhalte, die Bedürfnisse der Nutzenden erfüllen, und erhalten dafür Aufmerksamkeit oder Entgelt. In den letzten zwei Jahrzehnten hat sich dieses Gleichgewicht jedoch zunehmend zugunsten der Anbieterseite verschoben, insbesondere im Bereich der sozialen Medien (Zuboff, 2019; Montag &amp; Elhai, 2023).</w:t>
       </w:r>
     </w:p>
     <w:p>
@@ -170,61 +141,24 @@
       <w:pPr>
         <w:pStyle w:val="berschrift2"/>
       </w:pPr>
-      <w:proofErr w:type="gramStart"/>
-      <w:r>
-        <w:t>1.1  Das</w:t>
-      </w:r>
-      <w:proofErr w:type="gramEnd"/>
-      <w:r>
-        <w:t xml:space="preserve"> Spannungsfeld zwischen Nutzer und Anbieter</w:t>
-      </w:r>
-    </w:p>
-    <w:p>
-      <w:pPr>
-        <w:spacing w:after="160" w:line="360" w:lineRule="auto"/>
-      </w:pPr>
-      <w:r>
-        <w:t xml:space="preserve">Nutzende digitaler Medien verfolgen eine Bandbreite an Motiven, von Information und Orientierung über Unterhaltung und Entspannung bis zu sozialer Zugehörigkeit und Identitätsbildung. Wird ein Medium diesen Motiven gerecht, entstehen Zufriedenheit und das Erleben, kompetent und selbstbestimmt mit dem Angebot umzugehen. Eine ausführliche theoretische Fundierung dieser Bedürfnisse, namentlich entlang des </w:t>
-      </w:r>
-      <w:proofErr w:type="spellStart"/>
-      <w:r>
-        <w:t>Uses</w:t>
-      </w:r>
-      <w:proofErr w:type="spellEnd"/>
-      <w:r>
-        <w:t>-and-</w:t>
-      </w:r>
-      <w:proofErr w:type="spellStart"/>
-      <w:r>
-        <w:t>Gratifications</w:t>
-      </w:r>
-      <w:proofErr w:type="spellEnd"/>
-      <w:r>
-        <w:t xml:space="preserve">-Ansatzes (Katz, </w:t>
-      </w:r>
-      <w:proofErr w:type="spellStart"/>
-      <w:r>
-        <w:t>Blumler</w:t>
-      </w:r>
-      <w:proofErr w:type="spellEnd"/>
-      <w:r>
-        <w:t xml:space="preserve"> &amp; Gurevitch, 1973) und der Self-Determination Theory (Ryan &amp; Deci, 2000), erfolgt in Abschnitt 2.1.2.</w:t>
-      </w:r>
-    </w:p>
-    <w:p>
-      <w:pPr>
-        <w:spacing w:after="160" w:line="360" w:lineRule="auto"/>
-      </w:pPr>
-      <w:r>
-        <w:t xml:space="preserve">Die Motivationen der Anbieter hingegen sind primär ökonomischer Natur. Kommerzielle Plattformen wie TikTok, Instagram, Facebook oder YouTube finanzieren sich überwiegend durch Werbung. Ihr zentrales Zielgrössensystem sind Engagement-Metriken: Verweildauer, Klicks, </w:t>
-      </w:r>
-      <w:proofErr w:type="spellStart"/>
-      <w:r>
-        <w:t>Impressions</w:t>
-      </w:r>
-      <w:proofErr w:type="spellEnd"/>
-      <w:r>
-        <w:t>, Interaktionsrate. Diese Grössen entscheiden über den Werbepreis und damit über den Ertrag. Alle zentralen Designentscheidungen, von der Rangfolge der Inhalte bis zur Gestaltung der Benutzeroberfläche, orientieren sich an diesen Metriken.</w:t>
+      <w:r>
+        <w:t>1.1  Das Spannungsfeld zwischen Nutzer und Anbieter</w:t>
+      </w:r>
+    </w:p>
+    <w:p>
+      <w:pPr>
+        <w:spacing w:after="160" w:line="360" w:lineRule="auto"/>
+      </w:pPr>
+      <w:r>
+        <w:t>Nutzende digitaler Medien verfolgen eine Bandbreite an Motiven, von Information und Orientierung über Unterhaltung und Entspannung bis zu sozialer Zugehörigkeit und Identitätsbildung. Wird ein Medium diesen Motiven gerecht, entstehen Zufriedenheit und das Erleben, kompetent und selbstbestimmt mit dem Angebot umzugehen. Eine ausführliche theoretische Fundierung dieser Bedürfnisse, namentlich entlang des Uses-and-Gratifications-Ansatzes (Katz, Blumler &amp; Gurevitch, 1973) und der Self-Determination Theory (Ryan &amp; Deci, 2000), erfolgt in Abschnitt 2.1.2.</w:t>
+      </w:r>
+    </w:p>
+    <w:p>
+      <w:pPr>
+        <w:spacing w:after="160" w:line="360" w:lineRule="auto"/>
+      </w:pPr>
+      <w:r>
+        <w:t>Die Motivationen der Anbieter hingegen sind primär ökonomischer Natur. Kommerzielle Plattformen wie TikTok, Instagram, Facebook oder YouTube finanzieren sich überwiegend durch Werbung. Ihr zentrales Zielgrössensystem sind Engagement-Metriken: Verweildauer, Klicks, Impressions, Interaktionsrate. Diese Grössen entscheiden über den Werbepreis und damit über den Ertrag. Alle zentralen Designentscheidungen, von der Rangfolge der Inhalte bis zur Gestaltung der Benutzeroberfläche, orientieren sich an diesen Metriken.</w:t>
       </w:r>
     </w:p>
     <w:p>
@@ -233,8 +167,6 @@
       </w:pPr>
       <w:r>
         <w:t xml:space="preserve">Solange die Ziele beider Seiten in die gleiche Richtung zeigen, ist dieses System funktional. Problematisch wird es dort, wo die Maximierung der Verweildauer nicht mehr mit dem Wohlbefinden der Nutzenden übereinstimmt, etwa weil Inhalte bewusst emotional </w:t>
-      </w:r>
-      <w:r>
         <w:lastRenderedPageBreak/>
         <w:t>aufgeladen werden, weil Nutzungssessions künstlich verlängert werden oder weil Vielfalt zugunsten reiner Relevanz geopfert wird. Genau dies ist in den letzten Jahren empirisch immer besser dokumentiert (Burr et al., 2020; Milano et al., 2020).</w:t>
       </w:r>
@@ -243,13 +175,8 @@
       <w:pPr>
         <w:pStyle w:val="berschrift2"/>
       </w:pPr>
-      <w:proofErr w:type="gramStart"/>
-      <w:r>
-        <w:t>1.2  Das</w:t>
-      </w:r>
-      <w:proofErr w:type="gramEnd"/>
-      <w:r>
-        <w:t xml:space="preserve"> Geschäftsmodell der Aufmerksamkeitsökonomie</w:t>
+      <w:r>
+        <w:t>1.2  Das Geschäftsmodell der Aufmerksamkeitsökonomie</w:t>
       </w:r>
     </w:p>
     <w:p>
@@ -265,28 +192,15 @@
         <w:spacing w:after="160" w:line="360" w:lineRule="auto"/>
       </w:pPr>
       <w:r>
-        <w:t>Die Asymmetrie dieses Modells ist strukturell: Während die Plattformen immer mehr über ihre Nutzenden wissen, bleibt den Nutzenden verborgen, welche Daten erhoben, wie sie interpretiert und mit welchem Ziel sie eingesetzt werden. Das in der Folge entstehende Steuerungsdefizit auf Nutzerseite wird in Abschnitt 1.6 als beobachtbares Phänomen beschrieben und in Abschnitt 2.3.4 unter dem Begriff der algorithmischen Souveränität (</w:t>
-      </w:r>
-      <w:proofErr w:type="spellStart"/>
-      <w:r>
-        <w:t>Reviglio</w:t>
-      </w:r>
-      <w:proofErr w:type="spellEnd"/>
-      <w:r>
-        <w:t xml:space="preserve"> &amp; Agosti, 2020) theoretisch eingeordnet.</w:t>
+        <w:t>Die Asymmetrie dieses Modells ist strukturell: Während die Plattformen immer mehr über ihre Nutzenden wissen, bleibt den Nutzenden verborgen, welche Daten erhoben, wie sie interpretiert und mit welchem Ziel sie eingesetzt werden. Das in der Folge entstehende Steuerungsdefizit auf Nutzerseite wird in Abschnitt 1.6 als beobachtbares Phänomen beschrieben und in Abschnitt 2.3.4 unter dem Begriff der algorithmischen Souveränität (Reviglio &amp; Agosti, 2020) theoretisch eingeordnet.</w:t>
       </w:r>
     </w:p>
     <w:p>
       <w:pPr>
         <w:pStyle w:val="berschrift2"/>
       </w:pPr>
-      <w:proofErr w:type="gramStart"/>
-      <w:r>
-        <w:t>1.3  Manipulative</w:t>
-      </w:r>
-      <w:proofErr w:type="gramEnd"/>
-      <w:r>
-        <w:t xml:space="preserve"> Designmuster</w:t>
+      <w:r>
+        <w:t>1.3  Manipulative Designmuster</w:t>
       </w:r>
     </w:p>
     <w:p>
@@ -358,13 +272,8 @@
         </w:numPr>
         <w:spacing w:after="80" w:line="360" w:lineRule="auto"/>
       </w:pPr>
-      <w:proofErr w:type="spellStart"/>
-      <w:r>
-        <w:t>Social</w:t>
-      </w:r>
-      <w:proofErr w:type="spellEnd"/>
-      <w:r>
-        <w:t>-Proof- und Reziprozitätsmechanismen, die soziale Grundbedürfnisse (Bestätigung, Gegenseitigkeit) für die Plattformbindung nutzen.</w:t>
+      <w:r>
+        <w:t>Social-Proof- und Reziprozitätsmechanismen, die soziale Grundbedürfnisse (Bestätigung, Gegenseitigkeit) für die Plattformbindung nutzen.</w:t>
       </w:r>
     </w:p>
     <w:p>
@@ -380,13 +289,8 @@
       <w:pPr>
         <w:pStyle w:val="berschrift2"/>
       </w:pPr>
-      <w:proofErr w:type="gramStart"/>
-      <w:r>
-        <w:t>1.4  Filterblasen</w:t>
-      </w:r>
-      <w:proofErr w:type="gramEnd"/>
-      <w:r>
-        <w:t>, Echokammern und Polarisierung</w:t>
+      <w:r>
+        <w:t>1.4  Filterblasen, Echokammern und Polarisierung</w:t>
       </w:r>
     </w:p>
     <w:p>
@@ -402,44 +306,23 @@
         <w:spacing w:after="160" w:line="360" w:lineRule="auto"/>
       </w:pPr>
       <w:r>
-        <w:t xml:space="preserve">Sunstein (2017) beschreibt, wie diese Informationsarchitekturen die gesellschaftliche Polarisierung befeuern: Wenn Nutzende bevorzugt mit Inhalten konfrontiert werden, die ihre bestehende Meinung bestätigen, verschärfen sich die Gräben zwischen unterschiedlichen Weltsichten. Dabei ist wichtig, dass dies nicht allein ein Problem der Algorithmen ist (menschliche kognitive Verzerrungen wie der </w:t>
-      </w:r>
-      <w:proofErr w:type="spellStart"/>
-      <w:r>
-        <w:t>Confirmation</w:t>
-      </w:r>
-      <w:proofErr w:type="spellEnd"/>
-      <w:r>
-        <w:t xml:space="preserve"> Bias wirken in die gleiche Richtung), sondern dass die Algorithmen bestehende Tendenzen systematisch verstärken, weil polarisierende und emotionalisierende Inhalte stärkere Reaktionen und damit höheres Engagement auslösen. Vosoughi, Roy und Aral (2018) belegen dies empirisch anhand einer grossangelegten Twitter-Analyse: Falsch- und Sensationsinformationen verbreiten sich im Durchschnitt schneller, tiefer und breiter als vergleichbare wahre Inhalte, was primär auf die stärkere emotionale Reaktion der Nutzenden zurückzuführen ist.</w:t>
+        <w:t>Sunstein (2017) beschreibt, wie diese Informationsarchitekturen die gesellschaftliche Polarisierung befeuern: Wenn Nutzende bevorzugt mit Inhalten konfrontiert werden, die ihre bestehende Meinung bestätigen, verschärfen sich die Gräben zwischen unterschiedlichen Weltsichten. Dabei ist wichtig, dass dies nicht allein ein Problem der Algorithmen ist (menschliche kognitive Verzerrungen wie der Confirmation Bias wirken in die gleiche Richtung), sondern dass die Algorithmen bestehende Tendenzen systematisch verstärken, weil polarisierende und emotionalisierende Inhalte stärkere Reaktionen und damit höheres Engagement auslösen. Vosoughi, Roy und Aral (2018) belegen dies empirisch anhand einer grossangelegten Twitter-Analyse: Falsch- und Sensationsinformationen verbreiten sich im Durchschnitt schneller, tiefer und breiter als vergleichbare wahre Inhalte, was primär auf die stärkere emotionale Reaktion der Nutzenden zurückzuführen ist.</w:t>
       </w:r>
     </w:p>
     <w:p>
       <w:pPr>
         <w:pStyle w:val="berschrift2"/>
       </w:pPr>
-      <w:proofErr w:type="gramStart"/>
-      <w:r>
-        <w:t>1.5  Psychisches</w:t>
-      </w:r>
-      <w:proofErr w:type="gramEnd"/>
-      <w:r>
-        <w:t xml:space="preserve"> Wohlbefinden und Suchtverhalten</w:t>
-      </w:r>
-    </w:p>
-    <w:p>
-      <w:pPr>
-        <w:spacing w:after="160" w:line="360" w:lineRule="auto"/>
-      </w:pPr>
-      <w:r>
-        <w:t xml:space="preserve">Die Folgen für das individuelle Wohlbefinden sind inzwischen empirisch vielfach untersucht. </w:t>
-      </w:r>
-      <w:proofErr w:type="spellStart"/>
-      <w:r>
-        <w:t>Verduyn</w:t>
-      </w:r>
-      <w:proofErr w:type="spellEnd"/>
-      <w:r>
-        <w:t xml:space="preserve"> et al. (2015) zeigen in einer experimentellen und längsschnittlichen Studie, dass passive Facebook-Nutzung (Konsumieren ohne aktive Teilnahme) das affektive Wohlbefinden nachweislich untergräbt, während aktive, kommunikative Nutzung neutral oder sogar positiv wirkt.</w:t>
+      <w:r>
+        <w:t>1.5  Psychisches Wohlbefinden und Suchtverhalten</w:t>
+      </w:r>
+    </w:p>
+    <w:p>
+      <w:pPr>
+        <w:spacing w:after="160" w:line="360" w:lineRule="auto"/>
+      </w:pPr>
+      <w:r>
+        <w:t>Die Folgen für das individuelle Wohlbefinden sind inzwischen empirisch vielfach untersucht. Verduyn et al. (2015) zeigen in einer experimentellen und längsschnittlichen Studie, dass passive Facebook-Nutzung (Konsumieren ohne aktive Teilnahme) das affektive Wohlbefinden nachweislich untergräbt, während aktive, kommunikative Nutzung neutral oder sogar positiv wirkt.</w:t>
       </w:r>
     </w:p>
     <w:p>
@@ -463,13 +346,8 @@
       <w:pPr>
         <w:pStyle w:val="berschrift2"/>
       </w:pPr>
-      <w:proofErr w:type="gramStart"/>
-      <w:r>
-        <w:t>1.6  Verlust</w:t>
-      </w:r>
-      <w:proofErr w:type="gramEnd"/>
-      <w:r>
-        <w:t xml:space="preserve"> der Nutzerautonomie</w:t>
+      <w:r>
+        <w:t>1.6  Verlust der Nutzerautonomie</w:t>
       </w:r>
     </w:p>
     <w:p>
@@ -485,36 +363,15 @@
         <w:spacing w:after="160" w:line="360" w:lineRule="auto"/>
       </w:pPr>
       <w:r>
-        <w:t xml:space="preserve">Der theoretische Rahmen für diese Beobachtung, namentlich die Self-Determination Theory (Ryan &amp; Deci, 2000) mit dem Grundbedürfnis nach Autonomie sowie das METUX-Modell für nutzerzentrierte Produktgestaltung (Peters, Calvo &amp; Ryan, 2018), wird in Abschnitt 2.3.1 vertieft. Auf der politisch-systemischen Ebene fordern </w:t>
-      </w:r>
-      <w:proofErr w:type="spellStart"/>
-      <w:r>
-        <w:t>Reviglio</w:t>
-      </w:r>
-      <w:proofErr w:type="spellEnd"/>
-      <w:r>
-        <w:t xml:space="preserve"> und Agosti (2020) eine algorithmische Souveränität, die in Abschnitt 2.3.4 entfaltet wird; Milano, Taddeo und </w:t>
-      </w:r>
-      <w:proofErr w:type="spellStart"/>
-      <w:r>
-        <w:t>Floridi</w:t>
-      </w:r>
-      <w:proofErr w:type="spellEnd"/>
-      <w:r>
-        <w:t xml:space="preserve"> (2020) ergänzen aus Sicht der Empfehlungssystem-Ethik, dass neben Relevanz auch Diversität, Fairness und Nutzerwohl als explizite Optimierungsziele in den Algorithmen verankert werden müssen.</w:t>
+        <w:t>Der theoretische Rahmen für diese Beobachtung, namentlich die Self-Determination Theory (Ryan &amp; Deci, 2000) mit dem Grundbedürfnis nach Autonomie sowie das METUX-Modell für nutzerzentrierte Produktgestaltung (Peters, Calvo &amp; Ryan, 2018), wird in Abschnitt 2.3.1 vertieft. Auf der politisch-systemischen Ebene fordern Reviglio und Agosti (2020) eine algorithmische Souveränität, die in Abschnitt 2.3.4 entfaltet wird; Milano, Taddeo und Floridi (2020) ergänzen aus Sicht der Empfehlungssystem-Ethik, dass neben Relevanz auch Diversität, Fairness und Nutzerwohl als explizite Optimierungsziele in den Algorithmen verankert werden müssen.</w:t>
       </w:r>
     </w:p>
     <w:p>
       <w:pPr>
         <w:pStyle w:val="berschrift2"/>
       </w:pPr>
-      <w:proofErr w:type="gramStart"/>
-      <w:r>
-        <w:t>1.7  Zwischenfazit</w:t>
-      </w:r>
-      <w:proofErr w:type="gramEnd"/>
-      <w:r>
-        <w:t>: Der Kern des Problems</w:t>
+      <w:r>
+        <w:t>1.7  Zwischenfazit: Der Kern des Problems</w:t>
       </w:r>
     </w:p>
     <w:p>
@@ -523,8 +380,6 @@
       </w:pPr>
       <w:r>
         <w:t xml:space="preserve">Das Problem sozialer Medien ist nicht die Personalisierung an sich. Personalisierung kann ein wertvolles Instrument sein, um Inhalte für einzelne Menschen relevant und bereichernd zu machen. Problematisch ist die einseitige Ausrichtung der Personalisierung auf die Ziele der Anbieter: Plattformen, die ursprünglich als Werkzeuge zur Information, Vernetzung und </w:t>
-      </w:r>
-      <w:r>
         <w:lastRenderedPageBreak/>
         <w:t>Unterhaltung gedacht waren, haben sich zu Systemen entwickelt, die primär ihre eigene Nutzungszeit maximieren, häufig auf Kosten der Nutzenden.</w:t>
       </w:r>
@@ -534,39 +389,7 @@
         <w:spacing w:after="160" w:line="360" w:lineRule="auto"/>
       </w:pPr>
       <w:r>
-        <w:t>Die Forschungslage zeigt drei miteinander verwobene Aspekte dieses Ungleichgewichts. Erstens ist es kein Zufall, sondern strukturell im werbefinanzierten Geschäftsmodell angelegt (</w:t>
-      </w:r>
-      <w:proofErr w:type="spellStart"/>
-      <w:r>
-        <w:t>Zuboff</w:t>
-      </w:r>
-      <w:proofErr w:type="spellEnd"/>
-      <w:r>
-        <w:t xml:space="preserve">, 2019; Montag &amp; </w:t>
-      </w:r>
-      <w:proofErr w:type="spellStart"/>
-      <w:r>
-        <w:t>Elhai</w:t>
-      </w:r>
-      <w:proofErr w:type="spellEnd"/>
-      <w:r>
-        <w:t xml:space="preserve">, 2023). Zweitens hat es messbare negative Folgen auf Informationsvielfalt, soziale Kohäsion und individuelles Wohlbefinden (Nguyen et al., 2014; Geschke et al., 2019; </w:t>
-      </w:r>
-      <w:proofErr w:type="spellStart"/>
-      <w:r>
-        <w:t>Verduyn</w:t>
-      </w:r>
-      <w:proofErr w:type="spellEnd"/>
-      <w:r>
-        <w:t xml:space="preserve"> et al., 2015; Orben, 2020). Drittens verfügen Nutzende in den aktuellen Systemen kaum über die Möglichkeit, dieses Ungleichgewicht selbst zu korrigieren (</w:t>
-      </w:r>
-      <w:proofErr w:type="spellStart"/>
-      <w:r>
-        <w:t>Reviglio</w:t>
-      </w:r>
-      <w:proofErr w:type="spellEnd"/>
-      <w:r>
-        <w:t xml:space="preserve"> &amp; Agosti, 2020; Milano et al., 2020).</w:t>
+        <w:t>Die Forschungslage zeigt drei miteinander verwobene Aspekte dieses Ungleichgewichts. Erstens ist es kein Zufall, sondern strukturell im werbefinanzierten Geschäftsmodell angelegt (Zuboff, 2019; Montag &amp; Elhai, 2023). Zweitens hat es messbare negative Folgen auf Informationsvielfalt, soziale Kohäsion und individuelles Wohlbefinden (Nguyen et al., 2014; Geschke et al., 2019; Verduyn et al., 2015; Orben, 2020). Drittens verfügen Nutzende in den aktuellen Systemen kaum über die Möglichkeit, dieses Ungleichgewicht selbst zu korrigieren (Reviglio &amp; Agosti, 2020; Milano et al., 2020).</w:t>
       </w:r>
     </w:p>
     <w:p>
@@ -582,12 +405,10 @@
         <w:pStyle w:val="berschrift1"/>
         <w:pageBreakBefore/>
       </w:pPr>
-      <w:proofErr w:type="gramStart"/>
       <w:r>
         <w:lastRenderedPageBreak/>
         <w:t>2  Background</w:t>
       </w:r>
-      <w:proofErr w:type="gramEnd"/>
     </w:p>
     <w:p>
       <w:pPr>
@@ -601,24 +422,17 @@
       <w:pPr>
         <w:pStyle w:val="berschrift2"/>
       </w:pPr>
-      <w:proofErr w:type="gramStart"/>
-      <w:r>
-        <w:t>2.1  Bedürfnisse</w:t>
-      </w:r>
-      <w:proofErr w:type="gramEnd"/>
-      <w:r>
-        <w:t xml:space="preserve"> und Motivationen der Akteure</w:t>
+      <w:r>
+        <w:t>2.1  Bedürfnisse und Motivationen der Akteure</w:t>
       </w:r>
     </w:p>
     <w:p>
       <w:pPr>
         <w:pStyle w:val="berschrift3"/>
       </w:pPr>
-      <w:proofErr w:type="gramStart"/>
       <w:r>
         <w:t>2.1.1  Anbieterseite</w:t>
       </w:r>
-      <w:proofErr w:type="gramEnd"/>
     </w:p>
     <w:p>
       <w:pPr>
@@ -638,23 +452,7 @@
         <w:spacing w:after="80" w:line="360" w:lineRule="auto"/>
       </w:pPr>
       <w:r>
-        <w:t xml:space="preserve">Kommerzielle Plattformen (TikTok, </w:t>
-      </w:r>
-      <w:proofErr w:type="spellStart"/>
-      <w:r>
-        <w:t>Meta</w:t>
-      </w:r>
-      <w:proofErr w:type="spellEnd"/>
-      <w:r>
-        <w:t>, YouTube, X) finanzieren sich primär werbebasiert. Ihr zentrales Geschäftsziel ist die Maximierung von Aufmerksamkeit und Datenspuren, die an Werbetreibende weiterverkauft werden (</w:t>
-      </w:r>
-      <w:proofErr w:type="spellStart"/>
-      <w:r>
-        <w:t>Zuboff</w:t>
-      </w:r>
-      <w:proofErr w:type="spellEnd"/>
-      <w:r>
-        <w:t>, 2019).</w:t>
+        <w:t>Kommerzielle Plattformen (TikTok, Meta, YouTube, X) finanzieren sich primär werbebasiert. Ihr zentrales Geschäftsziel ist die Maximierung von Aufmerksamkeit und Datenspuren, die an Werbetreibende weiterverkauft werden (Zuboff, 2019).</w:t>
       </w:r>
     </w:p>
     <w:p>
@@ -695,42 +493,16 @@
       <w:pPr>
         <w:pStyle w:val="berschrift3"/>
       </w:pPr>
-      <w:proofErr w:type="gramStart"/>
       <w:r>
         <w:t>2.1.2  Nutzerseite</w:t>
       </w:r>
-      <w:proofErr w:type="gramEnd"/>
-    </w:p>
-    <w:p>
-      <w:pPr>
-        <w:spacing w:after="160" w:line="360" w:lineRule="auto"/>
-      </w:pPr>
-      <w:r>
-        <w:t xml:space="preserve">Auf der Nutzerseite lassen sich die in Abschnitt 1.1 genannten Motive entlang etablierter theoretischer Rahmen ordnen. Aus dem </w:t>
-      </w:r>
-      <w:proofErr w:type="spellStart"/>
-      <w:r>
-        <w:t>Uses</w:t>
-      </w:r>
-      <w:proofErr w:type="spellEnd"/>
-      <w:r>
-        <w:t>-and-</w:t>
-      </w:r>
-      <w:proofErr w:type="spellStart"/>
-      <w:r>
-        <w:t>Gratifications</w:t>
-      </w:r>
-      <w:proofErr w:type="spellEnd"/>
-      <w:r>
-        <w:t xml:space="preserve">-Ansatz (Katz, </w:t>
-      </w:r>
-      <w:proofErr w:type="spellStart"/>
-      <w:r>
-        <w:t>Blumler</w:t>
-      </w:r>
-      <w:proofErr w:type="spellEnd"/>
-      <w:r>
-        <w:t xml:space="preserve"> &amp; Gurevitch, 1973) ergeben sich vier typische Nutzungsmotive: Information, Unterhaltung, soziale Interaktion und Identitätsbildung.</w:t>
+    </w:p>
+    <w:p>
+      <w:pPr>
+        <w:spacing w:after="160" w:line="360" w:lineRule="auto"/>
+      </w:pPr>
+      <w:r>
+        <w:t>Auf der Nutzerseite lassen sich die in Abschnitt 1.1 genannten Motive entlang etablierter theoretischer Rahmen ordnen. Aus dem Uses-and-Gratifications-Ansatz (Katz, Blumler &amp; Gurevitch, 1973) ergeben sich vier typische Nutzungsmotive: Information, Unterhaltung, soziale Interaktion und Identitätsbildung.</w:t>
       </w:r>
     </w:p>
     <w:p>
@@ -786,15 +558,7 @@
         <w:spacing w:after="160" w:line="360" w:lineRule="auto"/>
       </w:pPr>
       <w:r>
-        <w:t xml:space="preserve">Peters, Calvo und Ryan (2018) übertragen diese Perspektive im METUX-Modell (Motivation, Engagement and </w:t>
-      </w:r>
-      <w:proofErr w:type="spellStart"/>
-      <w:r>
-        <w:t>Thriving</w:t>
-      </w:r>
-      <w:proofErr w:type="spellEnd"/>
-      <w:r>
-        <w:t xml:space="preserve"> in User Experience) direkt auf die Gestaltung digitaler Produkte: Ein System fördert Wohlbefinden, wenn es diese Grundbedürfnisse auf mehreren Ebenen (Adoption, Benutzeroberfläche, Aufgabe, Verhalten, Leben) unterstützt, und untergräbt es, wenn es sie blockiert. Dieses Modell wird in Abschnitt 2.3.1 als zentrale Beurteilungsgrundlage erneut aufgegriffen.</w:t>
+        <w:t>Peters, Calvo und Ryan (2018) übertragen diese Perspektive im METUX-Modell (Motivation, Engagement and Thriving in User Experience) direkt auf die Gestaltung digitaler Produkte: Ein System fördert Wohlbefinden, wenn es diese Grundbedürfnisse auf mehreren Ebenen (Adoption, Benutzeroberfläche, Aufgabe, Verhalten, Leben) unterstützt, und untergräbt es, wenn es sie blockiert. Dieses Modell wird in Abschnitt 2.3.1 als zentrale Beurteilungsgrundlage erneut aufgegriffen.</w:t>
       </w:r>
     </w:p>
     <w:p>
@@ -809,13 +573,8 @@
       <w:pPr>
         <w:pStyle w:val="berschrift2"/>
       </w:pPr>
-      <w:proofErr w:type="gramStart"/>
-      <w:r>
-        <w:t>2.2  Mechanismen</w:t>
-      </w:r>
-      <w:proofErr w:type="gramEnd"/>
-      <w:r>
-        <w:t xml:space="preserve"> digitaler Medienangebote</w:t>
+      <w:r>
+        <w:t>2.2  Mechanismen digitaler Medienangebote</w:t>
       </w:r>
     </w:p>
     <w:p>
@@ -830,40 +589,25 @@
       <w:pPr>
         <w:pStyle w:val="berschrift3"/>
       </w:pPr>
-      <w:proofErr w:type="gramStart"/>
-      <w:r>
-        <w:t>2.2.1  Klassifikation</w:t>
-      </w:r>
-      <w:proofErr w:type="gramEnd"/>
-      <w:r>
-        <w:t xml:space="preserve"> und Ontologien</w:t>
-      </w:r>
-    </w:p>
-    <w:p>
-      <w:pPr>
-        <w:spacing w:after="160" w:line="360" w:lineRule="auto"/>
-      </w:pPr>
-      <w:r>
-        <w:t xml:space="preserve">Inhalte müssen strukturiert werden, damit sie auffindbar und </w:t>
-      </w:r>
-      <w:proofErr w:type="spellStart"/>
-      <w:r>
-        <w:t>empfehlbar</w:t>
-      </w:r>
-      <w:proofErr w:type="spellEnd"/>
-      <w:r>
-        <w:t xml:space="preserve"> sind. Klassifikationssysteme ordnen Inhalte entlang festgelegter Kategorien (Genre, Thema, Stimmung, Zielgruppe). Ontologien gehen darüber hinaus und modellieren semantische Beziehungen zwischen Konzepten, etwa die Zugehörigkeit von Subgenres zu Obergenres oder Ähnlichkeiten zwischen Themen. Auf der Nutzerseite werden analoge Strukturen verwendet, um Interessensprofile explizit oder implizit zu repräsentieren. Die Qualität dieser Strukturen prägt massgeblich die Qualität späterer Empfehlungen.</w:t>
+      <w:r>
+        <w:t>2.2.1  Klassifikation und Ontologien</w:t>
+      </w:r>
+    </w:p>
+    <w:p>
+      <w:pPr>
+        <w:spacing w:after="160" w:line="360" w:lineRule="auto"/>
+      </w:pPr>
+      <w:r>
+        <w:t>Inhalte müssen strukturiert werden, damit sie auffindbar und empfehlbar sind. Klassifikationssysteme ordnen Inhalte entlang festgelegter Kategorien (Genre, Thema, Stimmung, Zielgruppe). Ontologien gehen darüber hinaus und modellieren semantische Beziehungen zwischen Konzepten, etwa die Zugehörigkeit von Subgenres zu Obergenres oder Ähnlichkeiten zwischen Themen. Auf der Nutzerseite werden analoge Strukturen verwendet, um Interessensprofile explizit oder implizit zu repräsentieren. Die Qualität dieser Strukturen prägt massgeblich die Qualität späterer Empfehlungen.</w:t>
       </w:r>
     </w:p>
     <w:p>
       <w:pPr>
         <w:pStyle w:val="berschrift3"/>
       </w:pPr>
-      <w:proofErr w:type="gramStart"/>
       <w:r>
         <w:t>2.2.2  Suche</w:t>
       </w:r>
-      <w:proofErr w:type="gramEnd"/>
     </w:p>
     <w:p>
       <w:pPr>
@@ -871,57 +615,23 @@
       </w:pPr>
       <w:r>
         <w:lastRenderedPageBreak/>
-        <w:t xml:space="preserve">Suchmechanismen sind der klassische aktive Zugang zu Inhalten: Die Nutzenden formulieren eine Anfrage, das System liefert eine Ergebnisliste. Die Relevanzbewertung basiert historisch auf </w:t>
-      </w:r>
-      <w:proofErr w:type="spellStart"/>
-      <w:r>
-        <w:t>Textmatching</w:t>
-      </w:r>
-      <w:proofErr w:type="spellEnd"/>
-      <w:r>
-        <w:t xml:space="preserve"> und Linkstrukturen, zunehmend auch auf semantischen </w:t>
-      </w:r>
-      <w:proofErr w:type="spellStart"/>
-      <w:r>
-        <w:t>Embeddings</w:t>
-      </w:r>
-      <w:proofErr w:type="spellEnd"/>
-      <w:r>
-        <w:t xml:space="preserve"> und personalisierten Signalen. Suche </w:t>
-      </w:r>
-      <w:proofErr w:type="gramStart"/>
-      <w:r>
-        <w:t>ist vergleichsweise</w:t>
-      </w:r>
-      <w:proofErr w:type="gramEnd"/>
-      <w:r>
-        <w:t xml:space="preserve"> transparent, da die Intention von den Nutzenden formuliert wird. Zugleich wächst die Intransparenz dort, wo Personalisierung die Trefferlisten unsichtbar verändert.</w:t>
+        <w:t>Suchmechanismen sind der klassische aktive Zugang zu Inhalten: Die Nutzenden formulieren eine Anfrage, das System liefert eine Ergebnisliste. Die Relevanzbewertung basiert historisch auf Textmatching und Linkstrukturen, zunehmend auch auf semantischen Embeddings und personalisierten Signalen. Suche ist vergleichsweise transparent, da die Intention von den Nutzenden formuliert wird. Zugleich wächst die Intransparenz dort, wo Personalisierung die Trefferlisten unsichtbar verändert.</w:t>
       </w:r>
     </w:p>
     <w:p>
       <w:pPr>
         <w:pStyle w:val="berschrift3"/>
       </w:pPr>
-      <w:proofErr w:type="gramStart"/>
       <w:r>
         <w:t>2.2.3  Empfehlungssysteme</w:t>
       </w:r>
-      <w:proofErr w:type="gramEnd"/>
-    </w:p>
-    <w:p>
-      <w:pPr>
-        <w:spacing w:after="160" w:line="360" w:lineRule="auto"/>
-      </w:pPr>
-      <w:r>
-        <w:t>Empfehlungssysteme (</w:t>
-      </w:r>
-      <w:proofErr w:type="spellStart"/>
-      <w:r>
-        <w:t>Recommender</w:t>
-      </w:r>
-      <w:proofErr w:type="spellEnd"/>
-      <w:r>
-        <w:t xml:space="preserve"> Systems) schlagen Inhalte vor, ohne dass die Nutzenden aktiv danach suchen. In der Standardliteratur werden drei klassische Hauptparadigmen unterschieden (Ricci, Rokach &amp; Shapira, 2015):</w:t>
+    </w:p>
+    <w:p>
+      <w:pPr>
+        <w:spacing w:after="160" w:line="360" w:lineRule="auto"/>
+      </w:pPr>
+      <w:r>
+        <w:t>Empfehlungssysteme (Recommender Systems) schlagen Inhalte vor, ohne dass die Nutzenden aktiv danach suchen. In der Standardliteratur werden drei klassische Hauptparadigmen unterschieden (Ricci, Rokach &amp; Shapira, 2015):</w:t>
       </w:r>
     </w:p>
     <w:p>
@@ -960,73 +670,39 @@
         <w:spacing w:after="80" w:line="360" w:lineRule="auto"/>
       </w:pPr>
       <w:r>
-        <w:t xml:space="preserve">Hybride und Deep-Learning-basierte Ansätze: Kombination der obigen Verfahren mit impliziten Signalen (Verweildauer, </w:t>
-      </w:r>
-      <w:proofErr w:type="spellStart"/>
-      <w:r>
-        <w:t>Scrolltiefe</w:t>
-      </w:r>
-      <w:proofErr w:type="spellEnd"/>
-      <w:r>
-        <w:t>, Wiederholungen) und tiefen neuronalen Modellen, wie sie in Feeds von TikTok oder Instagram dominieren.</w:t>
-      </w:r>
-    </w:p>
-    <w:p>
-      <w:pPr>
-        <w:spacing w:after="160" w:line="360" w:lineRule="auto"/>
-      </w:pPr>
-      <w:r>
-        <w:t xml:space="preserve">Die Optimierung erfolgt in der kommerziellen Praxis überwiegend auf Engagement-Metriken. Nguyen et al. (2014) zeigen, dass dies zur Einengung der inhaltlichen Vielfalt führt. Milano, Taddeo und </w:t>
-      </w:r>
-      <w:proofErr w:type="spellStart"/>
-      <w:r>
-        <w:t>Floridi</w:t>
-      </w:r>
-      <w:proofErr w:type="spellEnd"/>
-      <w:r>
-        <w:t xml:space="preserve"> (2020) systematisieren die daraus folgenden ethischen Herausforderungen entlang sechs Dimensionen: Inhaltsqualität, Privatsphäre, Autonomie, Meinungsvielfalt, soziale Auswirkungen und Verantwortlichkeit.</w:t>
+        <w:t>Hybride und Deep-Learning-basierte Ansätze: Kombination der obigen Verfahren mit impliziten Signalen (Verweildauer, Scrolltiefe, Wiederholungen) und tiefen neuronalen Modellen, wie sie in Feeds von TikTok oder Instagram dominieren.</w:t>
+      </w:r>
+    </w:p>
+    <w:p>
+      <w:pPr>
+        <w:spacing w:after="160" w:line="360" w:lineRule="auto"/>
+      </w:pPr>
+      <w:r>
+        <w:t>Die Optimierung erfolgt in der kommerziellen Praxis überwiegend auf Engagement-Metriken. Nguyen et al. (2014) zeigen, dass dies zur Einengung der inhaltlichen Vielfalt führt. Milano, Taddeo und Floridi (2020) systematisieren die daraus folgenden ethischen Herausforderungen entlang sechs Dimensionen: Inhaltsqualität, Privatsphäre, Autonomie, Meinungsvielfalt, soziale Auswirkungen und Verantwortlichkeit.</w:t>
       </w:r>
     </w:p>
     <w:p>
       <w:pPr>
         <w:pStyle w:val="berschrift3"/>
       </w:pPr>
-      <w:proofErr w:type="gramStart"/>
-      <w:r>
-        <w:t>2.2.4  Personalisierung</w:t>
-      </w:r>
-      <w:proofErr w:type="gramEnd"/>
-      <w:r>
-        <w:t xml:space="preserve"> und Feed-Kuration</w:t>
-      </w:r>
-    </w:p>
-    <w:p>
-      <w:pPr>
-        <w:spacing w:after="160" w:line="360" w:lineRule="auto"/>
-      </w:pPr>
-      <w:r>
-        <w:t xml:space="preserve">Über die reine Empfehlung hinaus kuratieren Plattformen ganze Feeds, also ständig aktualisierte Inhaltsströme, die auf die einzelne Person zugeschnitten sind. Die Entscheidungslogik ist typischerweise nicht einsehbar: Das, was die Nutzenden sehen, ist das Ergebnis tausender implizit gelernter Signale, deren genaues Zusammenspiel selbst die Entwicklerinnen und Entwickler oft nur noch approximativ beschreiben können. </w:t>
-      </w:r>
-      <w:proofErr w:type="spellStart"/>
-      <w:r>
-        <w:t>Reviglio</w:t>
-      </w:r>
-      <w:proofErr w:type="spellEnd"/>
-      <w:r>
-        <w:t xml:space="preserve"> und Agosti (2020) fordern in diesem Zusammenhang eine algorithmische Souveränität: die Möglichkeit, die Logiken zu verstehen, zu modifizieren und bewusst zu steuern.</w:t>
+      <w:r>
+        <w:t>2.2.4  Personalisierung und Feed-Kuration</w:t>
+      </w:r>
+    </w:p>
+    <w:p>
+      <w:pPr>
+        <w:spacing w:after="160" w:line="360" w:lineRule="auto"/>
+      </w:pPr>
+      <w:r>
+        <w:t>Über die reine Empfehlung hinaus kuratieren Plattformen ganze Feeds, also ständig aktualisierte Inhaltsströme, die auf die einzelne Person zugeschnitten sind. Die Entscheidungslogik ist typischerweise nicht einsehbar: Das, was die Nutzenden sehen, ist das Ergebnis tausender implizit gelernter Signale, deren genaues Zusammenspiel selbst die Entwicklerinnen und Entwickler oft nur noch approximativ beschreiben können. Reviglio und Agosti (2020) fordern in diesem Zusammenhang eine algorithmische Souveränität: die Möglichkeit, die Logiken zu verstehen, zu modifizieren und bewusst zu steuern.</w:t>
       </w:r>
     </w:p>
     <w:p>
       <w:pPr>
         <w:pStyle w:val="berschrift3"/>
       </w:pPr>
-      <w:proofErr w:type="gramStart"/>
-      <w:r>
-        <w:t>2.2.5  Sharing</w:t>
-      </w:r>
-      <w:proofErr w:type="gramEnd"/>
-      <w:r>
-        <w:t xml:space="preserve"> und soziale Mechanismen</w:t>
+      <w:r>
+        <w:t>2.2.5  Sharing und soziale Mechanismen</w:t>
       </w:r>
     </w:p>
     <w:p>
@@ -1035,8 +711,6 @@
       </w:pPr>
       <w:r>
         <w:t xml:space="preserve">Teilen, Kommentieren und Reagieren erzeugen Netzwerkeffekte: Inhalte verbreiten sich viral, wenn sie starke emotionale Reaktionen auslösen. Diese Mechanismen sind nicht neutral, sondern begünstigen systematisch emotional aufgeladene, oft polarisierende Inhalte </w:t>
-      </w:r>
-      <w:r>
         <w:lastRenderedPageBreak/>
         <w:t>und wirken damit auf die in Abschnitt 1.4 beschriebene Triple-Filter-Bubble (Geschke et al., 2019; Sunstein, 2017).</w:t>
       </w:r>
@@ -1045,13 +719,8 @@
       <w:pPr>
         <w:pStyle w:val="berschrift3"/>
       </w:pPr>
-      <w:proofErr w:type="gramStart"/>
-      <w:r>
-        <w:t>2.2.6  Persuasive</w:t>
-      </w:r>
-      <w:proofErr w:type="gramEnd"/>
-      <w:r>
-        <w:t xml:space="preserve"> Design und Nudging</w:t>
+      <w:r>
+        <w:t>2.2.6  Persuasive Design und Nudging</w:t>
       </w:r>
     </w:p>
     <w:p>
@@ -1074,50 +743,25 @@
       <w:pPr>
         <w:pStyle w:val="berschrift3"/>
       </w:pPr>
-      <w:proofErr w:type="gramStart"/>
-      <w:r>
-        <w:t xml:space="preserve">2.2.7  </w:t>
-      </w:r>
-      <w:proofErr w:type="spellStart"/>
-      <w:r>
-        <w:t>Monetarisierungsmechanismen</w:t>
-      </w:r>
-      <w:proofErr w:type="spellEnd"/>
-      <w:proofErr w:type="gramEnd"/>
-    </w:p>
-    <w:p>
-      <w:pPr>
-        <w:spacing w:after="160" w:line="360" w:lineRule="auto"/>
-      </w:pPr>
-      <w:r>
-        <w:t>Die beschriebenen Mechanismen stehen in unmittelbarer Wechselwirkung mit der Monetarisierung. Werbebasierte Plattformen koppeln Empfehlungen, Feeds und persuasive Muster systematisch an Engagement-Metriken, während abonnementbasierte Anbieter tendenziell auf Retention-Metriken optimieren und öffentlich-rechtliche Anbieter auf Erfüllungskennzahlen wie Reichweite und Vielfalt. Die Wahl der Monetarisierung prägt damit das Verhalten der Mechanismen ebenso stark wie ihre technische Architektur (</w:t>
-      </w:r>
-      <w:proofErr w:type="spellStart"/>
-      <w:r>
-        <w:t>Zuboff</w:t>
-      </w:r>
-      <w:proofErr w:type="spellEnd"/>
-      <w:r>
-        <w:t xml:space="preserve">, 2019; Montag &amp; </w:t>
-      </w:r>
-      <w:proofErr w:type="spellStart"/>
-      <w:r>
-        <w:t>Elhai</w:t>
-      </w:r>
-      <w:proofErr w:type="spellEnd"/>
-      <w:r>
-        <w:t>, 2023).</w:t>
+      <w:r>
+        <w:t>2.2.7  Monetarisierungsmechanismen</w:t>
+      </w:r>
+    </w:p>
+    <w:p>
+      <w:pPr>
+        <w:spacing w:after="160" w:line="360" w:lineRule="auto"/>
+      </w:pPr>
+      <w:r>
+        <w:t>Die beschriebenen Mechanismen stehen in unmittelbarer Wechselwirkung mit der Monetarisierung. Werbebasierte Plattformen koppeln Empfehlungen, Feeds und persuasive Muster systematisch an Engagement-Metriken, während abonnementbasierte Anbieter tendenziell auf Retention-Metriken optimieren und öffentlich-rechtliche Anbieter auf Erfüllungskennzahlen wie Reichweite und Vielfalt. Die Wahl der Monetarisierung prägt damit das Verhalten der Mechanismen ebenso stark wie ihre technische Architektur (Zuboff, 2019; Montag &amp; Elhai, 2023).</w:t>
       </w:r>
     </w:p>
     <w:p>
       <w:pPr>
         <w:pStyle w:val="berschrift2"/>
       </w:pPr>
-      <w:proofErr w:type="gramStart"/>
       <w:r>
         <w:t>2.3  Beurteilungsgrundlagen</w:t>
       </w:r>
-      <w:proofErr w:type="gramEnd"/>
     </w:p>
     <w:p>
       <w:pPr>
@@ -1131,13 +775,8 @@
       <w:pPr>
         <w:pStyle w:val="berschrift3"/>
       </w:pPr>
-      <w:proofErr w:type="gramStart"/>
-      <w:r>
-        <w:t>2.3.1  Self</w:t>
-      </w:r>
-      <w:proofErr w:type="gramEnd"/>
-      <w:r>
-        <w:t>-Determination Theory (SDT)</w:t>
+      <w:r>
+        <w:t>2.3.1  Self-Determination Theory (SDT)</w:t>
       </w:r>
     </w:p>
     <w:p>
@@ -1146,8 +785,6 @@
       </w:pPr>
       <w:r>
         <w:t xml:space="preserve">Die Self-Determination Theory (Ryan &amp; Deci, 2000) liefert mit den drei psychologischen Grundbedürfnissen Autonomie, Kompetenz und soziale Eingebundenheit einen psychologischen Massstab für die Beurteilung digitaler Systeme. Mechanismen sind </w:t>
-      </w:r>
-      <w:r>
         <w:lastRenderedPageBreak/>
         <w:t>förderlich, wenn sie diese Bedürfnisse unterstützen, und schädlich, wenn sie sie untergraben. Insbesondere die Autonomie wird in den heutigen Plattformlogiken systematisch unterlaufen, wenn Nutzende durch manipulative Designmuster in Nutzungsschleifen gehalten werden (Peters, Calvo &amp; Ryan, 2018).</w:t>
       </w:r>
@@ -1157,28 +794,15 @@
         <w:spacing w:after="160" w:line="360" w:lineRule="auto"/>
       </w:pPr>
       <w:r>
-        <w:t xml:space="preserve">Peters et al. (2018) operationalisieren die SDT für die Gestaltung digitaler Produkte im METUX-Modell (Motivation, Engagement and </w:t>
-      </w:r>
-      <w:proofErr w:type="spellStart"/>
-      <w:r>
-        <w:t>Thriving</w:t>
-      </w:r>
-      <w:proofErr w:type="spellEnd"/>
-      <w:r>
-        <w:t xml:space="preserve"> in User Experience). METUX unterscheidet fünf Ebenen, auf denen ein System die Grundbedürfnisse fördern oder hemmen kann: Adoption, Interface, Aufgabe, Verhalten und Leben. Diese mehrstufige Sicht erlaubt es, Designentscheidungen differenziert daraufhin zu prüfen, ob sie das Wohlbefinden auf der unmittelbaren Bedienebene und zugleich auf der übergeordneten Ebene des Lebensvollzugs unterstützen.</w:t>
+        <w:t>Peters et al. (2018) operationalisieren die SDT für die Gestaltung digitaler Produkte im METUX-Modell (Motivation, Engagement and Thriving in User Experience). METUX unterscheidet fünf Ebenen, auf denen ein System die Grundbedürfnisse fördern oder hemmen kann: Adoption, Interface, Aufgabe, Verhalten und Leben. Diese mehrstufige Sicht erlaubt es, Designentscheidungen differenziert daraufhin zu prüfen, ob sie das Wohlbefinden auf der unmittelbaren Bedienebene und zugleich auf der übergeordneten Ebene des Lebensvollzugs unterstützen.</w:t>
       </w:r>
     </w:p>
     <w:p>
       <w:pPr>
         <w:pStyle w:val="berschrift3"/>
       </w:pPr>
-      <w:proofErr w:type="gramStart"/>
-      <w:r>
-        <w:t>2.3.2  Value</w:t>
-      </w:r>
-      <w:proofErr w:type="gramEnd"/>
-      <w:r>
-        <w:t>-Sensitive Design (VSD)</w:t>
+      <w:r>
+        <w:t>2.3.2  Value-Sensitive Design (VSD)</w:t>
       </w:r>
     </w:p>
     <w:p>
@@ -1193,68 +817,32 @@
       <w:pPr>
         <w:pStyle w:val="berschrift3"/>
       </w:pPr>
-      <w:proofErr w:type="gramStart"/>
-      <w:r>
-        <w:t>2.3.3  Digital</w:t>
-      </w:r>
-      <w:proofErr w:type="gramEnd"/>
-      <w:r>
-        <w:t xml:space="preserve"> Wellbeing</w:t>
-      </w:r>
-    </w:p>
-    <w:p>
-      <w:pPr>
-        <w:spacing w:after="160" w:line="360" w:lineRule="auto"/>
-      </w:pPr>
-      <w:r>
-        <w:t xml:space="preserve">Digital Wellbeing beschreibt die Qualität des Medienkonsums aus Perspektive der Nutzenden. Calvo und Peters (2014) haben mit dem Ansatz des «Positive Computing» die grundlegende Forderung formuliert, dass digitale Systeme aktiv das menschliche Wohlbefinden und Aufblühen fördern sollen, statt es nur zu vermeiden, Schaden zu verursachen. Vanden Abeele (2021) betont ergänzend den dynamischen Charakter von Digital Wellbeing: Wellbeing ist keine absolute Grösse, sondern eine kontextabhängige Balance. Burr, Taddeo und </w:t>
-      </w:r>
-      <w:proofErr w:type="spellStart"/>
-      <w:r>
-        <w:t>Floridi</w:t>
-      </w:r>
-      <w:proofErr w:type="spellEnd"/>
-      <w:r>
-        <w:t xml:space="preserve"> (2020) fordern, dass Technologiedesign aktiv zum Wohlbefinden beitragen </w:t>
-      </w:r>
-      <w:proofErr w:type="gramStart"/>
-      <w:r>
-        <w:t>soll</w:t>
-      </w:r>
-      <w:proofErr w:type="gramEnd"/>
-      <w:r>
-        <w:t xml:space="preserve"> statt es zu untergraben, und entwickeln dafür einen thematischen Ordnungsrahmen. Peters, Ahmadpour und Calvo (2020) konkretisieren diesen Anspruch in einem Framework für Wellbeing-Supportive Design, das Features, Charakteristika und Prototypen systematisch katalogisiert.</w:t>
+      <w:r>
+        <w:t>2.3.3  Digital Wellbeing</w:t>
+      </w:r>
+    </w:p>
+    <w:p>
+      <w:pPr>
+        <w:spacing w:after="160" w:line="360" w:lineRule="auto"/>
+      </w:pPr>
+      <w:r>
+        <w:t>Digital Wellbeing beschreibt die Qualität des Medienkonsums aus Perspektive der Nutzenden. Calvo und Peters (2014) haben mit dem Ansatz des «Positive Computing» die grundlegende Forderung formuliert, dass digitale Systeme aktiv das menschliche Wohlbefinden und Aufblühen fördern sollen, statt es nur zu vermeiden, Schaden zu verursachen. Vanden Abeele (2021) betont ergänzend den dynamischen Charakter von Digital Wellbeing: Wellbeing ist keine absolute Grösse, sondern eine kontextabhängige Balance. Burr, Taddeo und Floridi (2020) fordern, dass Technologiedesign aktiv zum Wohlbefinden beitragen soll statt es zu untergraben, und entwickeln dafür einen thematischen Ordnungsrahmen. Peters, Ahmadpour und Calvo (2020) konkretisieren diesen Anspruch in einem Framework für Wellbeing-Supportive Design, das Features, Charakteristika und Prototypen systematisch katalogisiert.</w:t>
       </w:r>
     </w:p>
     <w:p>
       <w:pPr>
         <w:pStyle w:val="berschrift3"/>
       </w:pPr>
-      <w:proofErr w:type="gramStart"/>
-      <w:r>
-        <w:t>2.3.4  Ethik</w:t>
-      </w:r>
-      <w:proofErr w:type="gramEnd"/>
-      <w:r>
-        <w:t xml:space="preserve"> von Empfehlungssystemen und algorithmische Souveränität</w:t>
-      </w:r>
-    </w:p>
-    <w:p>
-      <w:pPr>
-        <w:spacing w:after="160" w:line="360" w:lineRule="auto"/>
-      </w:pPr>
-      <w:r>
-        <w:t xml:space="preserve">Milano et al. (2020) systematisieren die ethischen Herausforderungen von Empfehlungssystemen und argumentieren, dass neben Relevanz auch Diversität, Fairness und Nutzerwohl als Optimierungsziele verankert werden müssen. </w:t>
-      </w:r>
-      <w:proofErr w:type="spellStart"/>
-      <w:r>
-        <w:t>Reviglio</w:t>
-      </w:r>
-      <w:proofErr w:type="spellEnd"/>
-      <w:r>
-        <w:t xml:space="preserve"> und Agosti (2020) </w:t>
-      </w:r>
-      <w:r>
+      <w:r>
+        <w:t>2.3.4  Ethik von Empfehlungssystemen und algorithmische Souveränität</w:t>
+      </w:r>
+    </w:p>
+    <w:p>
+      <w:pPr>
+        <w:spacing w:after="160" w:line="360" w:lineRule="auto"/>
+      </w:pPr>
+      <w:r>
+        <w:t xml:space="preserve">Milano et al. (2020) systematisieren die ethischen Herausforderungen von Empfehlungssystemen und argumentieren, dass neben Relevanz auch Diversität, Fairness und Nutzerwohl als Optimierungsziele verankert werden müssen. Reviglio und Agosti (2020) </w:t>
         <w:lastRenderedPageBreak/>
         <w:t>ergänzen die politische Dimension und fordern algorithmische Souveränität, also eine echte, bedeutungsvolle Kontrolle über die Algorithmen, die Inhalte kuratieren. Die in Abschnitt 1.6 beobachtete Asymmetrie zwischen System und Nutzenden lässt sich damit nicht nur als individueller Autonomieverlust (SDT), sondern auch als strukturelles Souveränitätsdefizit lesen.</w:t>
       </w:r>
@@ -1263,90 +851,40 @@
       <w:pPr>
         <w:pStyle w:val="berschrift3"/>
       </w:pPr>
-      <w:proofErr w:type="gramStart"/>
-      <w:r>
-        <w:t>2.3.5  Gebrauchstauglichkeit</w:t>
-      </w:r>
-      <w:proofErr w:type="gramEnd"/>
-      <w:r>
-        <w:t xml:space="preserve"> und Akzeptanz</w:t>
-      </w:r>
-    </w:p>
-    <w:p>
-      <w:pPr>
-        <w:spacing w:after="160" w:line="360" w:lineRule="auto"/>
-      </w:pPr>
-      <w:r>
-        <w:t xml:space="preserve">Neben den normativen Kriterien spielt die klassische Gebrauchstauglichkeit eine Rolle. Der System Usability Scale (Brooke, 1996; Bangor, Kortum &amp; Miller, 2008) ist ein etabliertes, kurzes Messinstrument, das die subjektive Usability eines Systems mit zehn Items erhebt und in der vorliegenden Arbeit ergänzend zu den </w:t>
-      </w:r>
-      <w:proofErr w:type="spellStart"/>
-      <w:r>
-        <w:t>wellbeing</w:t>
-      </w:r>
-      <w:proofErr w:type="spellEnd"/>
-      <w:r>
-        <w:t>-bezogenen Massen eingesetzt werden kann.</w:t>
+      <w:r>
+        <w:t>2.3.5  Gebrauchstauglichkeit und Akzeptanz</w:t>
+      </w:r>
+    </w:p>
+    <w:p>
+      <w:pPr>
+        <w:spacing w:after="160" w:line="360" w:lineRule="auto"/>
+      </w:pPr>
+      <w:r>
+        <w:t>Neben den normativen Kriterien spielt die klassische Gebrauchstauglichkeit eine Rolle. Der System Usability Scale (Brooke, 1996; Bangor, Kortum &amp; Miller, 2008) ist ein etabliertes, kurzes Messinstrument, das die subjektive Usability eines Systems mit zehn Items erhebt und in der vorliegenden Arbeit ergänzend zu den wellbeing-bezogenen Massen eingesetzt werden kann.</w:t>
       </w:r>
     </w:p>
     <w:p>
       <w:pPr>
         <w:pStyle w:val="berschrift2"/>
       </w:pPr>
-      <w:proofErr w:type="gramStart"/>
-      <w:r>
-        <w:t>2.4  Gegenüberstellung</w:t>
-      </w:r>
-      <w:proofErr w:type="gramEnd"/>
-      <w:r>
-        <w:t xml:space="preserve"> der Medienmodelle</w:t>
-      </w:r>
-    </w:p>
-    <w:p>
-      <w:pPr>
-        <w:spacing w:after="160" w:line="360" w:lineRule="auto"/>
-      </w:pPr>
-      <w:r>
-        <w:t xml:space="preserve">Die beschriebenen Mechanismen und Kriterien lassen sich entlang von drei idealtypischen Medienmodellen zusammenfassen: einem traditionell-redaktionellen Modell (z. B. öffentlich-rechtliches Radio), einem </w:t>
-      </w:r>
-      <w:proofErr w:type="spellStart"/>
-      <w:r>
-        <w:t>engagement</w:t>
-      </w:r>
-      <w:proofErr w:type="spellEnd"/>
-      <w:r>
-        <w:t xml:space="preserve">-optimierten Modell (z. B. TikTok, Instagram) und einem </w:t>
-      </w:r>
-      <w:proofErr w:type="spellStart"/>
-      <w:r>
-        <w:t>wellbeing</w:t>
-      </w:r>
-      <w:proofErr w:type="spellEnd"/>
-      <w:r>
-        <w:t>-orientierten Modell, das diese Arbeit konzipiert und prototypisch umsetzt.</w:t>
-      </w:r>
-    </w:p>
-    <w:p>
-      <w:pPr>
-        <w:spacing w:after="160" w:line="360" w:lineRule="auto"/>
-      </w:pPr>
-      <w:r>
-        <w:t xml:space="preserve">Die Gegenüberstellung zeigt: Jedes Modell hat spezifische Stärken und Schwächen. Das redaktionelle Modell steht für Qualität und Pluralismus, bietet aber wenig Personalisierung und schlechtere Verfügbarkeit. Das </w:t>
-      </w:r>
-      <w:proofErr w:type="spellStart"/>
-      <w:r>
-        <w:t>engagement</w:t>
-      </w:r>
-      <w:proofErr w:type="spellEnd"/>
-      <w:r>
-        <w:t xml:space="preserve">-optimierte Modell bietet hohe Relevanz und Verfügbarkeit, jedoch um den Preis von Vielfalt, Transparenz und Autonomie. Das </w:t>
-      </w:r>
-      <w:proofErr w:type="spellStart"/>
-      <w:r>
-        <w:t>wellbeing</w:t>
-      </w:r>
-      <w:proofErr w:type="spellEnd"/>
-      <w:r>
-        <w:t>-orientierte Modell versucht, Personalisierung mit Transparenz, Nutzerkontrolle und Qualität zu verbinden, ist aber in der Praxis bisher kaum in durchgängigen Artefakten umgesetzt.</w:t>
+      <w:r>
+        <w:t>2.4  Gegenüberstellung der Medienmodelle</w:t>
+      </w:r>
+    </w:p>
+    <w:p>
+      <w:pPr>
+        <w:spacing w:after="160" w:line="360" w:lineRule="auto"/>
+      </w:pPr>
+      <w:r>
+        <w:t>Die beschriebenen Mechanismen und Kriterien lassen sich entlang von drei idealtypischen Medienmodellen zusammenfassen: einem traditionell-redaktionellen Modell (z. B. öffentlich-rechtliches Radio), einem engagement-optimierten Modell (z. B. TikTok, Instagram) und einem wellbeing-orientierten Modell, das diese Arbeit konzipiert und prototypisch umsetzt.</w:t>
+      </w:r>
+    </w:p>
+    <w:p>
+      <w:pPr>
+        <w:spacing w:after="160" w:line="360" w:lineRule="auto"/>
+      </w:pPr>
+      <w:r>
+        <w:t>Die Gegenüberstellung zeigt: Jedes Modell hat spezifische Stärken und Schwächen. Das redaktionelle Modell steht für Qualität und Pluralismus, bietet aber wenig Personalisierung und schlechtere Verfügbarkeit. Das engagement-optimierte Modell bietet hohe Relevanz und Verfügbarkeit, jedoch um den Preis von Vielfalt, Transparenz und Autonomie. Das wellbeing-orientierte Modell versucht, Personalisierung mit Transparenz, Nutzerkontrolle und Qualität zu verbinden, ist aber in der Praxis bisher kaum in durchgängigen Artefakten umgesetzt.</w:t>
       </w:r>
     </w:p>
     <w:tbl>
@@ -1810,25 +1348,7 @@
                 <w:szCs w:val="20"/>
                 <w:lang w:val="en-US"/>
               </w:rPr>
-              <w:t xml:space="preserve">Minimal (Like/Skip, </w:t>
-            </w:r>
-            <w:proofErr w:type="spellStart"/>
-            <w:r>
-              <w:rPr>
-                <w:sz w:val="20"/>
-                <w:szCs w:val="20"/>
-                <w:lang w:val="en-US"/>
-              </w:rPr>
-              <w:t>Interessen</w:t>
-            </w:r>
-            <w:proofErr w:type="spellEnd"/>
-            <w:r>
-              <w:rPr>
-                <w:sz w:val="20"/>
-                <w:szCs w:val="20"/>
-                <w:lang w:val="en-US"/>
-              </w:rPr>
-              <w:t>-Tagging)</w:t>
+              <w:t>Minimal (Like/Skip, Interessen-Tagging)</w:t>
             </w:r>
           </w:p>
         </w:tc>
@@ -1909,7 +1429,6 @@
             </w:tcMar>
           </w:tcPr>
           <w:p>
-            <w:proofErr w:type="spellStart"/>
             <w:r>
               <w:rPr>
                 <w:sz w:val="20"/>
@@ -1917,7 +1436,6 @@
               </w:rPr>
               <w:t>Pluralismusauftrag</w:t>
             </w:r>
-            <w:proofErr w:type="spellEnd"/>
           </w:p>
         </w:tc>
         <w:tc>
@@ -2315,34 +1833,16 @@
       <w:pPr>
         <w:pStyle w:val="berschrift2"/>
       </w:pPr>
-      <w:proofErr w:type="gramStart"/>
       <w:r>
         <w:t>2.5  Forschungslücke</w:t>
       </w:r>
-      <w:proofErr w:type="gramEnd"/>
-    </w:p>
-    <w:p>
-      <w:pPr>
-        <w:spacing w:after="160" w:line="360" w:lineRule="auto"/>
-      </w:pPr>
-      <w:r>
-        <w:t xml:space="preserve">Aus der Literatur wird deutlich, dass die theoretischen Grundlagen für eine nutzerzentrierte, </w:t>
-      </w:r>
-      <w:proofErr w:type="spellStart"/>
-      <w:r>
-        <w:t>wellbeing</w:t>
-      </w:r>
-      <w:proofErr w:type="spellEnd"/>
-      <w:r>
-        <w:t xml:space="preserve">-orientierte Gestaltung digitaler Medien vorhanden sind: Self-Determination Theory, Value-Sensitive Design, Digital Wellbeing, Persuasive Technology und algorithmische Souveränität liefern einen dichten konzeptionellen Rahmen. Auch die Probleme der </w:t>
-      </w:r>
-      <w:proofErr w:type="spellStart"/>
-      <w:r>
-        <w:t>engagement</w:t>
-      </w:r>
-      <w:proofErr w:type="spellEnd"/>
-      <w:r>
-        <w:t>-getriebenen Modelle sind sowohl theoretisch als auch empirisch gut dokumentiert.</w:t>
+    </w:p>
+    <w:p>
+      <w:pPr>
+        <w:spacing w:after="160" w:line="360" w:lineRule="auto"/>
+      </w:pPr>
+      <w:r>
+        <w:t>Aus der Literatur wird deutlich, dass die theoretischen Grundlagen für eine nutzerzentrierte, wellbeing-orientierte Gestaltung digitaler Medien vorhanden sind: Self-Determination Theory, Value-Sensitive Design, Digital Wellbeing, Persuasive Technology und algorithmische Souveränität liefern einen dichten konzeptionellen Rahmen. Auch die Probleme der engagement-getriebenen Modelle sind sowohl theoretisch als auch empirisch gut dokumentiert.</w:t>
       </w:r>
     </w:p>
     <w:p>
@@ -2358,43 +1858,25 @@
         <w:pStyle w:val="berschrift1"/>
         <w:pageBreakBefore/>
       </w:pPr>
-      <w:proofErr w:type="gramStart"/>
       <w:r>
         <w:lastRenderedPageBreak/>
-        <w:t>3  Radio</w:t>
-      </w:r>
-      <w:proofErr w:type="gramEnd"/>
-      <w:r>
-        <w:t xml:space="preserve"> 25 als Forschungsartefakt</w:t>
-      </w:r>
-    </w:p>
-    <w:p>
-      <w:pPr>
-        <w:spacing w:after="160" w:line="360" w:lineRule="auto"/>
-      </w:pPr>
-      <w:r>
-        <w:t xml:space="preserve">Aus der in Kapitel 2 dargestellten Forschungslücke leitet sich die Notwendigkeit eines konkreten, lauffähigen Demonstrationsmediums ab, an dem die </w:t>
-      </w:r>
-      <w:proofErr w:type="gramStart"/>
-      <w:r>
-        <w:t>diskutierten</w:t>
-      </w:r>
-      <w:proofErr w:type="gramEnd"/>
-      <w:r>
-        <w:t xml:space="preserve"> Prinzipien der nutzerzentrierten Personalisierung sicht- und untersuchbar werden. Die vorliegende Arbeit setzt diesen Lösungsvorschlag in Form eines vollautomatisierten, KI-gestützten Radios um, im Folgenden als Radio 25 bezeichnet. Dieses Kapitel begründet die Wahl des Mediums, beschreibt den geplanten Untersuchungsgegenstand und ordnet die zu untersuchenden Mechanismen den in Kapitel 2 entwickelten Beurteilungsgrundlagen zu.</w:t>
+        <w:t>3  Attune als Forschungsartefakt</w:t>
+      </w:r>
+    </w:p>
+    <w:p>
+      <w:pPr>
+        <w:spacing w:after="160" w:line="360" w:lineRule="auto"/>
+      </w:pPr>
+      <w:r>
+        <w:t>Aus der in Kapitel 2 dargestellten Forschungslücke leitet sich die Notwendigkeit eines konkreten, lauffähigen Demonstrationsmediums ab, an dem die diskutierten Prinzipien der nutzerzentrierten Personalisierung sicht- und untersuchbar werden. Die vorliegende Arbeit setzt diesen Lösungsvorschlag in Form eines vollautomatisierten, KI-gestützten Radios um, im Folgenden als Attune bezeichnet. Dieses Kapitel begründet die Wahl des Mediums, beschreibt den geplanten Untersuchungsgegenstand und ordnet die zu untersuchenden Mechanismen den in Kapitel 2 entwickelten Beurteilungsgrundlagen zu.</w:t>
       </w:r>
     </w:p>
     <w:p>
       <w:pPr>
         <w:pStyle w:val="berschrift2"/>
       </w:pPr>
-      <w:proofErr w:type="gramStart"/>
-      <w:r>
-        <w:t>3.1  Warum</w:t>
-      </w:r>
-      <w:proofErr w:type="gramEnd"/>
-      <w:r>
-        <w:t xml:space="preserve"> dieses Untersuchungsmedium?</w:t>
+      <w:r>
+        <w:t>3.1  Warum dieses Untersuchungsmedium?</w:t>
       </w:r>
     </w:p>
     <w:p>
@@ -2410,47 +1892,15 @@
         <w:spacing w:after="160" w:line="360" w:lineRule="auto"/>
       </w:pPr>
       <w:r>
-        <w:t xml:space="preserve">Erstens vereint ein Radio in einem einzigen Format mehrere Inhaltsarten, die in der bisherigen Forschung getrennt betrachtet werden: Nachrichten, Wetter- und Service-Informationen, Moderation, Musik sowie Jingles. Damit lassen sich an einem Artefakt sowohl informative als auch unterhaltende Bedürfnisse abbilden, die der </w:t>
-      </w:r>
-      <w:proofErr w:type="spellStart"/>
-      <w:r>
-        <w:t>Uses</w:t>
-      </w:r>
-      <w:proofErr w:type="spellEnd"/>
-      <w:r>
-        <w:t>-and-</w:t>
-      </w:r>
-      <w:proofErr w:type="spellStart"/>
-      <w:r>
-        <w:t>Gratifications</w:t>
-      </w:r>
-      <w:proofErr w:type="spellEnd"/>
-      <w:r>
-        <w:t xml:space="preserve">-Ansatz unterscheidet (Katz et al., 1973), und es können verschiedene Empfehlungs- und </w:t>
-      </w:r>
-      <w:proofErr w:type="spellStart"/>
-      <w:r>
-        <w:t>Kurationsmechanismen</w:t>
-      </w:r>
-      <w:proofErr w:type="spellEnd"/>
-      <w:r>
-        <w:t xml:space="preserve"> unter realistischen Bedingungen kombiniert werden.</w:t>
-      </w:r>
-    </w:p>
-    <w:p>
-      <w:pPr>
-        <w:spacing w:after="160" w:line="360" w:lineRule="auto"/>
-      </w:pPr>
-      <w:r>
-        <w:t xml:space="preserve">Zweitens ist Radio ein lineares, zeitlich gerahmtes Medium. Im Gegensatz zu Feeds mit endlosem Scrollen besitzt eine Sendung einen definierten Anfang und ein definiertes Ende. Diese Eigenschaft macht es möglich, gezielt diejenigen Designmuster zu vermeiden, die in Kapitel 1 als problematisch identifiziert wurden (endloses Scrollen, Autoplay, künstliche Verlängerung von Sessions), und stattdessen alternative, </w:t>
-      </w:r>
-      <w:proofErr w:type="spellStart"/>
-      <w:r>
-        <w:t>wellbeing</w:t>
-      </w:r>
-      <w:proofErr w:type="spellEnd"/>
-      <w:r>
-        <w:t>-fördernde Strukturen wie natürliche Pausen, klare Sendungslängen und bewusste Abschlusspunkte zu erproben (Vanden Abeele, 2021; Peters et al., 2018).</w:t>
+        <w:t>Erstens vereint ein Radio in einem einzigen Format mehrere Inhaltsarten, die in der bisherigen Forschung getrennt betrachtet werden: Nachrichten, Wetter- und Service-Informationen, Moderation, Musik sowie Jingles. Damit lassen sich an einem Artefakt sowohl informative als auch unterhaltende Bedürfnisse abbilden, die der Uses-and-Gratifications-Ansatz unterscheidet (Katz et al., 1973), und es können verschiedene Empfehlungs- und Kurationsmechanismen unter realistischen Bedingungen kombiniert werden.</w:t>
+      </w:r>
+    </w:p>
+    <w:p>
+      <w:pPr>
+        <w:spacing w:after="160" w:line="360" w:lineRule="auto"/>
+      </w:pPr>
+      <w:r>
+        <w:t>Zweitens ist Radio ein lineares, zeitlich gerahmtes Medium. Im Gegensatz zu Feeds mit endlosem Scrollen besitzt eine Sendung einen definierten Anfang und ein definiertes Ende. Diese Eigenschaft macht es möglich, gezielt diejenigen Designmuster zu vermeiden, die in Kapitel 1 als problematisch identifiziert wurden (endloses Scrollen, Autoplay, künstliche Verlängerung von Sessions), und stattdessen alternative, wellbeing-fördernde Strukturen wie natürliche Pausen, klare Sendungslängen und bewusste Abschlusspunkte zu erproben (Vanden Abeele, 2021; Peters et al., 2018).</w:t>
       </w:r>
     </w:p>
     <w:p>
@@ -2467,8 +1917,6 @@
       </w:pPr>
       <w:r>
         <w:t xml:space="preserve">Viertens lässt sich an einem vollautomatisierten Radio die gesamte Wertschöpfungskette technisch beherrschen. Die Inhalte werden nicht aus einem geschlossenen Empfehlungssystem eines Drittanbieters bezogen, sondern in einer eigenen Pipeline aus </w:t>
-      </w:r>
-      <w:r>
         <w:lastRenderedPageBreak/>
         <w:t>Quellen-Aggregation, Sprachmodell-basierter Moderation und Sprachsynthese erzeugt. Dadurch lassen sich Personalisierungslogik, Transparenz, Diversität und Nutzerkontrolle in einem einzigen, durchgängigen System experimentell variieren, was bei kommerziellen Plattformen aus methodischen Gründen ausgeschlossen ist.</w:t>
       </w:r>
@@ -2478,31 +1926,7 @@
         <w:spacing w:after="160" w:line="360" w:lineRule="auto"/>
       </w:pPr>
       <w:r>
-        <w:t xml:space="preserve">Fünftens existiert mit dem öffentlich-rechtlichen Radio (SRF, DLF, BBC) ein etabliertes redaktionelles Vergleichsmodell, das sich an Pluralismus und Qualität orientiert. Damit liegt für jede der drei in Abschnitt 2.4 verglichenen Medienlogiken (redaktionell, </w:t>
-      </w:r>
-      <w:proofErr w:type="spellStart"/>
-      <w:r>
-        <w:t>engagement</w:t>
-      </w:r>
-      <w:proofErr w:type="spellEnd"/>
-      <w:r>
-        <w:t xml:space="preserve">-optimiert, </w:t>
-      </w:r>
-      <w:proofErr w:type="spellStart"/>
-      <w:r>
-        <w:t>wellbeing</w:t>
-      </w:r>
-      <w:proofErr w:type="spellEnd"/>
-      <w:r>
-        <w:t xml:space="preserve">-orientiert) ein realer oder konstruierter Referenzfall vor, an dem sich das </w:t>
-      </w:r>
-      <w:proofErr w:type="spellStart"/>
-      <w:r>
-        <w:t>wellbeing</w:t>
-      </w:r>
-      <w:proofErr w:type="spellEnd"/>
-      <w:r>
-        <w:t>-orientierte Modell argumentativ wie empirisch positionieren kann.</w:t>
+        <w:t>Fünftens existiert mit dem öffentlich-rechtlichen Radio (SRF, DLF, BBC) ein etabliertes redaktionelles Vergleichsmodell, das sich an Pluralismus und Qualität orientiert. Damit liegt für jede der drei in Abschnitt 2.4 verglichenen Medienlogiken (redaktionell, engagement-optimiert, wellbeing-orientiert) ein realer oder konstruierter Referenzfall vor, an dem sich das wellbeing-orientierte Modell argumentativ wie empirisch positionieren kann.</w:t>
       </w:r>
     </w:p>
     <w:p>
@@ -2526,103 +1950,56 @@
         <w:spacing w:after="160" w:line="360" w:lineRule="auto"/>
       </w:pPr>
       <w:r>
-        <w:t xml:space="preserve">Zum anderen demonstriert ein KI-gestütztes Radio dieselben Technologien, die in kommerziellen Plattformen heute zur Engagement-Optimierung eingesetzt werden, jedoch konsequent mit umgekehrter Zielfunktion: nicht Verweildauer und Klickrate, sondern Autonomie, Transparenz und subjektives Wohlbefinden. Genau diese Umkehrung der Optimierungsfunktion bei sonst vergleichbarem Technologie-Stack ist die methodische Pointe der Arbeit. Sie erlaubt es, zu zeigen, dass die problematischen Effekte </w:t>
-      </w:r>
-      <w:proofErr w:type="spellStart"/>
-      <w:r>
-        <w:t>engagement</w:t>
-      </w:r>
-      <w:proofErr w:type="spellEnd"/>
-      <w:r>
-        <w:t>-optimierter Systeme nicht in der zugrundeliegenden Technologie selbst, sondern in deren Zielsetzung begründet liegen.</w:t>
-      </w:r>
-    </w:p>
-    <w:p>
-      <w:pPr>
-        <w:spacing w:after="160" w:line="360" w:lineRule="auto"/>
-      </w:pPr>
-      <w:r>
-        <w:t xml:space="preserve">Schliesslich ist ein Radio als Forschungsartefakt mit überschaubarem Aufwand realisierbar und gleichzeitig reichhaltig genug, um die zentralen Designentscheidungen einer </w:t>
-      </w:r>
-      <w:proofErr w:type="spellStart"/>
-      <w:r>
-        <w:t>wellbeing</w:t>
-      </w:r>
-      <w:proofErr w:type="spellEnd"/>
-      <w:r>
-        <w:t>-orientierten Plattform durchgängig abzubilden. Es benötigt keinen redaktionellen Apparat, keine soziale Komponente und keine Empfehlungs-Infrastruktur eines Drittanbieters und kann dennoch Personalisierung, Inhaltsdiversität, Transparenz und Zeitgestaltung in einem konsistenten Erlebnis kombinieren.</w:t>
+        <w:t>Zum anderen demonstriert ein KI-gestütztes Radio dieselben Technologien, die in kommerziellen Plattformen heute zur Engagement-Optimierung eingesetzt werden, jedoch konsequent mit umgekehrter Zielfunktion: nicht Verweildauer und Klickrate, sondern Autonomie, Transparenz und subjektives Wohlbefinden. Genau diese Umkehrung der Optimierungsfunktion bei sonst vergleichbarem Technologie-Stack ist die methodische Pointe der Arbeit. Sie erlaubt es, zu zeigen, dass die problematischen Effekte engagement-optimierter Systeme nicht in der zugrundeliegenden Technologie selbst, sondern in deren Zielsetzung begründet liegen.</w:t>
+      </w:r>
+    </w:p>
+    <w:p>
+      <w:pPr>
+        <w:spacing w:after="160" w:line="360" w:lineRule="auto"/>
+      </w:pPr>
+      <w:r>
+        <w:t>Schliesslich ist ein Radio als Forschungsartefakt mit überschaubarem Aufwand realisierbar und gleichzeitig reichhaltig genug, um die zentralen Designentscheidungen einer wellbeing-orientierten Plattform durchgängig abzubilden. Es benötigt keinen redaktionellen Apparat, keine soziale Komponente und keine Empfehlungs-Infrastruktur eines Drittanbieters und kann dennoch Personalisierung, Inhaltsdiversität, Transparenz und Zeitgestaltung in einem konsistenten Erlebnis kombinieren.</w:t>
       </w:r>
     </w:p>
     <w:p>
       <w:pPr>
         <w:pStyle w:val="berschrift2"/>
       </w:pPr>
-      <w:proofErr w:type="gramStart"/>
       <w:r>
         <w:lastRenderedPageBreak/>
-        <w:t>3.3  Was</w:t>
-      </w:r>
-      <w:proofErr w:type="gramEnd"/>
-      <w:r>
-        <w:t xml:space="preserve"> an Radio 25 konkret umgesetzt wird</w:t>
-      </w:r>
-    </w:p>
-    <w:p>
-      <w:pPr>
-        <w:spacing w:after="160" w:line="360" w:lineRule="auto"/>
-      </w:pPr>
-      <w:r>
-        <w:t xml:space="preserve">Radio 25 ist als prototypischer Demonstrator konzipiert, der die in Kapitel 2 beschriebenen Mechanismen exemplarisch in einer </w:t>
-      </w:r>
-      <w:proofErr w:type="spellStart"/>
-      <w:r>
-        <w:t>wellbeing</w:t>
-      </w:r>
-      <w:proofErr w:type="spellEnd"/>
-      <w:r>
-        <w:t>-orientierten Variante zeigt. Die folgenden Bausteine werden umgesetzt.</w:t>
+        <w:t>3.3  Was an Attune konkret umgesetzt wird</w:t>
+      </w:r>
+    </w:p>
+    <w:p>
+      <w:pPr>
+        <w:spacing w:after="160" w:line="360" w:lineRule="auto"/>
+      </w:pPr>
+      <w:r>
+        <w:t>Attune ist als prototypischer Demonstrator konzipiert, der die in Kapitel 2 beschriebenen Mechanismen exemplarisch in einer wellbeing-orientierten Variante zeigt. Die folgenden Bausteine werden umgesetzt.</w:t>
       </w:r>
     </w:p>
     <w:p>
       <w:pPr>
         <w:pStyle w:val="berschrift3"/>
       </w:pPr>
-      <w:proofErr w:type="gramStart"/>
-      <w:r>
-        <w:t>3.3.1  Explizite</w:t>
-      </w:r>
-      <w:proofErr w:type="gramEnd"/>
-      <w:r>
-        <w:t xml:space="preserve"> Präferenzangaben und Profilkonstruktion</w:t>
-      </w:r>
-    </w:p>
-    <w:p>
-      <w:pPr>
-        <w:spacing w:after="160" w:line="360" w:lineRule="auto"/>
-      </w:pPr>
-      <w:r>
-        <w:t>Die Hörerinnen und Hörer geben ihre Interessen, ihren Standort und einen Moderationsstil aktiv und nachvollziehbar an. Anders als bei Plattformen, die Profile primär aus implizitem Verhalten lernen, bleibt das Profil bei Radio 25 transparent, einsehbar und jederzeit veränderbar. Damit wird die Anforderung an algorithmische Souveränität (</w:t>
-      </w:r>
-      <w:proofErr w:type="spellStart"/>
-      <w:r>
-        <w:t>Reviglio</w:t>
-      </w:r>
-      <w:proofErr w:type="spellEnd"/>
-      <w:r>
-        <w:t xml:space="preserve"> &amp; Agosti, 2020) konkret operationalisierbar, ohne die Nutzenden mit einem aufwendigen Konfigurationsritual zu überfordern.</w:t>
+      <w:r>
+        <w:t>3.3.1  Explizite Präferenzangaben und Profilkonstruktion</w:t>
+      </w:r>
+    </w:p>
+    <w:p>
+      <w:pPr>
+        <w:spacing w:after="160" w:line="360" w:lineRule="auto"/>
+      </w:pPr>
+      <w:r>
+        <w:t>Die Hörerinnen und Hörer geben ihre Interessen, ihren Standort und einen Moderationsstil aktiv und nachvollziehbar an. Anders als bei Plattformen, die Profile primär aus implizitem Verhalten lernen, bleibt das Profil bei Attune transparent, einsehbar und jederzeit veränderbar. Damit wird die Anforderung an algorithmische Souveränität (Reviglio &amp; Agosti, 2020) konkret operationalisierbar, ohne die Nutzenden mit einem aufwendigen Konfigurationsritual zu überfordern.</w:t>
       </w:r>
     </w:p>
     <w:p>
       <w:pPr>
         <w:pStyle w:val="berschrift3"/>
       </w:pPr>
-      <w:proofErr w:type="gramStart"/>
-      <w:r>
-        <w:t>3.3.2  Vollautomatisierte</w:t>
-      </w:r>
-      <w:proofErr w:type="gramEnd"/>
-      <w:r>
-        <w:t xml:space="preserve"> Sendungspipeline</w:t>
+      <w:r>
+        <w:t>3.3.2  Vollautomatisierte Sendungspipeline</w:t>
       </w:r>
     </w:p>
     <w:p>
@@ -2637,55 +2014,24 @@
       <w:pPr>
         <w:pStyle w:val="berschrift3"/>
       </w:pPr>
-      <w:proofErr w:type="gramStart"/>
-      <w:r>
-        <w:t xml:space="preserve">3.3.3  </w:t>
-      </w:r>
-      <w:proofErr w:type="spellStart"/>
-      <w:r>
-        <w:t>Kuratierungs</w:t>
-      </w:r>
-      <w:proofErr w:type="spellEnd"/>
-      <w:proofErr w:type="gramEnd"/>
-      <w:r>
-        <w:t>- und Empfehlungslogik mit alternativem Zielwert</w:t>
-      </w:r>
-    </w:p>
-    <w:p>
-      <w:pPr>
-        <w:spacing w:after="160" w:line="360" w:lineRule="auto"/>
-      </w:pPr>
-      <w:r>
-        <w:t xml:space="preserve">Die Auswahl und Reihenfolge der Inhalte folgt nicht der Maximierung von Verweildauer, sondern explizit definierten, am Nutzerwohl ausgerichteten Kriterien: thematische Vielfalt im Sinne einer bewussten Diversifikation, Eignung für den Tageszeitkontext und Übereinstimmung mit den deklarierten Präferenzen. Damit werden die in Abschnitt 2.2.3 beschriebenen Empfehlungsparadigmen (Ricci et al., 2015) auf eine </w:t>
-      </w:r>
-      <w:proofErr w:type="spellStart"/>
-      <w:r>
-        <w:t>wellbeing</w:t>
-      </w:r>
-      <w:proofErr w:type="spellEnd"/>
-      <w:r>
-        <w:t>-orientierte Zielfunktion umgestellt, wie sie Milano et al. (2020) und Peters et al. (2020) als notwendig erachten.</w:t>
+      <w:r>
+        <w:t>3.3.3  Kuratierungs- und Empfehlungslogik mit alternativem Zielwert</w:t>
+      </w:r>
+    </w:p>
+    <w:p>
+      <w:pPr>
+        <w:spacing w:after="160" w:line="360" w:lineRule="auto"/>
+      </w:pPr>
+      <w:r>
+        <w:t>Die Auswahl und Reihenfolge der Inhalte folgt nicht der Maximierung von Verweildauer, sondern explizit definierten, am Nutzerwohl ausgerichteten Kriterien: thematische Vielfalt im Sinne einer bewussten Diversifikation, Eignung für den Tageszeitkontext und Übereinstimmung mit den deklarierten Präferenzen. Damit werden die in Abschnitt 2.2.3 beschriebenen Empfehlungsparadigmen (Ricci et al., 2015) auf eine wellbeing-orientierte Zielfunktion umgestellt, wie sie Milano et al. (2020) und Peters et al. (2020) als notwendig erachten.</w:t>
       </w:r>
     </w:p>
     <w:p>
       <w:pPr>
         <w:pStyle w:val="berschrift3"/>
       </w:pPr>
-      <w:proofErr w:type="gramStart"/>
-      <w:r>
-        <w:t>3.3.4  Definierte</w:t>
-      </w:r>
-      <w:proofErr w:type="gramEnd"/>
-      <w:r>
-        <w:t xml:space="preserve"> </w:t>
-      </w:r>
-      <w:proofErr w:type="spellStart"/>
-      <w:r>
-        <w:t>Sessiongestaltung</w:t>
-      </w:r>
-      <w:proofErr w:type="spellEnd"/>
-      <w:r>
-        <w:t xml:space="preserve"> statt endlosem Strom</w:t>
+      <w:r>
+        <w:t>3.3.4  Definierte Sessiongestaltung statt endlosem Strom</w:t>
       </w:r>
     </w:p>
     <w:p>
@@ -2700,67 +2046,33 @@
       <w:pPr>
         <w:pStyle w:val="berschrift3"/>
       </w:pPr>
-      <w:proofErr w:type="gramStart"/>
       <w:r>
         <w:lastRenderedPageBreak/>
-        <w:t>3.3.5  Transparenz</w:t>
-      </w:r>
-      <w:proofErr w:type="gramEnd"/>
-      <w:r>
-        <w:t xml:space="preserve"> über Quellen, Logik und Personalisierung</w:t>
-      </w:r>
-    </w:p>
-    <w:p>
-      <w:pPr>
-        <w:spacing w:after="160" w:line="360" w:lineRule="auto"/>
-      </w:pPr>
-      <w:r>
-        <w:t>Die Hörerinnen und Hörer können einsehen, aus welchen Quellen die Nachrichten stammen, welche Präferenzen welche Inhalte wie beeinflusst haben und welche Schritte die Pipeline durchlaufen hat. Damit wird der Black-Box-Charakter heutiger Empfehlungssysteme bewusst aufgebrochen und das Konzept der algorithmischen Souveränität (</w:t>
-      </w:r>
-      <w:proofErr w:type="spellStart"/>
-      <w:r>
-        <w:t>Reviglio</w:t>
-      </w:r>
-      <w:proofErr w:type="spellEnd"/>
-      <w:r>
-        <w:t xml:space="preserve"> &amp; Agosti, 2020) in einer für die Nutzenden zugänglichen Form operationalisiert.</w:t>
+        <w:t>3.3.5  Transparenz über Quellen, Logik und Personalisierung</w:t>
+      </w:r>
+    </w:p>
+    <w:p>
+      <w:pPr>
+        <w:spacing w:after="160" w:line="360" w:lineRule="auto"/>
+      </w:pPr>
+      <w:r>
+        <w:t>Die Hörerinnen und Hörer können einsehen, aus welchen Quellen die Nachrichten stammen, welche Präferenzen welche Inhalte wie beeinflusst haben und welche Schritte die Pipeline durchlaufen hat. Damit wird der Black-Box-Charakter heutiger Empfehlungssysteme bewusst aufgebrochen und das Konzept der algorithmischen Souveränität (Reviglio &amp; Agosti, 2020) in einer für die Nutzenden zugänglichen Form operationalisiert.</w:t>
       </w:r>
     </w:p>
     <w:p>
       <w:pPr>
         <w:pStyle w:val="berschrift2"/>
       </w:pPr>
-      <w:proofErr w:type="gramStart"/>
-      <w:r>
-        <w:t>3.4  Welche</w:t>
-      </w:r>
-      <w:proofErr w:type="gramEnd"/>
-      <w:r>
-        <w:t xml:space="preserve"> Mechanismen am Radio untersucht und verbessert werden</w:t>
-      </w:r>
-    </w:p>
-    <w:p>
-      <w:pPr>
-        <w:spacing w:after="160" w:line="360" w:lineRule="auto"/>
-      </w:pPr>
-      <w:r>
-        <w:t xml:space="preserve">Aus den Bausteinen ergeben sich die Mechanismen, an denen die Arbeit experimentell ansetzt. Sie korrespondieren mit den in Abschnitt 2.3 beschriebenen Mechanismen aktueller Medienangebote und werden im </w:t>
-      </w:r>
-      <w:proofErr w:type="spellStart"/>
-      <w:r>
-        <w:t>wellbeing</w:t>
-      </w:r>
-      <w:proofErr w:type="spellEnd"/>
-      <w:r>
-        <w:t xml:space="preserve">-orientierten Modell systematisch </w:t>
-      </w:r>
-      <w:proofErr w:type="spellStart"/>
-      <w:r>
-        <w:t>umakzentuiert</w:t>
-      </w:r>
-      <w:proofErr w:type="spellEnd"/>
-      <w:r>
-        <w:t>.</w:t>
+      <w:r>
+        <w:t>3.4  Welche Mechanismen am Radio untersucht und verbessert werden</w:t>
+      </w:r>
+    </w:p>
+    <w:p>
+      <w:pPr>
+        <w:spacing w:after="160" w:line="360" w:lineRule="auto"/>
+      </w:pPr>
+      <w:r>
+        <w:t>Aus den Bausteinen ergeben sich die Mechanismen, an denen die Arbeit experimentell ansetzt. Sie korrespondieren mit den in Abschnitt 2.3 beschriebenen Mechanismen aktueller Medienangebote und werden im wellbeing-orientierten Modell systematisch umakzentuiert.</w:t>
       </w:r>
     </w:p>
     <w:p>
@@ -2786,23 +2098,7 @@
         <w:spacing w:after="80" w:line="360" w:lineRule="auto"/>
       </w:pPr>
       <w:r>
-        <w:t xml:space="preserve">Personalisierte </w:t>
-      </w:r>
-      <w:proofErr w:type="spellStart"/>
-      <w:r>
-        <w:t>Kuratierung</w:t>
-      </w:r>
-      <w:proofErr w:type="spellEnd"/>
-      <w:r>
-        <w:t xml:space="preserve"> mit alternativer Zielfunktion: Welche Effekte hat eine auf Vielfalt, Tageskontext und Selbstbestimmung optimierte Auswahl gegenüber einer </w:t>
-      </w:r>
-      <w:proofErr w:type="spellStart"/>
-      <w:r>
-        <w:t>engagement</w:t>
-      </w:r>
-      <w:proofErr w:type="spellEnd"/>
-      <w:r>
-        <w:t>-optimierten Empfehlungslogik (Nguyen et al., 2014; Milano et al., 2020)?</w:t>
+        <w:t>Personalisierte Kuratierung mit alternativer Zielfunktion: Welche Effekte hat eine auf Vielfalt, Tageskontext und Selbstbestimmung optimierte Auswahl gegenüber einer engagement-optimierten Empfehlungslogik (Nguyen et al., 2014; Milano et al., 2020)?</w:t>
       </w:r>
     </w:p>
     <w:p>
@@ -2814,13 +2110,8 @@
         </w:numPr>
         <w:spacing w:after="80" w:line="360" w:lineRule="auto"/>
       </w:pPr>
-      <w:proofErr w:type="spellStart"/>
-      <w:r>
-        <w:t>Sessiongestaltung</w:t>
-      </w:r>
-      <w:proofErr w:type="spellEnd"/>
-      <w:r>
-        <w:t>: Wie wirken eine definierte Sendungslänge und ein bewusst gesetzter Abschluss im Vergleich zu endlosen Strömen auf die subjektive Zufriedenheit, das Zeitempfinden und die Nutzungskontrolle (Vanden Abeele, 2021; Montag et al., 2019)?</w:t>
+      <w:r>
+        <w:t>Sessiongestaltung: Wie wirken eine definierte Sendungslänge und ein bewusst gesetzter Abschluss im Vergleich zu endlosen Strömen auf die subjektive Zufriedenheit, das Zeitempfinden und die Nutzungskontrolle (Vanden Abeele, 2021; Montag et al., 2019)?</w:t>
       </w:r>
     </w:p>
     <w:p>
@@ -2833,15 +2124,7 @@
         <w:spacing w:after="80" w:line="360" w:lineRule="auto"/>
       </w:pPr>
       <w:r>
-        <w:t>Transparenz der Algorithmik: Wie verändert eine offengelegte Personalisierungslogik das Vertrauen, die wahrgenommene Fairness und die Bereitschaft zur weiteren Nutzung (</w:t>
-      </w:r>
-      <w:proofErr w:type="spellStart"/>
-      <w:r>
-        <w:t>Reviglio</w:t>
-      </w:r>
-      <w:proofErr w:type="spellEnd"/>
-      <w:r>
-        <w:t xml:space="preserve"> &amp; Agosti, 2020; Milano et al., 2020)?</w:t>
+        <w:t>Transparenz der Algorithmik: Wie verändert eine offengelegte Personalisierungslogik das Vertrauen, die wahrgenommene Fairness und die Bereitschaft zur weiteren Nutzung (Reviglio &amp; Agosti, 2020; Milano et al., 2020)?</w:t>
       </w:r>
     </w:p>
     <w:p>
@@ -2854,15 +2137,7 @@
         <w:spacing w:after="80" w:line="360" w:lineRule="auto"/>
       </w:pPr>
       <w:r>
-        <w:t xml:space="preserve">Persuasive Designmuster: Welche der in Abschnitt 1.3 katalogisierten Muster (Push-Benachrichtigungen, variable Belohnungen, Autoplay) entfallen in einem </w:t>
-      </w:r>
-      <w:proofErr w:type="spellStart"/>
-      <w:r>
-        <w:t>wellbeing</w:t>
-      </w:r>
-      <w:proofErr w:type="spellEnd"/>
-      <w:r>
-        <w:t>-orientierten Format, und welche nicht-manipulativen Alternativen lassen sich durch Digital Nudging (Weinmann et al., 2016) im Sinne der Nutzenden umsetzen?</w:t>
+        <w:t>Persuasive Designmuster: Welche der in Abschnitt 1.3 katalogisierten Muster (Push-Benachrichtigungen, variable Belohnungen, Autoplay) entfallen in einem wellbeing-orientierten Format, und welche nicht-manipulativen Alternativen lassen sich durch Digital Nudging (Weinmann et al., 2016) im Sinne der Nutzenden umsetzen?</w:t>
       </w:r>
     </w:p>
     <w:p>
@@ -2875,28 +2150,15 @@
         <w:spacing w:after="80" w:line="360" w:lineRule="auto"/>
       </w:pPr>
       <w:r>
-        <w:t xml:space="preserve">Gebrauchstauglichkeit und Akzeptanz: Wie schneidet ein </w:t>
-      </w:r>
-      <w:proofErr w:type="spellStart"/>
-      <w:r>
-        <w:t>wellbeing</w:t>
-      </w:r>
-      <w:proofErr w:type="spellEnd"/>
-      <w:r>
-        <w:t>-orientiertes Radio im System Usability Scale (Brooke, 1996; Bangor et al., 2008) und in der subjektiven Akzeptanz im Vergleich zu vertrauten Plattformen ab?</w:t>
+        <w:t>Gebrauchstauglichkeit und Akzeptanz: Wie schneidet ein wellbeing-orientiertes Radio im System Usability Scale (Brooke, 1996; Bangor et al., 2008) und in der subjektiven Akzeptanz im Vergleich zu vertrauten Plattformen ab?</w:t>
       </w:r>
     </w:p>
     <w:p>
       <w:pPr>
         <w:pStyle w:val="berschrift2"/>
       </w:pPr>
-      <w:proofErr w:type="gramStart"/>
-      <w:r>
-        <w:t>3.5  Abgrenzung</w:t>
-      </w:r>
-      <w:proofErr w:type="gramEnd"/>
-      <w:r>
-        <w:t xml:space="preserve"> des Untersuchungsumfangs</w:t>
+      <w:r>
+        <w:t>3.5  Abgrenzung des Untersuchungsumfangs</w:t>
       </w:r>
     </w:p>
     <w:p>
@@ -2905,15 +2167,7 @@
       </w:pPr>
       <w:r>
         <w:lastRenderedPageBreak/>
-        <w:t xml:space="preserve">Radio 25 versteht sich als Konzeptstudie, nicht als marktreifes Produkt. Die Pipeline wird </w:t>
-      </w:r>
-      <w:proofErr w:type="gramStart"/>
-      <w:r>
-        <w:t>soweit</w:t>
-      </w:r>
-      <w:proofErr w:type="gramEnd"/>
-      <w:r>
-        <w:t xml:space="preserve"> umgesetzt, wie es für eine konsistente Hörerfahrung und eine aussagekräftige Nutzerstudie mit einer kleinen Probandengruppe erforderlich ist. Aspekte, die für eine Skalierung relevant wären (Authentifizierung, Datenhaltung in einer Datenbank, redaktionelle Qualitätssicherung im grossen Massstab, Werbe- und Lizenzfragen), werden bewusst ausgeklammert und im Ausblick der Arbeit eingeordnet. Die folgenden Kapitel entwickeln auf dieser Grundlage die konkrete Forschungsfrage, das Untersuchungsdesign und den Aufbau der Evaluation.</w:t>
+        <w:t>Attune versteht sich als Konzeptstudie, nicht als marktreifes Produkt. Die Pipeline wird soweit umgesetzt, wie es für eine konsistente Hörerfahrung und eine aussagekräftige Nutzerstudie mit einer kleinen Probandengruppe erforderlich ist. Aspekte, die für eine Skalierung relevant wären (Authentifizierung, Datenhaltung in einer Datenbank, redaktionelle Qualitätssicherung im grossen Massstab, Werbe- und Lizenzfragen), werden bewusst ausgeklammert und im Ausblick der Arbeit eingeordnet. Die folgenden Kapitel entwickeln auf dieser Grundlage die konkrete Forschungsfrage, das Untersuchungsdesign und den Aufbau der Evaluation.</w:t>
       </w:r>
     </w:p>
     <w:p>
@@ -2921,49 +2175,26 @@
         <w:pStyle w:val="berschrift1"/>
         <w:pageBreakBefore/>
       </w:pPr>
-      <w:proofErr w:type="gramStart"/>
       <w:r>
         <w:lastRenderedPageBreak/>
-        <w:t>4  Forschungsfrage</w:t>
-      </w:r>
-      <w:proofErr w:type="gramEnd"/>
-      <w:r>
-        <w:t xml:space="preserve"> und Zielsetzung</w:t>
-      </w:r>
-    </w:p>
-    <w:p>
-      <w:pPr>
-        <w:spacing w:after="160" w:line="360" w:lineRule="auto"/>
-      </w:pPr>
-      <w:r>
-        <w:t xml:space="preserve">Aus der in Kapitel 2 entwickelten Forschungslücke und dem in Kapitel 3 vorgestellten Untersuchungsmedium leitet sich die konkrete Forschungsfrage dieser Arbeit ab. Das vorliegende Kapitel formuliert zunächst die Hauptforschungsfrage, leitet daraus untersuchungsleitende Teilfragen sowie die Zielsetzung im Sinne </w:t>
-      </w:r>
-      <w:proofErr w:type="gramStart"/>
-      <w:r>
-        <w:t>eines Goal</w:t>
-      </w:r>
-      <w:proofErr w:type="gramEnd"/>
-      <w:r>
-        <w:t>/</w:t>
-      </w:r>
-      <w:proofErr w:type="spellStart"/>
-      <w:r>
-        <w:t>Objective</w:t>
-      </w:r>
-      <w:proofErr w:type="spellEnd"/>
-      <w:r>
-        <w:t>-Paares ab, beschreibt den erwarteten Nutzen für unterschiedliche Adressatenkreise und grenzt das Vorhaben gegenüber verwandten Themenfeldern ab. Damit bildet das Kapitel die Brücke zwischen der theoretischen Fundierung der Kapitel 1 und 2 und dem methodischen Vorgehen in Kapitel 5.</w:t>
+        <w:t>4  Forschungsfrage und Zielsetzung</w:t>
+      </w:r>
+    </w:p>
+    <w:p>
+      <w:pPr>
+        <w:spacing w:after="160" w:line="360" w:lineRule="auto"/>
+      </w:pPr>
+      <w:r>
+        <w:t>Aus der in Kapitel 2 entwickelten Forschungslücke und dem in Kapitel 3 vorgestellten Untersuchungsmedium leitet sich die konkrete Forschungsfrage dieser Arbeit ab. Das vorliegende Kapitel formuliert zunächst die Hauptforschungsfrage, leitet daraus untersuchungsleitende Teilfragen sowie die Zielsetzung im Sinne eines Goal/Objective-Paares ab, beschreibt den erwarteten Nutzen für unterschiedliche Adressatenkreise und grenzt das Vorhaben gegenüber verwandten Themenfeldern ab. Damit bildet das Kapitel die Brücke zwischen der theoretischen Fundierung der Kapitel 1 und 2 und dem methodischen Vorgehen in Kapitel 5.</w:t>
       </w:r>
     </w:p>
     <w:p>
       <w:pPr>
         <w:pStyle w:val="berschrift2"/>
       </w:pPr>
-      <w:proofErr w:type="gramStart"/>
       <w:r>
         <w:t>4.1  Forschungsfrage</w:t>
       </w:r>
-      <w:proofErr w:type="gramEnd"/>
     </w:p>
     <w:p>
       <w:pPr>
@@ -3000,26 +2231,16 @@
         <w:spacing w:after="160" w:line="360" w:lineRule="auto"/>
       </w:pPr>
       <w:r>
-        <w:t xml:space="preserve">Die Beantwortung erfolgt durch die Entwicklung und Evaluation eines vollautomatisierten, KI-gestützten Radios (Radio 25), an dem sich die Wirkung expliziter Präferenzangabe, transparenter Personalisierungslogik und definierter </w:t>
-      </w:r>
-      <w:proofErr w:type="spellStart"/>
-      <w:r>
-        <w:t>Sessiongestaltung</w:t>
-      </w:r>
-      <w:proofErr w:type="spellEnd"/>
-      <w:r>
-        <w:t xml:space="preserve"> in einem einwöchigen Pilottest mit Nutzenden empirisch beobachten lässt. Das methodische Vorgehen wird in Kapitel 5 ausführlich entfaltet.</w:t>
+        <w:t>Die Beantwortung erfolgt durch die Entwicklung und Evaluation eines vollautomatisierten, KI-gestützten Radios (Attune), an dem sich die Wirkung expliziter Präferenzangabe, transparenter Personalisierungslogik und definierter Sessiongestaltung in einem einwöchigen Pilottest mit Nutzenden empirisch beobachten lässt. Das methodische Vorgehen wird in Kapitel 5 ausführlich entfaltet.</w:t>
       </w:r>
     </w:p>
     <w:p>
       <w:pPr>
         <w:pStyle w:val="berschrift2"/>
       </w:pPr>
-      <w:proofErr w:type="gramStart"/>
       <w:r>
         <w:t>4.2  Teilfragen</w:t>
       </w:r>
-      <w:proofErr w:type="gramEnd"/>
     </w:p>
     <w:p>
       <w:pPr>
@@ -3027,15 +2248,7 @@
       </w:pPr>
       <w:r>
         <w:lastRenderedPageBreak/>
-        <w:t xml:space="preserve">Die Hauptforschungsfrage wird zur empirischen Bearbeitung in vier untersuchungsleitende Teilfragen heruntergebrochen. Sie korrespondieren mit den in Abschnitt 3.4 identifizierten Mechanismen sowie mit den in Abschnitt 2.3 entwickelten Beurteilungsgrundlagen und decken die für das Vorhaben relevanten Wirkdimensionen Autonomie, Inhaltsdiversität, </w:t>
-      </w:r>
-      <w:proofErr w:type="spellStart"/>
-      <w:r>
-        <w:t>Sessiongestaltung</w:t>
-      </w:r>
-      <w:proofErr w:type="spellEnd"/>
-      <w:r>
-        <w:t xml:space="preserve"> und Transparenz ab.</w:t>
+        <w:t>Die Hauptforschungsfrage wird zur empirischen Bearbeitung in vier untersuchungsleitende Teilfragen heruntergebrochen. Sie korrespondieren mit den in Abschnitt 3.4 identifizierten Mechanismen sowie mit den in Abschnitt 2.3 entwickelten Beurteilungsgrundlagen und decken die für das Vorhaben relevanten Wirkdimensionen Autonomie, Inhaltsdiversität, Sessiongestaltung und Transparenz ab.</w:t>
       </w:r>
     </w:p>
     <w:p>
@@ -3061,15 +2274,7 @@
         <w:spacing w:after="80" w:line="360" w:lineRule="auto"/>
       </w:pPr>
       <w:r>
-        <w:t xml:space="preserve">T2 – Inhaltsdiversität und Bedürfnisgerechtigkeit: In welchem Mass werden eine bewusst diversifizierte Inhaltsauswahl und eine am Tageskontext orientierte Reihenfolge gegenüber einer </w:t>
-      </w:r>
-      <w:proofErr w:type="spellStart"/>
-      <w:r>
-        <w:t>engagement</w:t>
-      </w:r>
-      <w:proofErr w:type="spellEnd"/>
-      <w:r>
-        <w:t>-optimierten Logik als bedürfnisgerecht und qualitativ angemessen erlebt (Nguyen et al., 2014; Milano et al., 2020)?</w:t>
+        <w:t>T2 – Inhaltsdiversität und Bedürfnisgerechtigkeit: In welchem Mass werden eine bewusst diversifizierte Inhaltsauswahl und eine am Tageskontext orientierte Reihenfolge gegenüber einer engagement-optimierten Logik als bedürfnisgerecht und qualitativ angemessen erlebt (Nguyen et al., 2014; Milano et al., 2020)?</w:t>
       </w:r>
     </w:p>
     <w:p>
@@ -3082,15 +2287,7 @@
         <w:spacing w:after="80" w:line="360" w:lineRule="auto"/>
       </w:pPr>
       <w:r>
-        <w:t xml:space="preserve">T3 – </w:t>
-      </w:r>
-      <w:proofErr w:type="spellStart"/>
-      <w:r>
-        <w:t>Sessiongestaltung</w:t>
-      </w:r>
-      <w:proofErr w:type="spellEnd"/>
-      <w:r>
-        <w:t xml:space="preserve"> und Nutzungskontrolle: Wie wirken eine definierte Sendungslänge und ein bewusst gesetzter Sendungsabschluss auf die subjektive Zufriedenheit, das Zeitempfinden und die wahrgenommene Kontrolle über die eigene Mediennutzung (Vanden Abeele, 2021; Montag et al., 2019)?</w:t>
+        <w:t>T3 – Sessiongestaltung und Nutzungskontrolle: Wie wirken eine definierte Sendungslänge und ein bewusst gesetzter Sendungsabschluss auf die subjektive Zufriedenheit, das Zeitempfinden und die wahrgenommene Kontrolle über die eigene Mediennutzung (Vanden Abeele, 2021; Montag et al., 2019)?</w:t>
       </w:r>
     </w:p>
     <w:p>
@@ -3103,15 +2300,7 @@
         <w:spacing w:after="80" w:line="360" w:lineRule="auto"/>
       </w:pPr>
       <w:r>
-        <w:t xml:space="preserve">T4 – Transparenz und Akzeptanz: Wie verändert eine offengelegte Personalisierungslogik die wahrgenommene Fairness, das Vertrauen und die Gebrauchstauglichkeit, gemessen unter anderem über den System Usability Scale (Brooke, 1996; Bangor et al., 2008; </w:t>
-      </w:r>
-      <w:proofErr w:type="spellStart"/>
-      <w:r>
-        <w:t>Reviglio</w:t>
-      </w:r>
-      <w:proofErr w:type="spellEnd"/>
-      <w:r>
-        <w:t xml:space="preserve"> &amp; Agosti, 2020)?</w:t>
+        <w:t>T4 – Transparenz und Akzeptanz: Wie verändert eine offengelegte Personalisierungslogik die wahrgenommene Fairness, das Vertrauen und die Gebrauchstauglichkeit, gemessen unter anderem über den System Usability Scale (Brooke, 1996; Bangor et al., 2008; Reviglio &amp; Agosti, 2020)?</w:t>
       </w:r>
     </w:p>
     <w:p>
@@ -3126,34 +2315,16 @@
       <w:pPr>
         <w:pStyle w:val="berschrift2"/>
       </w:pPr>
-      <w:proofErr w:type="gramStart"/>
-      <w:r>
-        <w:t>4.3  Goal</w:t>
-      </w:r>
-      <w:proofErr w:type="gramEnd"/>
-      <w:r>
-        <w:t xml:space="preserve"> und </w:t>
-      </w:r>
-      <w:proofErr w:type="spellStart"/>
-      <w:r>
-        <w:t>Objective</w:t>
-      </w:r>
-      <w:proofErr w:type="spellEnd"/>
-    </w:p>
-    <w:p>
-      <w:pPr>
-        <w:spacing w:after="160" w:line="360" w:lineRule="auto"/>
-      </w:pPr>
-      <w:r>
-        <w:t xml:space="preserve">In der Diktion des Design-Science-Ansatzes (Hevner et al., 2004; Peffers et al., 2007) lassen sich Ziel und Vorhaben dieser Arbeit auf zwei Ebenen formulieren: ein übergeordnetes Goal, das den angestrebten Beitrag im Anwendungsfeld beschreibt, und ein konkretes </w:t>
-      </w:r>
-      <w:proofErr w:type="spellStart"/>
-      <w:r>
-        <w:t>Objective</w:t>
-      </w:r>
-      <w:proofErr w:type="spellEnd"/>
-      <w:r>
-        <w:t>, das den im Rahmen dieser Arbeit zu liefernden Ergebnisstand definiert.</w:t>
+      <w:r>
+        <w:t>4.3  Goal und Objective</w:t>
+      </w:r>
+    </w:p>
+    <w:p>
+      <w:pPr>
+        <w:spacing w:after="160" w:line="360" w:lineRule="auto"/>
+      </w:pPr>
+      <w:r>
+        <w:t>In der Diktion des Design-Science-Ansatzes (Hevner et al., 2004; Peffers et al., 2007) lassen sich Ziel und Vorhaben dieser Arbeit auf zwei Ebenen formulieren: ein übergeordnetes Goal, das den angestrebten Beitrag im Anwendungsfeld beschreibt, und ein konkretes Objective, das den im Rahmen dieser Arbeit zu liefernden Ergebnisstand definiert.</w:t>
       </w:r>
     </w:p>
     <w:p>
@@ -3169,180 +2340,80 @@
         <w:t xml:space="preserve">Goal. </w:t>
       </w:r>
       <w:r>
-        <w:t xml:space="preserve">Anhand eines vollautomatisierten Radios soll demonstriert werden, wie algorithmische Personalisierung so gestaltet werden kann, dass sie das Digital Wellbeing der Nutzenden </w:t>
-      </w:r>
-      <w:proofErr w:type="gramStart"/>
-      <w:r>
-        <w:t>fördert</w:t>
-      </w:r>
-      <w:proofErr w:type="gramEnd"/>
-      <w:r>
-        <w:t xml:space="preserve"> statt es zu untergraben. Das Artefakt dient damit als konkreter Gegenentwurf zu den </w:t>
-      </w:r>
-      <w:proofErr w:type="spellStart"/>
-      <w:r>
-        <w:t>engagement</w:t>
-      </w:r>
-      <w:proofErr w:type="spellEnd"/>
-      <w:r>
-        <w:t>-optimierten Empfehlungssystemen heutiger Plattformen und macht die in Kapitel 2 entwickelten Beurteilungsgrundlagen in einem lauffähigen System sicht- und prüfbar.</w:t>
-      </w:r>
-    </w:p>
-    <w:p>
-      <w:pPr>
-        <w:spacing w:after="160" w:line="360" w:lineRule="auto"/>
-      </w:pPr>
-      <w:proofErr w:type="spellStart"/>
+        <w:t>Anhand eines vollautomatisierten Radios soll demonstriert werden, wie algorithmische Personalisierung so gestaltet werden kann, dass sie das Digital Wellbeing der Nutzenden fördert statt es zu untergraben. Das Artefakt dient damit als konkreter Gegenentwurf zu den engagement-optimierten Empfehlungssystemen heutiger Plattformen und macht die in Kapitel 2 entwickelten Beurteilungsgrundlagen in einem lauffähigen System sicht- und prüfbar.</w:t>
+      </w:r>
+    </w:p>
+    <w:p>
+      <w:pPr>
+        <w:spacing w:after="160" w:line="360" w:lineRule="auto"/>
+      </w:pPr>
       <w:r>
         <w:rPr>
           <w:b/>
           <w:bCs/>
         </w:rPr>
-        <w:t>Objective</w:t>
-      </w:r>
-      <w:proofErr w:type="spellEnd"/>
-      <w:r>
-        <w:rPr>
-          <w:b/>
-          <w:bCs/>
-        </w:rPr>
-        <w:t xml:space="preserve">. </w:t>
-      </w:r>
-      <w:r>
-        <w:t xml:space="preserve">Im Rahmen dieser Arbeit wird ein funktionsfähiger Demonstrator entwickelt, der die Prinzipien der nutzerzentrierten Personalisierung – explizite Präferenzangabe, transparente Empfehlungslogik, bewusste Inhaltsdiversität und definierte </w:t>
-      </w:r>
-      <w:proofErr w:type="spellStart"/>
-      <w:r>
-        <w:t>Sessiongestaltung</w:t>
-      </w:r>
-      <w:proofErr w:type="spellEnd"/>
-      <w:r>
-        <w:t xml:space="preserve"> – in einem Ende-zu-Ende-System umsetzt. Das System integriert externe Datenquellen (RSS-Feeds, Wetter-API), eine LLM-basierte Textgenerierung, eine Sprachsynthese und eine Webapplikation zu einer durchgängigen Sendungsproduktion und stellt das Ergebnis einem einwöchigen Pilottest mit einer kleinen Probandengruppe zur Verfügung.</w:t>
-      </w:r>
-    </w:p>
-    <w:p>
-      <w:pPr>
-        <w:spacing w:after="160" w:line="360" w:lineRule="auto"/>
-      </w:pPr>
-      <w:r>
-        <w:t xml:space="preserve">Aus Goal und </w:t>
-      </w:r>
-      <w:proofErr w:type="spellStart"/>
-      <w:r>
-        <w:t>Objective</w:t>
-      </w:r>
-      <w:proofErr w:type="spellEnd"/>
-      <w:r>
-        <w:t xml:space="preserve"> leiten sich die Erfolgskriterien der Arbeit ab, die in Abschnitt 8.4 operationalisiert werden.</w:t>
+        <w:t xml:space="preserve">Objective. </w:t>
+      </w:r>
+      <w:r>
+        <w:t>Im Rahmen dieser Arbeit wird ein funktionsfähiger Demonstrator entwickelt, der die Prinzipien der nutzerzentrierten Personalisierung – explizite Präferenzangabe, transparente Empfehlungslogik, bewusste Inhaltsdiversität und definierte Sessiongestaltung – in einem Ende-zu-Ende-System umsetzt. Das System integriert externe Datenquellen (RSS-Feeds, Wetter-API), eine LLM-basierte Textgenerierung, eine Sprachsynthese und eine Webapplikation zu einer durchgängigen Sendungsproduktion und stellt das Ergebnis einem einwöchigen Pilottest mit einer kleinen Probandengruppe zur Verfügung.</w:t>
+      </w:r>
+    </w:p>
+    <w:p>
+      <w:pPr>
+        <w:spacing w:after="160" w:line="360" w:lineRule="auto"/>
+      </w:pPr>
+      <w:r>
+        <w:t>Aus Goal und Objective leiten sich die Erfolgskriterien der Arbeit ab, die in Abschnitt 8.4 operationalisiert werden.</w:t>
       </w:r>
     </w:p>
     <w:p>
       <w:pPr>
         <w:pStyle w:val="berschrift2"/>
       </w:pPr>
-      <w:proofErr w:type="gramStart"/>
       <w:r>
         <w:t>4.4  Nutzen</w:t>
       </w:r>
-      <w:proofErr w:type="gramEnd"/>
-    </w:p>
-    <w:p>
-      <w:pPr>
-        <w:spacing w:after="160" w:line="360" w:lineRule="auto"/>
-      </w:pPr>
-      <w:r>
-        <w:t xml:space="preserve">Endnutzende erhalten ein personalisiertes Radioerlebnis, dessen Ausrichtung explizit am Wohlbefinden orientiert ist. Anders als bei </w:t>
-      </w:r>
-      <w:proofErr w:type="spellStart"/>
-      <w:r>
-        <w:t>engagement</w:t>
-      </w:r>
-      <w:proofErr w:type="spellEnd"/>
-      <w:r>
-        <w:t>-getriebenen Plattformen bestimmen die Nutzenden aktiv, welche Themen, welche Sendungslänge und welchen Grad inhaltlicher Diversifikation sie erleben. Die definierte Sendungslänge bricht bewusst mit dem Paradigma des endlosen Scrollens (Vanden Abeele, 2021) und schafft natürliche Abschlusspunkte; die offengelegte Personalisierungslogik macht algorithmische Souveränität (</w:t>
-      </w:r>
-      <w:proofErr w:type="spellStart"/>
-      <w:r>
-        <w:t>Reviglio</w:t>
-      </w:r>
-      <w:proofErr w:type="spellEnd"/>
-      <w:r>
-        <w:t xml:space="preserve"> &amp; Agosti, 2020) im Alltag erfahrbar. Damit bietet das Artefakt ein Erlebnis, das in der heutigen Medienlandschaft als integriertes, durchgängig </w:t>
-      </w:r>
-      <w:proofErr w:type="spellStart"/>
-      <w:r>
-        <w:t>wellbeing</w:t>
-      </w:r>
-      <w:proofErr w:type="spellEnd"/>
-      <w:r>
-        <w:t>-orientiertes Format kaum verfügbar ist.</w:t>
-      </w:r>
-    </w:p>
-    <w:p>
-      <w:pPr>
-        <w:spacing w:after="160" w:line="360" w:lineRule="auto"/>
-      </w:pPr>
-      <w:r>
-        <w:t>Die Arbeit leistet einen Beitrag an der Schnittstelle von Wirtschaftsinformatik, Medienethik und Human-Computer Interaction. Sie liefert ein durchgängiges, lauffähiges Artefakt, an dem sich die Prinzipien aus Self-Determination Theory (Ryan &amp; Deci, 2000), Value-Sensitive Design (Hendry et al., 2021), Digital Wellbeing (Vanden Abeele, 2021; Burr et al., 2020; Peters et al., 2020) und algorithmischer Souveränität (</w:t>
-      </w:r>
-      <w:proofErr w:type="spellStart"/>
-      <w:r>
-        <w:t>Reviglio</w:t>
-      </w:r>
-      <w:proofErr w:type="spellEnd"/>
-      <w:r>
-        <w:t xml:space="preserve"> &amp; Agosti, 2020) integriert beobachten lassen – ein Setting, das in der bisherigen Literatur überwiegend konzeptionell, aber nur selten in einem konsistent gebauten System adressiert wird (vgl. Abschnitt 2.5). Der Pilottest erzeugt darüber hinaus erste empirische Hinweise auf die Nutzerakzeptanz </w:t>
-      </w:r>
-      <w:proofErr w:type="spellStart"/>
-      <w:r>
+    </w:p>
+    <w:p>
+      <w:pPr>
+        <w:spacing w:after="160" w:line="360" w:lineRule="auto"/>
+      </w:pPr>
+      <w:r>
+        <w:t>Endnutzende erhalten ein personalisiertes Radioerlebnis, dessen Ausrichtung explizit am Wohlbefinden orientiert ist. Anders als bei engagement-getriebenen Plattformen bestimmen die Nutzenden aktiv, welche Themen, welche Sendungslänge und welchen Grad inhaltlicher Diversifikation sie erleben. Die definierte Sendungslänge bricht bewusst mit dem Paradigma des endlosen Scrollens (Vanden Abeele, 2021) und schafft natürliche Abschlusspunkte; die offengelegte Personalisierungslogik macht algorithmische Souveränität (Reviglio &amp; Agosti, 2020) im Alltag erfahrbar. Damit bietet das Artefakt ein Erlebnis, das in der heutigen Medienlandschaft als integriertes, durchgängig wellbeing-orientiertes Format kaum verfügbar ist.</w:t>
+      </w:r>
+    </w:p>
+    <w:p>
+      <w:pPr>
+        <w:spacing w:after="160" w:line="360" w:lineRule="auto"/>
+      </w:pPr>
+      <w:r>
+        <w:t xml:space="preserve">Die Arbeit leistet einen Beitrag an der Schnittstelle von Wirtschaftsinformatik, Medienethik und Human-Computer Interaction. Sie liefert ein durchgängiges, lauffähiges Artefakt, an dem sich die Prinzipien aus Self-Determination Theory (Ryan &amp; Deci, 2000), Value-Sensitive Design (Hendry et al., 2021), Digital Wellbeing (Vanden Abeele, 2021; Burr et al., 2020; Peters et al., 2020) und algorithmischer Souveränität (Reviglio &amp; Agosti, 2020) integriert beobachten lassen – ein Setting, das in der bisherigen Literatur überwiegend konzeptionell, aber nur selten in einem konsistent gebauten System adressiert wird (vgl. Abschnitt 2.5). Der Pilottest erzeugt darüber hinaus erste empirische Hinweise auf die Nutzerakzeptanz </w:t>
         <w:lastRenderedPageBreak/>
-        <w:t>wellbeing</w:t>
-      </w:r>
-      <w:proofErr w:type="spellEnd"/>
-      <w:r>
-        <w:t>-orientierter Personalisierung und liefert eine methodische Vorlage, an der sich grössere Folgestudien orientieren können.</w:t>
-      </w:r>
-    </w:p>
-    <w:p>
-      <w:pPr>
-        <w:spacing w:after="160" w:line="360" w:lineRule="auto"/>
-      </w:pPr>
-      <w:r>
-        <w:t xml:space="preserve">Auf gesellschaftlicher Ebene zeigt die Arbeit, dass Personalisierung kein per se schädliches Konzept ist, sondern dass die Wirkung an der zugrundeliegenden Zielfunktion hängt. Indem Radio 25 als funktionierendes Gegenbeispiel zu </w:t>
-      </w:r>
-      <w:proofErr w:type="spellStart"/>
-      <w:r>
-        <w:t>engagement</w:t>
-      </w:r>
-      <w:proofErr w:type="spellEnd"/>
-      <w:r>
-        <w:t>-getriebenen Plattformen verfügbar wird, wird die Diskussion um ethische Medientechnologie auf eine konkrete Erfahrungsebene gehoben. Die zugrundeliegenden Designentscheidungen lassen sich auf andere Medienformate (Podcast, Newsletter, kuratierte Lese-Streams) übertragen und können als Referenzpunkt für regulatorische und gestalterische Diskussionen über algorithmische Souveränität (</w:t>
-      </w:r>
-      <w:proofErr w:type="spellStart"/>
-      <w:r>
-        <w:t>Reviglio</w:t>
-      </w:r>
-      <w:proofErr w:type="spellEnd"/>
-      <w:r>
-        <w:t xml:space="preserve"> &amp; Agosti, 2020) und Wellbeing-supportive Design (Peters et al., 2020) dienen.</w:t>
+        <w:t>wellbeing-orientierter Personalisierung und liefert eine methodische Vorlage, an der sich grössere Folgestudien orientieren können.</w:t>
+      </w:r>
+    </w:p>
+    <w:p>
+      <w:pPr>
+        <w:spacing w:after="160" w:line="360" w:lineRule="auto"/>
+      </w:pPr>
+      <w:r>
+        <w:t>Auf gesellschaftlicher Ebene zeigt die Arbeit, dass Personalisierung kein per se schädliches Konzept ist, sondern dass die Wirkung an der zugrundeliegenden Zielfunktion hängt. Indem Attune als funktionierendes Gegenbeispiel zu engagement-getriebenen Plattformen verfügbar wird, wird die Diskussion um ethische Medientechnologie auf eine konkrete Erfahrungsebene gehoben. Die zugrundeliegenden Designentscheidungen lassen sich auf andere Medienformate (Podcast, Newsletter, kuratierte Lese-Streams) übertragen und können als Referenzpunkt für regulatorische und gestalterische Diskussionen über algorithmische Souveränität (Reviglio &amp; Agosti, 2020) und Wellbeing-supportive Design (Peters et al., 2020) dienen.</w:t>
       </w:r>
     </w:p>
     <w:p>
       <w:pPr>
         <w:pStyle w:val="berschrift2"/>
       </w:pPr>
-      <w:proofErr w:type="gramStart"/>
       <w:r>
         <w:t>4.5  Abgrenzung</w:t>
       </w:r>
-      <w:proofErr w:type="gramEnd"/>
-    </w:p>
-    <w:p>
-      <w:pPr>
-        <w:spacing w:after="160" w:line="360" w:lineRule="auto"/>
-      </w:pPr>
-      <w:r>
-        <w:t>Radio 25 versteht sich, wie in Abschnitt 3.5 bereits eingeführt, als Konzeptstudie. Die Arbeit fokussiert auf die nutzerzentrierte Personalisierung und das daraus erwachsende Wohlbefinden; einige verwandte Themenfelder werden bewusst ausgeklammert, um den Untersuchungsgegenstand trennscharf zu halten.</w:t>
+    </w:p>
+    <w:p>
+      <w:pPr>
+        <w:spacing w:after="160" w:line="360" w:lineRule="auto"/>
+      </w:pPr>
+      <w:r>
+        <w:t>Attune versteht sich, wie in Abschnitt 3.5 bereits eingeführt, als Konzeptstudie. Die Arbeit fokussiert auf die nutzerzentrierte Personalisierung und das daraus erwachsende Wohlbefinden; einige verwandte Themenfelder werden bewusst ausgeklammert, um den Untersuchungsgegenstand trennscharf zu halten.</w:t>
       </w:r>
     </w:p>
     <w:p>
@@ -3408,8 +2479,6 @@
       </w:pPr>
       <w:r>
         <w:t xml:space="preserve">Sprach- und Kulturraum: Untersucht wird der deutschsprachige Raum mit Schweizer Hochdeutsch als Sprachausgabe; mehrsprachige Anwendung und kulturelle </w:t>
-      </w:r>
-      <w:r>
         <w:lastRenderedPageBreak/>
         <w:t>Adaption werden im Ausblick (Abschnitt 11.3) gestreift, nicht aber empirisch untersucht.</w:t>
       </w:r>
@@ -3427,12 +2496,10 @@
         <w:pStyle w:val="berschrift1"/>
         <w:pageBreakBefore/>
       </w:pPr>
-      <w:proofErr w:type="gramStart"/>
       <w:r>
         <w:lastRenderedPageBreak/>
         <w:t>5  Methodik</w:t>
       </w:r>
-      <w:proofErr w:type="gramEnd"/>
     </w:p>
     <w:p>
       <w:pPr>
@@ -3446,13 +2513,8 @@
       <w:pPr>
         <w:pStyle w:val="berschrift2"/>
       </w:pPr>
-      <w:proofErr w:type="gramStart"/>
-      <w:r>
-        <w:t>5.1  Vorgehen</w:t>
-      </w:r>
-      <w:proofErr w:type="gramEnd"/>
-      <w:r>
-        <w:t xml:space="preserve"> der Literaturrecherche</w:t>
+      <w:r>
+        <w:t>5.1  Vorgehen der Literaturrecherche</w:t>
       </w:r>
     </w:p>
     <w:p>
@@ -3468,267 +2530,75 @@
         <w:spacing w:after="160" w:line="360" w:lineRule="auto"/>
       </w:pPr>
       <w:r>
-        <w:t xml:space="preserve">Als erstes Werkzeug wurden die klassischen wissenschaftlichen Suchmaschinen </w:t>
-      </w:r>
-      <w:proofErr w:type="spellStart"/>
-      <w:r>
-        <w:t>Swisscovery</w:t>
-      </w:r>
-      <w:proofErr w:type="spellEnd"/>
-      <w:r>
-        <w:t xml:space="preserve"> und Google Scholar eingesetzt. Gesucht wurde nach englisch- und deutschsprachigen Quellen zu den Kernbegriffen «Digital Wellbeing», «</w:t>
-      </w:r>
-      <w:proofErr w:type="spellStart"/>
-      <w:r>
-        <w:t>Social</w:t>
-      </w:r>
-      <w:proofErr w:type="spellEnd"/>
-      <w:r>
-        <w:t xml:space="preserve"> Media», «</w:t>
-      </w:r>
-      <w:proofErr w:type="spellStart"/>
-      <w:r>
-        <w:t>Recommender</w:t>
-      </w:r>
-      <w:proofErr w:type="spellEnd"/>
-      <w:r>
-        <w:t xml:space="preserve"> Systems», «</w:t>
-      </w:r>
-      <w:proofErr w:type="spellStart"/>
-      <w:r>
-        <w:t>Personalization</w:t>
-      </w:r>
-      <w:proofErr w:type="spellEnd"/>
-      <w:r>
-        <w:t>», «Value-Sensitive Design» und «Self-Determination Theory». Die Ergebnislisten wurden nach Titel, Abstract und Zitationshäufigkeit vorgefiltert. Als besonders ertragreich erwiesen sich die Reviews von Burr et al. (2020) und Orben (2020), die als Einstiegspunkte für Rückwärtssuchen dienten.</w:t>
-      </w:r>
-    </w:p>
-    <w:p>
-      <w:pPr>
-        <w:spacing w:after="160" w:line="360" w:lineRule="auto"/>
-      </w:pPr>
-      <w:r>
-        <w:t xml:space="preserve">Als zweites Werkzeug wurde Claude (Anthropic) als KI-basiertes Recherchewerkzeug eingesetzt, primär zur Query Expansion und zur Identifikation angrenzender Theoriefelder. Prompts wie «Welche Theorien und zentralen Autorinnen und Autoren prägen die Debatte um Digital Wellbeing in </w:t>
-      </w:r>
-      <w:proofErr w:type="spellStart"/>
-      <w:r>
-        <w:t>Social</w:t>
-      </w:r>
-      <w:proofErr w:type="spellEnd"/>
-      <w:r>
-        <w:t xml:space="preserve"> Media?» oder «Welche Konzepte adressieren Nutzerkontrolle und algorithmische Transparenz in Empfehlungssystemen?» lieferten thematische Übersichten und konkrete Quellenvorschläge. Auf diesem Weg wurden unter anderem die Begriffe «</w:t>
-      </w:r>
-      <w:proofErr w:type="spellStart"/>
-      <w:r>
-        <w:t>Algorithmic</w:t>
-      </w:r>
-      <w:proofErr w:type="spellEnd"/>
-      <w:r>
-        <w:t xml:space="preserve"> </w:t>
-      </w:r>
-      <w:proofErr w:type="spellStart"/>
-      <w:r>
-        <w:t>Sovereignty</w:t>
-      </w:r>
-      <w:proofErr w:type="spellEnd"/>
-      <w:r>
-        <w:t>» (</w:t>
-      </w:r>
-      <w:proofErr w:type="spellStart"/>
-      <w:r>
-        <w:t>Reviglio</w:t>
-      </w:r>
-      <w:proofErr w:type="spellEnd"/>
-      <w:r>
-        <w:t xml:space="preserve"> &amp; Agosti, 2020), «Persuasive Technology» (Fogg, 2003), «Digital Nudging» (Weinmann et al., 2016) und das METUX-Modell (Peters et al., 2018) als relevant identifiziert. Claude wurde dabei ausschliesslich für die Ideenfindung und Begriffserweiterung genutzt; jede vorgeschlagene Quelle wurde anschliessend in </w:t>
-      </w:r>
-      <w:proofErr w:type="spellStart"/>
-      <w:r>
+        <w:t>Als erstes Werkzeug wurden die klassischen wissenschaftlichen Suchmaschinen Swisscovery und Google Scholar eingesetzt. Gesucht wurde nach englisch- und deutschsprachigen Quellen zu den Kernbegriffen «Digital Wellbeing», «Social Media», «Recommender Systems», «Personalization», «Value-Sensitive Design» und «Self-Determination Theory». Die Ergebnislisten wurden nach Titel, Abstract und Zitationshäufigkeit vorgefiltert. Als besonders ertragreich erwiesen sich die Reviews von Burr et al. (2020) und Orben (2020), die als Einstiegspunkte für Rückwärtssuchen dienten.</w:t>
+      </w:r>
+    </w:p>
+    <w:p>
+      <w:pPr>
+        <w:spacing w:after="160" w:line="360" w:lineRule="auto"/>
+      </w:pPr>
+      <w:r>
+        <w:t xml:space="preserve">Als zweites Werkzeug wurde Claude (Anthropic) als KI-basiertes Recherchewerkzeug eingesetzt, primär zur Query Expansion und zur Identifikation angrenzender Theoriefelder. Prompts wie «Welche Theorien und zentralen Autorinnen und Autoren prägen die Debatte um Digital Wellbeing in Social Media?» oder «Welche Konzepte adressieren Nutzerkontrolle und algorithmische Transparenz in Empfehlungssystemen?» lieferten thematische Übersichten und konkrete Quellenvorschläge. Auf diesem Weg wurden unter anderem die Begriffe «Algorithmic Sovereignty» (Reviglio &amp; Agosti, 2020), «Persuasive Technology» (Fogg, 2003), «Digital Nudging» (Weinmann et al., 2016) und das METUX-Modell (Peters et al., 2018) als relevant identifiziert. Claude wurde dabei ausschliesslich für die Ideenfindung und Begriffserweiterung genutzt; jede vorgeschlagene Quelle wurde anschliessend in </w:t>
         <w:lastRenderedPageBreak/>
-        <w:t>Swisscovery</w:t>
-      </w:r>
-      <w:proofErr w:type="spellEnd"/>
-      <w:r>
-        <w:t xml:space="preserve">, im Verlagskatalog oder über den Digital </w:t>
-      </w:r>
-      <w:proofErr w:type="spellStart"/>
-      <w:r>
-        <w:t>Object</w:t>
-      </w:r>
-      <w:proofErr w:type="spellEnd"/>
-      <w:r>
-        <w:t xml:space="preserve"> Identifier verifiziert und als Originaldokument bezogen. Kein Inhalt wurde ohne Gegenprüfung übernommen.</w:t>
-      </w:r>
-    </w:p>
-    <w:p>
-      <w:pPr>
-        <w:spacing w:after="160" w:line="360" w:lineRule="auto"/>
-      </w:pPr>
-      <w:r>
-        <w:t xml:space="preserve">Als drittes Werkzeug wurde </w:t>
-      </w:r>
-      <w:proofErr w:type="spellStart"/>
-      <w:r>
-        <w:t>NotebookLM</w:t>
-      </w:r>
-      <w:proofErr w:type="spellEnd"/>
-      <w:r>
-        <w:t xml:space="preserve"> (Google) eingesetzt, um den aufgebauten Quellenpool thematisch zu strukturieren und die Kernaussagen mehrerer Arbeiten gegenüberzustellen. Dies erleichterte die Einordnung der Quellen in die Abschnitte zu Bedürfnissen, Mechanismen und Beurteilungsgrundlagen und half, inhaltliche Dopplungen und Lücken zu erkennen.</w:t>
-      </w:r>
-    </w:p>
-    <w:p>
-      <w:pPr>
-        <w:spacing w:after="160" w:line="360" w:lineRule="auto"/>
-      </w:pPr>
-      <w:r>
-        <w:t xml:space="preserve">Die finale Verwaltung der Quellen erfolgt in </w:t>
-      </w:r>
-      <w:proofErr w:type="spellStart"/>
-      <w:r>
-        <w:t>Zotero</w:t>
-      </w:r>
-      <w:proofErr w:type="spellEnd"/>
-      <w:r>
-        <w:t>. Das gesamte Quellenset ist dort gepflegt und exportierbar; die in Kapitel 1 und 2 zitierten Arbeiten sind im Literaturverzeichnis aufgeführt. Der Review wird im weiteren Verlauf der Arbeit laufend ergänzt, insbesondere im Bereich der konkreten Mechanismen und der Evaluationsliteratur.</w:t>
+        <w:t>Swisscovery, im Verlagskatalog oder über den Digital Object Identifier verifiziert und als Originaldokument bezogen. Kein Inhalt wurde ohne Gegenprüfung übernommen.</w:t>
+      </w:r>
+    </w:p>
+    <w:p>
+      <w:pPr>
+        <w:spacing w:after="160" w:line="360" w:lineRule="auto"/>
+      </w:pPr>
+      <w:r>
+        <w:t>Als drittes Werkzeug wurde NotebookLM (Google) eingesetzt, um den aufgebauten Quellenpool thematisch zu strukturieren und die Kernaussagen mehrerer Arbeiten gegenüberzustellen. Dies erleichterte die Einordnung der Quellen in die Abschnitte zu Bedürfnissen, Mechanismen und Beurteilungsgrundlagen und half, inhaltliche Dopplungen und Lücken zu erkennen.</w:t>
+      </w:r>
+    </w:p>
+    <w:p>
+      <w:pPr>
+        <w:spacing w:after="160" w:line="360" w:lineRule="auto"/>
+      </w:pPr>
+      <w:r>
+        <w:t>Die finale Verwaltung der Quellen erfolgt in Zotero. Das gesamte Quellenset ist dort gepflegt und exportierbar; die in Kapitel 1 und 2 zitierten Arbeiten sind im Literaturverzeichnis aufgeführt. Der Review wird im weiteren Verlauf der Arbeit laufend ergänzt, insbesondere im Bereich der konkreten Mechanismen und der Evaluationsliteratur.</w:t>
       </w:r>
     </w:p>
     <w:p>
       <w:pPr>
         <w:pStyle w:val="berschrift2"/>
       </w:pPr>
-      <w:proofErr w:type="gramStart"/>
       <w:r>
         <w:t>5.2  Forschungsdesign</w:t>
       </w:r>
-      <w:proofErr w:type="gramEnd"/>
-    </w:p>
-    <w:p>
-      <w:pPr>
-        <w:spacing w:after="160" w:line="360" w:lineRule="auto"/>
-      </w:pPr>
-      <w:r>
-        <w:t xml:space="preserve">Die Arbeit folgt dem Design-Science-Ansatz, wie er von Hevner, March, Park und Ram (2004) für die Wirtschaftsinformatik etabliert und von Peffers, </w:t>
-      </w:r>
-      <w:proofErr w:type="spellStart"/>
-      <w:r>
-        <w:t>Tuunanen</w:t>
-      </w:r>
-      <w:proofErr w:type="spellEnd"/>
-      <w:r>
-        <w:t>, Rothenberger und Chatterjee (2007) zu einer prozeduralen Forschungsmethodologie ausgearbeitet wurde. Im Zentrum dieses Ansatzes steht die Entwicklung eines neuartigen, zweckgebundenen Artefakts (hier: Radio 25), das ein praktisches Problem (</w:t>
-      </w:r>
-      <w:proofErr w:type="spellStart"/>
-      <w:r>
-        <w:t>engagement</w:t>
-      </w:r>
-      <w:proofErr w:type="spellEnd"/>
-      <w:r>
-        <w:t xml:space="preserve">-getriebene, </w:t>
-      </w:r>
-      <w:proofErr w:type="spellStart"/>
-      <w:r>
-        <w:t>wellbeing</w:t>
-      </w:r>
-      <w:proofErr w:type="spellEnd"/>
-      <w:r>
-        <w:t>-untergrabende Personalisierung) adressiert und gleichzeitig einen wissenschaftlichen Erkenntnisbeitrag leistet. Design Science ist dafür besonders geeignet, weil es die im Spannungsfeld dieser Arbeit liegenden Pole verbindet: theoretische Verankerung (Rigor) und praktische Relevanz (</w:t>
-      </w:r>
-      <w:proofErr w:type="spellStart"/>
-      <w:r>
-        <w:t>Relevance</w:t>
-      </w:r>
-      <w:proofErr w:type="spellEnd"/>
-      <w:r>
-        <w:t>) treffen sich in der iterativen Konstruktion und Evaluation eines konkreten Systems.</w:t>
-      </w:r>
-    </w:p>
-    <w:p>
-      <w:pPr>
-        <w:spacing w:after="160" w:line="360" w:lineRule="auto"/>
-      </w:pPr>
-      <w:r>
-        <w:t xml:space="preserve">Hevner (2007) verdichtet diesen Ansatz zur </w:t>
-      </w:r>
-      <w:proofErr w:type="spellStart"/>
-      <w:r>
-        <w:t>Three</w:t>
-      </w:r>
-      <w:proofErr w:type="spellEnd"/>
-      <w:r>
-        <w:t xml:space="preserve">-Cycle-View, die die Forschung in drei eng verzahnten Zyklen organisiert. Der </w:t>
-      </w:r>
-      <w:proofErr w:type="spellStart"/>
-      <w:r>
-        <w:t>Relevance</w:t>
-      </w:r>
-      <w:proofErr w:type="spellEnd"/>
-      <w:r>
-        <w:t xml:space="preserve"> Cycle verbindet das Design mit dem Anwendungsfeld: Aus der Anwendungsdomäne (digitale Medien, Plattformökonomie, Digital Wellbeing) werden Anforderungen abgeleitet, und in dieselbe Domäne wird das Artefakt zur Evaluation zurückgespielt. Der Rigor Cycle stellt sicher, dass das Vorgehen wissenschaftlich anschlussfähig bleibt: Theorien und Methoden aus der Wissensbasis (Self-Determination Theory, Value-Sensitive Design, </w:t>
-      </w:r>
-      <w:proofErr w:type="spellStart"/>
-      <w:r>
-        <w:t>Recommender</w:t>
-      </w:r>
-      <w:proofErr w:type="spellEnd"/>
-      <w:r>
-        <w:t>-Systems-Forschung, Persuasive Technology) fliessen in das Design ein, und die gewonnenen Erkenntnisse werden zur Wissensbasis zurückgegeben. Im inneren Design Cycle werden die Konstruktion und die Evaluation des Artefakts iterativ verschränkt.</w:t>
-      </w:r>
-    </w:p>
-    <w:p>
-      <w:pPr>
-        <w:spacing w:after="160" w:line="360" w:lineRule="auto"/>
-      </w:pPr>
-      <w:r>
-        <w:t xml:space="preserve">Auf die vorliegende Arbeit übertragen bedeutet dies: Der </w:t>
-      </w:r>
-      <w:proofErr w:type="spellStart"/>
-      <w:r>
-        <w:t>Relevance</w:t>
-      </w:r>
-      <w:proofErr w:type="spellEnd"/>
-      <w:r>
-        <w:t xml:space="preserve"> Cycle ist in den Kapiteln 1 und 3 sowie im Pilottest (Abschnitt 8.3) verankert; der Rigor Cycle wird in Kapitel 2 sowie </w:t>
-      </w:r>
-      <w:r>
+    </w:p>
+    <w:p>
+      <w:pPr>
+        <w:spacing w:after="160" w:line="360" w:lineRule="auto"/>
+      </w:pPr>
+      <w:r>
+        <w:t>Die Arbeit folgt dem Design-Science-Ansatz, wie er von Hevner, March, Park und Ram (2004) für die Wirtschaftsinformatik etabliert und von Peffers, Tuunanen, Rothenberger und Chatterjee (2007) zu einer prozeduralen Forschungsmethodologie ausgearbeitet wurde. Im Zentrum dieses Ansatzes steht die Entwicklung eines neuartigen, zweckgebundenen Artefakts (hier: Attune), das ein praktisches Problem (engagement-getriebene, wellbeing-untergrabende Personalisierung) adressiert und gleichzeitig einen wissenschaftlichen Erkenntnisbeitrag leistet. Design Science ist dafür besonders geeignet, weil es die im Spannungsfeld dieser Arbeit liegenden Pole verbindet: theoretische Verankerung (Rigor) und praktische Relevanz (Relevance) treffen sich in der iterativen Konstruktion und Evaluation eines konkreten Systems.</w:t>
+      </w:r>
+    </w:p>
+    <w:p>
+      <w:pPr>
+        <w:spacing w:after="160" w:line="360" w:lineRule="auto"/>
+      </w:pPr>
+      <w:r>
+        <w:t>Hevner (2007) verdichtet diesen Ansatz zur Three-Cycle-View, die die Forschung in drei eng verzahnten Zyklen organisiert. Der Relevance Cycle verbindet das Design mit dem Anwendungsfeld: Aus der Anwendungsdomäne (digitale Medien, Plattformökonomie, Digital Wellbeing) werden Anforderungen abgeleitet, und in dieselbe Domäne wird das Artefakt zur Evaluation zurückgespielt. Der Rigor Cycle stellt sicher, dass das Vorgehen wissenschaftlich anschlussfähig bleibt: Theorien und Methoden aus der Wissensbasis (Self-Determination Theory, Value-Sensitive Design, Recommender-Systems-Forschung, Persuasive Technology) fliessen in das Design ein, und die gewonnenen Erkenntnisse werden zur Wissensbasis zurückgegeben. Im inneren Design Cycle werden die Konstruktion und die Evaluation des Artefakts iterativ verschränkt.</w:t>
+      </w:r>
+    </w:p>
+    <w:p>
+      <w:pPr>
+        <w:spacing w:after="160" w:line="360" w:lineRule="auto"/>
+      </w:pPr>
+      <w:r>
+        <w:t xml:space="preserve">Auf die vorliegende Arbeit übertragen bedeutet dies: Der Relevance Cycle ist in den Kapiteln 1 und 3 sowie im Pilottest (Abschnitt 8.3) verankert; der Rigor Cycle wird in Kapitel 2 sowie </w:t>
         <w:lastRenderedPageBreak/>
-        <w:t xml:space="preserve">in Abschnitt 5.1 dokumentiert; der Design Cycle umfasst die in den Kapiteln 6 und 7 beschriebene iterative Konstruktion und die in Kapitel 8 ausgeführte Evaluation. Peffers et al. (2007) ergänzen diesen Rahmen um eine konkrete Schrittfolge – Problem </w:t>
-      </w:r>
-      <w:proofErr w:type="spellStart"/>
-      <w:r>
-        <w:t>Identification</w:t>
-      </w:r>
-      <w:proofErr w:type="spellEnd"/>
-      <w:r>
-        <w:t xml:space="preserve">, Definition </w:t>
-      </w:r>
-      <w:proofErr w:type="spellStart"/>
-      <w:r>
-        <w:t>of</w:t>
-      </w:r>
-      <w:proofErr w:type="spellEnd"/>
-      <w:r>
-        <w:t xml:space="preserve"> </w:t>
-      </w:r>
-      <w:proofErr w:type="spellStart"/>
-      <w:r>
-        <w:t>Objectives</w:t>
-      </w:r>
-      <w:proofErr w:type="spellEnd"/>
-      <w:r>
-        <w:t>, Design and Development, Demonstration, Evaluation, Communication –, die im Gesamtaufbau dieser Arbeit unmittelbar erkennbar ist und in der nachfolgenden Vorgehensbeschreibung in Abschnitt 5.3 ihren operativen Ausdruck findet.</w:t>
+        <w:t>in Abschnitt 5.1 dokumentiert; der Design Cycle umfasst die in den Kapiteln 6 und 7 beschriebene iterative Konstruktion und die in Kapitel 8 ausgeführte Evaluation. Peffers et al. (2007) ergänzen diesen Rahmen um eine konkrete Schrittfolge – Problem Identification, Definition of Objectives, Design and Development, Demonstration, Evaluation, Communication –, die im Gesamtaufbau dieser Arbeit unmittelbar erkennbar ist und in der nachfolgenden Vorgehensbeschreibung in Abschnitt 5.3 ihren operativen Ausdruck findet.</w:t>
       </w:r>
     </w:p>
     <w:p>
       <w:pPr>
         <w:pStyle w:val="berschrift2"/>
       </w:pPr>
-      <w:proofErr w:type="gramStart"/>
-      <w:r>
-        <w:t>5.3  Vorgehen</w:t>
-      </w:r>
-      <w:proofErr w:type="gramEnd"/>
-      <w:r>
-        <w:t xml:space="preserve"> im Überblick</w:t>
+      <w:r>
+        <w:t>5.3  Vorgehen im Überblick</w:t>
       </w:r>
     </w:p>
     <w:p>
@@ -4208,23 +3078,7 @@
                 <w:sz w:val="20"/>
                 <w:szCs w:val="20"/>
               </w:rPr>
-              <w:t>Durchstich (End-</w:t>
-            </w:r>
-            <w:proofErr w:type="spellStart"/>
-            <w:r>
-              <w:rPr>
-                <w:sz w:val="20"/>
-                <w:szCs w:val="20"/>
-              </w:rPr>
-              <w:t>to</w:t>
-            </w:r>
-            <w:proofErr w:type="spellEnd"/>
-            <w:r>
-              <w:rPr>
-                <w:sz w:val="20"/>
-                <w:szCs w:val="20"/>
-              </w:rPr>
-              <w:t>-End)</w:t>
+              <w:t>Durchstich (End-to-End)</w:t>
             </w:r>
           </w:p>
         </w:tc>
@@ -4406,23 +3260,7 @@
                 <w:sz w:val="20"/>
                 <w:szCs w:val="20"/>
               </w:rPr>
-              <w:t xml:space="preserve">Erweiterter Demonstrator mit </w:t>
-            </w:r>
-            <w:proofErr w:type="spellStart"/>
-            <w:r>
-              <w:rPr>
-                <w:sz w:val="20"/>
-                <w:szCs w:val="20"/>
-              </w:rPr>
-              <w:t>wellbeing</w:t>
-            </w:r>
-            <w:proofErr w:type="spellEnd"/>
-            <w:r>
-              <w:rPr>
-                <w:sz w:val="20"/>
-                <w:szCs w:val="20"/>
-              </w:rPr>
-              <w:t>-orientierten Features</w:t>
+              <w:t>Erweiterter Demonstrator mit wellbeing-orientierten Features</w:t>
             </w:r>
           </w:p>
         </w:tc>
@@ -4810,56 +3648,25 @@
         <w:spacing w:after="160" w:line="360" w:lineRule="auto"/>
       </w:pPr>
       <w:r>
-        <w:t xml:space="preserve">Die Pakete AP1 bis AP4 bilden den Kern des Design Cycle, AP5 und AP6 schliessen den </w:t>
-      </w:r>
-      <w:proofErr w:type="spellStart"/>
-      <w:r>
-        <w:t>Relevance</w:t>
-      </w:r>
-      <w:proofErr w:type="spellEnd"/>
-      <w:r>
-        <w:t xml:space="preserve"> Cycle, und AP7 sichert die Anschlussfähigkeit für den Rigor Cycle. Der </w:t>
-      </w:r>
-      <w:r>
+        <w:t xml:space="preserve">Die Pakete AP1 bis AP4 bilden den Kern des Design Cycle, AP5 und AP6 schliessen den Relevance Cycle, und AP7 sichert die Anschlussfähigkeit für den Rigor Cycle. Der </w:t>
         <w:lastRenderedPageBreak/>
-        <w:t xml:space="preserve">Zeitrahmen erstreckt sich über das offizielle </w:t>
-      </w:r>
-      <w:proofErr w:type="spellStart"/>
-      <w:r>
-        <w:t>BSc</w:t>
-      </w:r>
-      <w:proofErr w:type="spellEnd"/>
-      <w:r>
-        <w:t>-Thesis-Fenster von rund zehn Wochen, ergänzt um eine Vorbereitungsphase, in der erste Literaturrecherchen sowie technische Prototypen bereits vor dem offiziellen Projektstart durchgeführt wurden.</w:t>
+        <w:t>Zeitrahmen erstreckt sich über das offizielle BSc-Thesis-Fenster von rund zehn Wochen, ergänzt um eine Vorbereitungsphase, in der erste Literaturrecherchen sowie technische Prototypen bereits vor dem offiziellen Projektstart durchgeführt wurden.</w:t>
       </w:r>
     </w:p>
     <w:p>
       <w:pPr>
         <w:pStyle w:val="berschrift2"/>
       </w:pPr>
-      <w:proofErr w:type="gramStart"/>
-      <w:r>
-        <w:t>5.4  Methoden</w:t>
-      </w:r>
-      <w:proofErr w:type="gramEnd"/>
-      <w:r>
-        <w:t xml:space="preserve"> der Datenerhebung</w:t>
-      </w:r>
-    </w:p>
-    <w:p>
-      <w:pPr>
-        <w:spacing w:after="160" w:line="360" w:lineRule="auto"/>
-      </w:pPr>
-      <w:r>
-        <w:t xml:space="preserve">Die empirische Erhebung im Rahmen dieser Arbeit hat den Charakter einer formativen Pilotstudie. Sie ist nicht darauf ausgelegt, statistisch repräsentative Aussagen zu generieren, sondern auf das frühe Erkennen von Mustern, Problemen und Wirkungen, die in nachfolgenden Studien systematischer untersucht werden können. Die Erhebung kombiniert vier Datenquellen, die sich gegenseitig stützen und </w:t>
-      </w:r>
-      <w:proofErr w:type="spellStart"/>
-      <w:r>
-        <w:t>triangulierbar</w:t>
-      </w:r>
-      <w:proofErr w:type="spellEnd"/>
-      <w:r>
-        <w:t xml:space="preserve"> sind.</w:t>
+      <w:r>
+        <w:t>5.4  Methoden der Datenerhebung</w:t>
+      </w:r>
+    </w:p>
+    <w:p>
+      <w:pPr>
+        <w:spacing w:after="160" w:line="360" w:lineRule="auto"/>
+      </w:pPr>
+      <w:r>
+        <w:t>Die empirische Erhebung im Rahmen dieser Arbeit hat den Charakter einer formativen Pilotstudie. Sie ist nicht darauf ausgelegt, statistisch repräsentative Aussagen zu generieren, sondern auf das frühe Erkennen von Mustern, Problemen und Wirkungen, die in nachfolgenden Studien systematischer untersucht werden können. Die Erhebung kombiniert vier Datenquellen, die sich gegenseitig stützen und triangulierbar sind.</w:t>
       </w:r>
     </w:p>
     <w:p>
@@ -4875,31 +3682,7 @@
         <w:spacing w:after="160" w:line="360" w:lineRule="auto"/>
       </w:pPr>
       <w:r>
-        <w:t xml:space="preserve">Zweitens werden </w:t>
-      </w:r>
-      <w:proofErr w:type="spellStart"/>
-      <w:r>
-        <w:t>wellbeing</w:t>
-      </w:r>
-      <w:proofErr w:type="spellEnd"/>
-      <w:r>
-        <w:t xml:space="preserve">-bezogene Items eingesetzt, die in einem kurzen Tagesfragebogen den subjektiven Zustand der Nutzenden vor und nach der Sendung erfassen. Die konkrete </w:t>
-      </w:r>
-      <w:proofErr w:type="spellStart"/>
-      <w:r>
-        <w:t>Itembatterie</w:t>
-      </w:r>
-      <w:proofErr w:type="spellEnd"/>
-      <w:r>
-        <w:t xml:space="preserve"> wird in der Implementationsphase finalisiert und orientiert sich an den von Peters, Ahmadpour und Calvo (2020) zusammengetragenen </w:t>
-      </w:r>
-      <w:proofErr w:type="spellStart"/>
-      <w:r>
-        <w:t>wellbeing</w:t>
-      </w:r>
-      <w:proofErr w:type="spellEnd"/>
-      <w:r>
-        <w:t>-bezogenen Konstrukten sowie an der Definition von Vanden Abeele (2021). Diese Daten adressieren die Teilfragen T1 (Autonomie- und Kompetenzerleben) und T3 (Zeitempfinden und Nutzungskontrolle).</w:t>
+        <w:t>Zweitens werden wellbeing-bezogene Items eingesetzt, die in einem kurzen Tagesfragebogen den subjektiven Zustand der Nutzenden vor und nach der Sendung erfassen. Die konkrete Itembatterie wird in der Implementationsphase finalisiert und orientiert sich an den von Peters, Ahmadpour und Calvo (2020) zusammengetragenen wellbeing-bezogenen Konstrukten sowie an der Definition von Vanden Abeele (2021). Diese Daten adressieren die Teilfragen T1 (Autonomie- und Kompetenzerleben) und T3 (Zeitempfinden und Nutzungskontrolle).</w:t>
       </w:r>
     </w:p>
     <w:p>
@@ -4924,8 +3707,6 @@
       </w:pPr>
       <w:r>
         <w:t xml:space="preserve">Der Pilottest läuft über eine Woche mit ca. fünf Testpersonen aus dem Bekanntenkreis des Autors. Die Probandengruppe ist gezielt klein gehalten, um eine intensive qualitative Auswertung zu ermöglichen. Der Ablauf – Onboarding, Nutzung im Alltag, </w:t>
-      </w:r>
-      <w:r>
         <w:lastRenderedPageBreak/>
         <w:t>Abschlussinterview – sowie die Einwilligung der Teilnehmenden werden in den Abschnitten 8.3 und 8.5 ausführlich beschrieben.</w:t>
       </w:r>
@@ -4934,13 +3715,8 @@
       <w:pPr>
         <w:pStyle w:val="berschrift2"/>
       </w:pPr>
-      <w:proofErr w:type="gramStart"/>
-      <w:r>
-        <w:t>5.5  Methoden</w:t>
-      </w:r>
-      <w:proofErr w:type="gramEnd"/>
-      <w:r>
-        <w:t xml:space="preserve"> der Auswertung</w:t>
+      <w:r>
+        <w:t>5.5  Methoden der Auswertung</w:t>
       </w:r>
     </w:p>
     <w:p>
@@ -4956,15 +3732,7 @@
         <w:spacing w:after="160" w:line="360" w:lineRule="auto"/>
       </w:pPr>
       <w:r>
-        <w:t xml:space="preserve">Die qualitativen Daten aus den Interviews werden inhaltlich strukturiert ausgewertet. Aussagen werden entlang der vier Teilfragen kodiert und in thematische Cluster zusammengefasst (Autonomie- und Kompetenzerleben, Inhaltsdiversität, </w:t>
-      </w:r>
-      <w:proofErr w:type="spellStart"/>
-      <w:r>
-        <w:t>Sessiongestaltung</w:t>
-      </w:r>
-      <w:proofErr w:type="spellEnd"/>
-      <w:r>
-        <w:t>, Transparenz und Vertrauen). Aus den Clustern werden Kernmuster und repräsentative Zitate extrahiert, die den Befund illustrieren. Die Auswertung bleibt bewusst nahe an den Aussagen der Teilnehmenden und vermeidet überinterpretierende Kategorisierungen, was bei einer kleinen Stichprobe ohnehin angezeigt ist.</w:t>
+        <w:t>Die qualitativen Daten aus den Interviews werden inhaltlich strukturiert ausgewertet. Aussagen werden entlang der vier Teilfragen kodiert und in thematische Cluster zusammengefasst (Autonomie- und Kompetenzerleben, Inhaltsdiversität, Sessiongestaltung, Transparenz und Vertrauen). Aus den Clustern werden Kernmuster und repräsentative Zitate extrahiert, die den Befund illustrieren. Die Auswertung bleibt bewusst nahe an den Aussagen der Teilnehmenden und vermeidet überinterpretierende Kategorisierungen, was bei einer kleinen Stichprobe ohnehin angezeigt ist.</w:t>
       </w:r>
     </w:p>
     <w:p>
@@ -4987,113 +3755,34 @@
       <w:pPr>
         <w:pStyle w:val="berschrift2"/>
       </w:pPr>
-      <w:proofErr w:type="gramStart"/>
-      <w:r>
-        <w:t>5.6  Reflexion</w:t>
-      </w:r>
-      <w:proofErr w:type="gramEnd"/>
-      <w:r>
-        <w:t xml:space="preserve"> zu Ressourcen und Kompetenzen</w:t>
-      </w:r>
-    </w:p>
-    <w:p>
-      <w:pPr>
-        <w:spacing w:after="160" w:line="360" w:lineRule="auto"/>
-      </w:pPr>
-      <w:r>
-        <w:t xml:space="preserve">Die Durchführung der Arbeit setzt ein Bündel an Kompetenzen voraus, die im Studienverlauf des Autors bereits angelegt sind, in einzelnen Bereichen aber gezielt vertieft werden. Die LLM-Integration mit Claude über das </w:t>
-      </w:r>
-      <w:proofErr w:type="spellStart"/>
-      <w:r>
-        <w:t>Vercel</w:t>
-      </w:r>
-      <w:proofErr w:type="spellEnd"/>
-      <w:r>
-        <w:t xml:space="preserve"> AI SDK sowie das Prompt-Engineering für Schweizer Hochdeutsch sind im Rahmen der Implementation neu erschlossene Themen; die Sprachsynthese mit </w:t>
-      </w:r>
-      <w:proofErr w:type="spellStart"/>
-      <w:r>
-        <w:t>ElevenLabs</w:t>
-      </w:r>
-      <w:proofErr w:type="spellEnd"/>
-      <w:r>
-        <w:t xml:space="preserve"> (eleven_multilingual_v2) erfordert eine Konfiguration der Stimmenprofile und der Aussprachekontrolle, die im Verlauf des Design Cycle iterativ </w:t>
-      </w:r>
-      <w:r>
+      <w:r>
+        <w:t>5.6  Reflexion zu Ressourcen und Kompetenzen</w:t>
+      </w:r>
+    </w:p>
+    <w:p>
+      <w:pPr>
+        <w:spacing w:after="160" w:line="360" w:lineRule="auto"/>
+      </w:pPr>
+      <w:r>
+        <w:t xml:space="preserve">Die Durchführung der Arbeit setzt ein Bündel an Kompetenzen voraus, die im Studienverlauf des Autors bereits angelegt sind, in einzelnen Bereichen aber gezielt vertieft werden. Die LLM-Integration mit Claude über das Vercel AI SDK sowie das Prompt-Engineering für Schweizer Hochdeutsch sind im Rahmen der Implementation neu erschlossene Themen; die Sprachsynthese mit ElevenLabs (eleven_multilingual_v2) erfordert eine Konfiguration der Stimmenprofile und der Aussprachekontrolle, die im Verlauf des Design Cycle iterativ </w:t>
         <w:lastRenderedPageBreak/>
-        <w:t xml:space="preserve">angepasst wird. Die Webapplikation auf Basis von Next.js 15, React 19, </w:t>
-      </w:r>
-      <w:proofErr w:type="spellStart"/>
-      <w:r>
-        <w:t>TypeScript</w:t>
-      </w:r>
-      <w:proofErr w:type="spellEnd"/>
-      <w:r>
-        <w:t xml:space="preserve"> und </w:t>
-      </w:r>
-      <w:proofErr w:type="spellStart"/>
-      <w:r>
-        <w:t>Tailwind</w:t>
-      </w:r>
-      <w:proofErr w:type="spellEnd"/>
-      <w:r>
-        <w:t xml:space="preserve"> CSS 4 baut auf vorhandenen Erfahrungen auf, die </w:t>
-      </w:r>
-      <w:proofErr w:type="spellStart"/>
-      <w:r>
-        <w:t>agentische</w:t>
-      </w:r>
-      <w:proofErr w:type="spellEnd"/>
-      <w:r>
-        <w:t xml:space="preserve"> Pipeline-Steuerung erweitert sie um asynchrone Orchestrierungsmuster.</w:t>
-      </w:r>
-    </w:p>
-    <w:p>
-      <w:pPr>
-        <w:spacing w:after="160" w:line="360" w:lineRule="auto"/>
-      </w:pPr>
-      <w:r>
-        <w:t xml:space="preserve">Auf der Methodenseite kombiniert die Arbeit eine strukturierte Literaturrecherche (Abschnitt 5.1) mit einer formativen Nutzerstudie (Abschnitte 5.4 und 5.5). Die qualitative und deskriptive Auswertung ist mit Grundkenntnissen aus dem Studium gut zu leisten; die kleine Probandengruppe erlaubt eine sorgfältige Einzelfallbetrachtung, ohne dass komplexere statistische Verfahren erforderlich werden. Externe Werkzeuge (Claude für Recherche und Schreibhilfe, </w:t>
-      </w:r>
-      <w:proofErr w:type="spellStart"/>
-      <w:r>
-        <w:t>NotebookLM</w:t>
-      </w:r>
-      <w:proofErr w:type="spellEnd"/>
-      <w:r>
-        <w:t xml:space="preserve"> für die thematische Strukturierung, </w:t>
-      </w:r>
-      <w:proofErr w:type="spellStart"/>
-      <w:r>
-        <w:t>Zotero</w:t>
-      </w:r>
-      <w:proofErr w:type="spellEnd"/>
-      <w:r>
-        <w:t xml:space="preserve"> für die Quellenverwaltung, Cursor und GitHub Copilot für Teile der Code-Entwicklung) werden in der KI-Nutzungserklärung des Front Matter im Detail offengelegt.</w:t>
-      </w:r>
-    </w:p>
-    <w:p>
-      <w:pPr>
-        <w:spacing w:after="160" w:line="360" w:lineRule="auto"/>
-      </w:pPr>
-      <w:r>
-        <w:t xml:space="preserve">Insgesamt ist das Vorhaben in den verfügbaren Ressourcen – Zeitbudget von rund zehn Wochen, </w:t>
-      </w:r>
-      <w:proofErr w:type="spellStart"/>
-      <w:r>
-        <w:t>Einzelautorenschaft</w:t>
-      </w:r>
-      <w:proofErr w:type="spellEnd"/>
-      <w:r>
-        <w:t xml:space="preserve">, kleine Probandengruppe – bewusst so dimensioniert, dass die zentrale Forschungsfrage substanziell beantwortet werden kann, ohne den Rahmen einer </w:t>
-      </w:r>
-      <w:proofErr w:type="spellStart"/>
-      <w:r>
-        <w:t>BSc</w:t>
-      </w:r>
-      <w:proofErr w:type="spellEnd"/>
-      <w:r>
-        <w:t>-Thesis zu überschreiten.</w:t>
+        <w:t>angepasst wird. Die Webapplikation auf Basis von Next.js 15, React 19, TypeScript und Tailwind CSS 4 baut auf vorhandenen Erfahrungen auf, die agentische Pipeline-Steuerung erweitert sie um asynchrone Orchestrierungsmuster.</w:t>
+      </w:r>
+    </w:p>
+    <w:p>
+      <w:pPr>
+        <w:spacing w:after="160" w:line="360" w:lineRule="auto"/>
+      </w:pPr>
+      <w:r>
+        <w:t>Auf der Methodenseite kombiniert die Arbeit eine strukturierte Literaturrecherche (Abschnitt 5.1) mit einer formativen Nutzerstudie (Abschnitte 5.4 und 5.5). Die qualitative und deskriptive Auswertung ist mit Grundkenntnissen aus dem Studium gut zu leisten; die kleine Probandengruppe erlaubt eine sorgfältige Einzelfallbetrachtung, ohne dass komplexere statistische Verfahren erforderlich werden. Externe Werkzeuge (Claude für Recherche und Schreibhilfe, NotebookLM für die thematische Strukturierung, Zotero für die Quellenverwaltung, Cursor und GitHub Copilot für Teile der Code-Entwicklung) werden in der KI-Nutzungserklärung des Front Matter im Detail offengelegt.</w:t>
+      </w:r>
+    </w:p>
+    <w:p>
+      <w:pPr>
+        <w:spacing w:after="160" w:line="360" w:lineRule="auto"/>
+      </w:pPr>
+      <w:r>
+        <w:t>Insgesamt ist das Vorhaben in den verfügbaren Ressourcen – Zeitbudget von rund zehn Wochen, Einzelautorenschaft, kleine Probandengruppe – bewusst so dimensioniert, dass die zentrale Forschungsfrage substanziell beantwortet werden kann, ohne den Rahmen einer BSc-Thesis zu überschreiten.</w:t>
       </w:r>
     </w:p>
     <w:p>
@@ -5101,12 +3790,10 @@
         <w:pStyle w:val="berschrift1"/>
         <w:pageBreakBefore/>
       </w:pPr>
-      <w:proofErr w:type="gramStart"/>
       <w:r>
         <w:lastRenderedPageBreak/>
         <w:t>8  Validierung</w:t>
       </w:r>
-      <w:proofErr w:type="gramEnd"/>
     </w:p>
     <w:p>
       <w:pPr>
@@ -5120,13 +3807,8 @@
       <w:pPr>
         <w:pStyle w:val="berschrift2"/>
       </w:pPr>
-      <w:proofErr w:type="gramStart"/>
-      <w:r>
-        <w:t>8.1  Aufbau</w:t>
-      </w:r>
-      <w:proofErr w:type="gramEnd"/>
-      <w:r>
-        <w:t xml:space="preserve"> der Validierung</w:t>
+      <w:r>
+        <w:t>8.1  Aufbau der Validierung</w:t>
       </w:r>
     </w:p>
     <w:p>
@@ -5149,28 +3831,16 @@
       <w:pPr>
         <w:pStyle w:val="berschrift2"/>
       </w:pPr>
-      <w:proofErr w:type="gramStart"/>
       <w:r>
         <w:t>8.2  Machbarkeitsnachweis</w:t>
       </w:r>
-      <w:proofErr w:type="gramEnd"/>
-    </w:p>
-    <w:p>
-      <w:pPr>
-        <w:spacing w:after="160" w:line="360" w:lineRule="auto"/>
-      </w:pPr>
-      <w:r>
-        <w:t>Der Machbarkeitsnachweis erfolgt auf drei Ebenen. Erstens dient der lauffähige Prototyp als Demonstration: Ein End-</w:t>
-      </w:r>
-      <w:proofErr w:type="spellStart"/>
-      <w:r>
-        <w:t>to</w:t>
-      </w:r>
-      <w:proofErr w:type="spellEnd"/>
-      <w:r>
-        <w:t xml:space="preserve">-End-Durchlauf von der Profileingabe über Datenintegration, LLM-gestützte Textgenerierung und Sprachsynthese bis zur ausgespielten Sendung wird reproduzierbar dokumentiert; eine Beispielsendung findet sich in Anhang E. Zweitens werden für die zentralen Pipeline-Komponenten – Datenintegration, Personalisierung, LLM-Aufrufe und Sprachsynthese – automatisierte Tests geführt, die Normalfälle, Fehlerpfade und Grenzfälle abdecken. Drittens werden nicht-funktionale Eigenschaften gemessen: Latenz pro Pipeline-Schritt, Kosten pro Sendung in LLM-Tokens und TTS-Minuten, Fehlerraten (Halluzinationen, fehlgeschlagene API-Calls) und Stabilität bei wiederholter </w:t>
-      </w:r>
-      <w:r>
+    </w:p>
+    <w:p>
+      <w:pPr>
+        <w:spacing w:after="160" w:line="360" w:lineRule="auto"/>
+      </w:pPr>
+      <w:r>
+        <w:t xml:space="preserve">Der Machbarkeitsnachweis erfolgt auf drei Ebenen. Erstens dient der lauffähige Prototyp als Demonstration: Ein End-to-End-Durchlauf von der Profileingabe über Datenintegration, LLM-gestützte Textgenerierung und Sprachsynthese bis zur ausgespielten Sendung wird reproduzierbar dokumentiert; eine Beispielsendung findet sich in Anhang E. Zweitens werden für die zentralen Pipeline-Komponenten – Datenintegration, Personalisierung, LLM-Aufrufe und Sprachsynthese – automatisierte Tests geführt, die Normalfälle, Fehlerpfade und Grenzfälle abdecken. Drittens werden nicht-funktionale Eigenschaften gemessen: Latenz pro Pipeline-Schritt, Kosten pro Sendung in LLM-Tokens und TTS-Minuten, Fehlerraten (Halluzinationen, fehlgeschlagene API-Calls) und Stabilität bei wiederholter </w:t>
         <w:lastRenderedPageBreak/>
         <w:t>Ausführung. Die Messungen erfolgen über mindestens 20 generierte Sendungen mit unterschiedlichen Profilkonfigurationen, um Schwankungen sichtbar zu machen.</w:t>
       </w:r>
@@ -5179,13 +3849,8 @@
       <w:pPr>
         <w:pStyle w:val="berschrift2"/>
       </w:pPr>
-      <w:proofErr w:type="gramStart"/>
-      <w:r>
-        <w:t>8.3  Usability</w:t>
-      </w:r>
-      <w:proofErr w:type="gramEnd"/>
-      <w:r>
-        <w:t xml:space="preserve"> und Akzeptanz</w:t>
+      <w:r>
+        <w:t>8.3  Usability und Akzeptanz</w:t>
       </w:r>
     </w:p>
     <w:p>
@@ -5200,39 +3865,24 @@
       <w:pPr>
         <w:pStyle w:val="berschrift2"/>
       </w:pPr>
-      <w:proofErr w:type="gramStart"/>
       <w:r>
         <w:t>8.4  Wirkung</w:t>
       </w:r>
-      <w:proofErr w:type="gramEnd"/>
-    </w:p>
-    <w:p>
-      <w:pPr>
-        <w:spacing w:after="160" w:line="360" w:lineRule="auto"/>
-      </w:pPr>
-      <w:r>
-        <w:t xml:space="preserve">Die Wirkungsitems werden direkt aus dem theoretischen Rahmen in Kapitel 2 abgeleitet, sodass die Studie die spezifischen Konstrukte prüft, mit denen das Artefakt begründet wurde. Erhoben werden vier Wirkungsdimensionen. Die erste Dimension umfasst die psychologischen Grundbedürfnisse Autonomie, Kompetenz und Verbundenheit nach SDT (Abschnitt 2.3.1) sowie die wahrgenommene Werteorientierung im Sinne von VSD (Abschnitt 2.3.2). Die zweite Dimension misst das situative Wohlbefinden vor und nach der Nutzung in Anlehnung an die Wellbeing-Items aus Abschnitt 5.4 und das in Abschnitt 2.3.3 entwickelte Wellbeing-Verständnis. Die dritte Dimension erfasst die Aspekte der algorithmischen Souveränität – Transparenz, Steuerbarkeit und Vertrauen – und greift damit das in Abschnitt 2.3.4 als Souveränitätsdefizit beschriebene Phänomen direkt auf. Die vierte Dimension umfasst zwei Bereiche, die nicht aus dem Wellbeing-Diskurs stammen, für ein Medienartefakt aber konstitutiv sind: die klassischen Gebrauchszwecke Information und Unterhaltung (als Kontrollvariablen, damit die </w:t>
-      </w:r>
-      <w:proofErr w:type="spellStart"/>
-      <w:r>
-        <w:t>Wohlbefindenswirkung</w:t>
-      </w:r>
-      <w:proofErr w:type="spellEnd"/>
-      <w:r>
-        <w:t xml:space="preserve"> nicht zulasten der Grundfunktionen erkauft wird) und Awareness-Items zu Filterblasen, Bias und Grenzen des Systems (als zentraler Anspruch des Artefakts). Eine Übersicht der Konstrukte mit Beispielitems findet sich in Anhang C; die genaue Itemformulierung wird vor dem Pilottest finalisiert.</w:t>
+    </w:p>
+    <w:p>
+      <w:pPr>
+        <w:spacing w:after="160" w:line="360" w:lineRule="auto"/>
+      </w:pPr>
+      <w:r>
+        <w:t>Die Wirkungsitems werden direkt aus dem theoretischen Rahmen in Kapitel 2 abgeleitet, sodass die Studie die spezifischen Konstrukte prüft, mit denen das Artefakt begründet wurde. Erhoben werden vier Wirkungsdimensionen. Die erste Dimension umfasst die psychologischen Grundbedürfnisse Autonomie, Kompetenz und Verbundenheit nach SDT (Abschnitt 2.3.1) sowie die wahrgenommene Werteorientierung im Sinne von VSD (Abschnitt 2.3.2). Die zweite Dimension misst das situative Wohlbefinden vor und nach der Nutzung in Anlehnung an die Wellbeing-Items aus Abschnitt 5.4 und das in Abschnitt 2.3.3 entwickelte Wellbeing-Verständnis. Die dritte Dimension erfasst die Aspekte der algorithmischen Souveränität – Transparenz, Steuerbarkeit und Vertrauen – und greift damit das in Abschnitt 2.3.4 als Souveränitätsdefizit beschriebene Phänomen direkt auf. Die vierte Dimension umfasst zwei Bereiche, die nicht aus dem Wellbeing-Diskurs stammen, für ein Medienartefakt aber konstitutiv sind: die klassischen Gebrauchszwecke Information und Unterhaltung (als Kontrollvariablen, damit die Wohlbefindenswirkung nicht zulasten der Grundfunktionen erkauft wird) und Awareness-Items zu Filterblasen, Bias und Grenzen des Systems (als zentraler Anspruch des Artefakts). Eine Übersicht der Konstrukte mit Beispielitems findet sich in Anhang C; die genaue Itemformulierung wird vor dem Pilottest finalisiert.</w:t>
       </w:r>
     </w:p>
     <w:p>
       <w:pPr>
         <w:pStyle w:val="berschrift2"/>
       </w:pPr>
-      <w:proofErr w:type="gramStart"/>
-      <w:r>
-        <w:t>8.5  Operationalisierung</w:t>
-      </w:r>
-      <w:proofErr w:type="gramEnd"/>
-      <w:r>
-        <w:t xml:space="preserve"> der Erfolgskriterien und Ethik</w:t>
+      <w:r>
+        <w:t>8.5  Operationalisierung der Erfolgskriterien und Ethik</w:t>
       </w:r>
     </w:p>
     <w:p>
@@ -5241,47 +3891,15 @@
       </w:pPr>
       <w:r>
         <w:lastRenderedPageBreak/>
-        <w:t>Die in Abschnitt 4.2 konzeptuell formulierten Erfolgskriterien werden für die Validierung pro Strang operationalisiert. Auf der Machbarkeitsebene gilt der End-</w:t>
-      </w:r>
-      <w:proofErr w:type="spellStart"/>
-      <w:r>
-        <w:t>to</w:t>
-      </w:r>
-      <w:proofErr w:type="spellEnd"/>
-      <w:r>
-        <w:t>-End-Durchlauf als erfolgreich, wenn er auf mindestens 95 Prozent der Versuche fehlerfrei terminiert, die Latenz pro Sendung unter einem mit dem Betreuer abgestimmten Schwellwert bleibt und die Unit-Test-Abdeckung pro Komponente mindestens 70 Prozent erreicht. Auf der Akzeptanzebene wird ein SUS-Score von mindestens 68 Punkten – dem industriellen Durchschnitt nach Bangor, Kortum und Miller (2008) – angestrebt; ergänzend muss zu jeder Einstellungsmöglichkeit mehrheitlich positives Feedback dokumentiert sein. Auf der Wirkungsebene gilt der Nachweis als erbracht, wenn die Items zu Autonomie, Steuerbarkeit und Transparenz im Median bei mindestens vier von fünf Punkten liegen und die Awareness-Items qualitativ belegte Bewusstseinsberichte erzeugen.</w:t>
-      </w:r>
-    </w:p>
-    <w:p>
-      <w:pPr>
-        <w:spacing w:after="160" w:line="360" w:lineRule="auto"/>
-      </w:pPr>
-      <w:r>
-        <w:t xml:space="preserve">Die konkreten Schwellwerte werden vor dem Pilottest mit dem Betreuer abgestimmt. Ethik, Einwilligung und Datenschutz </w:t>
-      </w:r>
-      <w:proofErr w:type="spellStart"/>
-      <w:r>
-        <w:t>folgen den</w:t>
-      </w:r>
-      <w:proofErr w:type="spellEnd"/>
-      <w:r>
-        <w:t xml:space="preserve"> ZHAW-Standards für studentische Forschung mit Personen: Vor Studienbeginn unterzeichnen alle Testpersonen eine Einwilligungserklärung (</w:t>
-      </w:r>
-      <w:proofErr w:type="spellStart"/>
-      <w:r>
-        <w:t>Informed</w:t>
-      </w:r>
-      <w:proofErr w:type="spellEnd"/>
-      <w:r>
-        <w:t xml:space="preserve"> Consent, siehe Anhang H), </w:t>
-      </w:r>
-      <w:proofErr w:type="gramStart"/>
-      <w:r>
-        <w:t>die Studienzweck</w:t>
-      </w:r>
-      <w:proofErr w:type="gramEnd"/>
-      <w:r>
-        <w:t>, Datenarten, Verwendung, Speicherdauer und Widerrufsrecht regelt. Nutzungsdaten werden lokal erhoben und sechs Monate nach Abgabe der Thesis gelöscht; ein clientseitiges Tracking findet nicht statt.</w:t>
+        <w:t>Die in Abschnitt 4.2 konzeptuell formulierten Erfolgskriterien werden für die Validierung pro Strang operationalisiert. Auf der Machbarkeitsebene gilt der End-to-End-Durchlauf als erfolgreich, wenn er auf mindestens 95 Prozent der Versuche fehlerfrei terminiert, die Latenz pro Sendung unter einem mit dem Betreuer abgestimmten Schwellwert bleibt und die Unit-Test-Abdeckung pro Komponente mindestens 70 Prozent erreicht. Auf der Akzeptanzebene wird ein SUS-Score von mindestens 68 Punkten – dem industriellen Durchschnitt nach Bangor, Kortum und Miller (2008) – angestrebt; ergänzend muss zu jeder Einstellungsmöglichkeit mehrheitlich positives Feedback dokumentiert sein. Auf der Wirkungsebene gilt der Nachweis als erbracht, wenn die Items zu Autonomie, Steuerbarkeit und Transparenz im Median bei mindestens vier von fünf Punkten liegen und die Awareness-Items qualitativ belegte Bewusstseinsberichte erzeugen.</w:t>
+      </w:r>
+    </w:p>
+    <w:p>
+      <w:pPr>
+        <w:spacing w:after="160" w:line="360" w:lineRule="auto"/>
+      </w:pPr>
+      <w:r>
+        <w:t>Die konkreten Schwellwerte werden vor dem Pilottest mit dem Betreuer abgestimmt. Ethik, Einwilligung und Datenschutz folgen den ZHAW-Standards für studentische Forschung mit Personen: Vor Studienbeginn unterzeichnen alle Testpersonen eine Einwilligungserklärung (Informed Consent, siehe Anhang H), die Studienzweck, Datenarten, Verwendung, Speicherdauer und Widerrufsrecht regelt. Nutzungsdaten werden lokal erhoben und sechs Monate nach Abgabe der Thesis gelöscht; ein clientseitiges Tracking findet nicht statt.</w:t>
       </w:r>
     </w:p>
     <w:p>
@@ -5289,12 +3907,10 @@
         <w:pStyle w:val="berschrift1"/>
         <w:pageBreakBefore/>
       </w:pPr>
-      <w:proofErr w:type="gramStart"/>
       <w:r>
         <w:lastRenderedPageBreak/>
         <w:t>10  Diskussion</w:t>
       </w:r>
-      <w:proofErr w:type="gramEnd"/>
     </w:p>
     <w:p>
       <w:pPr>
@@ -5308,42 +3924,24 @@
       <w:pPr>
         <w:pStyle w:val="berschrift2"/>
       </w:pPr>
-      <w:proofErr w:type="gramStart"/>
-      <w:r>
-        <w:t>10.1  Beantwortung</w:t>
-      </w:r>
-      <w:proofErr w:type="gramEnd"/>
-      <w:r>
-        <w:t xml:space="preserve"> der Forschungsfrage</w:t>
-      </w:r>
-    </w:p>
-    <w:p>
-      <w:pPr>
-        <w:spacing w:after="160" w:line="360" w:lineRule="auto"/>
-      </w:pPr>
-      <w:r>
-        <w:t xml:space="preserve">[Stub – wird nach dem Pilottest auf Basis der Ergebnisse aus Kap. 9 verfasst.] Synthese über die drei Validierungsstränge: Was wurde nachgewiesen, was bleibt offen? Die Hauptforschungsfrage aus Kap. 4 wird hier </w:t>
-      </w:r>
-      <w:proofErr w:type="spellStart"/>
-      <w:r>
-        <w:t>ebenenübergreifend</w:t>
-      </w:r>
-      <w:proofErr w:type="spellEnd"/>
-      <w:r>
-        <w:t xml:space="preserve"> beantwortet, mit klarer Markierung dessen, was die kleine Stichprobe und der kurze Untersuchungszeitraum tragen.</w:t>
+      <w:r>
+        <w:t>10.1  Beantwortung der Forschungsfrage</w:t>
+      </w:r>
+    </w:p>
+    <w:p>
+      <w:pPr>
+        <w:spacing w:after="160" w:line="360" w:lineRule="auto"/>
+      </w:pPr>
+      <w:r>
+        <w:t>[Stub – wird nach dem Pilottest auf Basis der Ergebnisse aus Kap. 9 verfasst.] Synthese über die drei Validierungsstränge: Was wurde nachgewiesen, was bleibt offen? Die Hauptforschungsfrage aus Kap. 4 wird hier ebenenübergreifend beantwortet, mit klarer Markierung dessen, was die kleine Stichprobe und der kurze Untersuchungszeitraum tragen.</w:t>
       </w:r>
     </w:p>
     <w:p>
       <w:pPr>
         <w:pStyle w:val="berschrift2"/>
       </w:pPr>
-      <w:proofErr w:type="gramStart"/>
-      <w:r>
-        <w:t>10.2  Diskussion</w:t>
-      </w:r>
-      <w:proofErr w:type="gramEnd"/>
-      <w:r>
-        <w:t xml:space="preserve"> der Machbarkeit</w:t>
+      <w:r>
+        <w:t>10.2  Diskussion der Machbarkeit</w:t>
       </w:r>
     </w:p>
     <w:p>
@@ -5358,13 +3956,8 @@
       <w:pPr>
         <w:pStyle w:val="berschrift2"/>
       </w:pPr>
-      <w:proofErr w:type="gramStart"/>
-      <w:r>
-        <w:t>10.3  Diskussion</w:t>
-      </w:r>
-      <w:proofErr w:type="gramEnd"/>
-      <w:r>
-        <w:t xml:space="preserve"> der Usability und Akzeptanz</w:t>
+      <w:r>
+        <w:t>10.3  Diskussion der Usability und Akzeptanz</w:t>
       </w:r>
     </w:p>
     <w:p>
@@ -5379,13 +3972,8 @@
       <w:pPr>
         <w:pStyle w:val="berschrift2"/>
       </w:pPr>
-      <w:proofErr w:type="gramStart"/>
-      <w:r>
-        <w:t>10.4  Diskussion</w:t>
-      </w:r>
-      <w:proofErr w:type="gramEnd"/>
-      <w:r>
-        <w:t xml:space="preserve"> der Wirkung</w:t>
+      <w:r>
+        <w:t>10.4  Diskussion der Wirkung</w:t>
       </w:r>
     </w:p>
     <w:p>
@@ -5400,48 +3988,25 @@
       <w:pPr>
         <w:pStyle w:val="berschrift2"/>
       </w:pPr>
-      <w:proofErr w:type="gramStart"/>
-      <w:r>
-        <w:t>10.5  Implikationen</w:t>
-      </w:r>
-      <w:proofErr w:type="gramEnd"/>
-      <w:r>
-        <w:t xml:space="preserve"> für Design und Praxis</w:t>
-      </w:r>
-    </w:p>
-    <w:p>
-      <w:pPr>
-        <w:spacing w:after="160" w:line="360" w:lineRule="auto"/>
-      </w:pPr>
-      <w:r>
-        <w:t xml:space="preserve">[Stub.] Welche Designentscheidungen sind übertragbar auf andere </w:t>
-      </w:r>
-      <w:proofErr w:type="spellStart"/>
-      <w:r>
-        <w:t>wellbeing</w:t>
-      </w:r>
-      <w:proofErr w:type="spellEnd"/>
-      <w:r>
-        <w:t xml:space="preserve">-orientierte Medienartefakte, welche radio-spezifisch? Welche Implikationen ergeben sich für die Praxis öffentlich-rechtlicher Medien, die ein </w:t>
-      </w:r>
-      <w:proofErr w:type="spellStart"/>
-      <w:r>
-        <w:t>wellbeing</w:t>
-      </w:r>
-      <w:proofErr w:type="spellEnd"/>
-      <w:r>
-        <w:t>-orientiertes Angebot prüfen?</w:t>
+      <w:r>
+        <w:t>10.5  Implikationen für Design und Praxis</w:t>
+      </w:r>
+    </w:p>
+    <w:p>
+      <w:pPr>
+        <w:spacing w:after="160" w:line="360" w:lineRule="auto"/>
+      </w:pPr>
+      <w:r>
+        <w:t>[Stub.] Welche Designentscheidungen sind übertragbar auf andere wellbeing-orientierte Medienartefakte, welche radio-spezifisch? Welche Implikationen ergeben sich für die Praxis öffentlich-rechtlicher Medien, die ein wellbeing-orientiertes Angebot prüfen?</w:t>
       </w:r>
     </w:p>
     <w:p>
       <w:pPr>
         <w:pStyle w:val="berschrift2"/>
       </w:pPr>
-      <w:proofErr w:type="gramStart"/>
       <w:r>
         <w:t>10.6  Limitationen</w:t>
       </w:r>
-      <w:proofErr w:type="gramEnd"/>
     </w:p>
     <w:p>
       <w:pPr>
@@ -5456,29 +4021,16 @@
       <w:pPr>
         <w:pStyle w:val="berschrift2"/>
       </w:pPr>
-      <w:proofErr w:type="gramStart"/>
-      <w:r>
-        <w:t>10.7  Übertragbarkeit</w:t>
-      </w:r>
-      <w:proofErr w:type="gramEnd"/>
-      <w:r>
-        <w:t xml:space="preserve"> auf andere Medienkontexte</w:t>
-      </w:r>
-    </w:p>
-    <w:p>
-      <w:pPr>
-        <w:spacing w:after="160" w:line="360" w:lineRule="auto"/>
-      </w:pPr>
-      <w:r>
-        <w:t xml:space="preserve">[Stub.] Inwiefern lassen sich die Befunde auf Streaming, Podcast-Empfehlungen oder News-Aggregatoren übertragen? Welche Eigenschaften von Radio 25 sind generisch (definierte </w:t>
-      </w:r>
-      <w:proofErr w:type="spellStart"/>
-      <w:r>
-        <w:t>Sessionlänge</w:t>
-      </w:r>
-      <w:proofErr w:type="spellEnd"/>
-      <w:r>
-        <w:t>, explizite Präferenzangabe, Transparenzanzeige), welche formatspezifisch (auditive Modalität, eingebettete Musikauswahl)?</w:t>
+      <w:r>
+        <w:t>10.7  Übertragbarkeit auf andere Medienkontexte</w:t>
+      </w:r>
+    </w:p>
+    <w:p>
+      <w:pPr>
+        <w:spacing w:after="160" w:line="360" w:lineRule="auto"/>
+      </w:pPr>
+      <w:r>
+        <w:t>[Stub.] Inwiefern lassen sich die Befunde auf Streaming, Podcast-Empfehlungen oder News-Aggregatoren übertragen? Welche Eigenschaften von Attune sind generisch (definierte Sessionlänge, explizite Präferenzangabe, Transparenzanzeige), welche formatspezifisch (auditive Modalität, eingebettete Musikauswahl)?</w:t>
       </w:r>
     </w:p>
     <w:p>
@@ -5496,15 +4048,7 @@
         <w:spacing w:after="160" w:line="360" w:lineRule="auto"/>
       </w:pPr>
       <w:r>
-        <w:t xml:space="preserve">Die folgende Liste enthält die in den Kapiteln 1 und 2 zitierten Quellen. Sie wird im weiteren Verlauf der Arbeit ergänzt und vollständig in </w:t>
-      </w:r>
-      <w:proofErr w:type="spellStart"/>
-      <w:r>
-        <w:t>Zotero</w:t>
-      </w:r>
-      <w:proofErr w:type="spellEnd"/>
-      <w:r>
-        <w:t xml:space="preserve"> verwaltet.</w:t>
+        <w:t>Die folgende Liste enthält die in den Kapiteln 1 und 2 zitierten Quellen. Sie wird im weiteren Verlauf der Arbeit ergänzt und vollständig in Zotero verwaltet.</w:t>
       </w:r>
     </w:p>
     <w:p>
@@ -5537,35 +4081,7 @@
         <w:rPr>
           <w:lang w:val="en-US"/>
         </w:rPr>
-        <w:t xml:space="preserve">Brooke, J. (1996). SUS: A «quick and dirty» usability scale. In P. W. Jordan, B. Thomas, I. L. McClelland &amp; B. </w:t>
-      </w:r>
-      <w:proofErr w:type="spellStart"/>
-      <w:r>
-        <w:rPr>
-          <w:lang w:val="en-US"/>
-        </w:rPr>
-        <w:t>Weerdmeester</w:t>
-      </w:r>
-      <w:proofErr w:type="spellEnd"/>
-      <w:r>
-        <w:rPr>
-          <w:lang w:val="en-US"/>
-        </w:rPr>
-        <w:t xml:space="preserve"> (</w:t>
-      </w:r>
-      <w:proofErr w:type="spellStart"/>
-      <w:r>
-        <w:rPr>
-          <w:lang w:val="en-US"/>
-        </w:rPr>
-        <w:t>Hrsg</w:t>
-      </w:r>
-      <w:proofErr w:type="spellEnd"/>
-      <w:r>
-        <w:rPr>
-          <w:lang w:val="en-US"/>
-        </w:rPr>
-        <w:t>.), Usability evaluation in industry (S. 189–194). Taylor &amp; Francis.</w:t>
+        <w:t>Brooke, J. (1996). SUS: A «quick and dirty» usability scale. In P. W. Jordan, B. Thomas, I. L. McClelland &amp; B. Weerdmeester (Hrsg.), Usability evaluation in industry (S. 189–194). Taylor &amp; Francis.</w:t>
       </w:r>
     </w:p>
     <w:p>
@@ -5580,21 +4096,7 @@
         <w:rPr>
           <w:lang w:val="en-US"/>
         </w:rPr>
-        <w:t xml:space="preserve">Burr, C., Taddeo, M., &amp; </w:t>
-      </w:r>
-      <w:proofErr w:type="spellStart"/>
-      <w:r>
-        <w:rPr>
-          <w:lang w:val="en-US"/>
-        </w:rPr>
-        <w:t>Floridi</w:t>
-      </w:r>
-      <w:proofErr w:type="spellEnd"/>
-      <w:r>
-        <w:rPr>
-          <w:lang w:val="en-US"/>
-        </w:rPr>
-        <w:t>, L. (2020). The ethics of digital well-being: A thematic review. Science and Engineering Ethics, 26, 2441–2460. https://doi.org/10.1007/s11948-020-00175-8</w:t>
+        <w:t>Burr, C., Taddeo, M., &amp; Floridi, L. (2020). The ethics of digital well-being: A thematic review. Science and Engineering Ethics, 26, 2441–2460. https://doi.org/10.1007/s11948-020-00175-8</w:t>
       </w:r>
     </w:p>
     <w:p>
@@ -5672,21 +4174,7 @@
         <w:rPr>
           <w:lang w:val="en-US"/>
         </w:rPr>
-        <w:t xml:space="preserve">Hevner, A. R. (2007). A </w:t>
-      </w:r>
-      <w:proofErr w:type="gramStart"/>
-      <w:r>
-        <w:rPr>
-          <w:lang w:val="en-US"/>
-        </w:rPr>
-        <w:t>three cycle</w:t>
-      </w:r>
-      <w:proofErr w:type="gramEnd"/>
-      <w:r>
-        <w:rPr>
-          <w:lang w:val="en-US"/>
-        </w:rPr>
-        <w:t xml:space="preserve"> view of design science research. Scandinavian Journal of Information Systems, 19(2), 87–92.</w:t>
+        <w:t>Hevner, A. R. (2007). A three cycle view of design science research. Scandinavian Journal of Information Systems, 19(2), 87–92.</w:t>
       </w:r>
     </w:p>
     <w:p>
@@ -5716,21 +4204,7 @@
         <w:rPr>
           <w:lang w:val="en-US"/>
         </w:rPr>
-        <w:t xml:space="preserve">Katz, E., </w:t>
-      </w:r>
-      <w:proofErr w:type="spellStart"/>
-      <w:r>
-        <w:rPr>
-          <w:lang w:val="en-US"/>
-        </w:rPr>
-        <w:t>Blumler</w:t>
-      </w:r>
-      <w:proofErr w:type="spellEnd"/>
-      <w:r>
-        <w:rPr>
-          <w:lang w:val="en-US"/>
-        </w:rPr>
-        <w:t>, J. G., &amp; Gurevitch, M. (1973). Uses and gratifications research. Public Opinion Quarterly, 37(4), 509–523. https://doi.org/10.1086/268109</w:t>
+        <w:t>Katz, E., Blumler, J. G., &amp; Gurevitch, M. (1973). Uses and gratifications research. Public Opinion Quarterly, 37(4), 509–523. https://doi.org/10.1086/268109</w:t>
       </w:r>
     </w:p>
     <w:p>
@@ -5745,21 +4219,7 @@
         <w:rPr>
           <w:lang w:val="en-US"/>
         </w:rPr>
-        <w:t xml:space="preserve">Milano, S., Taddeo, M., &amp; </w:t>
-      </w:r>
-      <w:proofErr w:type="spellStart"/>
-      <w:r>
-        <w:rPr>
-          <w:lang w:val="en-US"/>
-        </w:rPr>
-        <w:t>Floridi</w:t>
-      </w:r>
-      <w:proofErr w:type="spellEnd"/>
-      <w:r>
-        <w:rPr>
-          <w:lang w:val="en-US"/>
-        </w:rPr>
-        <w:t>, L. (2020). Recommender systems and their ethical challenges. AI &amp; Society, 35, 957–967. https://doi.org/10.1007/s00146-020-00950-y</w:t>
+        <w:t>Milano, S., Taddeo, M., &amp; Floridi, L. (2020). Recommender systems and their ethical challenges. AI &amp; Society, 35, 957–967. https://doi.org/10.1007/s00146-020-00950-y</w:t>
       </w:r>
     </w:p>
     <w:p>
@@ -5802,15 +4262,7 @@
         </w:rPr>
       </w:pPr>
       <w:r>
-        <w:t xml:space="preserve">Nguyen, T. T., Hui, P.-M., Harper, F. M., Terveen, L., &amp; </w:t>
-      </w:r>
-      <w:proofErr w:type="spellStart"/>
-      <w:r>
-        <w:t>Konstan</w:t>
-      </w:r>
-      <w:proofErr w:type="spellEnd"/>
-      <w:r>
-        <w:t xml:space="preserve">, J. A. (2014). </w:t>
+        <w:t xml:space="preserve">Nguyen, T. T., Hui, P.-M., Harper, F. M., Terveen, L., &amp; Konstan, J. A. (2014). </w:t>
       </w:r>
       <w:r>
         <w:rPr>
@@ -5861,21 +4313,7 @@
         <w:rPr>
           <w:lang w:val="en-US"/>
         </w:rPr>
-        <w:t xml:space="preserve">Peffers, K., </w:t>
-      </w:r>
-      <w:proofErr w:type="spellStart"/>
-      <w:r>
-        <w:rPr>
-          <w:lang w:val="en-US"/>
-        </w:rPr>
-        <w:t>Tuunanen</w:t>
-      </w:r>
-      <w:proofErr w:type="spellEnd"/>
-      <w:r>
-        <w:rPr>
-          <w:lang w:val="en-US"/>
-        </w:rPr>
-        <w:t>, T., Rothenberger, M. A., &amp; Chatterjee, S. (2007). A design science research methodology for information systems research. Journal of Management Information Systems, 24(3), 45–77. https://doi.org/10.2753/MIS0742-1222240302</w:t>
+        <w:t>Peffers, K., Tuunanen, T., Rothenberger, M. A., &amp; Chatterjee, S. (2007). A design science research methodology for information systems research. Journal of Management Information Systems, 24(3), 45–77. https://doi.org/10.2753/MIS0742-1222240302</w:t>
       </w:r>
     </w:p>
     <w:p>
@@ -5890,21 +4328,7 @@
         <w:rPr>
           <w:lang w:val="en-US"/>
         </w:rPr>
-        <w:t xml:space="preserve">Peters, D., Ahmadpour, N., &amp; Calvo, R. A. (2020). Tools for </w:t>
-      </w:r>
-      <w:proofErr w:type="gramStart"/>
-      <w:r>
-        <w:rPr>
-          <w:lang w:val="en-US"/>
-        </w:rPr>
-        <w:t>wellbeing</w:t>
-      </w:r>
-      <w:proofErr w:type="gramEnd"/>
-      <w:r>
-        <w:rPr>
-          <w:lang w:val="en-US"/>
-        </w:rPr>
-        <w:t>-supportive design: Features, characteristics, and prototypes. Multimodal Technologies and Interaction, 4(3), 40. https://doi.org/10.3390/mti4030040</w:t>
+        <w:t>Peters, D., Ahmadpour, N., &amp; Calvo, R. A. (2020). Tools for wellbeing-supportive design: Features, characteristics, and prototypes. Multimodal Technologies and Interaction, 4(3), 40. https://doi.org/10.3390/mti4030040</w:t>
       </w:r>
     </w:p>
     <w:p>
@@ -5919,21 +4343,7 @@
         <w:rPr>
           <w:lang w:val="en-US"/>
         </w:rPr>
-        <w:t xml:space="preserve">Peters, D., Calvo, R. A., &amp; Ryan, R. M. (2018). </w:t>
-      </w:r>
-      <w:proofErr w:type="gramStart"/>
-      <w:r>
-        <w:rPr>
-          <w:lang w:val="en-US"/>
-        </w:rPr>
-        <w:t>Designing for</w:t>
-      </w:r>
-      <w:proofErr w:type="gramEnd"/>
-      <w:r>
-        <w:rPr>
-          <w:lang w:val="en-US"/>
-        </w:rPr>
-        <w:t xml:space="preserve"> motivation, engagement and wellbeing in digital experience. Frontiers in Psychology, 9, 797. https://doi.org/10.3389/fpsyg.2018.00797</w:t>
+        <w:t>Peters, D., Calvo, R. A., &amp; Ryan, R. M. (2018). Designing for motivation, engagement and wellbeing in digital experience. Frontiers in Psychology, 9, 797. https://doi.org/10.3389/fpsyg.2018.00797</w:t>
       </w:r>
     </w:p>
     <w:p>
@@ -5944,47 +4354,11 @@
           <w:lang w:val="en-US"/>
         </w:rPr>
       </w:pPr>
-      <w:proofErr w:type="spellStart"/>
       <w:r>
         <w:rPr>
           <w:lang w:val="en-US"/>
         </w:rPr>
-        <w:t>Reviglio</w:t>
-      </w:r>
-      <w:proofErr w:type="spellEnd"/>
-      <w:r>
-        <w:rPr>
-          <w:lang w:val="en-US"/>
-        </w:rPr>
-        <w:t xml:space="preserve">, U., &amp; Agosti, C. (2020). Thinking outside the </w:t>
-      </w:r>
-      <w:proofErr w:type="gramStart"/>
-      <w:r>
-        <w:rPr>
-          <w:lang w:val="en-US"/>
-        </w:rPr>
-        <w:t>black-box</w:t>
-      </w:r>
-      <w:proofErr w:type="gramEnd"/>
-      <w:r>
-        <w:rPr>
-          <w:lang w:val="en-US"/>
-        </w:rPr>
-        <w:t xml:space="preserve">: The case for «algorithmic sovereignty» in social media. </w:t>
-      </w:r>
-      <w:proofErr w:type="gramStart"/>
-      <w:r>
-        <w:rPr>
-          <w:lang w:val="en-US"/>
-        </w:rPr>
-        <w:t>Social Media</w:t>
-      </w:r>
-      <w:proofErr w:type="gramEnd"/>
-      <w:r>
-        <w:rPr>
-          <w:lang w:val="en-US"/>
-        </w:rPr>
-        <w:t xml:space="preserve"> + Society, 6(2), 1–12. https://doi.org/10.1177/2056305120915613</w:t>
+        <w:t>Reviglio, U., &amp; Agosti, C. (2020). Thinking outside the black-box: The case for «algorithmic sovereignty» in social media. Social Media + Society, 6(2), 1–12. https://doi.org/10.1177/2056305120915613</w:t>
       </w:r>
     </w:p>
     <w:p>
@@ -5996,48 +4370,10 @@
         <w:rPr>
           <w:lang w:val="en-US"/>
         </w:rPr>
-        <w:t>Ricci, F., Rokach, L., &amp; Shapira, B. (</w:t>
-      </w:r>
-      <w:proofErr w:type="spellStart"/>
-      <w:r>
-        <w:rPr>
-          <w:lang w:val="en-US"/>
-        </w:rPr>
-        <w:t>Hrsg</w:t>
-      </w:r>
-      <w:proofErr w:type="spellEnd"/>
-      <w:r>
-        <w:rPr>
-          <w:lang w:val="en-US"/>
-        </w:rPr>
-        <w:t xml:space="preserve">.). </w:t>
-      </w:r>
-      <w:r>
-        <w:t xml:space="preserve">(2015). </w:t>
-      </w:r>
-      <w:proofErr w:type="spellStart"/>
-      <w:r>
-        <w:t>Recommender</w:t>
-      </w:r>
-      <w:proofErr w:type="spellEnd"/>
-      <w:r>
-        <w:t xml:space="preserve"> </w:t>
-      </w:r>
-      <w:proofErr w:type="spellStart"/>
-      <w:r>
-        <w:t>systems</w:t>
-      </w:r>
-      <w:proofErr w:type="spellEnd"/>
-      <w:r>
-        <w:t xml:space="preserve"> </w:t>
-      </w:r>
-      <w:proofErr w:type="spellStart"/>
-      <w:r>
-        <w:t>handbook</w:t>
-      </w:r>
-      <w:proofErr w:type="spellEnd"/>
-      <w:r>
-        <w:t xml:space="preserve"> (2. Aufl.). Springer. https://doi.org/10.1007/978-1-4899-7637-6</w:t>
+        <w:t xml:space="preserve">Ricci, F., Rokach, L., &amp; Shapira, B. (Hrsg.). </w:t>
+      </w:r>
+      <w:r>
+        <w:t>(2015). Recommender systems handbook (2. Aufl.). Springer. https://doi.org/10.1007/978-1-4899-7637-6</w:t>
       </w:r>
     </w:p>
     <w:p>
@@ -6083,21 +4419,7 @@
         <w:rPr>
           <w:lang w:val="en-US"/>
         </w:rPr>
-        <w:t xml:space="preserve">Vanden Abeele, M. M. P. (2021). Digital wellbeing </w:t>
-      </w:r>
-      <w:proofErr w:type="gramStart"/>
-      <w:r>
-        <w:rPr>
-          <w:lang w:val="en-US"/>
-        </w:rPr>
-        <w:t>as</w:t>
-      </w:r>
-      <w:proofErr w:type="gramEnd"/>
-      <w:r>
-        <w:rPr>
-          <w:lang w:val="en-US"/>
-        </w:rPr>
-        <w:t xml:space="preserve"> a dynamic construct. Communication Theory, 31(4), 932–955. https://doi.org/10.1093/ct/qtaa024</w:t>
+        <w:t>Vanden Abeele, M. M. P. (2021). Digital wellbeing as a dynamic construct. Communication Theory, 31(4), 932–955. https://doi.org/10.1093/ct/qtaa024</w:t>
       </w:r>
     </w:p>
     <w:p>
@@ -6112,21 +4434,7 @@
         <w:rPr>
           <w:lang w:val="en-US"/>
         </w:rPr>
-        <w:t xml:space="preserve">Verduyn, P., Lee, D. S., Park, J., </w:t>
-      </w:r>
-      <w:proofErr w:type="spellStart"/>
-      <w:r>
-        <w:rPr>
-          <w:lang w:val="en-US"/>
-        </w:rPr>
-        <w:t>Shablack</w:t>
-      </w:r>
-      <w:proofErr w:type="spellEnd"/>
-      <w:r>
-        <w:rPr>
-          <w:lang w:val="en-US"/>
-        </w:rPr>
-        <w:t>, H., Orvell, A., Bayer, J., Ybarra, O., Jonides, J., &amp; Kross, E. (2015). Passive Facebook usage undermines affective well-being: Experimental and longitudinal evidence. Journal of Experimental Psychology: General, 144(2), 480–488. https://doi.org/10.1037/xge0000057</w:t>
+        <w:t>Verduyn, P., Lee, D. S., Park, J., Shablack, H., Orvell, A., Bayer, J., Ybarra, O., Jonides, J., &amp; Kross, E. (2015). Passive Facebook usage undermines affective well-being: Experimental and longitudinal evidence. Journal of Experimental Psychology: General, 144(2), 480–488. https://doi.org/10.1037/xge0000057</w:t>
       </w:r>
     </w:p>
     <w:p>
@@ -6173,13 +4481,8 @@
         </w:rPr>
         <w:t xml:space="preserve">Zuboff, S. (2019). The discovery of behavioral surplus. In The age of surveillance capitalism: The fight for a human future at the new frontier of power (Kap. 3, S. 63–97). </w:t>
       </w:r>
-      <w:proofErr w:type="spellStart"/>
-      <w:r>
-        <w:t>PublicAffairs</w:t>
-      </w:r>
-      <w:proofErr w:type="spellEnd"/>
-      <w:r>
-        <w:t>.</w:t>
+      <w:r>
+        <w:t>PublicAffairs.</w:t>
       </w:r>
     </w:p>
     <w:sectPr>

</xml_diff>

<commit_message>
Thesis-Finalisierung: Kriterien-Konsistenz, Reliabilität (alpha), Unit-Tests, Contribution-Schärfung
</commit_message>
<xml_diff>
--- a/Hauptdokument.docx
+++ b/Hauptdokument.docx
@@ -153,7 +153,7 @@
       </w:pPr>
       <w:r>
         <w:lastRenderedPageBreak/>
-        <w:t>Die Arbeit zeigt damit, dass wellbeing-orientierte Personalisierung technisch machbar ist und von den Nutzenden angenommen wird, und verdichtet die Befunde zu vier übertragbaren Designprinzipien: explizite Präferenzangabe über wenige verständliche Stellschrauben, definierte Sessions mit bewusst gesetztem Ende, salient platzierte Transparenz sowie Vielfalt als expliziter Zielwert der Kuratierung. Das Modell ist insbesondere für öffentlich-rechtliche und werbefreie Anbieter anschlussfähig. Empfohlen werden eine Längsschnittstudie zur Prüfung von Gewöhnungseffekten, ein Kontrollvergleich mit einem engagement-optimierten Referenzsystem sowie der gezielte Ausbau des Prototyps (Musikrichtungs-Wahl, Aktualitäts-Guard, native App).</w:t>
+        <w:t>Die Arbeit zeigt damit, dass wellbeing-orientierte Personalisierung technisch machbar ist und von den Nutzenden angenommen wird, und verdichtet die Befunde zu vier übertragbaren Designprinzipien: explizite Präferenzangabe über wenige verständliche Stellschrauben, definierte Sessions mit bewusst gesetztem Ende, salient platzierte Transparenz sowie Vielfalt als expliziter Zielwert der Kuratierung. Der Beitrag liegt damit auf drei Ebenen: einem theoretisch verankerten Bausteinmodell wellbeing-orientierter Personalisierung (konzeptionell), einem lauffähigen End-to-End-Artefakt, das diese Personalisierung ohne jede Erhebung von Verhaltensdaten allein aus expliziten, jederzeit einsehbaren Präferenzangaben erzeugt (technisch), und erster reproduzierbar offengelegter Evidenz, dass die bekannten Plattformprobleme an der Zielfunktion und nicht an der Technologie liegen (empirisch). Das Modell ist insbesondere für öffentlich-rechtliche und werbefreie Anbieter anschlussfähig. Empfohlen werden eine Längsschnittstudie zur Prüfung von Gewöhnungseffekten, ein Kontrollvergleich mit einem engagement-optimierten Referenzsystem sowie der gezielte Ausbau des Prototyps (Musikrichtungs-Wahl, Aktualitäts-Guard, native App).</w:t>
       </w:r>
     </w:p>
     <w:p>
@@ -4828,15 +4828,7 @@
       </w:pPr>
       <w:r>
         <w:rPr/>
-        <w:t xml:space="preserve">Medienkonsum ist das Ergebnis eines Zusammenspiels zweier Seiten: Auf der einen Seite stehen die Nutzenden mit ihren Bedürfnissen und Motivationen wie Information, Unterhaltung, Orientierung, soziale Zugehörigkeit und Identitätsbildung. Auf der anderen Seite stehen die Anbieter mit ihren Geschäftsmodellen, Zielen und Anreizen wie Reichweite, Nutzerbindung, Werbeeinnahmen und Marktanteilen. Idealerweise stehen diese beiden Seiten in einem ausgewogenen Verhältnis: Die Anbieter liefern Inhalte, die Bedürfnisse der Nutzenden erfüllen, und erhalten dafür Aufmerksamkeit oder Entgelt. In den letzten zwei Jahrzehnten hat sich dieses Gleichgewicht jedoch zunehmend zugunsten der Anbieterseite verschoben, insbesondere im Bereich der sozialen Medien (</w:t>
-      </w:r>
-      <w:r>
-        <w:rPr/>
-        <w:t xml:space="preserve">Montag &amp; Elhai, 2023; Zuboff, 2019</w:t>
-      </w:r>
-      <w:r>
-        <w:rPr/>
-        <w:t xml:space="preserve">).</w:t>
+        <w:t>Medienkonsum ist das Ergebnis eines Zusammenspiels zweier Seiten: Auf der einen Seite stehen die Nutzenden mit ihren Bedürfnissen und Motivationen wie Information, Unterhaltung, Orientierung, soziale Zugehörigkeit und Identitätsbildung. Auf der anderen Seite stehen die Anbieter mit ihren Geschäftsmodellen, Zielen und Anreizen wie Reichweite, Nutzerbindung, Werbeeinnahmen und Marktanteilen. Idealerweise stehen diese beiden Seiten in einem ausgewogenen Verhältnis: Die Anbieter liefern Inhalte, die Bedürfnisse der Nutzenden erfüllen, und erhalten dafür Aufmerksamkeit oder Entgelt. In den letzten zwei Jahrzehnten hat sich dieses Gleichgewicht jedoch zunehmend zugunsten der Anbieterseite verschoben, insbesondere im Bereich der sozialen Medien (Montag &amp; Elhai, 2023; Zuboff, 2019).</w:t>
       </w:r>
     </w:p>
     <w:p>
@@ -4925,23 +4917,7 @@
       </w:pPr>
       <w:r>
         <w:rPr/>
-        <w:t xml:space="preserve">Die ökonomische Logik manifestiert sich in konkreten Designmustern, die gezielt auf Schwachstellen der menschlichen Psyche zielen</w:t>
-      </w:r>
-      <w:r>
-        <w:rPr/>
-        <w:t xml:space="preserve"> (Gray et al., 2018; Mathur et al., 2019)</w:t>
-      </w:r>
-      <w:r>
-        <w:rPr/>
-        <w:t xml:space="preserve">. Zu den am besten dokumentierten Mustern gehören</w:t>
-      </w:r>
-      <w:r>
-        <w:rPr/>
-        <w:t xml:space="preserve"> (Montag et al., 2019; Weinmann et al., 2016)</w:t>
-      </w:r>
-      <w:r>
-        <w:rPr/>
-        <w:t xml:space="preserve">:</w:t>
+        <w:t>Die ökonomische Logik manifestiert sich in konkreten Designmustern, die gezielt auf Schwachstellen der menschlichen Psyche zielen (Gray et al., 2018; Mathur et al., 2019). Zu den am besten dokumentierten Mustern gehören (Montag et al., 2019; Weinmann et al., 2016):</w:t>
       </w:r>
     </w:p>
     <w:p>
@@ -5132,31 +5108,7 @@
       </w:pPr>
       <w:r>
         <w:rPr/>
-        <w:t xml:space="preserve">Die Forschungslage zeigt drei miteinander verwobene Aspekte dieses Ungleichgewichts. Erstens ist es kein Zufall, sondern strukturell im werbefinanzierten Geschäftsmodell angelegt (</w:t>
-      </w:r>
-      <w:r>
-        <w:rPr/>
-        <w:t xml:space="preserve">Montag &amp; Elhai, 2023; Zuboff, 2019</w:t>
-      </w:r>
-      <w:r>
-        <w:rPr/>
-        <w:t xml:space="preserve">). Zweitens hat es messbare negative Folgen auf Informationsvielfalt, soziale Kohäsion und individuelles Wohlbefinden (</w:t>
-      </w:r>
-      <w:r>
-        <w:rPr/>
-        <w:t xml:space="preserve">Geschke et al., 2019; Nguyen et al., 2014; Orben, 2020; Verduyn et al., 2015</w:t>
-      </w:r>
-      <w:r>
-        <w:rPr/>
-        <w:t xml:space="preserve">). Drittens verfügen Nutzende in den aktuellen Systemen kaum über die Möglichkeit, dieses Ungleichgewicht selbst zu korrigieren (</w:t>
-      </w:r>
-      <w:r>
-        <w:rPr/>
-        <w:t xml:space="preserve">Milano et al., 2020; Reviglio &amp; Agosti, 2020</w:t>
-      </w:r>
-      <w:r>
-        <w:rPr/>
-        <w:t xml:space="preserve">).</w:t>
+        <w:t>Die Forschungslage zeigt drei miteinander verwobene Aspekte dieses Ungleichgewichts. Erstens ist es kein Zufall, sondern strukturell im werbefinanzierten Geschäftsmodell angelegt (Montag &amp; Elhai, 2023; Zuboff, 2019). Zweitens hat es messbare negative Folgen auf Informationsvielfalt, soziale Kohäsion und individuelles Wohlbefinden (Geschke et al., 2019; Nguyen et al., 2014; Orben, 2020; Verduyn et al., 2015). Drittens verfügen Nutzende in den aktuellen Systemen kaum über die Möglichkeit, dieses Ungleichgewicht selbst zu korrigieren (Milano et al., 2020; Reviglio &amp; Agosti, 2020).</w:t>
       </w:r>
     </w:p>
     <w:p>
@@ -5384,37 +5336,29 @@
       </w:r>
       <w:r>
         <w:rPr/>
-        <w:t xml:space="preserve"> (Gruber, 1995)</w:t>
+        <w:t xml:space="preserve"> (Gruber, 1995). Auf der Nutzerseite werden analoge Strukturen verwendet, um Interessensprofile explizit oder implizit zu repräsentieren. Die Qualität dieser Strukturen prägt massgeblich die Qualität späterer Empfehlungen.</w:t>
+      </w:r>
+    </w:p>
+    <w:p>
+      <w:pPr>
+        <w:pStyle w:val="berschrift3"/>
+      </w:pPr>
+      <w:bookmarkStart w:id="19" w:name="_Toc232116581"/>
+      <w:r>
+        <w:t>2.2.2  Suche</w:t>
+      </w:r>
+      <w:bookmarkEnd w:id="19"/>
+    </w:p>
+    <w:p>
+      <w:pPr>
+        <w:spacing w:after="160" w:line="360" w:lineRule="auto"/>
+      </w:pPr>
+      <w:r>
+        <w:t>Suchmechanismen sind der klassische aktive Zugang zu Inhalten: Die Nutzenden formulieren eine Anfrage, das System liefert eine Ergebnisliste. Die Relevanzbewertung basiert historisch auf Textmatching und Linkstrukturen, zunehmend auch auf semantischen Embeddings und personalisierten Signalen</w:t>
       </w:r>
       <w:r>
         <w:rPr/>
-        <w:t xml:space="preserve">. Auf der Nutzerseite werden analoge Strukturen verwendet, um Interessensprofile explizit oder implizit zu repräsentieren. Die Qualität dieser Strukturen prägt massgeblich die Qualität späterer Empfehlungen.</w:t>
-      </w:r>
-    </w:p>
-    <w:p>
-      <w:pPr>
-        <w:pStyle w:val="berschrift3"/>
-      </w:pPr>
-      <w:bookmarkStart w:id="19" w:name="_Toc232116581"/>
-      <w:r>
-        <w:t>2.2.2  Suche</w:t>
-      </w:r>
-      <w:bookmarkEnd w:id="19"/>
-    </w:p>
-    <w:p>
-      <w:pPr>
-        <w:spacing w:after="160" w:line="360" w:lineRule="auto"/>
-      </w:pPr>
-      <w:r>
-        <w:t>Suchmechanismen sind der klassische aktive Zugang zu Inhalten: Die Nutzenden formulieren eine Anfrage, das System liefert eine Ergebnisliste. Die Relevanzbewertung basiert historisch auf Textmatching und Linkstrukturen, zunehmend auch auf semantischen Embeddings und personalisierten Signalen</w:t>
-      </w:r>
-      <w:r>
-        <w:rPr/>
-        <w:t xml:space="preserve"> (Manning et al., 2008)</w:t>
-      </w:r>
-      <w:r>
-        <w:rPr/>
-        <w:t xml:space="preserve">. Suche ist vergleichsweise transparent, da die Intention von den Nutzenden formuliert wird. Zugleich wächst die Intransparenz dort, wo Personalisierung die Trefferlisten unsichtbar verändert.</w:t>
+        <w:t xml:space="preserve"> (Manning et al., 2008). Suche ist vergleichsweise transparent, da die Intention von den Nutzenden formuliert wird. Zugleich wächst die Intransparenz dort, wo Personalisierung die Trefferlisten unsichtbar verändert.</w:t>
       </w:r>
     </w:p>
     <w:p>
@@ -5479,7 +5423,7 @@
         <w:spacing w:after="160" w:line="360" w:lineRule="auto"/>
       </w:pPr>
       <w:r>
-        <w:t>Die Optimierung erfolgt in der kommerziellen Praxis überwiegend auf Engagement-Metriken. Nguyen et al. (2014) zeigen, dass dies zur Einengung der inhaltlichen Vielfalt führt. Milano et al. (2020) systematisieren die daraus folgenden ethischen Herausforderungen entlang sechs Dimensionen: Inhaltsqualität, Privatsphäre, Autonomie, Meinungsvielfalt, soziale Auswirkungen und Verantwortlichkeit.</w:t>
+        <w:t>Die Optimierung erfolgt in der kommerziellen Praxis überwiegend auf Engagement-Metriken. Nguyen et al. (2014) zeigen, dass dies zur Einengung der inhaltlichen Vielfalt führt. Milano et al. (2020) systematisieren die daraus folgenden ethischen Herausforderungen entlang sechs Dimensionen: Inhaltsqualität, Privatsphäre, Autonomie, Meinungsvielfalt, soziale Auswirkungen und Verantwortlichkeit. Als konstruktive Gegenbewegung hat sich in der Empfehlungssystemforschung ein eigener Strang zu Diversität, Novelty und Serendipität etabliert, der Vielfalt nicht als blosse Nebenbedingung, sondern als eigenständiges Optimierungsziel modelliert (Kunaver &amp; Požrl, 2017); für den Nachrichtenkontext fordert Helberger (2019) Empfehlungssysteme, die aktiv eine demokratisch wünschenswerte Vielfalt herstellen. Die in Abschnitt 3.3.3 beschriebene Kuratierungslogik von Attune greift diesen Strang auf.</w:t>
       </w:r>
     </w:p>
     <w:p>
@@ -5524,11 +5468,7 @@
       </w:r>
       <w:r>
         <w:rPr/>
-        <w:t xml:space="preserve"> (Berger &amp; Milkman, 2012)</w:t>
-      </w:r>
-      <w:r>
-        <w:rPr/>
-        <w:t xml:space="preserve">. Diese Mechanismen sind nicht neutral, sondern begünstigen systematisch emotional aufgeladene, oft polarisierende Inhalte und wirken damit auf die in Abschnitt 1.4 beschriebene Triple-Filter-Bubble (Geschke et al., 2019; Sunstein, 2017).</w:t>
+        <w:t xml:space="preserve"> (Berger &amp; Milkman, 2012). Diese Mechanismen sind nicht neutral, sondern begünstigen systematisch emotional aufgeladene, oft polarisierende Inhalte und wirken damit auf die in Abschnitt 1.4 beschriebene Triple-Filter-Bubble (Geschke et al., 2019; Sunstein, 2017).</w:t>
       </w:r>
     </w:p>
     <w:p>
@@ -5582,11 +5522,7 @@
       </w:r>
       <w:r>
         <w:rPr/>
-        <w:t xml:space="preserve">Montag &amp; Elhai, 2023; Zuboff, 2019</w:t>
-      </w:r>
-      <w:r>
-        <w:rPr/>
-        <w:t xml:space="preserve">).</w:t>
+        <w:t>Montag &amp; Elhai, 2023; Zuboff, 2019).</w:t>
       </w:r>
     </w:p>
     <w:p>
@@ -5705,15 +5641,7 @@
       </w:pPr>
       <w:r>
         <w:rPr/>
-        <w:t xml:space="preserve">Neben den normativen Kriterien spielt die klassische Gebrauchstauglichkeit eine Rolle. Der System Usability Scale (</w:t>
-      </w:r>
-      <w:r>
-        <w:rPr/>
-        <w:t xml:space="preserve">Bangor et al., 2008; Brooke, 1996)</w:t>
-      </w:r>
-      <w:r>
-        <w:rPr/>
-        <w:t xml:space="preserve"> ist ein etabliertes, kurzes Messinstrument, das die subjektive Usability eines Systems mit zehn Items erhebt und in der vorliegenden Arbeit ergänzend zu den wellbeing-bezogenen Massen eingesetzt werden kann.</w:t>
+        <w:t>Neben den normativen Kriterien spielt die klassische Gebrauchstauglichkeit eine Rolle. Der System Usability Scale (Bangor et al., 2008; Brooke, 1996) ist ein etabliertes, kurzes Messinstrument, das die subjektive Usability eines Systems mit zehn Items erhebt und in der vorliegenden Arbeit ergänzend zu den wellbeing-bezogenen Massen eingesetzt werden kann.</w:t>
       </w:r>
     </w:p>
     <w:p>
@@ -6672,15 +6600,7 @@
       </w:pPr>
       <w:r>
         <w:rPr/>
-        <w:t xml:space="preserve">Gleichzeitig fehlen konkrete, lauffähige Artefakte, die diese Prinzipien in einem integrierten System zeigen. Bestehende Ansätze bleiben entweder auf konzeptioneller Ebene (</w:t>
-      </w:r>
-      <w:r>
-        <w:rPr/>
-        <w:t xml:space="preserve">Hendry et al., 2021; Peters et al., 2020</w:t>
-      </w:r>
-      <w:r>
-        <w:rPr/>
-        <w:t xml:space="preserve">) oder beschränken sich auf einzelne Features wie Bildschirmzeit-Tracker und Wochenberichte, die der strukturellen Logik der Plattformen nichts entgegensetzen. Ein durchgängiges Demonstrationsmedium, das Personalisierung, Transparenz und Wellbeing in einem funktionierenden System verbindet und damit der Engagement-Logik ein konkretes Gegenmodell zur Seite stellt, steht aus. Eben diese Lücke adressiert die vorliegende Arbeit; die Forschungsfrage sowie der Lösungsvorschlag werden in den nachfolgenden Kapiteln entwickelt.</w:t>
+        <w:t>Gleichzeitig fehlen konkrete, lauffähige Artefakte, die diese Prinzipien in einem integrierten System zeigen. Bestehende Ansätze bleiben entweder auf konzeptioneller Ebene (Hendry et al., 2021; Peters et al., 2020) oder beschränken sich auf einzelne Features wie Bildschirmzeit-Tracker und Wochenberichte, die der strukturellen Logik der Plattformen nichts entgegensetzen. Ein durchgängiges Demonstrationsmedium, das Personalisierung, Transparenz und Wellbeing in einem funktionierenden System verbindet und damit der Engagement-Logik ein konkretes Gegenmodell zur Seite stellt, steht aus. Eben diese Lücke adressiert die vorliegende Arbeit; die Forschungsfrage sowie der Lösungsvorschlag werden in den nachfolgenden Kapiteln entwickelt.</w:t>
       </w:r>
     </w:p>
     <w:p>
@@ -6735,15 +6655,7 @@
       </w:pPr>
       <w:r>
         <w:rPr/>
-        <w:t xml:space="preserve">Zweitens ist Radio ein lineares, zeitlich gerahmtes Medium. Im Gegensatz zu Feeds mit endlosem Scrollen besitzt eine Sendung einen definierten Anfang und ein definiertes Ende. Diese Eigenschaft macht es möglich, gezielt diejenigen Designmuster zu vermeiden, die in Kapitel 1 als problematisch identifiziert wurden (endloses Scrollen, Autoplay, künstliche Verlängerung von Sessions), und stattdessen alternative, wellbeing-fördernde Strukturen wie natürliche Pausen, klare Sendungslängen und bewusste Abschlusspunkte zu erproben (</w:t>
-      </w:r>
-      <w:r>
-        <w:rPr/>
-        <w:t xml:space="preserve">Peters et al., 2018; Vanden Abeele, 2021</w:t>
-      </w:r>
-      <w:r>
-        <w:rPr/>
-        <w:t xml:space="preserve">).</w:t>
+        <w:t>Zweitens ist Radio ein lineares, zeitlich gerahmtes Medium. Im Gegensatz zu Feeds mit endlosem Scrollen besitzt eine Sendung einen definierten Anfang und ein definiertes Ende. Diese Eigenschaft macht es möglich, gezielt diejenigen Designmuster zu vermeiden, die in Kapitel 1 als problematisch identifiziert wurden (endloses Scrollen, Autoplay, künstliche Verlängerung von Sessions), und stattdessen alternative, wellbeing-fördernde Strukturen wie natürliche Pausen, klare Sendungslängen und bewusste Abschlusspunkte zu erproben (Peters et al., 2018; Vanden Abeele, 2021).</w:t>
       </w:r>
     </w:p>
     <w:p>
@@ -7053,7 +6965,7 @@
           <w:i/>
           <w:iCs/>
         </w:rPr>
-        <w:t>«Wie können Nutzerinnen und Nutzer ihre individuellen Präferenzen bei einem digitalen Medienangebot so angeben, dass das Ergebnis ihre Bedürfnisse optimal erfüllt und gleichzeitig ihr Wohlbefinden fördert?»</w:t>
+        <w:t>«Wie können Nutzerinnen und Nutzer ihre individuellen Präferenzen bei einem digitalen Medienangebot so angeben, dass das Ergebnis ihre Bedürfnisse erfüllt und gleichzeitig ihr Wohlbefinden fördert?»</w:t>
       </w:r>
     </w:p>
     <w:p>
@@ -7062,15 +6974,7 @@
       </w:pPr>
       <w:r>
         <w:rPr/>
-        <w:t xml:space="preserve">Die Frage bündelt drei Spannungsachsen, die sich aus den vorausgegangenen Kapiteln ergeben. Erstens stellt sie den Mechanismus der Präferenzangabe ins Zentrum: den Übergang von impliziter, verhaltensgetriebener Personalisierung hin zu expliziter, von den Nutzenden selbst formulierter Steuerung (vgl. Abschnitt 2.2.4 sowie 3.3.1). Zweitens stellt sie eine Doppelbedingung an das Resultat: Es muss subjektiv den Bedürfnissen der Nutzenden entsprechen und sich zugleich am Massstab des Wohlbefindens (</w:t>
-      </w:r>
-      <w:r>
-        <w:rPr/>
-        <w:t xml:space="preserve">Peters et al., 2018; Vanden Abeele, 2021</w:t>
-      </w:r>
-      <w:r>
-        <w:rPr/>
-        <w:t xml:space="preserve">) messen lassen. Drittens wird die Frage methodisch über ein konkretes, lauffähiges Artefakt beantwortet, an dem sich die genannten Mechanismen sichtbar und beobachtbar machen lassen.</w:t>
+        <w:t>Die Frage bündelt drei Spannungsachsen, die sich aus den vorausgegangenen Kapiteln ergeben. Erstens stellt sie den Mechanismus der Präferenzangabe ins Zentrum: den Übergang von impliziter, verhaltensgetriebener Personalisierung hin zu expliziter, von den Nutzenden selbst formulierter Steuerung (vgl. Abschnitt 2.2.4 sowie 3.3.1). Zweitens stellt sie eine Doppelbedingung an das Resultat: Es muss subjektiv den Bedürfnissen der Nutzenden entsprechen und sich zugleich am Massstab des Wohlbefindens (Peters et al., 2018; Vanden Abeele, 2021) messen lassen. Drittens wird die Frage methodisch über ein konkretes, lauffähiges Artefakt beantwortet, an dem sich die genannten Mechanismen sichtbar und beobachtbar machen lassen.</w:t>
       </w:r>
     </w:p>
     <w:p>
@@ -7124,15 +7028,7 @@
       </w:pPr>
       <w:r>
         <w:rPr/>
-        <w:t xml:space="preserve">T2 – Inhaltsdiversität und Bedürfnisgerechtigkeit: In welchem Mass werden eine bewusst diversifizierte Inhaltsauswahl und eine am Tageskontext orientierte Reihenfolge gegenüber einer engagement-optimierten Logik als bedürfnisgerecht und qualitativ angemessen erlebt (</w:t>
-      </w:r>
-      <w:r>
-        <w:rPr/>
-        <w:t xml:space="preserve">Milano et al., 2020; Nguyen et al., 2014</w:t>
-      </w:r>
-      <w:r>
-        <w:rPr/>
-        <w:t xml:space="preserve">)?</w:t>
+        <w:t>T2 – Inhaltsdiversität und Bedürfnisgerechtigkeit: In welchem Mass werden eine bewusst diversifizierte Inhaltsauswahl und eine am Tageskontext orientierte Reihenfolge gegenüber einer engagement-optimierten Logik als bedürfnisgerecht und qualitativ angemessen erlebt (Milano et al., 2020; Nguyen et al., 2014)?</w:t>
       </w:r>
     </w:p>
     <w:p>
@@ -7146,15 +7042,7 @@
       </w:pPr>
       <w:r>
         <w:rPr/>
-        <w:t xml:space="preserve">T3 – Sessiongestaltung und Nutzungskontrolle: Wie wirken eine definierte Sendungslänge und ein bewusst gesetzter Sendungsabschluss auf die subjektive Zufriedenheit, das Zeitempfinden und die wahrgenommene Kontrolle über die eigene Mediennutzung (</w:t>
-      </w:r>
-      <w:r>
-        <w:rPr/>
-        <w:t xml:space="preserve">Montag et al., 2019; Vanden Abeele, 2021</w:t>
-      </w:r>
-      <w:r>
-        <w:rPr/>
-        <w:t xml:space="preserve">)?</w:t>
+        <w:t>T3 – Sessiongestaltung und Nutzungskontrolle: Wie wirken eine definierte Sendungslänge und ein bewusst gesetzter Sendungsabschluss auf die subjektive Zufriedenheit, das Zeitempfinden und die wahrgenommene Kontrolle über die eigene Mediennutzung (Montag et al., 2019; Vanden Abeele, 2021)?</w:t>
       </w:r>
     </w:p>
     <w:p>
@@ -7168,15 +7056,7 @@
       </w:pPr>
       <w:r>
         <w:rPr/>
-        <w:t xml:space="preserve">T4 – Transparenz und Akzeptanz: Wie verändert eine offengelegte Personalisierungslogik die wahrgenommene Fairness, das Vertrauen und die Gebrauchstauglichkeit, gemessen unter anderem über den System Usability Scale (</w:t>
-      </w:r>
-      <w:r>
-        <w:rPr/>
-        <w:t xml:space="preserve">Bangor et al., 2008; Brooke, 1996; Reviglio &amp; Agosti, 2020</w:t>
-      </w:r>
-      <w:r>
-        <w:rPr/>
-        <w:t xml:space="preserve">)?</w:t>
+        <w:t>T4 – Transparenz und Akzeptanz: Wie verändert eine offengelegte Personalisierungslogik die wahrgenommene Fairness, das Vertrauen und die Gebrauchstauglichkeit, gemessen unter anderem über den System Usability Scale (Bangor et al., 2008; Brooke, 1996; Reviglio &amp; Agosti, 2020)?</w:t>
       </w:r>
     </w:p>
     <w:p>
@@ -7270,15 +7150,7 @@
       </w:pPr>
       <w:r>
         <w:rPr/>
-        <w:t xml:space="preserve">Die Arbeit leistet einen Beitrag an der Schnittstelle von Wirtschaftsinformatik, Medienethik und Human-Computer Interaction. Sie liefert ein durchgängiges, lauffähiges Artefakt, an dem sich die Prinzipien aus Self-Determination Theory (Ryan &amp; Deci, 2000), Value-Sensitive Design (Hendry et al., 2021), Digital Wellbeing (</w:t>
-      </w:r>
-      <w:r>
-        <w:rPr/>
-        <w:t xml:space="preserve">Burr et al., 2020; Peters et al., 2020; Vanden Abeele, 2021</w:t>
-      </w:r>
-      <w:r>
-        <w:rPr/>
-        <w:t xml:space="preserve">) und algorithmischer Souveränität (Reviglio &amp; Agosti, 2020) integriert beobachten lassen – ein Setting, das in der bisherigen Literatur überwiegend konzeptionell, aber nur selten in einem konsistent gebauten System adressiert wird (vgl. Abschnitt 2.5). Der Pilottest erzeugt darüber hinaus erste empirische Hinweise auf die Nutzerakzeptanz wellbeing-orientierter Personalisierung und liefert eine methodische Vorlage, an der sich grössere Folgestudien orientieren können.</w:t>
+        <w:t>Die Arbeit leistet einen Beitrag an der Schnittstelle von Wirtschaftsinformatik, Medienethik und Human-Computer Interaction. Sie liefert ein durchgängiges, lauffähiges Artefakt, an dem sich die Prinzipien aus Self-Determination Theory (Ryan &amp; Deci, 2000), Value-Sensitive Design (Hendry et al., 2021), Digital Wellbeing (Burr et al., 2020; Peters et al., 2020; Vanden Abeele, 2021) und algorithmischer Souveränität (Reviglio &amp; Agosti, 2020) integriert beobachten lassen – ein Setting, das in der bisherigen Literatur überwiegend konzeptionell, aber nur selten in einem konsistent gebauten System adressiert wird (vgl. Abschnitt 2.5). Der Pilottest erzeugt darüber hinaus erste empirische Hinweise auf die Nutzerakzeptanz wellbeing-orientierter Personalisierung und liefert eine methodische Vorlage, an der sich grössere Folgestudien orientieren können.</w:t>
       </w:r>
     </w:p>
     <w:p>
@@ -7399,15 +7271,7 @@
       </w:pPr>
       <w:r>
         <w:rPr/>
-        <w:t xml:space="preserve">Dieses Kapitel beschreibt die Methodik der vorliegenden Arbeit. Es macht transparent, mit welchem Forschungsdesign, mit welchen Vorgehensweisen, Werkzeugen und Datenquellen gearbeitet wird, damit die Ergebnisse nachvollziehbar und überprüfbar sind. Abschnitt 5.1 dokumentiert das bereits abgeschlossene Vorgehen der Literaturrecherche, auf der die Kapitel 1 und 2 beruhen. Abschnitt 5.2 ordnet die Arbeit als Design-Science-Vorhaben (</w:t>
-      </w:r>
-      <w:r>
-        <w:rPr/>
-        <w:t xml:space="preserve">Hevner, 2007; Hevner et al., 2004; Peffers et al., 2007</w:t>
-      </w:r>
-      <w:r>
-        <w:rPr/>
-        <w:t xml:space="preserve">) ein. Abschnitt 5.3 fasst das praktische Vorgehen entlang der Arbeitspakete zusammen. Die Abschnitte 5.4 und 5.5 beschreiben die Methoden der Datenerhebung (formatives Erstfeedback, standardisierte Online-Befragung mit usability- und wirkungsbezogenen Items) und der Auswertung (deskriptive Statistik, qualitative Clusterung der Freitextantworten). Abschnitt 5.6 reflektiert schliesslich die eingesetzten Ressourcen und Kompetenzen.</w:t>
+        <w:t>Dieses Kapitel beschreibt die Methodik der vorliegenden Arbeit. Es macht transparent, mit welchem Forschungsdesign, mit welchen Vorgehensweisen, Werkzeugen und Datenquellen gearbeitet wird, damit die Ergebnisse nachvollziehbar und überprüfbar sind. Abschnitt 5.1 dokumentiert das bereits abgeschlossene Vorgehen der Literaturrecherche, auf der die Kapitel 1 und 2 beruhen. Abschnitt 5.2 ordnet die Arbeit als Design-Science-Vorhaben (Hevner, 2007; Hevner et al., 2004; Peffers et al., 2007) ein. Abschnitt 5.3 fasst das praktische Vorgehen entlang der Arbeitspakete zusammen. Die Abschnitte 5.4 und 5.5 beschreiben die Methoden der Datenerhebung (formatives Erstfeedback, standardisierte Online-Befragung mit usability- und wirkungsbezogenen Items) und der Auswertung (deskriptive Statistik, qualitative Clusterung der Freitextantworten). Abschnitt 5.6 reflektiert schliesslich die eingesetzten Ressourcen und Kompetenzen.</w:t>
       </w:r>
     </w:p>
     <w:p>
@@ -7495,7 +7359,7 @@
         <w:spacing w:after="160" w:line="360" w:lineRule="auto"/>
       </w:pPr>
       <w:r>
-        <w:t>Auf die vorliegende Arbeit übertragen bedeutet dies: Der Relevance Cycle ist in den Kapiteln 1 und 3 sowie in der Pilotbefragung (Abschnitte 8.3 und 8.6) verankert; der Rigor Cycle wird in Kapitel 2 sowie in Abschnitt 5.1 dokumentiert; der Design Cycle umfasst die in den Kapiteln 6 und 7 beschriebene iterative Konstruktion und die in Kapitel 8 ausgeführte Evaluation. Peffers et al. (2007) ergänzen diesen Rahmen um eine konkrete Schrittfolge – Problem Identification, Definition of Objectives, Design and Development, Demonstration, Evaluation, Communication –, die im Gesamtaufbau dieser Arbeit unmittelbar erkennbar ist und in der nachfolgenden Vorgehensbeschreibung in Abschnitt 5.3 ihren operativen Ausdruck findet.</w:t>
+        <w:t>Auf die vorliegende Arbeit übertragen bedeutet dies: Der Relevance Cycle ist in den Kapiteln 1 und 3 sowie in der Pilotbefragung (Abschnitte 8.3 und 8.6) verankert; der Rigor Cycle wird in Kapitel 2 sowie in Abschnitt 5.1 dokumentiert; der Design Cycle umfasst die in den Kapiteln 6 und 7 beschriebene iterative Konstruktion und die in Kapitel 8 ausgeführte Evaluation. Peffers et al. (2007) ergänzen diesen Rahmen um eine konkrete Schrittfolge – Problem Identification, Definition of Objectives, Design and Development, Demonstration, Evaluation, Communication –, die im Gesamtaufbau dieser Arbeit unmittelbar erkennbar ist und in der nachfolgenden Vorgehensbeschreibung in Abschnitt 5.3 ihren operativen Ausdruck findet. Die Wahl der Evaluationsstrategie folgt dabei dem Framework for Evaluation in Design Science (FEDS) von Venable et al. (2016): Die vorliegende Pilotbefragung ist als formativ-naturalistische Evaluation früher Ausprägung angelegt, die das Artefakt mit realen Nutzenden im Anwendungskontext prüft, während summative und vergleichende Evaluationsstufen – insbesondere ein Kontrollvergleich und eine Längsschnittbetrachtung – bewusst nachgelagerten Arbeiten überlassen werden (Abschnitt 11.3).</w:t>
       </w:r>
     </w:p>
     <w:p>
@@ -8565,27 +8429,7 @@
       </w:r>
       <w:r>
         <w:rPr/>
-        <w:t xml:space="preserve">; Lewis, 2018</w:t>
-      </w:r>
-      <w:r>
-        <w:rPr/>
-        <w:t xml:space="preserve">) angelehnten Items erhoben, die als adaptierter Index berichtet werden, ergänzt um eigenkonstruierte, am Technology Acceptance Model (TAM</w:t>
-      </w:r>
-      <w:r>
-        <w:rPr/>
-        <w:t xml:space="preserve">; Davis, 1989</w:t>
-      </w:r>
-      <w:r>
-        <w:rPr/>
-        <w:t xml:space="preserve">) und der Unified Theory of Acceptance and Use of Technology (UTAUT</w:t>
-      </w:r>
-      <w:r>
-        <w:rPr/>
-        <w:t xml:space="preserve">; Venkatesh et al., 2003</w:t>
-      </w:r>
-      <w:r>
-        <w:rPr/>
-        <w:t xml:space="preserve">) orientierte Akzeptanz-Items zu den einzelnen Einstellungsmöglichkeiten. Die Wirkung wird über theoriegeleitete Items erfasst, die direkt aus dem Rahmen in Kapitel 2 abgeleitet sind und sich an den von Peters et al. (2020) zusammengetragenen wellbeing-bezogenen Konstrukten sowie an der Definition von Vanden Abeele (2021) orientieren; sie adressieren die Teilfragen T1 bis T4. Der Gesamteindruck wird mit einem siebenstufigen semantischen Differential erfasst; alle übrigen geschlossenen Items sind fünfstufige Likert-Skalen. Offene Freitextfragen ergänzen die geschlossenen Formate. Das vollständige Instrument ist als Fragebogen-PDF im begleitenden Repository dokumentiert (vgl. Abschnitt 8.6); die Operationalisierung der einzelnen Stränge wird in den Abschnitten 8.2 bis 8.5 entfaltet.</w:t>
+        <w:t>; Lewis, 2018) angelehnten Items erhoben, die als adaptierter Index berichtet werden, ergänzt um eigenkonstruierte, am Technology Acceptance Model (TAM; Davis, 1989) und der Unified Theory of Acceptance and Use of Technology (UTAUT; Venkatesh et al., 2003) orientierte Akzeptanz-Items zu den einzelnen Einstellungsmöglichkeiten. Die Wirkung wird über theoriegeleitete Items erfasst, die direkt aus dem Rahmen in Kapitel 2 abgeleitet sind und sich an den von Peters et al. (2020) zusammengetragenen wellbeing-bezogenen Konstrukten sowie an der Definition von Vanden Abeele (2021) orientieren; sie adressieren die Teilfragen T1 bis T4. Der Gesamteindruck wird mit einem siebenstufigen semantischen Differential erfasst; alle übrigen geschlossenen Items sind fünfstufige Likert-Skalen. Offene Freitextfragen ergänzen die geschlossenen Formate. Das vollständige Instrument ist als Fragebogen-PDF im begleitenden Repository dokumentiert (vgl. Abschnitt 8.6); die Operationalisierung der einzelnen Stränge wird in den Abschnitten 8.2 bis 8.5 entfaltet.</w:t>
       </w:r>
     </w:p>
     <w:p>
@@ -8613,7 +8457,7 @@
       <w:r>
         <w:t xml:space="preserve">Die geschlossenen Items werden deskriptiv über Mittelwerte, Standardabweichungen und Häufigkeiten ausgewertet, gruppiert nach den Konstrukten der drei Validierungsstränge. Für die sechs SUS-angelehnten Items wird ein adaptierter Bedienbarkeits-Index (0 bis 100) gebildet; da das Instrument nicht standardkonform ist, dient der Vergleich mit den Referenzwerten von Bangor et al. (2008) nur als grobe Orientierung. Negativ formulierte Items werden konstruktspezifisch umgepolt; Items, </w:t>
         <w:lastRenderedPageBreak/>
-        <w:t>die ein erwünschtes kritisches Bewusstsein messen, bleiben bewusst unverändert. Auf inferenzstatistische Verfahren und Reliabilitätskoeffizienten wird angesichts der Stichprobengrösse verzichtet; explorative Subgruppenvergleiche sind hypothesengenerierend zu lesen.</w:t>
+        <w:t>die ein erwünschtes kritisches Bewusstsein messen, bleiben bewusst unverändert. Auf inferenzstatistische Verfahren wird angesichts der Stichprobengrösse verzichtet; explorative Subgruppenvergleiche sind hypothesengenerierend zu lesen. Die interne Konsistenz der mehrteiligen Wirkungsskalen wird ergänzend über Cronbachs α geprüft: Die theoretisch tragenden Kernskalen sind intern konsistent (Selbstbestimmung beziehungsweise Autonomie sowie der aggregierte T1-Score je α = .85, Wohlbefinden α = .75), während kurze Zwei-Item-Indizes (Kompetenz) und heterogene Teilfragen-Aggregate (T3) erwartungsgemäss niedrigere Werte erreichen; die Auswertung bleibt deshalb bewusst auf Item-Ebene deskriptiv, und die Skalenmittel dienen nur der Orientierung.</w:t>
       </w:r>
     </w:p>
     <w:p>
@@ -8961,7 +8805,7 @@
         <w:spacing w:after="160" w:line="360" w:lineRule="auto"/>
       </w:pPr>
       <w:r>
-        <w:t>Die Kuratierungslogik (Baustein 3) operationalisiert den alternativen Zielwert in einem vierstufigen Auswahlverfahren. Zunächst stellt ein Abdeckungs-Durchgang sicher, dass jedes im Profil gewählte Thema mit mindestens einem Artikel vertreten ist. Danach fügt ein Serendipitäts-Durchgang gezielt einen Artikel aus einem nicht gewählten Themenfeld hinzu, der in der Oberfläche als Überraschung gekennzeichnet wird – eine bewusste Massnahme gegen die in Abschnitt 1.4 beschriebene Verengung des Informationshorizonts (Reviglio &amp; Agosti, 2020). Ein Tiefen-Durchgang ergänzt reihum zweite Artikel pro Thema, wobei eine Obergrenze von zwei Artikeln je Thema verhindert, dass ein einzelnes Thema die Sendung dominiert. Ein letzter Durchgang füllt verbleibende Plätze auf. Zusätzlich begrenzt eine Tageszeitregel die Gesamtzahl der Meldungen: am Morgen und in der Nacht deutlich weniger als tagsüber, um die kognitive Last an den Tagesrhythmus anzupassen (Vanden Abeele, 2021).</w:t>
+        <w:t>Die Kuratierungslogik (Baustein 3) operationalisiert den alternativen Zielwert in einem vierstufigen Auswahlverfahren. Zunächst stellt ein Abdeckungs-Durchgang sicher, dass jedes im Profil gewählte Thema mit mindestens einem Artikel vertreten ist. Danach fügt ein Serendipitäts-Durchgang gezielt einen Artikel aus einem nicht gewählten Themenfeld hinzu, der in der Oberfläche als Überraschung gekennzeichnet wird – eine bewusste Massnahme gegen die in Abschnitt 1.4 beschriebene Verengung des Informationshorizonts (Reviglio &amp; Agosti, 2020). Ein Tiefen-Durchgang ergänzt reihum zweite Artikel pro Thema, wobei eine Obergrenze von zwei Artikeln je Thema verhindert, dass ein einzelnes Thema die Sendung dominiert. Ein letzter Durchgang füllt verbleibende Plätze auf. Zusätzlich begrenzt eine Tageszeitregel die Gesamtzahl der Meldungen: am Morgen und in der Nacht deutlich weniger als tagsüber, um die kognitive Last an den Tagesrhythmus anzupassen (Vanden Abeele, 2021). In der umgesetzten Form greift diese Tageszeit-Obergrenze allerdings vor allem nachts (Begrenzung auf vier Meldungen); tagsüber liegt sie über dem ohnehin längenabhängig kleineren Artikelbudget und bindet daher meist nicht. Methodisch handelt es sich bei der Auswahl um eine regelbasierte, deterministische Diversitäts-Heuristik und nicht um ein lernendes Empfehlungsmodell – eine bewusste Entscheidung, die Nachvollziehbarkeit und algorithmische Souveränität (Reviglio &amp; Agosti, 2020) über prädiktive Genauigkeit stellt und Vielfalt im Sinne der diversitätsorientierten Empfehlungsforschung (Kunaver &amp; Požrl, 2017) als expliziten Zielwert kodiert.</w:t>
       </w:r>
     </w:p>
     <w:p>
@@ -10984,15 +10828,15 @@
         <w:spacing w:after="160" w:line="360" w:lineRule="auto"/>
       </w:pPr>
       <w:r>
-        <w:t>Gemessen an den in Abschnitt 8.5 operationalisierten Kriterien ergibt sich ein differenziertes Bild. Auf der Akzeptanzebene wird das SUS-Kriterium von mindestens 68 Punkten mit dem adaptierten Index von 82.5 deutlich übertroffen – mit dem Vorbehalt, dass kein standardkonformer Score vorliegt –, und zu allen Einstellungsmöglichkeiten liegt mehrheitlich positives Feedback vor (Sendungslänge M = 4.40, Themenwahl M = 3.80, Sessionende M = 3.92). Auf der Machbarkeitsebene berichten 22 von 25 Teilnehmenden (88 Prozent) einen vollständig fehlerfreien Durchlauf ohne Abbrüche; das 95-Prozent-Kriterium wird aus Nutzersicht knapp verfehlt, wobei die berichteten Störungen geringfügig waren. Auf der Wirkungsebene liegen die Items zu Autonomie, Steuerbarkeit und Transparenz mit Mittelwerten zwischen 3.32 und 4.04 mehrheitlich unter dem angestrebten Wert von vier Punkten; das Kriterium ist in der Erstkontakt-Situation nur teilweise erfüllt. Die Awareness-Items erzeugen dagegen die geforderten, qualitativ belegten Bewusstseinsberichte (M = 4.08 bis 4.20, gestützt durch Freitextantworten).</w:t>
-      </w:r>
-    </w:p>
-    <w:p>
-      <w:pPr>
-        <w:spacing w:after="160" w:line="360" w:lineRule="auto"/>
-      </w:pPr>
-      <w:r>
-        <w:t>Eine Einschränkung ist festzuhalten: Es wurden die Machbarkeits- und Wirkungskriterien als Anteils- bzw. Medianwerte formuliert, hier aber – konsistent mit dem Auswertungs-Notebook – auf Mittelwertebene berichtet. Insgesamt sind die Akzeptanzkriterien klar erfüllt, die Machbarkeit aus Nutzersicht weitgehend belegt und die Wirkungskriterien teilweise erfüllt – eine Einordnung, die Kapitel 10 vertieft. Abbildung 9.4 verdichtet diese Gesamtschau grafisch.</w:t>
+        <w:t>Gemessen an den in Abschnitt 8.5 operationalisierten Kriterien ergibt sich ein differenziertes Bild. Auf der Akzeptanzebene wird das SUS-Kriterium von mindestens 68 Punkten mit dem adaptierten Index von 82.5 deutlich übertroffen – mit dem Vorbehalt, dass kein standardkonformer Score vorliegt –, und zu allen Einstellungsmöglichkeiten liegt mehrheitlich positives Feedback vor (Sendungslänge M = 4.40, Themenwahl M = 3.80, Sessionende M = 3.92). Auf der Machbarkeitsebene berichten 22 von 25 Teilnehmenden (88 Prozent) einen vollständig fehlerfreien Durchlauf ohne Abbrüche; das 95-Prozent-Kriterium wird aus Nutzersicht knapp verfehlt, wobei die berichteten Störungen geringfügig waren. Auf der Wirkungsebene wird das Kriterium definitionsgemäss am Median geprüft (Abschnitt 8.5): Die Items zu Autonomie (Md = 4) und Steuerbarkeit (Md = 4) erreichen den angestrebten Wert von vier Punkten, die Transparenz-Items nur teilweise (drei von vier Items Md = 4). Auf Mittelwertebene liegen dieselben Items zwischen M = 3.32 und 4.04. Das Wirkungskriterium gilt damit für Autonomie und Steuerbarkeit als erfüllt, für Transparenz als teilweise erfüllt; das unmittelbar berichtete Wohlbefindenserleben bleibt davon unberührt verhalten (Abschnitt 9.3). Die Awareness-Items erzeugen dagegen die geforderten, qualitativ belegten Bewusstseinsberichte (M = 4.08 bis 4.20, gestützt durch Freitextantworten).</w:t>
+      </w:r>
+    </w:p>
+    <w:p>
+      <w:pPr>
+        <w:spacing w:after="160" w:line="360" w:lineRule="auto"/>
+      </w:pPr>
+      <w:r>
+        <w:t>Die Machbarkeits- und Wirkungskriterien wurden in Abschnitt 8.5 als Anteils- bzw. Medianwerte definiert und werden hier entsprechend berichtet; die Mittelwerte sind zur Einordnung ergänzt. Insgesamt sind die Akzeptanzkriterien klar erfüllt, das Machbarkeitskriterium aus Nutzersicht knapp verfehlt (88 % gegenüber geforderten 95 %) und die Wirkungskriterien für Autonomie und Steuerbarkeit erfüllt, für Transparenz teilweise – eine Einordnung, die Kapitel 10 vertieft. Abbildung 9.4 verdichtet diese Gesamtschau grafisch.</w:t>
       </w:r>
     </w:p>
     <w:p>
@@ -11085,7 +10929,7 @@
         <w:spacing w:after="160" w:line="360" w:lineRule="auto"/>
       </w:pPr>
       <w:r>
-        <w:t>Die Hauptforschungsfrage – wie Nutzerinnen und Nutzer ihre individuellen Präferenzen so angeben können, dass das Ergebnis ihre Bedürfnisse optimal erfüllt und zugleich ihr Wohlbefinden fördert – lässt sich auf Basis der Pilotdaten vorsichtig positiv beantworten. Über die drei Validierungsstränge hinweg ergibt sich ein konsistentes Muster: Die Machbarkeit ist aus Nutzersicht weitgehend belegt (88 Prozent fehlerfreie Durchläufe, hohe Werte für Audioqualität und Verständlichkeit), die Akzeptanz übertrifft mit einem adaptierten Bedienbarkeits-Index von 82.5 das Erfolgskriterium deutlich, und alle vier Teilfragen liegen mit Werten zwischen 3.62 und 3.94 über der Skalenmitte. Der Mechanismus, der den Kern der Forschungsfrage adressiert – die explizite, transparente Präferenzangabe – zeigt dabei die stärkste Wirkung: T1 (Präferenzbildung und Autonomie) erreicht mit M = 3.94 den höchsten Teilfragen-Wert, getragen vom Kompetenz- (M = 3.98) und Selbstbestimmungserleben (M = 3.81).</w:t>
+        <w:t>Die Hauptforschungsfrage – wie Nutzerinnen und Nutzer ihre individuellen Präferenzen so angeben können, dass das Ergebnis ihre Bedürfnisse erfüllt und zugleich ihr Wohlbefinden fördert – lässt sich auf Basis der Pilotdaten vorsichtig positiv beantworten. Über die drei Validierungsstränge hinweg ergibt sich ein konsistentes Muster: Die Machbarkeit ist aus Nutzersicht weitgehend belegt (88 Prozent fehlerfreie Durchläufe, hohe Werte für Audioqualität und Verständlichkeit), die Akzeptanz übertrifft mit einem adaptierten Bedienbarkeits-Index von 82.5 das Erfolgskriterium deutlich, und alle vier Teilfragen liegen mit Werten zwischen 3.62 und 3.94 über der Skalenmitte. Der Mechanismus, der den Kern der Forschungsfrage adressiert – die explizite, transparente Präferenzangabe – zeigt dabei die stärkste Wirkung: T1 (Präferenzbildung und Autonomie) erreicht mit M = 3.94 den höchsten Teilfragen-Wert, getragen vom Kompetenz- (M = 3.98) und Selbstbestimmungserleben (M = 3.81).</w:t>
       </w:r>
     </w:p>
     <w:p>
@@ -11359,7 +11203,7 @@
         <w:spacing w:after="160" w:line="360" w:lineRule="auto"/>
       </w:pPr>
       <w:r>
-        <w:t>Der Beitrag der Arbeit liegt auf drei Ebenen. Konzeptionell liefert sie ein theoretisch verankertes Bausteinmodell für wellbeing-orientierte Personalisierung samt einem expliziten Mapping von Werten auf Designentscheidungen, aus dem sich vier übertragbare Designprinzipien verdichten lassen. Technisch zeigt der lauffähige End-to-End-Demonstrator, dass sich derselbe Technologie-Stack, der heute Engagement-Optimierung antreibt, mit umgekehrter Zielfunktion betreiben lässt, und zwar ohne Erhebung von Verhaltensdaten: Personalisierung und Datensparsamkeit schliessen sich nicht aus. Empirisch liefert die Pilotbefragung erste deskriptive Evidenz für die Annahme, dass die problematischen Effekte heutiger Plattformen nicht in der Technologie, sondern in deren Zielsetzung begründet liegen; die vollständige Auswertung ist als reproduzierbares Notebook offengelegt. Insgesamt sind die drei Zyklen des Design-Science-Rahmens geschlossen: Die Anforderungen aus dem Anwendungsfeld wurden in ein Artefakt überführt, das Artefakt wurde im Feld evaluiert, und die Erkenntnisse fliessen in Form übertragbarer Prinzipien in die Wissensbasis zurück.</w:t>
+        <w:t>Der Beitrag der Arbeit liegt auf drei Ebenen. Konzeptionell liefert sie ein theoretisch verankertes Bausteinmodell für wellbeing-orientierte Personalisierung samt einem expliziten Mapping von Werten auf Designentscheidungen, aus dem sich vier übertragbare Designprinzipien verdichten lassen. Technisch zeigt der lauffähige End-to-End-Demonstrator, dass sich derselbe Technologie-Stack, der heute Engagement-Optimierung antreibt, mit umgekehrter Zielfunktion betreiben lässt, und zwar ohne Erhebung von Verhaltensdaten: Personalisierung und Datensparsamkeit schliessen sich nicht aus. Empirisch liefert die Pilotbefragung erste deskriptive Evidenz für die Annahme, dass die problematischen Effekte heutiger Plattformen nicht in der Technologie, sondern in deren Zielsetzung begründet liegen; die vollständige Auswertung ist als reproduzierbares Notebook offengelegt. Insgesamt sind die drei Zyklen des Design-Science-Rahmens geschlossen: Die Anforderungen aus dem Anwendungsfeld wurden in ein Artefakt überführt, das Artefakt wurde im Feld evaluiert, und die Erkenntnisse fliessen in Form übertragbarer Prinzipien in die Wissensbasis zurück. Das zentrale, übertragbare Resultat lautet: Bedürfnisgerechte Personalisierung setzt keine Verhaltensüberwachung voraus – sie lässt sich vollständig aus expliziten, jederzeit einsehbaren Präferenzangaben erzeugen und bleibt damit mit Datensparsamkeit und algorithmischer Souveränität vereinbar.</w:t>
       </w:r>
     </w:p>
     <w:p>
@@ -11547,13 +11391,7 @@
         <w:rPr>
           <w:lang w:val="en-US"/>
         </w:rPr>
-        <w:t xml:space="preserve">(4), 2313–2343</w:t>
-      </w:r>
-      <w:r>
-        <w:rPr>
-          <w:lang w:val="en-US"/>
-        </w:rPr>
-        <w:t xml:space="preserve">. https://doi.org/10.1007/s11948-020-00175-8</w:t>
+        <w:t>(4), 2313–2343. https://doi.org/10.1007/s11948-020-00175-8</w:t>
       </w:r>
     </w:p>
     <w:p>
@@ -11763,7 +11601,7 @@
         <w:rPr>
           <w:lang w:val="en-US"/>
         </w:rPr>
-        <w:t xml:space="preserve">Hendry, D. G., Friedman, B., &amp; Ballard, S. (2021). Value sensitive design as a formative framework. </w:t>
+        <w:t xml:space="preserve">Helberger, N. (2019). On the democratic role of news recommenders. </w:t>
       </w:r>
       <w:r>
         <w:rPr>
@@ -11771,13 +11609,13 @@
           <w:iCs/>
           <w:lang w:val="en-US"/>
         </w:rPr>
-        <w:t xml:space="preserve">Ethics and Information Technology, 23</w:t>
-      </w:r>
-      <w:r>
-        <w:rPr>
-          <w:lang w:val="en-US"/>
-        </w:rPr>
-        <w:t xml:space="preserve">(1), 39–44. https://doi.org/10.1007/s10676-021-09579-x</w:t>
+        <w:t xml:space="preserve">Digital Journalism, 7</w:t>
+      </w:r>
+      <w:r>
+        <w:rPr>
+          <w:lang w:val="en-US"/>
+        </w:rPr>
+        <w:t xml:space="preserve">(8), 993–1012. https://doi.org/10.1080/21670811.2019.1623700</w:t>
       </w:r>
     </w:p>
     <w:p>
@@ -11792,7 +11630,7 @@
         <w:rPr>
           <w:lang w:val="en-US"/>
         </w:rPr>
-        <w:t xml:space="preserve">Hevner, A. R. (2007). A three cycle view of design science research. </w:t>
+        <w:t xml:space="preserve">Hendry, D. G., Friedman, B., &amp; Ballard, S. (2021). Value sensitive design as a formative framework. </w:t>
       </w:r>
       <w:r>
         <w:rPr>
@@ -11800,13 +11638,13 @@
           <w:iCs/>
           <w:lang w:val="en-US"/>
         </w:rPr>
-        <w:t xml:space="preserve">Scandinavian Journal of Information Systems, 19</w:t>
-      </w:r>
-      <w:r>
-        <w:rPr>
-          <w:lang w:val="en-US"/>
-        </w:rPr>
-        <w:t xml:space="preserve">(2), 87–92.</w:t>
+        <w:t xml:space="preserve">Ethics and Information Technology, 23</w:t>
+      </w:r>
+      <w:r>
+        <w:rPr>
+          <w:lang w:val="en-US"/>
+        </w:rPr>
+        <w:t xml:space="preserve">(1), 39–44. https://doi.org/10.1007/s10676-021-09579-x</w:t>
       </w:r>
     </w:p>
     <w:p>
@@ -11821,7 +11659,7 @@
         <w:rPr>
           <w:lang w:val="en-US"/>
         </w:rPr>
-        <w:t xml:space="preserve">Hevner, A. R., March, S. T., Park, J., &amp; Ram, S. (2004). Design science in information systems research. </w:t>
+        <w:t xml:space="preserve">Hevner, A. R. (2007). A three cycle view of design science research. </w:t>
       </w:r>
       <w:r>
         <w:rPr>
@@ -11829,13 +11667,13 @@
           <w:iCs/>
           <w:lang w:val="en-US"/>
         </w:rPr>
-        <w:t xml:space="preserve">MIS Quarterly, 28</w:t>
-      </w:r>
-      <w:r>
-        <w:rPr>
-          <w:lang w:val="en-US"/>
-        </w:rPr>
-        <w:t xml:space="preserve">(1), 75–105. https://doi.org/10.2307/25148625</w:t>
+        <w:t xml:space="preserve">Scandinavian Journal of Information Systems, 19</w:t>
+      </w:r>
+      <w:r>
+        <w:rPr>
+          <w:lang w:val="en-US"/>
+        </w:rPr>
+        <w:t xml:space="preserve">(2), 87–92.</w:t>
       </w:r>
     </w:p>
     <w:p>
@@ -11850,7 +11688,7 @@
         <w:rPr>
           <w:lang w:val="en-US"/>
         </w:rPr>
-        <w:t xml:space="preserve">Katz, E., Blumler, J. G., &amp; Gurevitch, M. (1973). Uses and gratifications research. </w:t>
+        <w:t xml:space="preserve">Hevner, A. R., March, S. T., Park, J., &amp; Ram, S. (2004). Design science in information systems research. </w:t>
       </w:r>
       <w:r>
         <w:rPr>
@@ -11858,13 +11696,13 @@
           <w:iCs/>
           <w:lang w:val="en-US"/>
         </w:rPr>
-        <w:t xml:space="preserve">Public Opinion Quarterly, 37</w:t>
-      </w:r>
-      <w:r>
-        <w:rPr>
-          <w:lang w:val="en-US"/>
-        </w:rPr>
-        <w:t xml:space="preserve">(4), 509–523. https://doi.org/10.1086/268109</w:t>
+        <w:t xml:space="preserve">MIS Quarterly, 28</w:t>
+      </w:r>
+      <w:r>
+        <w:rPr>
+          <w:lang w:val="en-US"/>
+        </w:rPr>
+        <w:t xml:space="preserve">(1), 75–105. https://doi.org/10.2307/25148625</w:t>
       </w:r>
     </w:p>
     <w:p>
@@ -11879,7 +11717,7 @@
         <w:rPr>
           <w:lang w:val="en-US"/>
         </w:rPr>
-        <w:t xml:space="preserve">Lewis, J. R. (2018). The System Usability Scale: Past, present, and future. </w:t>
+        <w:t xml:space="preserve">Katz, E., Blumler, J. G., &amp; Gurevitch, M. (1973). Uses and gratifications research. </w:t>
       </w:r>
       <w:r>
         <w:rPr>
@@ -11887,13 +11725,13 @@
           <w:iCs/>
           <w:lang w:val="en-US"/>
         </w:rPr>
-        <w:t xml:space="preserve">International Journal of Human-Computer Interaction, 34</w:t>
-      </w:r>
-      <w:r>
-        <w:rPr>
-          <w:lang w:val="en-US"/>
-        </w:rPr>
-        <w:t xml:space="preserve">(7), 577–590. https://doi.org/10.1080/10447318.2018.1455307</w:t>
+        <w:t xml:space="preserve">Public Opinion Quarterly, 37</w:t>
+      </w:r>
+      <w:r>
+        <w:rPr>
+          <w:lang w:val="en-US"/>
+        </w:rPr>
+        <w:t xml:space="preserve">(4), 509–523. https://doi.org/10.1086/268109</w:t>
       </w:r>
     </w:p>
     <w:p>
@@ -11908,7 +11746,7 @@
         <w:rPr>
           <w:lang w:val="en-US"/>
         </w:rPr>
-        <w:t xml:space="preserve">Manning, C. D., Raghavan, P., &amp; Schütze, H. (2008). </w:t>
+        <w:t xml:space="preserve">Kunaver, M., &amp; Požrl, T. (2017). Diversity in recommender systems – A survey. </w:t>
       </w:r>
       <w:r>
         <w:rPr>
@@ -11916,13 +11754,13 @@
           <w:iCs/>
           <w:lang w:val="en-US"/>
         </w:rPr>
-        <w:t xml:space="preserve">Introduction to information retrieval</w:t>
-      </w:r>
-      <w:r>
-        <w:rPr>
-          <w:lang w:val="en-US"/>
-        </w:rPr>
-        <w:t xml:space="preserve">. Cambridge University Press.</w:t>
+        <w:t xml:space="preserve">Knowledge-Based Systems, 123</w:t>
+      </w:r>
+      <w:r>
+        <w:rPr>
+          <w:lang w:val="en-US"/>
+        </w:rPr>
+        <w:t xml:space="preserve">, 154–162. https://doi.org/10.1016/j.knosys.2017.02.009</w:t>
       </w:r>
     </w:p>
     <w:p>
@@ -11937,7 +11775,7 @@
         <w:rPr>
           <w:lang w:val="en-US"/>
         </w:rPr>
-        <w:t xml:space="preserve">Mathur, A., Acar, G., Friedman, M. J., Lucherini, E., Mayer, J., Chetty, M., &amp; Narayanan, A. (2019). Dark patterns at scale: Findings from a crawl of 11K shopping websites. </w:t>
+        <w:t xml:space="preserve">Lewis, J. R. (2018). The System Usability Scale: Past, present, and future. </w:t>
       </w:r>
       <w:r>
         <w:rPr>
@@ -11945,13 +11783,13 @@
           <w:iCs/>
           <w:lang w:val="en-US"/>
         </w:rPr>
-        <w:t xml:space="preserve">Proceedings of the ACM on Human-Computer Interaction, 3</w:t>
-      </w:r>
-      <w:r>
-        <w:rPr>
-          <w:lang w:val="en-US"/>
-        </w:rPr>
-        <w:t xml:space="preserve">(CSCW), Artikel 81. https://doi.org/10.1145/3359183</w:t>
+        <w:t xml:space="preserve">International Journal of Human-Computer Interaction, 34</w:t>
+      </w:r>
+      <w:r>
+        <w:rPr>
+          <w:lang w:val="en-US"/>
+        </w:rPr>
+        <w:t xml:space="preserve">(7), 577–590. https://doi.org/10.1080/10447318.2018.1455307</w:t>
       </w:r>
     </w:p>
     <w:p>
@@ -11966,7 +11804,7 @@
         <w:rPr>
           <w:lang w:val="en-US"/>
         </w:rPr>
-        <w:t xml:space="preserve">Milano, S., Taddeo, M., &amp; Floridi, L. (2020). Recommender systems and their ethical challenges. </w:t>
+        <w:t xml:space="preserve">Manning, C. D., Raghavan, P., &amp; Schütze, H. (2008). </w:t>
       </w:r>
       <w:r>
         <w:rPr>
@@ -11974,13 +11812,13 @@
           <w:iCs/>
           <w:lang w:val="en-US"/>
         </w:rPr>
-        <w:t xml:space="preserve">AI &amp; Society, 35</w:t>
-      </w:r>
-      <w:r>
-        <w:rPr>
-          <w:lang w:val="en-US"/>
-        </w:rPr>
-        <w:t xml:space="preserve">, 957–967. https://doi.org/10.1007/s00146-020-00950-y</w:t>
+        <w:t xml:space="preserve">Introduction to information retrieval</w:t>
+      </w:r>
+      <w:r>
+        <w:rPr>
+          <w:lang w:val="en-US"/>
+        </w:rPr>
+        <w:t xml:space="preserve">. Cambridge University Press.</w:t>
       </w:r>
     </w:p>
     <w:p>
@@ -11995,7 +11833,7 @@
         <w:rPr>
           <w:lang w:val="en-US"/>
         </w:rPr>
-        <w:t xml:space="preserve">Montag, C., &amp; Elhai, J. D. (2023). On social media design, (online-)time well-spent and addictive behaviors in the age of surveillance capitalism. </w:t>
+        <w:t xml:space="preserve">Mathur, A., Acar, G., Friedman, M. J., Lucherini, E., Mayer, J., Chetty, M., &amp; Narayanan, A. (2019). Dark patterns at scale: Findings from a crawl of 11K shopping websites. </w:t>
       </w:r>
       <w:r>
         <w:rPr>
@@ -12003,19 +11841,13 @@
           <w:iCs/>
           <w:lang w:val="en-US"/>
         </w:rPr>
-        <w:t xml:space="preserve">Current Addiction Reports, 10</w:t>
-      </w:r>
-      <w:r>
-        <w:rPr>
-          <w:lang w:val="en-US"/>
-        </w:rPr>
-        <w:t xml:space="preserve">, 610–616</w:t>
-      </w:r>
-      <w:r>
-        <w:rPr>
-          <w:lang w:val="en-US"/>
-        </w:rPr>
-        <w:t xml:space="preserve">. https://doi.org/10.1007/s40429-023-00494-3</w:t>
+        <w:t xml:space="preserve">Proceedings of the ACM on Human-Computer Interaction, 3</w:t>
+      </w:r>
+      <w:r>
+        <w:rPr>
+          <w:lang w:val="en-US"/>
+        </w:rPr>
+        <w:t xml:space="preserve">(CSCW), Artikel 81. https://doi.org/10.1145/3359183</w:t>
       </w:r>
     </w:p>
     <w:p>
@@ -12030,7 +11862,7 @@
         <w:rPr>
           <w:lang w:val="en-US"/>
         </w:rPr>
-        <w:t xml:space="preserve">Montag, C., Lachmann, B., Herrlich, M., &amp; Zweig, K. (2019). Addictive features of social media/messenger platforms and freemium games against the background of psychological and economic theories. </w:t>
+        <w:t xml:space="preserve">Milano, S., Taddeo, M., &amp; Floridi, L. (2020). Recommender systems and their ethical challenges. </w:t>
       </w:r>
       <w:r>
         <w:rPr>
@@ -12038,13 +11870,13 @@
           <w:iCs/>
           <w:lang w:val="en-US"/>
         </w:rPr>
-        <w:t xml:space="preserve">International Journal of Environmental Research and Public Health, 16</w:t>
-      </w:r>
-      <w:r>
-        <w:rPr>
-          <w:lang w:val="en-US"/>
-        </w:rPr>
-        <w:t xml:space="preserve">(14), 2612. https://doi.org/10.3390/ijerph16142612</w:t>
+        <w:t xml:space="preserve">AI &amp; Society, 35</w:t>
+      </w:r>
+      <w:r>
+        <w:rPr>
+          <w:lang w:val="en-US"/>
+        </w:rPr>
+        <w:t xml:space="preserve">, 957–967. https://doi.org/10.1007/s00146-020-00950-y</w:t>
       </w:r>
     </w:p>
     <w:p>
@@ -12056,6 +11888,64 @@
         </w:rPr>
       </w:pPr>
       <w:r>
+        <w:rPr>
+          <w:lang w:val="en-US"/>
+        </w:rPr>
+        <w:t xml:space="preserve">Montag, C., &amp; Elhai, J. D. (2023). On social media design, (online-)time well-spent and addictive behaviors in the age of surveillance capitalism. </w:t>
+      </w:r>
+      <w:r>
+        <w:rPr>
+          <w:i/>
+          <w:iCs/>
+          <w:lang w:val="en-US"/>
+        </w:rPr>
+        <w:t xml:space="preserve">Current Addiction Reports, 10</w:t>
+      </w:r>
+      <w:r>
+        <w:rPr>
+          <w:lang w:val="en-US"/>
+        </w:rPr>
+        <w:t>, 610–616. https://doi.org/10.1007/s40429-023-00494-3</w:t>
+      </w:r>
+    </w:p>
+    <w:p>
+      <w:pPr>
+        <w:spacing w:after="120" w:line="360" w:lineRule="auto"/>
+        <w:ind w:left="720" w:hanging="720"/>
+        <w:rPr>
+          <w:lang w:val="en-US"/>
+        </w:rPr>
+      </w:pPr>
+      <w:r>
+        <w:rPr>
+          <w:lang w:val="en-US"/>
+        </w:rPr>
+        <w:t xml:space="preserve">Montag, C., Lachmann, B., Herrlich, M., &amp; Zweig, K. (2019). Addictive features of social media/messenger platforms and freemium games against the background of psychological and economic theories. </w:t>
+      </w:r>
+      <w:r>
+        <w:rPr>
+          <w:i/>
+          <w:iCs/>
+          <w:lang w:val="en-US"/>
+        </w:rPr>
+        <w:t xml:space="preserve">International Journal of Environmental Research and Public Health, 16</w:t>
+      </w:r>
+      <w:r>
+        <w:rPr>
+          <w:lang w:val="en-US"/>
+        </w:rPr>
+        <w:t xml:space="preserve">(14), 2612. https://doi.org/10.3390/ijerph16142612</w:t>
+      </w:r>
+    </w:p>
+    <w:p>
+      <w:pPr>
+        <w:spacing w:after="120" w:line="360" w:lineRule="auto"/>
+        <w:ind w:left="720" w:hanging="720"/>
+        <w:rPr>
+          <w:lang w:val="en-US"/>
+        </w:rPr>
+      </w:pPr>
+      <w:r>
         <w:rPr/>
         <w:t xml:space="preserve">Nguyen, T. T., Hui, P.-M., Harper, F. M., Terveen, L., &amp; Konstan, J. A. (2014). Exploring the filter bubble: The effect of using recommender systems on content diversity. In </w:t>
       </w:r>
@@ -12155,19 +12045,7 @@
         <w:rPr>
           <w:lang w:val="en-US"/>
         </w:rPr>
-        <w:t xml:space="preserve">(3), 45–</w:t>
-      </w:r>
-      <w:r>
-        <w:rPr>
-          <w:lang w:val="en-US"/>
-        </w:rPr>
-        <w:t xml:space="preserve">78</w:t>
-      </w:r>
-      <w:r>
-        <w:rPr>
-          <w:lang w:val="en-US"/>
-        </w:rPr>
-        <w:t xml:space="preserve">. https://doi.org/10.2753/MIS0742-1222240302</w:t>
+        <w:t>(3), 45–78. https://doi.org/10.2753/MIS0742-1222240302</w:t>
       </w:r>
     </w:p>
     <w:p>
@@ -12280,19 +12158,7 @@
         <w:rPr>
           <w:lang w:val="en-US"/>
         </w:rPr>
-        <w:t xml:space="preserve"> (</w:t>
-      </w:r>
-      <w:r>
-        <w:rPr>
-          <w:lang w:val="en-US"/>
-        </w:rPr>
-        <w:t xml:space="preserve">2. Auflage</w:t>
-      </w:r>
-      <w:r>
-        <w:rPr>
-          <w:lang w:val="en-US"/>
-        </w:rPr>
-        <w:t xml:space="preserve">). Springer. https://doi.org/10.1007/978-1-4899-7637-6</w:t>
+        <w:t xml:space="preserve"> (2. Auflage). Springer. https://doi.org/10.1007/978-1-4899-7637-6</w:t>
       </w:r>
     </w:p>
     <w:p>
@@ -12394,7 +12260,7 @@
         <w:rPr>
           <w:lang w:val="en-US"/>
         </w:rPr>
-        <w:t xml:space="preserve">Venkatesh, V., Morris, M. G., Davis, G. B., &amp; Davis, F. D. (2003). User acceptance of information technology: Toward a unified view. </w:t>
+        <w:t xml:space="preserve">Venable, J., Pries-Heje, J., &amp; Baskerville, R. (2016). FEDS: A framework for evaluation in design science research. </w:t>
       </w:r>
       <w:r>
         <w:rPr>
@@ -12402,13 +12268,13 @@
           <w:iCs/>
           <w:lang w:val="en-US"/>
         </w:rPr>
-        <w:t xml:space="preserve">MIS Quarterly, 27</w:t>
-      </w:r>
-      <w:r>
-        <w:rPr>
-          <w:lang w:val="en-US"/>
-        </w:rPr>
-        <w:t xml:space="preserve">(3), 425–478. https://doi.org/10.2307/30036540</w:t>
+        <w:t xml:space="preserve">European Journal of Information Systems, 25</w:t>
+      </w:r>
+      <w:r>
+        <w:rPr>
+          <w:lang w:val="en-US"/>
+        </w:rPr>
+        <w:t xml:space="preserve">(1), 77–89. https://doi.org/10.1057/ejis.2014.36</w:t>
       </w:r>
     </w:p>
     <w:p>
@@ -12423,7 +12289,7 @@
         <w:rPr>
           <w:lang w:val="en-US"/>
         </w:rPr>
-        <w:t xml:space="preserve">Verduyn, P., Lee, D. S., Park, J., Shablack, H., Orvell, A., Bayer, J., Ybarra, O., Jonides, J., &amp; Kross, E. (2015). Passive Facebook usage undermines affective well-being: Experimental and longitudinal evidence. </w:t>
+        <w:t xml:space="preserve">Venkatesh, V., Morris, M. G., Davis, G. B., &amp; Davis, F. D. (2003). User acceptance of information technology: Toward a unified view. </w:t>
       </w:r>
       <w:r>
         <w:rPr>
@@ -12431,25 +12297,28 @@
           <w:iCs/>
           <w:lang w:val="en-US"/>
         </w:rPr>
-        <w:t xml:space="preserve">Journal of Experimental Psychology: General, 144</w:t>
-      </w:r>
-      <w:r>
-        <w:rPr>
-          <w:lang w:val="en-US"/>
-        </w:rPr>
-        <w:t xml:space="preserve">(2), 480–488. https://doi.org/10.1037/xge0000057</w:t>
+        <w:t xml:space="preserve">MIS Quarterly, 27</w:t>
+      </w:r>
+      <w:r>
+        <w:rPr>
+          <w:lang w:val="en-US"/>
+        </w:rPr>
+        <w:t xml:space="preserve">(3), 425–478. https://doi.org/10.2307/30036540</w:t>
       </w:r>
     </w:p>
     <w:p>
       <w:pPr>
         <w:spacing w:after="120" w:line="360" w:lineRule="auto"/>
         <w:ind w:left="720" w:hanging="720"/>
-      </w:pPr>
-      <w:r>
-        <w:rPr>
-          <w:lang w:val="en-US"/>
-        </w:rPr>
-        <w:t xml:space="preserve">Vosoughi, S., Roy, D., &amp; Aral, S. (2018). The spread of true and false news online. </w:t>
+        <w:rPr>
+          <w:lang w:val="en-US"/>
+        </w:rPr>
+      </w:pPr>
+      <w:r>
+        <w:rPr>
+          <w:lang w:val="en-US"/>
+        </w:rPr>
+        <w:t xml:space="preserve">Verduyn, P., Lee, D. S., Park, J., Shablack, H., Orvell, A., Bayer, J., Ybarra, O., Jonides, J., &amp; Kross, E. (2015). Passive Facebook usage undermines affective well-being: Experimental and longitudinal evidence. </w:t>
       </w:r>
       <w:r>
         <w:rPr>
@@ -12457,19 +12326,45 @@
           <w:iCs/>
           <w:lang w:val="en-US"/>
         </w:rPr>
-        <w:t xml:space="preserve">Science, 359</w:t>
-      </w:r>
-      <w:r>
-        <w:rPr>
-          <w:lang w:val="en-US"/>
-        </w:rPr>
-        <w:t xml:space="preserve">(6380), 1146–1151. https://doi.org/10.1126/science.aap9559</w:t>
+        <w:t xml:space="preserve">Journal of Experimental Psychology: General, 144</w:t>
+      </w:r>
+      <w:r>
+        <w:rPr>
+          <w:lang w:val="en-US"/>
+        </w:rPr>
+        <w:t xml:space="preserve">(2), 480–488. https://doi.org/10.1037/xge0000057</w:t>
       </w:r>
     </w:p>
     <w:p>
       <w:pPr>
         <w:spacing w:after="120" w:line="360" w:lineRule="auto"/>
         <w:ind w:left="720" w:hanging="720"/>
+      </w:pPr>
+      <w:r>
+        <w:rPr>
+          <w:lang w:val="en-US"/>
+        </w:rPr>
+        <w:t xml:space="preserve">Vosoughi, S., Roy, D., &amp; Aral, S. (2018). The spread of true and false news online. </w:t>
+      </w:r>
+      <w:r>
+        <w:rPr>
+          <w:i/>
+          <w:iCs/>
+          <w:lang w:val="en-US"/>
+        </w:rPr>
+        <w:t xml:space="preserve">Science, 359</w:t>
+      </w:r>
+      <w:r>
+        <w:rPr>
+          <w:lang w:val="en-US"/>
+        </w:rPr>
+        <w:t xml:space="preserve">(6380), 1146–1151. https://doi.org/10.1126/science.aap9559</w:t>
+      </w:r>
+    </w:p>
+    <w:p>
+      <w:pPr>
+        <w:spacing w:after="120" w:line="360" w:lineRule="auto"/>
+        <w:ind w:left="720" w:hanging="720"/>
         <w:rPr>
           <w:lang w:val="en-US"/>
         </w:rPr>
@@ -12487,11 +12382,7 @@
       </w:r>
       <w:r>
         <w:rPr/>
-        <w:t xml:space="preserve">(6), 433–436. https://doi.org/10.1007/s12599-016-0453-</w:t>
-      </w:r>
-      <w:r>
-        <w:rPr/>
-        <w:t xml:space="preserve">1</w:t>
+        <w:t>(6), 433–436. https://doi.org/10.1007/s12599-016-0453-1</w:t>
       </w:r>
     </w:p>
     <w:p>

</xml_diff>